<commit_message>
add w1s1.doc to 1870/Note folder
</commit_message>
<xml_diff>
--- a/26fall/1870/Note/w1s1.docx
+++ b/26fall/1870/Note/w1s1.docx
@@ -13,6 +13,8 @@
           <w:rFonts w:hint="eastAsia"/>
         </w:rPr>
       </w:pPr>
+      <w:bookmarkStart w:id="0" w:name="_Hlk241742757"/>
+      <w:bookmarkEnd w:id="0"/>
       <w:r>
         <w:t>Introduction</w:t>
       </w:r>
@@ -4659,6 +4661,9 @@
       <w:pPr>
         <w:ind w:firstLineChars="50" w:firstLine="105"/>
         <w:jc w:val="center"/>
+        <w:rPr>
+          <w:rFonts w:hint="eastAsia"/>
+        </w:rPr>
       </w:pPr>
       <w:r>
         <w:rPr>
@@ -6526,6 +6531,7 @@
       <w:pPr>
         <w:jc w:val="left"/>
         <w:rPr>
+          <w:rFonts w:hint="eastAsia"/>
           <w:color w:val="074F6A" w:themeColor="accent4" w:themeShade="80"/>
         </w:rPr>
       </w:pPr>
@@ -6534,6 +6540,7 @@
       <w:pPr>
         <w:jc w:val="left"/>
         <w:rPr>
+          <w:rFonts w:hint="eastAsia"/>
           <w:color w:val="074F6A" w:themeColor="accent4" w:themeShade="80"/>
         </w:rPr>
       </w:pPr>
@@ -6563,6 +6570,9 @@
           <w:numId w:val="2"/>
         </w:numPr>
         <w:ind w:left="440" w:hanging="440"/>
+        <w:rPr>
+          <w:rFonts w:hint="eastAsia"/>
+        </w:rPr>
       </w:pPr>
       <w:r>
         <w:rPr>
@@ -6573,6 +6583,11 @@
       </w:r>
     </w:p>
     <w:p>
+      <w:pPr>
+        <w:rPr>
+          <w:rFonts w:hint="eastAsia"/>
+        </w:rPr>
+      </w:pPr>
       <w:r>
         <w:rPr>
           <w:rFonts w:hint="eastAsia"/>
@@ -6583,6 +6598,7 @@
     <w:p>
       <w:pPr>
         <w:rPr>
+          <w:rFonts w:hint="eastAsia"/>
           <w:color w:val="074F6A" w:themeColor="accent4" w:themeShade="80"/>
         </w:rPr>
       </w:pPr>
@@ -6723,9 +6739,6 @@
           <w:ilvl w:val="1"/>
           <w:numId w:val="2"/>
         </w:numPr>
-        <w:rPr>
-          <w:rFonts w:hint="eastAsia"/>
-        </w:rPr>
       </w:pPr>
       <w:r>
         <w:t>Propositional logic</w:t>
@@ -6744,6 +6757,1860 @@
           <w:rFonts w:hint="eastAsia"/>
         </w:rPr>
         <w:t>)</w:t>
+      </w:r>
+    </w:p>
+    <w:p>
+      <w:pPr>
+        <w:pStyle w:val="a9"/>
+        <w:numPr>
+          <w:ilvl w:val="0"/>
+          <w:numId w:val="3"/>
+        </w:numPr>
+      </w:pPr>
+      <w:r>
+        <w:rPr>
+          <w:rFonts w:hint="eastAsia"/>
+          <w:b/>
+          <w:bCs/>
+        </w:rPr>
+        <w:t>Proposition</w:t>
+      </w:r>
+      <w:r>
+        <w:rPr>
+          <w:rFonts w:hint="eastAsia"/>
+        </w:rPr>
+        <w:t>(命题)</w:t>
+      </w:r>
+      <w:r>
+        <w:rPr>
+          <w:rFonts w:hint="eastAsia"/>
+        </w:rPr>
+        <w:t>是一个或真或假的陈述句</w:t>
+      </w:r>
+      <w:r>
+        <w:rPr>
+          <w:rFonts w:hint="eastAsia"/>
+        </w:rPr>
+        <w:t>.</w:t>
+      </w:r>
+    </w:p>
+    <w:tbl>
+      <w:tblPr>
+        <w:tblStyle w:val="af1"/>
+        <w:tblW w:w="0" w:type="auto"/>
+        <w:tblLook w:val="04A0" w:firstRow="1" w:lastRow="0" w:firstColumn="1" w:lastColumn="0" w:noHBand="0" w:noVBand="1"/>
+      </w:tblPr>
+      <w:tblGrid>
+        <w:gridCol w:w="5231"/>
+        <w:gridCol w:w="5225"/>
+      </w:tblGrid>
+      <w:tr>
+        <w:tc>
+          <w:tcPr>
+            <w:tcW w:w="5341" w:type="dxa"/>
+          </w:tcPr>
+          <w:p>
+            <w:pPr>
+              <w:jc w:val="center"/>
+              <w:rPr>
+                <w:rFonts w:hint="eastAsia"/>
+                <w:b/>
+                <w:bCs/>
+              </w:rPr>
+            </w:pPr>
+            <w:r>
+              <w:rPr>
+                <w:rFonts w:hint="eastAsia"/>
+                <w:b/>
+                <w:bCs/>
+              </w:rPr>
+              <w:t>命题</w:t>
+            </w:r>
+          </w:p>
+        </w:tc>
+        <w:tc>
+          <w:tcPr>
+            <w:tcW w:w="5341" w:type="dxa"/>
+          </w:tcPr>
+          <w:p>
+            <w:pPr>
+              <w:jc w:val="center"/>
+              <w:rPr>
+                <w:rFonts w:hint="eastAsia"/>
+                <w:b/>
+                <w:bCs/>
+              </w:rPr>
+            </w:pPr>
+            <w:r>
+              <w:rPr>
+                <w:rFonts w:hint="eastAsia"/>
+                <w:b/>
+                <w:bCs/>
+              </w:rPr>
+              <w:t>非命题</w:t>
+            </w:r>
+          </w:p>
+        </w:tc>
+      </w:tr>
+      <w:tr>
+        <w:tc>
+          <w:tcPr>
+            <w:tcW w:w="5341" w:type="dxa"/>
+          </w:tcPr>
+          <w:p>
+            <w:pPr>
+              <w:rPr>
+                <w:rFonts w:hint="eastAsia"/>
+                <w:b/>
+                <w:bCs/>
+              </w:rPr>
+            </w:pPr>
+            <w:r>
+              <w:rPr>
+                <w:rFonts w:hint="eastAsia"/>
+                <w:b/>
+                <w:bCs/>
+              </w:rPr>
+              <w:t xml:space="preserve">2+3=5          </w:t>
+            </w:r>
+          </w:p>
+          <w:p>
+            <w:pPr>
+              <w:rPr>
+                <w:rFonts w:hint="eastAsia"/>
+              </w:rPr>
+            </w:pPr>
+          </w:p>
+          <w:p>
+            <w:pPr>
+              <w:rPr>
+                <w:rFonts w:hint="eastAsia"/>
+              </w:rPr>
+            </w:pPr>
+            <w:r>
+              <w:rPr>
+                <w:rFonts w:hint="eastAsia"/>
+              </w:rPr>
+              <w:t>是陈述句且为真</w:t>
+            </w:r>
+          </w:p>
+        </w:tc>
+        <w:tc>
+          <w:tcPr>
+            <w:tcW w:w="5341" w:type="dxa"/>
+          </w:tcPr>
+          <w:p>
+            <w:pPr>
+              <w:rPr>
+                <w:rFonts w:hint="eastAsia"/>
+                <w:b/>
+                <w:bCs/>
+              </w:rPr>
+            </w:pPr>
+            <w:r>
+              <w:rPr>
+                <w:rFonts w:hint="eastAsia"/>
+                <w:b/>
+                <w:bCs/>
+              </w:rPr>
+              <w:t>太阳会从西边出来吗？</w:t>
+            </w:r>
+          </w:p>
+          <w:p>
+            <w:pPr>
+              <w:rPr>
+                <w:rFonts w:hint="eastAsia"/>
+              </w:rPr>
+            </w:pPr>
+          </w:p>
+          <w:p>
+            <w:pPr>
+              <w:rPr>
+                <w:rFonts w:hint="eastAsia"/>
+              </w:rPr>
+            </w:pPr>
+            <w:r>
+              <w:rPr>
+                <w:rFonts w:hint="eastAsia"/>
+              </w:rPr>
+              <w:t>是疑问句不是陈述句</w:t>
+            </w:r>
+          </w:p>
+        </w:tc>
+      </w:tr>
+      <w:tr>
+        <w:tc>
+          <w:tcPr>
+            <w:tcW w:w="5341" w:type="dxa"/>
+          </w:tcPr>
+          <w:p>
+            <w:pPr>
+              <w:rPr>
+                <w:rFonts w:hint="eastAsia"/>
+                <w:b/>
+                <w:bCs/>
+              </w:rPr>
+            </w:pPr>
+            <w:r>
+              <w:rPr>
+                <w:rFonts w:hint="eastAsia"/>
+                <w:b/>
+                <w:bCs/>
+              </w:rPr>
+              <w:t>a^2 + b^2 = c^2 ，abc是三角形的三条边</w:t>
+            </w:r>
+          </w:p>
+          <w:p>
+            <w:pPr>
+              <w:rPr>
+                <w:rFonts w:hint="eastAsia"/>
+              </w:rPr>
+            </w:pPr>
+          </w:p>
+          <w:p>
+            <w:pPr>
+              <w:rPr>
+                <w:rFonts w:hint="eastAsia"/>
+              </w:rPr>
+            </w:pPr>
+            <w:r>
+              <w:rPr>
+                <w:rFonts w:hint="eastAsia"/>
+              </w:rPr>
+              <w:t>是一个陈述句且为假</w:t>
+            </w:r>
+          </w:p>
+        </w:tc>
+        <w:tc>
+          <w:tcPr>
+            <w:tcW w:w="5341" w:type="dxa"/>
+          </w:tcPr>
+          <w:p>
+            <w:pPr>
+              <w:rPr>
+                <w:rFonts w:hint="eastAsia"/>
+                <w:b/>
+                <w:bCs/>
+              </w:rPr>
+            </w:pPr>
+            <w:r>
+              <w:rPr>
+                <w:rFonts w:hint="eastAsia"/>
+                <w:b/>
+                <w:bCs/>
+              </w:rPr>
+              <w:t>今天天气真好啊！</w:t>
+            </w:r>
+          </w:p>
+          <w:p>
+            <w:pPr>
+              <w:rPr>
+                <w:rFonts w:hint="eastAsia"/>
+              </w:rPr>
+            </w:pPr>
+          </w:p>
+          <w:p>
+            <w:pPr>
+              <w:rPr>
+                <w:rFonts w:hint="eastAsia"/>
+              </w:rPr>
+            </w:pPr>
+            <w:r>
+              <w:rPr>
+                <w:rFonts w:hint="eastAsia"/>
+              </w:rPr>
+              <w:t>是感叹句不是陈述句</w:t>
+            </w:r>
+          </w:p>
+        </w:tc>
+      </w:tr>
+    </w:tbl>
+    <w:p/>
+    <w:p>
+      <w:pPr>
+        <w:rPr>
+          <w:rFonts w:hint="eastAsia"/>
+        </w:rPr>
+      </w:pPr>
+    </w:p>
+    <w:p>
+      <w:pPr>
+        <w:pStyle w:val="a9"/>
+        <w:numPr>
+          <w:ilvl w:val="0"/>
+          <w:numId w:val="3"/>
+        </w:numPr>
+      </w:pPr>
+      <w:r>
+        <w:rPr>
+          <w:rFonts w:hint="eastAsia"/>
+        </w:rPr>
+        <w:t xml:space="preserve">We use </w:t>
+      </w:r>
+      <w:r>
+        <w:rPr>
+          <w:rFonts w:hint="eastAsia"/>
+          <w:b/>
+          <w:bCs/>
+        </w:rPr>
+        <w:t>upper-case letters</w:t>
+      </w:r>
+      <w:r>
+        <w:rPr>
+          <w:rFonts w:hint="eastAsia"/>
+        </w:rPr>
+        <w:t>（大写字母）</w:t>
+      </w:r>
+      <w:r>
+        <w:rPr>
+          <w:rFonts w:hint="eastAsia"/>
+        </w:rPr>
+        <w:t xml:space="preserve"> to represent propositions, such as </w:t>
+      </w:r>
+      <w:r>
+        <w:rPr>
+          <w:rFonts w:hint="eastAsia"/>
+          <w:b/>
+          <w:bCs/>
+        </w:rPr>
+        <w:t>A, B, P1, P2, P3</w:t>
+      </w:r>
+    </w:p>
+    <w:p>
+      <w:pPr>
+        <w:pStyle w:val="a9"/>
+        <w:ind w:left="440"/>
+        <w:rPr>
+          <w:rFonts w:hint="eastAsia"/>
+        </w:rPr>
+      </w:pPr>
+    </w:p>
+    <w:p>
+      <w:pPr>
+        <w:pStyle w:val="a9"/>
+        <w:numPr>
+          <w:ilvl w:val="0"/>
+          <w:numId w:val="3"/>
+        </w:numPr>
+      </w:pPr>
+      <w:r>
+        <w:rPr>
+          <w:rFonts w:hint="eastAsia"/>
+        </w:rPr>
+        <w:t>Propositions are used to build more complicated statements</w:t>
+      </w:r>
+      <w:r>
+        <w:rPr>
+          <w:rFonts w:hint="eastAsia"/>
+        </w:rPr>
+        <w:t>（更复杂的句子）</w:t>
+      </w:r>
+      <w:r>
+        <w:rPr>
+          <w:rFonts w:hint="eastAsia"/>
+        </w:rPr>
+        <w:t>，</w:t>
+      </w:r>
+      <w:r>
+        <w:rPr>
+          <w:rFonts w:hint="eastAsia"/>
+        </w:rPr>
+        <w:t>we need ways of combining propositions into more complicated expressions</w:t>
+      </w:r>
+      <w:r>
+        <w:rPr>
+          <w:rFonts w:hint="eastAsia"/>
+        </w:rPr>
+        <w:t>（</w:t>
+      </w:r>
+      <w:r>
+        <w:t>将命题组合成更复杂的表达式的方法</w:t>
+      </w:r>
+      <w:r>
+        <w:rPr>
+          <w:rFonts w:hint="eastAsia"/>
+        </w:rPr>
+        <w:t>）：</w:t>
+      </w:r>
+      <w:r>
+        <w:rPr>
+          <w:rFonts w:hint="eastAsia"/>
+          <w:b/>
+          <w:bCs/>
+        </w:rPr>
+        <w:t>logical operators</w:t>
+      </w:r>
+      <w:r>
+        <w:rPr>
+          <w:rFonts w:hint="eastAsia"/>
+        </w:rPr>
+        <w:t>（逻辑操作符）-</w:t>
+      </w:r>
+      <w:r>
+        <w:rPr>
+          <w:rFonts w:hint="eastAsia"/>
+        </w:rPr>
+        <w:t xml:space="preserve"> </w:t>
+      </w:r>
+      <w:r>
+        <w:rPr>
+          <w:rFonts w:hint="eastAsia"/>
+          <w:b/>
+          <w:bCs/>
+        </w:rPr>
+        <w:t xml:space="preserve"> AND / OR / NOT / XOR </w:t>
+      </w:r>
+      <w:r>
+        <w:rPr>
+          <w:rFonts w:hint="eastAsia"/>
+          <w:b/>
+          <w:bCs/>
+        </w:rPr>
+        <w:t xml:space="preserve">/ </w:t>
+      </w:r>
+      <w:r>
+        <w:rPr>
+          <w:rFonts w:hint="eastAsia"/>
+          <w:b/>
+          <w:bCs/>
+        </w:rPr>
+        <w:t>-</w:t>
+      </w:r>
+      <w:r>
+        <w:rPr>
+          <w:rFonts w:hint="eastAsia"/>
+          <w:b/>
+          <w:bCs/>
+        </w:rPr>
+        <w:t xml:space="preserve">&gt;( </w:t>
+      </w:r>
+      <w:r>
+        <w:rPr>
+          <w:rFonts w:hint="eastAsia"/>
+          <w:b/>
+          <w:bCs/>
+        </w:rPr>
+        <w:t>IMPLIES</w:t>
+      </w:r>
+      <w:r>
+        <w:rPr>
+          <w:rFonts w:hint="eastAsia"/>
+          <w:b/>
+          <w:bCs/>
+        </w:rPr>
+        <w:t>)</w:t>
+      </w:r>
+      <w:r>
+        <w:rPr>
+          <w:rFonts w:hint="eastAsia"/>
+          <w:b/>
+          <w:bCs/>
+        </w:rPr>
+        <w:t xml:space="preserve">     </w:t>
+      </w:r>
+      <w:r>
+        <w:rPr>
+          <w:rFonts w:hint="eastAsia"/>
+          <w:b/>
+          <w:bCs/>
+        </w:rPr>
+        <w:t>/ &lt;=&gt;(IFF)</w:t>
+      </w:r>
+      <w:r>
+        <w:rPr>
+          <w:noProof/>
+        </w:rPr>
+        <w:t xml:space="preserve"> </w:t>
+      </w:r>
+    </w:p>
+    <w:p>
+      <w:pPr>
+        <w:pStyle w:val="a9"/>
+        <w:ind w:left="440"/>
+        <w:jc w:val="center"/>
+      </w:pPr>
+      <w:r>
+        <w:rPr>
+          <w:noProof/>
+        </w:rPr>
+        <w:drawing>
+          <wp:inline distT="0" distB="0" distL="0" distR="0" wp14:anchorId="269BCFD5" wp14:editId="4280EF87">
+            <wp:extent cx="2248525" cy="1643749"/>
+            <wp:effectExtent l="0" t="0" r="0" b="0"/>
+            <wp:docPr id="48924829" name="图片 1"/>
+            <wp:cNvGraphicFramePr>
+              <a:graphicFrameLocks xmlns:a="http://schemas.openxmlformats.org/drawingml/2006/main" noChangeAspect="1"/>
+            </wp:cNvGraphicFramePr>
+            <a:graphic xmlns:a="http://schemas.openxmlformats.org/drawingml/2006/main">
+              <a:graphicData uri="http://schemas.openxmlformats.org/drawingml/2006/picture">
+                <pic:pic xmlns:pic="http://schemas.openxmlformats.org/drawingml/2006/picture">
+                  <pic:nvPicPr>
+                    <pic:cNvPr id="48924829" name=""/>
+                    <pic:cNvPicPr/>
+                  </pic:nvPicPr>
+                  <pic:blipFill>
+                    <a:blip r:embed="rId24"/>
+                    <a:stretch>
+                      <a:fillRect/>
+                    </a:stretch>
+                  </pic:blipFill>
+                  <pic:spPr>
+                    <a:xfrm>
+                      <a:off x="0" y="0"/>
+                      <a:ext cx="2254356" cy="1648011"/>
+                    </a:xfrm>
+                    <a:prstGeom prst="rect">
+                      <a:avLst/>
+                    </a:prstGeom>
+                  </pic:spPr>
+                </pic:pic>
+              </a:graphicData>
+            </a:graphic>
+          </wp:inline>
+        </w:drawing>
+      </w:r>
+    </w:p>
+    <w:p>
+      <w:pPr>
+        <w:pStyle w:val="a9"/>
+        <w:ind w:left="440"/>
+        <w:jc w:val="center"/>
+        <w:rPr>
+          <w:rFonts w:hint="eastAsia"/>
+        </w:rPr>
+      </w:pPr>
+    </w:p>
+    <w:p>
+      <w:r>
+        <w:rPr>
+          <w:rFonts w:hint="eastAsia"/>
+          <w:noProof/>
+        </w:rPr>
+        <w:drawing>
+          <wp:inline distT="0" distB="0" distL="0" distR="0" wp14:anchorId="79493178" wp14:editId="6BCB29EC">
+            <wp:extent cx="6639560" cy="1670050"/>
+            <wp:effectExtent l="0" t="0" r="8890" b="6350"/>
+            <wp:docPr id="1557866595" name="图片 1"/>
+            <wp:cNvGraphicFramePr>
+              <a:graphicFrameLocks xmlns:a="http://schemas.openxmlformats.org/drawingml/2006/main" noChangeAspect="1"/>
+            </wp:cNvGraphicFramePr>
+            <a:graphic xmlns:a="http://schemas.openxmlformats.org/drawingml/2006/main">
+              <a:graphicData uri="http://schemas.openxmlformats.org/drawingml/2006/picture">
+                <pic:pic xmlns:pic="http://schemas.openxmlformats.org/drawingml/2006/picture">
+                  <pic:nvPicPr>
+                    <pic:cNvPr id="0" name="Picture 1"/>
+                    <pic:cNvPicPr>
+                      <a:picLocks noChangeAspect="1" noChangeArrowheads="1"/>
+                    </pic:cNvPicPr>
+                  </pic:nvPicPr>
+                  <pic:blipFill>
+                    <a:blip r:embed="rId25">
+                      <a:extLst>
+                        <a:ext uri="{28A0092B-C50C-407E-A947-70E740481C1C}">
+                          <a14:useLocalDpi xmlns:a14="http://schemas.microsoft.com/office/drawing/2010/main" val="0"/>
+                        </a:ext>
+                      </a:extLst>
+                    </a:blip>
+                    <a:srcRect/>
+                    <a:stretch>
+                      <a:fillRect/>
+                    </a:stretch>
+                  </pic:blipFill>
+                  <pic:spPr bwMode="auto">
+                    <a:xfrm>
+                      <a:off x="0" y="0"/>
+                      <a:ext cx="6639560" cy="1670050"/>
+                    </a:xfrm>
+                    <a:prstGeom prst="rect">
+                      <a:avLst/>
+                    </a:prstGeom>
+                    <a:noFill/>
+                    <a:ln>
+                      <a:noFill/>
+                    </a:ln>
+                  </pic:spPr>
+                </pic:pic>
+              </a:graphicData>
+            </a:graphic>
+          </wp:inline>
+        </w:drawing>
+      </w:r>
+    </w:p>
+    <w:p/>
+    <w:p>
+      <w:pPr>
+        <w:jc w:val="center"/>
+        <w:rPr>
+          <w:rFonts w:hint="eastAsia"/>
+        </w:rPr>
+      </w:pPr>
+    </w:p>
+    <w:p>
+      <w:pPr>
+        <w:pStyle w:val="4"/>
+        <w:numPr>
+          <w:ilvl w:val="1"/>
+          <w:numId w:val="2"/>
+        </w:numPr>
+        <w:rPr>
+          <w:b/>
+          <w:bCs/>
+        </w:rPr>
+      </w:pPr>
+      <w:r>
+        <w:rPr>
+          <w:b/>
+          <w:bCs/>
+        </w:rPr>
+        <w:lastRenderedPageBreak/>
+        <w:t>Truth tables</w:t>
+      </w:r>
+      <w:r>
+        <w:rPr>
+          <w:rFonts w:hint="eastAsia"/>
+          <w:b/>
+          <w:bCs/>
+        </w:rPr>
+        <w:t>(真值表)</w:t>
+      </w:r>
+    </w:p>
+    <w:p>
+      <w:pPr>
+        <w:jc w:val="center"/>
+      </w:pPr>
+      <w:r>
+        <w:drawing>
+          <wp:inline distT="0" distB="0" distL="0" distR="0" wp14:anchorId="41CF2095" wp14:editId="08F397AD">
+            <wp:extent cx="2177917" cy="1534773"/>
+            <wp:effectExtent l="0" t="0" r="0" b="8890"/>
+            <wp:docPr id="1829955467" name="图片 1"/>
+            <wp:cNvGraphicFramePr>
+              <a:graphicFrameLocks xmlns:a="http://schemas.openxmlformats.org/drawingml/2006/main" noChangeAspect="1"/>
+            </wp:cNvGraphicFramePr>
+            <a:graphic xmlns:a="http://schemas.openxmlformats.org/drawingml/2006/main">
+              <a:graphicData uri="http://schemas.openxmlformats.org/drawingml/2006/picture">
+                <pic:pic xmlns:pic="http://schemas.openxmlformats.org/drawingml/2006/picture">
+                  <pic:nvPicPr>
+                    <pic:cNvPr id="1829955467" name=""/>
+                    <pic:cNvPicPr/>
+                  </pic:nvPicPr>
+                  <pic:blipFill>
+                    <a:blip r:embed="rId26"/>
+                    <a:stretch>
+                      <a:fillRect/>
+                    </a:stretch>
+                  </pic:blipFill>
+                  <pic:spPr>
+                    <a:xfrm>
+                      <a:off x="0" y="0"/>
+                      <a:ext cx="2190198" cy="1543427"/>
+                    </a:xfrm>
+                    <a:prstGeom prst="rect">
+                      <a:avLst/>
+                    </a:prstGeom>
+                  </pic:spPr>
+                </pic:pic>
+              </a:graphicData>
+            </a:graphic>
+          </wp:inline>
+        </w:drawing>
+      </w:r>
+    </w:p>
+    <w:p>
+      <w:pPr>
+        <w:jc w:val="center"/>
+        <w:rPr>
+          <w:rFonts w:hint="eastAsia"/>
+        </w:rPr>
+      </w:pPr>
+    </w:p>
+    <w:p>
+      <w:pPr>
+        <w:pStyle w:val="4"/>
+        <w:numPr>
+          <w:ilvl w:val="1"/>
+          <w:numId w:val="2"/>
+        </w:numPr>
+        <w:rPr>
+          <w:b/>
+          <w:bCs/>
+        </w:rPr>
+      </w:pPr>
+      <w:r>
+        <w:rPr>
+          <w:b/>
+          <w:bCs/>
+        </w:rPr>
+        <w:t>Satisfiability, validity, equivalence</w:t>
+      </w:r>
+      <w:r>
+        <w:rPr>
+          <w:rFonts w:hint="eastAsia"/>
+          <w:b/>
+          <w:bCs/>
+        </w:rPr>
+        <w:t>(</w:t>
+      </w:r>
+      <w:r>
+        <w:rPr>
+          <w:b/>
+          <w:bCs/>
+        </w:rPr>
+        <w:t>可满足性、有效性、等效性</w:t>
+      </w:r>
+      <w:r>
+        <w:rPr>
+          <w:rFonts w:hint="eastAsia"/>
+          <w:b/>
+          <w:bCs/>
+        </w:rPr>
+        <w:t>)</w:t>
+      </w:r>
+    </w:p>
+    <w:p>
+      <w:pPr>
+        <w:pStyle w:val="5"/>
+        <w:rPr>
+          <w:rFonts w:hint="eastAsia"/>
+          <w:b/>
+          <w:bCs/>
+        </w:rPr>
+      </w:pPr>
+      <w:r>
+        <w:rPr>
+          <w:rFonts w:hint="eastAsia"/>
+          <w:b/>
+          <w:bCs/>
+        </w:rPr>
+        <w:t xml:space="preserve">2.3.1 </w:t>
+      </w:r>
+      <w:r>
+        <w:rPr>
+          <w:b/>
+          <w:bCs/>
+        </w:rPr>
+        <w:t>Satisfiability</w:t>
+      </w:r>
+      <w:r>
+        <w:rPr>
+          <w:rFonts w:hint="eastAsia"/>
+          <w:b/>
+          <w:bCs/>
+        </w:rPr>
+        <w:t xml:space="preserve"> </w:t>
+      </w:r>
+      <w:r>
+        <w:rPr>
+          <w:rFonts w:hint="eastAsia"/>
+          <w:b/>
+          <w:bCs/>
+        </w:rPr>
+        <w:t xml:space="preserve"> </w:t>
+      </w:r>
+      <w:r>
+        <w:rPr>
+          <w:rFonts w:hint="eastAsia"/>
+          <w:b/>
+          <w:bCs/>
+        </w:rPr>
+        <w:t>（可满足性）</w:t>
+      </w:r>
+      <w:r>
+        <w:rPr>
+          <w:rFonts w:hint="eastAsia"/>
+          <w:b/>
+          <w:bCs/>
+        </w:rPr>
+        <w:t xml:space="preserve">&amp; </w:t>
+      </w:r>
+      <w:r>
+        <w:rPr>
+          <w:rFonts w:hint="eastAsia"/>
+          <w:b/>
+          <w:bCs/>
+        </w:rPr>
+        <w:t>T</w:t>
+      </w:r>
+      <w:r>
+        <w:rPr>
+          <w:b/>
+          <w:bCs/>
+        </w:rPr>
+        <w:t>autology</w:t>
+      </w:r>
+      <w:r>
+        <w:rPr>
+          <w:rFonts w:hint="eastAsia"/>
+          <w:b/>
+          <w:bCs/>
+        </w:rPr>
+        <w:t>(</w:t>
+      </w:r>
+      <w:r>
+        <w:rPr>
+          <w:rFonts w:hint="eastAsia"/>
+          <w:b/>
+          <w:bCs/>
+        </w:rPr>
+        <w:t>永真式</w:t>
+      </w:r>
+      <w:r>
+        <w:rPr>
+          <w:rFonts w:hint="eastAsia"/>
+          <w:b/>
+          <w:bCs/>
+        </w:rPr>
+        <w:t>)</w:t>
+      </w:r>
+    </w:p>
+    <w:p>
+      <w:pPr>
+        <w:rPr>
+          <w:rFonts w:hint="eastAsia"/>
+        </w:rPr>
+      </w:pPr>
+      <w:r>
+        <w:drawing>
+          <wp:inline distT="0" distB="0" distL="0" distR="0" wp14:anchorId="47CD0FAB" wp14:editId="772660A6">
+            <wp:extent cx="6065465" cy="740073"/>
+            <wp:effectExtent l="0" t="0" r="0" b="3175"/>
+            <wp:docPr id="1474138288" name="图片 1"/>
+            <wp:cNvGraphicFramePr>
+              <a:graphicFrameLocks xmlns:a="http://schemas.openxmlformats.org/drawingml/2006/main" noChangeAspect="1"/>
+            </wp:cNvGraphicFramePr>
+            <a:graphic xmlns:a="http://schemas.openxmlformats.org/drawingml/2006/main">
+              <a:graphicData uri="http://schemas.openxmlformats.org/drawingml/2006/picture">
+                <pic:pic xmlns:pic="http://schemas.openxmlformats.org/drawingml/2006/picture">
+                  <pic:nvPicPr>
+                    <pic:cNvPr id="1474138288" name=""/>
+                    <pic:cNvPicPr/>
+                  </pic:nvPicPr>
+                  <pic:blipFill>
+                    <a:blip r:embed="rId27"/>
+                    <a:stretch>
+                      <a:fillRect/>
+                    </a:stretch>
+                  </pic:blipFill>
+                  <pic:spPr>
+                    <a:xfrm>
+                      <a:off x="0" y="0"/>
+                      <a:ext cx="6081904" cy="742079"/>
+                    </a:xfrm>
+                    <a:prstGeom prst="rect">
+                      <a:avLst/>
+                    </a:prstGeom>
+                  </pic:spPr>
+                </pic:pic>
+              </a:graphicData>
+            </a:graphic>
+          </wp:inline>
+        </w:drawing>
+      </w:r>
+    </w:p>
+    <w:p>
+      <w:pPr>
+        <w:rPr>
+          <w:b/>
+          <w:bCs/>
+          <w:color w:val="074F6A" w:themeColor="accent4" w:themeShade="80"/>
+        </w:rPr>
+      </w:pPr>
+      <w:r>
+        <w:rPr>
+          <w:rFonts w:hint="eastAsia"/>
+          <w:b/>
+          <w:bCs/>
+          <w:color w:val="074F6A" w:themeColor="accent4" w:themeShade="80"/>
+        </w:rPr>
+        <w:t>A是由P1...Pn组成的陈述句</w:t>
+      </w:r>
+      <w:r>
+        <w:rPr>
+          <w:rFonts w:hint="eastAsia"/>
+          <w:b/>
+          <w:bCs/>
+          <w:color w:val="074F6A" w:themeColor="accent4" w:themeShade="80"/>
+        </w:rPr>
+        <w:t>:</w:t>
+      </w:r>
+    </w:p>
+    <w:p>
+      <w:pPr>
+        <w:ind w:firstLineChars="200" w:firstLine="420"/>
+        <w:rPr>
+          <w:b/>
+          <w:bCs/>
+          <w:color w:val="074F6A" w:themeColor="accent4" w:themeShade="80"/>
+        </w:rPr>
+      </w:pPr>
+      <w:r>
+        <w:rPr>
+          <w:rFonts w:hint="eastAsia"/>
+          <w:b/>
+          <w:bCs/>
+          <w:color w:val="074F6A" w:themeColor="accent4" w:themeShade="80"/>
+        </w:rPr>
+        <w:t>如真值表至少有一行为真，</w:t>
+      </w:r>
+      <w:r>
+        <w:rPr>
+          <w:rFonts w:hint="eastAsia"/>
+          <w:b/>
+          <w:bCs/>
+          <w:color w:val="074F6A" w:themeColor="accent4" w:themeShade="80"/>
+        </w:rPr>
+        <w:t xml:space="preserve">   </w:t>
+      </w:r>
+      <w:r>
+        <w:rPr>
+          <w:rFonts w:hint="eastAsia"/>
+          <w:b/>
+          <w:bCs/>
+          <w:color w:val="074F6A" w:themeColor="accent4" w:themeShade="80"/>
+        </w:rPr>
+        <w:t>则satisfiable（可满足的）；</w:t>
+      </w:r>
+    </w:p>
+    <w:p>
+      <w:pPr>
+        <w:ind w:firstLineChars="200" w:firstLine="420"/>
+        <w:rPr>
+          <w:b/>
+          <w:bCs/>
+          <w:color w:val="074F6A" w:themeColor="accent4" w:themeShade="80"/>
+        </w:rPr>
+      </w:pPr>
+      <w:r>
+        <w:rPr>
+          <w:rFonts w:hint="eastAsia"/>
+          <w:b/>
+          <w:bCs/>
+          <w:color w:val="074F6A" w:themeColor="accent4" w:themeShade="80"/>
+        </w:rPr>
+        <w:t>如真值表</w:t>
+      </w:r>
+      <w:r>
+        <w:rPr>
+          <w:rFonts w:hint="eastAsia"/>
+          <w:b/>
+          <w:bCs/>
+          <w:color w:val="074F6A" w:themeColor="accent4" w:themeShade="80"/>
+        </w:rPr>
+        <w:t>所有行</w:t>
+      </w:r>
+      <w:r>
+        <w:rPr>
+          <w:rFonts w:hint="eastAsia"/>
+          <w:b/>
+          <w:bCs/>
+          <w:color w:val="074F6A" w:themeColor="accent4" w:themeShade="80"/>
+        </w:rPr>
+        <w:t>全部为假，</w:t>
+      </w:r>
+      <w:r>
+        <w:rPr>
+          <w:rFonts w:hint="eastAsia"/>
+          <w:b/>
+          <w:bCs/>
+          <w:color w:val="074F6A" w:themeColor="accent4" w:themeShade="80"/>
+        </w:rPr>
+        <w:t xml:space="preserve">   </w:t>
+      </w:r>
+      <w:r>
+        <w:rPr>
+          <w:rFonts w:hint="eastAsia"/>
+          <w:b/>
+          <w:bCs/>
+          <w:color w:val="074F6A" w:themeColor="accent4" w:themeShade="80"/>
+        </w:rPr>
+        <w:t>则unsatisfiable(不可满足的)</w:t>
+      </w:r>
+      <w:r>
+        <w:rPr>
+          <w:rFonts w:hint="eastAsia"/>
+          <w:b/>
+          <w:bCs/>
+          <w:color w:val="074F6A" w:themeColor="accent4" w:themeShade="80"/>
+        </w:rPr>
+        <w:t>.</w:t>
+      </w:r>
+    </w:p>
+    <w:p>
+      <w:pPr>
+        <w:ind w:firstLineChars="200" w:firstLine="420"/>
+        <w:rPr>
+          <w:b/>
+          <w:bCs/>
+          <w:color w:val="074F6A" w:themeColor="accent4" w:themeShade="80"/>
+        </w:rPr>
+      </w:pPr>
+      <w:r>
+        <w:rPr>
+          <w:rFonts w:hint="eastAsia"/>
+          <w:b/>
+          <w:bCs/>
+          <w:color w:val="074F6A" w:themeColor="accent4" w:themeShade="80"/>
+        </w:rPr>
+        <w:t>如真值表</w:t>
+      </w:r>
+      <w:r>
+        <w:rPr>
+          <w:rFonts w:hint="eastAsia"/>
+          <w:b/>
+          <w:bCs/>
+          <w:color w:val="074F6A" w:themeColor="accent4" w:themeShade="80"/>
+        </w:rPr>
+        <w:t>所有行</w:t>
+      </w:r>
+      <w:r>
+        <w:rPr>
+          <w:rFonts w:hint="eastAsia"/>
+          <w:b/>
+          <w:bCs/>
+          <w:color w:val="074F6A" w:themeColor="accent4" w:themeShade="80"/>
+        </w:rPr>
+        <w:t>全部为</w:t>
+      </w:r>
+      <w:r>
+        <w:rPr>
+          <w:rFonts w:hint="eastAsia"/>
+          <w:b/>
+          <w:bCs/>
+          <w:color w:val="074F6A" w:themeColor="accent4" w:themeShade="80"/>
+        </w:rPr>
+        <w:t>真</w:t>
+      </w:r>
+      <w:r>
+        <w:rPr>
+          <w:rFonts w:hint="eastAsia"/>
+          <w:b/>
+          <w:bCs/>
+          <w:color w:val="074F6A" w:themeColor="accent4" w:themeShade="80"/>
+        </w:rPr>
+        <w:t>，</w:t>
+      </w:r>
+      <w:r>
+        <w:rPr>
+          <w:rFonts w:hint="eastAsia"/>
+          <w:b/>
+          <w:bCs/>
+          <w:color w:val="074F6A" w:themeColor="accent4" w:themeShade="80"/>
+        </w:rPr>
+        <w:t xml:space="preserve">   </w:t>
+      </w:r>
+      <w:r>
+        <w:rPr>
+          <w:rFonts w:hint="eastAsia"/>
+          <w:b/>
+          <w:bCs/>
+          <w:color w:val="074F6A" w:themeColor="accent4" w:themeShade="80"/>
+        </w:rPr>
+        <w:t>则</w:t>
+      </w:r>
+      <w:r>
+        <w:rPr>
+          <w:b/>
+          <w:bCs/>
+          <w:i/>
+          <w:iCs/>
+          <w:color w:val="074F6A" w:themeColor="accent4" w:themeShade="80"/>
+        </w:rPr>
+        <w:t>tautology</w:t>
+      </w:r>
+      <w:r>
+        <w:rPr>
+          <w:b/>
+          <w:bCs/>
+          <w:color w:val="074F6A" w:themeColor="accent4" w:themeShade="80"/>
+        </w:rPr>
+        <w:t xml:space="preserve"> </w:t>
+      </w:r>
+      <w:r>
+        <w:rPr>
+          <w:rFonts w:hint="eastAsia"/>
+          <w:b/>
+          <w:bCs/>
+          <w:color w:val="074F6A" w:themeColor="accent4" w:themeShade="80"/>
+        </w:rPr>
+        <w:t>(</w:t>
+      </w:r>
+      <w:r>
+        <w:rPr>
+          <w:rFonts w:hint="eastAsia"/>
+          <w:b/>
+          <w:bCs/>
+          <w:color w:val="074F6A" w:themeColor="accent4" w:themeShade="80"/>
+        </w:rPr>
+        <w:t>永真</w:t>
+      </w:r>
+      <w:r>
+        <w:rPr>
+          <w:rFonts w:hint="eastAsia"/>
+          <w:b/>
+          <w:bCs/>
+          <w:color w:val="074F6A" w:themeColor="accent4" w:themeShade="80"/>
+        </w:rPr>
+        <w:t>式</w:t>
+      </w:r>
+      <w:r>
+        <w:rPr>
+          <w:rFonts w:hint="eastAsia"/>
+          <w:b/>
+          <w:bCs/>
+          <w:color w:val="074F6A" w:themeColor="accent4" w:themeShade="80"/>
+        </w:rPr>
+        <w:t>)</w:t>
+      </w:r>
+      <w:r>
+        <w:rPr>
+          <w:rFonts w:hint="eastAsia"/>
+          <w:b/>
+          <w:bCs/>
+          <w:color w:val="074F6A" w:themeColor="accent4" w:themeShade="80"/>
+        </w:rPr>
+        <w:t>.</w:t>
+      </w:r>
+    </w:p>
+    <w:p>
+      <w:pPr>
+        <w:ind w:firstLineChars="200" w:firstLine="420"/>
+        <w:jc w:val="center"/>
+        <w:rPr>
+          <w:b/>
+          <w:bCs/>
+          <w:color w:val="074F6A" w:themeColor="accent4" w:themeShade="80"/>
+        </w:rPr>
+      </w:pPr>
+      <w:r>
+        <w:rPr>
+          <w:b/>
+          <w:bCs/>
+          <w:color w:val="074F6A" w:themeColor="accent4" w:themeShade="80"/>
+        </w:rPr>
+        <w:drawing>
+          <wp:inline distT="0" distB="0" distL="0" distR="0" wp14:anchorId="2C50FFA9" wp14:editId="6B91979A">
+            <wp:extent cx="4352760" cy="943227"/>
+            <wp:effectExtent l="0" t="0" r="0" b="9525"/>
+            <wp:docPr id="1063544715" name="图片 1"/>
+            <wp:cNvGraphicFramePr>
+              <a:graphicFrameLocks xmlns:a="http://schemas.openxmlformats.org/drawingml/2006/main" noChangeAspect="1"/>
+            </wp:cNvGraphicFramePr>
+            <a:graphic xmlns:a="http://schemas.openxmlformats.org/drawingml/2006/main">
+              <a:graphicData uri="http://schemas.openxmlformats.org/drawingml/2006/picture">
+                <pic:pic xmlns:pic="http://schemas.openxmlformats.org/drawingml/2006/picture">
+                  <pic:nvPicPr>
+                    <pic:cNvPr id="1063544715" name=""/>
+                    <pic:cNvPicPr/>
+                  </pic:nvPicPr>
+                  <pic:blipFill>
+                    <a:blip r:embed="rId28"/>
+                    <a:stretch>
+                      <a:fillRect/>
+                    </a:stretch>
+                  </pic:blipFill>
+                  <pic:spPr>
+                    <a:xfrm>
+                      <a:off x="0" y="0"/>
+                      <a:ext cx="4371815" cy="947356"/>
+                    </a:xfrm>
+                    <a:prstGeom prst="rect">
+                      <a:avLst/>
+                    </a:prstGeom>
+                  </pic:spPr>
+                </pic:pic>
+              </a:graphicData>
+            </a:graphic>
+          </wp:inline>
+        </w:drawing>
+      </w:r>
+    </w:p>
+    <w:tbl>
+      <w:tblPr>
+        <w:tblStyle w:val="af1"/>
+        <w:tblW w:w="0" w:type="auto"/>
+        <w:tblBorders>
+          <w:top w:val="none" w:sz="0" w:space="0" w:color="auto"/>
+          <w:left w:val="none" w:sz="0" w:space="0" w:color="auto"/>
+          <w:bottom w:val="none" w:sz="0" w:space="0" w:color="auto"/>
+          <w:right w:val="none" w:sz="0" w:space="0" w:color="auto"/>
+          <w:insideH w:val="none" w:sz="0" w:space="0" w:color="auto"/>
+          <w:insideV w:val="none" w:sz="0" w:space="0" w:color="auto"/>
+        </w:tblBorders>
+        <w:tblLook w:val="04A0" w:firstRow="1" w:lastRow="0" w:firstColumn="1" w:lastColumn="0" w:noHBand="0" w:noVBand="1"/>
+      </w:tblPr>
+      <w:tblGrid>
+        <w:gridCol w:w="3485"/>
+        <w:gridCol w:w="3485"/>
+        <w:gridCol w:w="3486"/>
+      </w:tblGrid>
+      <w:tr>
+        <w:tc>
+          <w:tcPr>
+            <w:tcW w:w="3485" w:type="dxa"/>
+            <w:tcBorders>
+              <w:bottom w:val="single" w:sz="4" w:space="0" w:color="auto"/>
+            </w:tcBorders>
+          </w:tcPr>
+          <w:p>
+            <w:pPr>
+              <w:jc w:val="center"/>
+              <w:rPr>
+                <w:b/>
+                <w:bCs/>
+                <w:color w:val="074F6A" w:themeColor="accent4" w:themeShade="80"/>
+              </w:rPr>
+            </w:pPr>
+            <w:r>
+              <w:rPr>
+                <w:rFonts w:hint="eastAsia"/>
+                <w:b/>
+                <w:bCs/>
+              </w:rPr>
+              <w:t>真值表</w:t>
+            </w:r>
+          </w:p>
+        </w:tc>
+        <w:tc>
+          <w:tcPr>
+            <w:tcW w:w="3485" w:type="dxa"/>
+            <w:tcBorders>
+              <w:bottom w:val="single" w:sz="4" w:space="0" w:color="auto"/>
+            </w:tcBorders>
+          </w:tcPr>
+          <w:p>
+            <w:pPr>
+              <w:jc w:val="center"/>
+              <w:rPr>
+                <w:b/>
+                <w:bCs/>
+                <w:color w:val="074F6A" w:themeColor="accent4" w:themeShade="80"/>
+              </w:rPr>
+            </w:pPr>
+            <w:r>
+              <w:rPr>
+                <w:rFonts w:hint="eastAsia"/>
+                <w:b/>
+                <w:bCs/>
+              </w:rPr>
+              <w:t>判定</w:t>
+            </w:r>
+          </w:p>
+        </w:tc>
+        <w:tc>
+          <w:tcPr>
+            <w:tcW w:w="3486" w:type="dxa"/>
+            <w:tcBorders>
+              <w:bottom w:val="single" w:sz="4" w:space="0" w:color="auto"/>
+            </w:tcBorders>
+          </w:tcPr>
+          <w:p>
+            <w:pPr>
+              <w:jc w:val="center"/>
+              <w:rPr>
+                <w:b/>
+                <w:bCs/>
+                <w:color w:val="074F6A" w:themeColor="accent4" w:themeShade="80"/>
+              </w:rPr>
+            </w:pPr>
+            <w:r>
+              <w:rPr>
+                <w:rFonts w:hint="eastAsia"/>
+                <w:b/>
+                <w:bCs/>
+              </w:rPr>
+              <w:t>值</w:t>
+            </w:r>
+          </w:p>
+        </w:tc>
+      </w:tr>
+      <w:tr>
+        <w:tc>
+          <w:tcPr>
+            <w:tcW w:w="3485" w:type="dxa"/>
+            <w:tcBorders>
+              <w:top w:val="single" w:sz="4" w:space="0" w:color="auto"/>
+            </w:tcBorders>
+          </w:tcPr>
+          <w:p>
+            <w:pPr>
+              <w:jc w:val="left"/>
+              <w:rPr>
+                <w:rFonts w:hint="eastAsia"/>
+                <w:b/>
+                <w:bCs/>
+              </w:rPr>
+            </w:pPr>
+            <w:r>
+              <w:rPr>
+                <w:rFonts w:hint="eastAsia"/>
+                <w:b/>
+                <w:bCs/>
+              </w:rPr>
+              <w:t>A Is ture  in at least one row</w:t>
+            </w:r>
+          </w:p>
+        </w:tc>
+        <w:tc>
+          <w:tcPr>
+            <w:tcW w:w="3485" w:type="dxa"/>
+            <w:tcBorders>
+              <w:top w:val="single" w:sz="4" w:space="0" w:color="auto"/>
+            </w:tcBorders>
+          </w:tcPr>
+          <w:p>
+            <w:pPr>
+              <w:jc w:val="center"/>
+              <w:rPr>
+                <w:b/>
+                <w:bCs/>
+              </w:rPr>
+            </w:pPr>
+            <w:r>
+              <w:rPr>
+                <w:rFonts w:hint="eastAsia"/>
+                <w:b/>
+                <w:bCs/>
+              </w:rPr>
+              <w:t>satisfiable</w:t>
+            </w:r>
+          </w:p>
+        </w:tc>
+        <w:tc>
+          <w:tcPr>
+            <w:tcW w:w="3486" w:type="dxa"/>
+            <w:tcBorders>
+              <w:top w:val="single" w:sz="4" w:space="0" w:color="auto"/>
+            </w:tcBorders>
+          </w:tcPr>
+          <w:p>
+            <w:pPr>
+              <w:jc w:val="center"/>
+              <w:rPr>
+                <w:b/>
+                <w:bCs/>
+              </w:rPr>
+            </w:pPr>
+            <w:r>
+              <w:rPr>
+                <w:rFonts w:hint="eastAsia"/>
+                <w:b/>
+                <w:bCs/>
+              </w:rPr>
+              <w:t>A</w:t>
+            </w:r>
+          </w:p>
+        </w:tc>
+      </w:tr>
+      <w:tr>
+        <w:tc>
+          <w:tcPr>
+            <w:tcW w:w="3485" w:type="dxa"/>
+          </w:tcPr>
+          <w:p>
+            <w:pPr>
+              <w:jc w:val="left"/>
+              <w:rPr>
+                <w:b/>
+                <w:bCs/>
+              </w:rPr>
+            </w:pPr>
+            <w:r>
+              <w:rPr>
+                <w:rFonts w:hint="eastAsia"/>
+                <w:b/>
+                <w:bCs/>
+              </w:rPr>
+              <w:t>A Is flase in every row</w:t>
+            </w:r>
+          </w:p>
+        </w:tc>
+        <w:tc>
+          <w:tcPr>
+            <w:tcW w:w="3485" w:type="dxa"/>
+          </w:tcPr>
+          <w:p>
+            <w:pPr>
+              <w:jc w:val="center"/>
+              <w:rPr>
+                <w:b/>
+                <w:bCs/>
+              </w:rPr>
+            </w:pPr>
+            <w:r>
+              <w:rPr>
+                <w:rFonts w:hint="eastAsia"/>
+                <w:b/>
+                <w:bCs/>
+              </w:rPr>
+              <w:t>unsatisfiable</w:t>
+            </w:r>
+          </w:p>
+        </w:tc>
+        <w:tc>
+          <w:tcPr>
+            <w:tcW w:w="3486" w:type="dxa"/>
+          </w:tcPr>
+          <w:p>
+            <w:pPr>
+              <w:jc w:val="center"/>
+              <w:rPr>
+                <w:b/>
+                <w:bCs/>
+              </w:rPr>
+            </w:pPr>
+            <w:r>
+              <w:rPr>
+                <w:rFonts w:hint="eastAsia"/>
+                <w:b/>
+                <w:bCs/>
+              </w:rPr>
+              <w:t>B</w:t>
+            </w:r>
+          </w:p>
+        </w:tc>
+      </w:tr>
+      <w:tr>
+        <w:tc>
+          <w:tcPr>
+            <w:tcW w:w="3485" w:type="dxa"/>
+          </w:tcPr>
+          <w:p>
+            <w:pPr>
+              <w:jc w:val="left"/>
+              <w:rPr>
+                <w:b/>
+                <w:bCs/>
+              </w:rPr>
+            </w:pPr>
+            <w:r>
+              <w:rPr>
+                <w:rFonts w:hint="eastAsia"/>
+                <w:b/>
+                <w:bCs/>
+              </w:rPr>
+              <w:t>A Is true</w:t>
+            </w:r>
+            <w:r>
+              <w:rPr>
+                <w:rFonts w:hint="eastAsia"/>
+                <w:b/>
+                <w:bCs/>
+              </w:rPr>
+              <w:t xml:space="preserve"> </w:t>
+            </w:r>
+            <w:r>
+              <w:rPr>
+                <w:rFonts w:hint="eastAsia"/>
+                <w:b/>
+                <w:bCs/>
+              </w:rPr>
+              <w:t xml:space="preserve"> in every row</w:t>
+            </w:r>
+          </w:p>
+        </w:tc>
+        <w:tc>
+          <w:tcPr>
+            <w:tcW w:w="3485" w:type="dxa"/>
+          </w:tcPr>
+          <w:p>
+            <w:pPr>
+              <w:jc w:val="center"/>
+              <w:rPr>
+                <w:rFonts w:hint="eastAsia"/>
+                <w:b/>
+                <w:bCs/>
+              </w:rPr>
+            </w:pPr>
+            <w:r>
+              <w:rPr>
+                <w:rFonts w:hint="eastAsia"/>
+                <w:b/>
+                <w:bCs/>
+              </w:rPr>
+              <w:t>s</w:t>
+            </w:r>
+            <w:r>
+              <w:rPr>
+                <w:rFonts w:hint="eastAsia"/>
+                <w:b/>
+                <w:bCs/>
+              </w:rPr>
+              <w:t>atisfiable</w:t>
+            </w:r>
+            <w:r>
+              <w:rPr>
+                <w:rFonts w:hint="eastAsia"/>
+                <w:b/>
+                <w:bCs/>
+              </w:rPr>
+              <w:t xml:space="preserve"> </w:t>
+            </w:r>
+            <w:r>
+              <w:rPr>
+                <w:rFonts w:hint="eastAsia"/>
+                <w:b/>
+                <w:bCs/>
+              </w:rPr>
+              <w:t>/</w:t>
+            </w:r>
+            <w:r>
+              <w:rPr>
+                <w:b/>
+                <w:bCs/>
+              </w:rPr>
+              <w:t xml:space="preserve"> </w:t>
+            </w:r>
+            <w:r>
+              <w:rPr>
+                <w:b/>
+                <w:bCs/>
+              </w:rPr>
+              <w:t>tautology</w:t>
+            </w:r>
+          </w:p>
+        </w:tc>
+        <w:tc>
+          <w:tcPr>
+            <w:tcW w:w="3486" w:type="dxa"/>
+          </w:tcPr>
+          <w:p>
+            <w:pPr>
+              <w:jc w:val="center"/>
+              <w:rPr>
+                <w:b/>
+                <w:bCs/>
+              </w:rPr>
+            </w:pPr>
+            <w:r>
+              <w:rPr>
+                <w:rFonts w:hint="eastAsia"/>
+                <w:b/>
+                <w:bCs/>
+              </w:rPr>
+              <w:t>C</w:t>
+            </w:r>
+          </w:p>
+        </w:tc>
+      </w:tr>
+      <w:tr>
+        <w:tc>
+          <w:tcPr>
+            <w:tcW w:w="3485" w:type="dxa"/>
+          </w:tcPr>
+          <w:p>
+            <w:pPr>
+              <w:jc w:val="left"/>
+              <w:rPr>
+                <w:rFonts w:hint="eastAsia"/>
+                <w:b/>
+                <w:bCs/>
+              </w:rPr>
+            </w:pPr>
+          </w:p>
+        </w:tc>
+        <w:tc>
+          <w:tcPr>
+            <w:tcW w:w="3485" w:type="dxa"/>
+          </w:tcPr>
+          <w:p>
+            <w:pPr>
+              <w:jc w:val="center"/>
+              <w:rPr>
+                <w:rFonts w:hint="eastAsia"/>
+                <w:b/>
+                <w:bCs/>
+              </w:rPr>
+            </w:pPr>
+          </w:p>
+        </w:tc>
+        <w:tc>
+          <w:tcPr>
+            <w:tcW w:w="3486" w:type="dxa"/>
+          </w:tcPr>
+          <w:p>
+            <w:pPr>
+              <w:jc w:val="center"/>
+              <w:rPr>
+                <w:rFonts w:hint="eastAsia"/>
+                <w:b/>
+                <w:bCs/>
+              </w:rPr>
+            </w:pPr>
+          </w:p>
+        </w:tc>
+      </w:tr>
+    </w:tbl>
+    <w:p>
+      <w:r>
+        <w:rPr>
+          <w:rFonts w:hint="eastAsia"/>
+          <w:noProof/>
+        </w:rPr>
+        <w:drawing>
+          <wp:inline distT="0" distB="0" distL="0" distR="0" wp14:anchorId="58451D15" wp14:editId="46F6C182">
+            <wp:extent cx="6588103" cy="3093057"/>
+            <wp:effectExtent l="0" t="0" r="3810" b="0"/>
+            <wp:docPr id="1678091778" name="图片 3"/>
+            <wp:cNvGraphicFramePr>
+              <a:graphicFrameLocks xmlns:a="http://schemas.openxmlformats.org/drawingml/2006/main" noChangeAspect="1"/>
+            </wp:cNvGraphicFramePr>
+            <a:graphic xmlns:a="http://schemas.openxmlformats.org/drawingml/2006/main">
+              <a:graphicData uri="http://schemas.openxmlformats.org/drawingml/2006/picture">
+                <pic:pic xmlns:pic="http://schemas.openxmlformats.org/drawingml/2006/picture">
+                  <pic:nvPicPr>
+                    <pic:cNvPr id="0" name="Picture 3"/>
+                    <pic:cNvPicPr>
+                      <a:picLocks noChangeAspect="1" noChangeArrowheads="1"/>
+                    </pic:cNvPicPr>
+                  </pic:nvPicPr>
+                  <pic:blipFill>
+                    <a:blip r:embed="rId29">
+                      <a:extLst>
+                        <a:ext uri="{28A0092B-C50C-407E-A947-70E740481C1C}">
+                          <a14:useLocalDpi xmlns:a14="http://schemas.microsoft.com/office/drawing/2010/main" val="0"/>
+                        </a:ext>
+                      </a:extLst>
+                    </a:blip>
+                    <a:srcRect/>
+                    <a:stretch>
+                      <a:fillRect/>
+                    </a:stretch>
+                  </pic:blipFill>
+                  <pic:spPr bwMode="auto">
+                    <a:xfrm>
+                      <a:off x="0" y="0"/>
+                      <a:ext cx="6635496" cy="3115307"/>
+                    </a:xfrm>
+                    <a:prstGeom prst="rect">
+                      <a:avLst/>
+                    </a:prstGeom>
+                    <a:noFill/>
+                    <a:ln>
+                      <a:noFill/>
+                    </a:ln>
+                  </pic:spPr>
+                </pic:pic>
+              </a:graphicData>
+            </a:graphic>
+          </wp:inline>
+        </w:drawing>
+      </w:r>
+    </w:p>
+    <w:p>
+      <w:r>
+        <w:rPr>
+          <w:rFonts w:hint="eastAsia"/>
+          <w:noProof/>
+        </w:rPr>
+        <w:lastRenderedPageBreak/>
+        <w:drawing>
+          <wp:inline distT="0" distB="0" distL="0" distR="0" wp14:anchorId="441BCF7D" wp14:editId="2CC7B0FB">
+            <wp:extent cx="5915770" cy="2925636"/>
+            <wp:effectExtent l="0" t="0" r="8890" b="8255"/>
+            <wp:docPr id="1277920051" name="图片 4"/>
+            <wp:cNvGraphicFramePr>
+              <a:graphicFrameLocks xmlns:a="http://schemas.openxmlformats.org/drawingml/2006/main" noChangeAspect="1"/>
+            </wp:cNvGraphicFramePr>
+            <a:graphic xmlns:a="http://schemas.openxmlformats.org/drawingml/2006/main">
+              <a:graphicData uri="http://schemas.openxmlformats.org/drawingml/2006/picture">
+                <pic:pic xmlns:pic="http://schemas.openxmlformats.org/drawingml/2006/picture">
+                  <pic:nvPicPr>
+                    <pic:cNvPr id="0" name="Picture 4"/>
+                    <pic:cNvPicPr>
+                      <a:picLocks noChangeAspect="1" noChangeArrowheads="1"/>
+                    </pic:cNvPicPr>
+                  </pic:nvPicPr>
+                  <pic:blipFill>
+                    <a:blip r:embed="rId30">
+                      <a:extLst>
+                        <a:ext uri="{28A0092B-C50C-407E-A947-70E740481C1C}">
+                          <a14:useLocalDpi xmlns:a14="http://schemas.microsoft.com/office/drawing/2010/main" val="0"/>
+                        </a:ext>
+                      </a:extLst>
+                    </a:blip>
+                    <a:srcRect/>
+                    <a:stretch>
+                      <a:fillRect/>
+                    </a:stretch>
+                  </pic:blipFill>
+                  <pic:spPr bwMode="auto">
+                    <a:xfrm>
+                      <a:off x="0" y="0"/>
+                      <a:ext cx="5924083" cy="2929747"/>
+                    </a:xfrm>
+                    <a:prstGeom prst="rect">
+                      <a:avLst/>
+                    </a:prstGeom>
+                    <a:noFill/>
+                    <a:ln>
+                      <a:noFill/>
+                    </a:ln>
+                  </pic:spPr>
+                </pic:pic>
+              </a:graphicData>
+            </a:graphic>
+          </wp:inline>
+        </w:drawing>
+      </w:r>
+    </w:p>
+    <w:p>
+      <w:pPr>
+        <w:rPr>
+          <w:rFonts w:hint="eastAsia"/>
+        </w:rPr>
+      </w:pPr>
+    </w:p>
+    <w:p>
+      <w:r>
+        <w:drawing>
+          <wp:inline distT="0" distB="0" distL="0" distR="0" wp14:anchorId="2A057148" wp14:editId="608DAF70">
+            <wp:extent cx="6645910" cy="1116965"/>
+            <wp:effectExtent l="0" t="0" r="2540" b="6985"/>
+            <wp:docPr id="1868890542" name="图片 1"/>
+            <wp:cNvGraphicFramePr>
+              <a:graphicFrameLocks xmlns:a="http://schemas.openxmlformats.org/drawingml/2006/main" noChangeAspect="1"/>
+            </wp:cNvGraphicFramePr>
+            <a:graphic xmlns:a="http://schemas.openxmlformats.org/drawingml/2006/main">
+              <a:graphicData uri="http://schemas.openxmlformats.org/drawingml/2006/picture">
+                <pic:pic xmlns:pic="http://schemas.openxmlformats.org/drawingml/2006/picture">
+                  <pic:nvPicPr>
+                    <pic:cNvPr id="1868890542" name=""/>
+                    <pic:cNvPicPr/>
+                  </pic:nvPicPr>
+                  <pic:blipFill>
+                    <a:blip r:embed="rId31"/>
+                    <a:stretch>
+                      <a:fillRect/>
+                    </a:stretch>
+                  </pic:blipFill>
+                  <pic:spPr>
+                    <a:xfrm>
+                      <a:off x="0" y="0"/>
+                      <a:ext cx="6645910" cy="1116965"/>
+                    </a:xfrm>
+                    <a:prstGeom prst="rect">
+                      <a:avLst/>
+                    </a:prstGeom>
+                  </pic:spPr>
+                </pic:pic>
+              </a:graphicData>
+            </a:graphic>
+          </wp:inline>
+        </w:drawing>
+      </w:r>
+    </w:p>
+    <w:p>
+      <w:pPr>
+        <w:rPr>
+          <w:rFonts w:hint="eastAsia"/>
+        </w:rPr>
+      </w:pPr>
+    </w:p>
+    <w:p>
+      <w:r>
+        <w:rPr>
+          <w:rFonts w:hint="eastAsia"/>
+          <w:noProof/>
+        </w:rPr>
+        <w:drawing>
+          <wp:inline distT="0" distB="0" distL="0" distR="0" wp14:anchorId="3881706B" wp14:editId="647BB615">
+            <wp:extent cx="6901732" cy="3586841"/>
+            <wp:effectExtent l="0" t="0" r="0" b="0"/>
+            <wp:docPr id="2098073335" name="图片 7"/>
+            <wp:cNvGraphicFramePr>
+              <a:graphicFrameLocks xmlns:a="http://schemas.openxmlformats.org/drawingml/2006/main" noChangeAspect="1"/>
+            </wp:cNvGraphicFramePr>
+            <a:graphic xmlns:a="http://schemas.openxmlformats.org/drawingml/2006/main">
+              <a:graphicData uri="http://schemas.openxmlformats.org/drawingml/2006/picture">
+                <pic:pic xmlns:pic="http://schemas.openxmlformats.org/drawingml/2006/picture">
+                  <pic:nvPicPr>
+                    <pic:cNvPr id="0" name="Picture 7"/>
+                    <pic:cNvPicPr>
+                      <a:picLocks noChangeAspect="1" noChangeArrowheads="1"/>
+                    </pic:cNvPicPr>
+                  </pic:nvPicPr>
+                  <pic:blipFill>
+                    <a:blip r:embed="rId32">
+                      <a:extLst>
+                        <a:ext uri="{28A0092B-C50C-407E-A947-70E740481C1C}">
+                          <a14:useLocalDpi xmlns:a14="http://schemas.microsoft.com/office/drawing/2010/main" val="0"/>
+                        </a:ext>
+                      </a:extLst>
+                    </a:blip>
+                    <a:srcRect/>
+                    <a:stretch>
+                      <a:fillRect/>
+                    </a:stretch>
+                  </pic:blipFill>
+                  <pic:spPr bwMode="auto">
+                    <a:xfrm>
+                      <a:off x="0" y="0"/>
+                      <a:ext cx="6906674" cy="3589409"/>
+                    </a:xfrm>
+                    <a:prstGeom prst="rect">
+                      <a:avLst/>
+                    </a:prstGeom>
+                    <a:noFill/>
+                    <a:ln>
+                      <a:noFill/>
+                    </a:ln>
+                  </pic:spPr>
+                </pic:pic>
+              </a:graphicData>
+            </a:graphic>
+          </wp:inline>
+        </w:drawing>
+      </w:r>
+    </w:p>
+    <w:p>
+      <w:pPr>
+        <w:rPr>
+          <w:rFonts w:hint="eastAsia"/>
+        </w:rPr>
+      </w:pPr>
+    </w:p>
+    <w:p>
+      <w:pPr>
+        <w:rPr>
+          <w:rFonts w:hint="eastAsia"/>
+        </w:rPr>
+      </w:pPr>
+      <w:r>
+        <w:drawing>
+          <wp:inline distT="0" distB="0" distL="0" distR="0" wp14:anchorId="2D96F058" wp14:editId="788D3859">
+            <wp:extent cx="6337189" cy="1111702"/>
+            <wp:effectExtent l="0" t="0" r="6985" b="0"/>
+            <wp:docPr id="633740487" name="图片 1"/>
+            <wp:cNvGraphicFramePr>
+              <a:graphicFrameLocks xmlns:a="http://schemas.openxmlformats.org/drawingml/2006/main" noChangeAspect="1"/>
+            </wp:cNvGraphicFramePr>
+            <a:graphic xmlns:a="http://schemas.openxmlformats.org/drawingml/2006/main">
+              <a:graphicData uri="http://schemas.openxmlformats.org/drawingml/2006/picture">
+                <pic:pic xmlns:pic="http://schemas.openxmlformats.org/drawingml/2006/picture">
+                  <pic:nvPicPr>
+                    <pic:cNvPr id="633740487" name=""/>
+                    <pic:cNvPicPr/>
+                  </pic:nvPicPr>
+                  <pic:blipFill>
+                    <a:blip r:embed="rId33"/>
+                    <a:stretch>
+                      <a:fillRect/>
+                    </a:stretch>
+                  </pic:blipFill>
+                  <pic:spPr>
+                    <a:xfrm>
+                      <a:off x="0" y="0"/>
+                      <a:ext cx="6380735" cy="1119341"/>
+                    </a:xfrm>
+                    <a:prstGeom prst="rect">
+                      <a:avLst/>
+                    </a:prstGeom>
+                  </pic:spPr>
+                </pic:pic>
+              </a:graphicData>
+            </a:graphic>
+          </wp:inline>
+        </w:drawing>
       </w:r>
     </w:p>
     <w:sectPr>
@@ -7414,7 +9281,7 @@
   <w:abstractNum w:abstractNumId="7" w15:restartNumberingAfterBreak="0">
     <w:nsid w:val="7E991A8B"/>
     <w:multiLevelType w:val="hybridMultilevel"/>
-    <w:tmpl w:val="F0684E7C"/>
+    <w:tmpl w:val="C922B06A"/>
     <w:lvl w:ilvl="0" w:tplc="04090001">
       <w:start w:val="1"/>
       <w:numFmt w:val="bullet"/>
@@ -8516,6 +10383,27 @@
       </w:tblBorders>
     </w:tblPr>
   </w:style>
+  <w:style w:type="paragraph" w:styleId="af2">
+    <w:name w:val="Date"/>
+    <w:basedOn w:val="a"/>
+    <w:next w:val="a"/>
+    <w:link w:val="af3"/>
+    <w:uiPriority w:val="99"/>
+    <w:semiHidden/>
+    <w:unhideWhenUsed/>
+    <w:rsid w:val="00714632"/>
+    <w:pPr>
+      <w:ind w:leftChars="2500" w:left="100"/>
+    </w:pPr>
+  </w:style>
+  <w:style w:type="character" w:customStyle="1" w:styleId="af3">
+    <w:name w:val="日期 字符"/>
+    <w:basedOn w:val="a0"/>
+    <w:link w:val="af2"/>
+    <w:uiPriority w:val="99"/>
+    <w:semiHidden/>
+    <w:rsid w:val="00714632"/>
+  </w:style>
 </w:styles>
 </file>
 

</xml_diff>

<commit_message>
add tracking table of augmenting path
</commit_message>
<xml_diff>
--- a/26fall/1870/Note/w1s1.docx
+++ b/26fall/1870/Note/w1s1.docx
@@ -6216,7 +6216,18 @@
         </w:rPr>
       </w:pPr>
       <w:r>
-        <w:t>我们从列表 L 设为 [x4, x6] 开始。在第 5 行，我们进入 while 循环，并选择 a 为 x4。我们在第 9 行到第 24 行之间重复执行 for 循环三次，b 分别取 y1、y3 和 y5。该循环结束时，列表 L 为 [x6, y1, y3, y5]。在下一次 while 循环中，</w:t>
+        <w:t xml:space="preserve">我们从列表 L 设为 [x4, x6] 开始。在第 5 行，我们进入 while 循环，并选择 a 为 x4。我们在第 9 行到第 24 行之间重复执行 for 循环三次，b 分别取 y1、y3 和 y5。该循环结束时，列表 </w:t>
+      </w:r>
+      <w:r>
+        <w:rPr>
+          <w:b/>
+          <w:bCs/>
+          <w:color w:val="EE0000"/>
+        </w:rPr>
+        <w:t>L 为 [x6, y1, y3, y5]</w:t>
+      </w:r>
+      <w:r>
+        <w:t>。在下一次 while 循环中，</w:t>
       </w:r>
       <w:r>
         <w:rPr>
@@ -6226,7 +6237,18 @@
         <w:t>a 被设为 x6。但是通过不在 M 中的边与 x6 相连的邻点是 y3 和 y5，这两个顶点在上一个 while 循环中均已被访问，所以 x6 没有未访问的邻点。因此我们以 a = x6 完成了这一轮 while 循环</w:t>
       </w:r>
       <w:r>
-        <w:t>。此时 L 为 [y1, y3, y5]。我们</w:t>
+        <w:t xml:space="preserve">。此时 L 为 </w:t>
+      </w:r>
+      <w:r>
+        <w:rPr>
+          <w:b/>
+          <w:bCs/>
+          <w:color w:val="EE0000"/>
+        </w:rPr>
+        <w:t>[y1, y3, y5]</w:t>
+      </w:r>
+      <w:r>
+        <w:t>。我们</w:t>
       </w:r>
       <w:r>
         <w:rPr>
@@ -6246,7 +6268,25 @@
         <w:t>通过 M 中的一条边与 y1 相连的顶点是 x1</w:t>
       </w:r>
       <w:r>
-        <w:t>。我们将 x1 标记为已访问，设置 pred(x1) = y1，然后将 x1 添加到 L 的末尾。列表现在为 [y3, y5, x1]。在下一次 while 循环中，</w:t>
+        <w:t>。我们将 x1 标记为已访问，设置 pred(x1) = y1，然后将 x1 添加到 L 的末尾。列表现在为</w:t>
+      </w:r>
+      <w:r>
+        <w:rPr>
+          <w:b/>
+          <w:bCs/>
+        </w:rPr>
+        <w:t xml:space="preserve"> </w:t>
+      </w:r>
+      <w:r>
+        <w:rPr>
+          <w:b/>
+          <w:bCs/>
+          <w:color w:val="EE0000"/>
+        </w:rPr>
+        <w:t>[y3, y5, x1]</w:t>
+      </w:r>
+      <w:r>
+        <w:t>。在下一次 while 循环中，</w:t>
       </w:r>
       <w:r>
         <w:rPr>
@@ -6266,7 +6306,18 @@
         <w:t>a 设为 y5，我们将 x3 加入 L</w:t>
       </w:r>
       <w:r>
-        <w:t>。此时 L 为 [x1, x2, x3]。</w:t>
+        <w:t>。此时 L 为</w:t>
+      </w:r>
+      <w:r>
+        <w:rPr>
+          <w:b/>
+          <w:bCs/>
+          <w:color w:val="EE0000"/>
+        </w:rPr>
+        <w:t xml:space="preserve"> [x1, x2, x3]</w:t>
+      </w:r>
+      <w:r>
+        <w:t>。</w:t>
       </w:r>
       <w:r>
         <w:rPr>
@@ -6276,7 +6327,18 @@
         <w:t>接下来我们以 a = x1 进入 while 循环，将 b 设为 y2</w:t>
       </w:r>
       <w:r>
-        <w:t>，并将 y2 添加到 L 的末尾。现在 L 为 [x2, x3, y2]。在下一次 while 循环中，</w:t>
+        <w:t>，并将 y2 添加到 L 的末尾。现在 L 为</w:t>
+      </w:r>
+      <w:r>
+        <w:rPr>
+          <w:b/>
+          <w:bCs/>
+          <w:color w:val="EE0000"/>
+        </w:rPr>
+        <w:t xml:space="preserve"> [x2, x3, y2]</w:t>
+      </w:r>
+      <w:r>
+        <w:t>。在下一次 while 循环中，</w:t>
       </w:r>
       <w:r>
         <w:rPr>
@@ -6286,7 +6348,18 @@
         <w:t>a 设为 x2。由于 x2 没有未访问的邻点，我们不进入 for 循环</w:t>
       </w:r>
       <w:r>
-        <w:t>。此时 L 为 [x3, y2]。现在我们</w:t>
+        <w:t>。此时 L 为</w:t>
+      </w:r>
+      <w:r>
+        <w:rPr>
+          <w:b/>
+          <w:bCs/>
+          <w:color w:val="EE0000"/>
+        </w:rPr>
+        <w:t xml:space="preserve"> [x3, y2]</w:t>
+      </w:r>
+      <w:r>
+        <w:t>。现在我们</w:t>
       </w:r>
       <w:r>
         <w:rPr>
@@ -6296,7 +6369,34 @@
         <w:t>将 a 设为 x3，x3 的所有邻点均已被访问，所以我们不进入 for 循环</w:t>
       </w:r>
       <w:r>
-        <w:t>。现在 L 中只剩一个元素：y2。</w:t>
+        <w:t>。现在 L 中只剩一个元素：</w:t>
+      </w:r>
+      <w:r>
+        <w:rPr>
+          <w:rFonts w:hint="eastAsia"/>
+          <w:color w:val="EE0000"/>
+        </w:rPr>
+        <w:t>【</w:t>
+      </w:r>
+      <w:r>
+        <w:rPr>
+          <w:b/>
+          <w:bCs/>
+          <w:color w:val="EE0000"/>
+        </w:rPr>
+        <w:t>y2</w:t>
+      </w:r>
+      <w:r>
+        <w:rPr>
+          <w:rFonts w:hint="eastAsia"/>
+          <w:b/>
+          <w:bCs/>
+          <w:color w:val="EE0000"/>
+        </w:rPr>
+        <w:t>】</w:t>
+      </w:r>
+      <w:r>
+        <w:t>。</w:t>
       </w:r>
       <w:r>
         <w:rPr>
@@ -6306,7 +6406,34 @@
         <w:t>我们将 a 设为 y2。通过 M 中的一条边与 y2 相连的顶点是 x5</w:t>
       </w:r>
       <w:r>
-        <w:t>，因此我们把它加入 L。现在 L 只含有单个顶点 x5。在 while 循环中，</w:t>
+        <w:t xml:space="preserve">，因此我们把它加入 L。现在 L 只含有单个顶点 </w:t>
+      </w:r>
+      <w:r>
+        <w:rPr>
+          <w:rFonts w:hint="eastAsia"/>
+          <w:color w:val="EE0000"/>
+        </w:rPr>
+        <w:t>【</w:t>
+      </w:r>
+      <w:r>
+        <w:rPr>
+          <w:b/>
+          <w:bCs/>
+          <w:color w:val="EE0000"/>
+        </w:rPr>
+        <w:t>x5</w:t>
+      </w:r>
+      <w:r>
+        <w:rPr>
+          <w:rFonts w:hint="eastAsia"/>
+          <w:b/>
+          <w:bCs/>
+          <w:color w:val="EE0000"/>
+        </w:rPr>
+        <w:t>】</w:t>
+      </w:r>
+      <w:r>
+        <w:t>。在 while 循环中，</w:t>
       </w:r>
       <w:r>
         <w:rPr>
@@ -6316,7 +6443,18 @@
         <w:t>a 设为 x5。x5 唯一的未访问邻点是 y4，所以我们设 b 为 y4</w:t>
       </w:r>
       <w:r>
-        <w:t>。我们将 y4 标记为已访问，并设置 pred(y4) = x5。由于 y4 未被 M 匹配，我们执行第 14 行的指令。接下来将通过执行第 17 行的 while 循环来重构增广路径 P。当算法终止时，增广路径 P 将等于 [x4, y1, x1, y2, x5, y4]。</w:t>
+        <w:t>。我们将 y4 标记为已访问，并设置 pred(y4) = x5。由于 y4 未被 M 匹配，我们执行第 14 行的指令。接下来将通过执行第 17 行的 while 循环来重构增广路径 P。当算法终止时，增广路径 P 将等于</w:t>
+      </w:r>
+      <w:r>
+        <w:rPr>
+          <w:b/>
+          <w:bCs/>
+          <w:color w:val="EE0000"/>
+        </w:rPr>
+        <w:t xml:space="preserve"> [x4, y1, x1, y2, x5, y4]</w:t>
+      </w:r>
+      <w:r>
+        <w:t>。</w:t>
       </w:r>
     </w:p>
     <w:p>

</xml_diff>

<commit_message>
add w12s1_collection.md in 1850
</commit_message>
<xml_diff>
--- a/26fall/1870/Note/w1s1.docx
+++ b/26fall/1870/Note/w1s1.docx
@@ -6474,7 +6474,18 @@
       </w:pPr>
       <w:r>
         <w:lastRenderedPageBreak/>
-        <w:t>我们通过翻转 P 中各条边的状态来扩大匹配。边 x4y1 被加入匹配，而 x1y1 被移出匹配；接着 x1y2 被加入匹配，x5y2 被移出匹配。继续这样操作，我们最终得到的匹配是：x4y1、x1y2、x5y4、x2y3、x3y5。这就是图 11 所示的匹配。</w:t>
+        <w:t>我们通过翻转 P 中各条边的状态来扩大匹配。边 x4y1 被加入匹配，而 x1y1 被移出匹配；接着 x1y2 被加入匹配，x5y2 被移出匹配。继续这样操作，我们最终得到的匹配是：</w:t>
+      </w:r>
+      <w:r>
+        <w:rPr>
+          <w:b/>
+          <w:bCs/>
+          <w:color w:val="EE0000"/>
+        </w:rPr>
+        <w:t>x4y1、x1y2、x5y4、x2y3、x3y5</w:t>
+      </w:r>
+      <w:r>
+        <w:t>。这就是图 11 所示的匹配。</w:t>
       </w:r>
     </w:p>
     <w:tbl>

</xml_diff>

<commit_message>
add proof in 1870
</commit_message>
<xml_diff>
--- a/26fall/1870/Note/w1s1.docx
+++ b/26fall/1870/Note/w1s1.docx
@@ -14409,6 +14409,8 @@
     </w:p>
     <w:p>
       <w:pPr>
+        <w:widowControl/>
+        <w:jc w:val="left"/>
         <w:rPr>
           <w:rFonts w:ascii="Cambria Math" w:hAnsi="Cambria Math" w:cs="Cambria Math"/>
           <w:color w:val="0F4761" w:themeColor="accent1" w:themeShade="BF"/>
@@ -14416,6 +14418,15 @@
           <w:szCs w:val="24"/>
         </w:rPr>
       </w:pPr>
+      <w:r>
+        <w:rPr>
+          <w:rFonts w:ascii="Cambria Math" w:hAnsi="Cambria Math" w:cs="Cambria Math"/>
+          <w:color w:val="0F4761" w:themeColor="accent1" w:themeShade="BF"/>
+          <w:sz w:val="24"/>
+          <w:szCs w:val="24"/>
+        </w:rPr>
+        <w:br w:type="page"/>
+      </w:r>
     </w:p>
     <w:p>
       <w:pPr>
@@ -14429,6 +14440,7 @@
         <w:rPr>
           <w:rFonts w:hint="eastAsia"/>
         </w:rPr>
+        <w:lastRenderedPageBreak/>
         <w:t>Proof（证明</w:t>
       </w:r>
       <w:r>
@@ -14733,6 +14745,7 @@
         </w:drawing>
       </w:r>
     </w:p>
+    <w:p/>
     <w:p>
       <w:pPr>
         <w:pStyle w:val="5"/>
@@ -14741,8 +14754,19 @@
         <w:rPr>
           <w:rFonts w:hint="eastAsia"/>
         </w:rPr>
-        <w:lastRenderedPageBreak/>
-        <w:t xml:space="preserve">2.3.1 </w:t>
+        <w:t>2.3.</w:t>
+      </w:r>
+      <w:r>
+        <w:rPr>
+          <w:rFonts w:hint="eastAsia"/>
+        </w:rPr>
+        <w:t>2</w:t>
+      </w:r>
+      <w:r>
+        <w:rPr>
+          <w:rFonts w:hint="eastAsia"/>
+        </w:rPr>
+        <w:t xml:space="preserve"> </w:t>
       </w:r>
       <w:r>
         <w:t>Valid arguments</w:t>
@@ -15215,7 +15239,6 @@
         <w:spacing w:line="360" w:lineRule="auto"/>
         <w:jc w:val="left"/>
         <w:rPr>
-          <w:rFonts w:hint="eastAsia"/>
           <w:color w:val="074F6A" w:themeColor="accent4" w:themeShade="80"/>
         </w:rPr>
       </w:pPr>
@@ -15328,7 +15351,24 @@
         <w:rPr>
           <w:rFonts w:hint="eastAsia"/>
         </w:rPr>
-        <w:t xml:space="preserve">     </w:t>
+        <w:t xml:space="preserve">  </w:t>
+      </w:r>
+    </w:p>
+    <w:p>
+      <w:pPr>
+        <w:spacing w:line="360" w:lineRule="auto"/>
+        <w:ind w:left="720"/>
+        <w:jc w:val="left"/>
+        <w:rPr>
+          <w:rFonts w:hint="eastAsia"/>
+          <w:color w:val="074F6A" w:themeColor="accent4" w:themeShade="80"/>
+        </w:rPr>
+      </w:pPr>
+      <w:r>
+        <w:rPr>
+          <w:rFonts w:hint="eastAsia"/>
+        </w:rPr>
+        <w:t xml:space="preserve">   </w:t>
       </w:r>
     </w:p>
     <w:tbl>
@@ -15801,7 +15841,7 @@
         <w:rPr>
           <w:color w:val="074F6A" w:themeColor="accent4" w:themeShade="80"/>
         </w:rPr>
-        <w:t>premises</w:t>
+        <w:t>premise</w:t>
       </w:r>
       <w:r>
         <w:rPr>
@@ -15850,7 +15890,7 @@
         <w:rPr>
           <w:color w:val="074F6A" w:themeColor="accent4" w:themeShade="80"/>
         </w:rPr>
-        <w:t>premises</w:t>
+        <w:t>premise</w:t>
       </w:r>
       <w:r>
         <w:rPr>
@@ -15954,7 +15994,6 @@
         <w:ind w:left="720"/>
         <w:jc w:val="left"/>
         <w:rPr>
-          <w:rFonts w:hint="eastAsia"/>
           <w:color w:val="074F6A" w:themeColor="accent4" w:themeShade="80"/>
         </w:rPr>
       </w:pPr>
@@ -15998,6 +16037,2716 @@
         </w:rPr>
         <w:t>。</w:t>
       </w:r>
+    </w:p>
+    <w:p>
+      <w:pPr>
+        <w:spacing w:line="360" w:lineRule="auto"/>
+        <w:ind w:left="720"/>
+        <w:jc w:val="left"/>
+        <w:rPr>
+          <w:rFonts w:hint="eastAsia"/>
+          <w:color w:val="074F6A" w:themeColor="accent4" w:themeShade="80"/>
+        </w:rPr>
+      </w:pPr>
+    </w:p>
+    <w:p>
+      <w:pPr>
+        <w:spacing w:line="360" w:lineRule="auto"/>
+        <w:jc w:val="left"/>
+        <w:rPr>
+          <w:rFonts w:hint="eastAsia"/>
+          <w:color w:val="074F6A" w:themeColor="accent4" w:themeShade="80"/>
+        </w:rPr>
+      </w:pPr>
+      <w:r>
+        <w:rPr>
+          <w:color w:val="074F6A" w:themeColor="accent4" w:themeShade="80"/>
+        </w:rPr>
+        <w:t>we can test that an argument is valid by writing</w:t>
+      </w:r>
+      <w:r>
+        <w:rPr>
+          <w:rFonts w:hint="eastAsia"/>
+          <w:color w:val="074F6A" w:themeColor="accent4" w:themeShade="80"/>
+        </w:rPr>
+        <w:t xml:space="preserve"> </w:t>
+      </w:r>
+      <w:r>
+        <w:rPr>
+          <w:color w:val="074F6A" w:themeColor="accent4" w:themeShade="80"/>
+        </w:rPr>
+        <w:t>the truth tables</w:t>
+      </w:r>
+      <w:r>
+        <w:rPr>
+          <w:rFonts w:hint="eastAsia"/>
+          <w:color w:val="074F6A" w:themeColor="accent4" w:themeShade="80"/>
+        </w:rPr>
+        <w:t>.</w:t>
+      </w:r>
+      <w:r>
+        <w:rPr>
+          <w:rFonts w:ascii="CMSS12" w:hAnsi="CMSS12"/>
+          <w:color w:val="000000"/>
+          <w:sz w:val="24"/>
+          <w:szCs w:val="24"/>
+        </w:rPr>
+        <w:t xml:space="preserve"> </w:t>
+      </w:r>
+      <w:r>
+        <w:rPr>
+          <w:color w:val="074F6A" w:themeColor="accent4" w:themeShade="80"/>
+        </w:rPr>
+        <w:t xml:space="preserve">We check the rows where </w:t>
+      </w:r>
+      <w:r>
+        <w:rPr>
+          <w:i/>
+          <w:iCs/>
+          <w:color w:val="074F6A" w:themeColor="accent4" w:themeShade="80"/>
+        </w:rPr>
+        <w:t xml:space="preserve">all </w:t>
+      </w:r>
+      <w:r>
+        <w:rPr>
+          <w:color w:val="074F6A" w:themeColor="accent4" w:themeShade="80"/>
+        </w:rPr>
+        <w:t>the premises are true. In order</w:t>
+      </w:r>
+      <w:r>
+        <w:rPr>
+          <w:rFonts w:hint="eastAsia"/>
+          <w:color w:val="074F6A" w:themeColor="accent4" w:themeShade="80"/>
+        </w:rPr>
+        <w:t xml:space="preserve"> </w:t>
+      </w:r>
+      <w:r>
+        <w:rPr>
+          <w:color w:val="074F6A" w:themeColor="accent4" w:themeShade="80"/>
+        </w:rPr>
+        <w:t>for the argument to be valid, the conclusion must be true in</w:t>
+      </w:r>
+      <w:r>
+        <w:rPr>
+          <w:rFonts w:hint="eastAsia"/>
+          <w:color w:val="074F6A" w:themeColor="accent4" w:themeShade="80"/>
+        </w:rPr>
+        <w:t xml:space="preserve"> </w:t>
+      </w:r>
+      <w:r>
+        <w:rPr>
+          <w:i/>
+          <w:iCs/>
+          <w:color w:val="074F6A" w:themeColor="accent4" w:themeShade="80"/>
+        </w:rPr>
+        <w:t xml:space="preserve">all </w:t>
+      </w:r>
+      <w:r>
+        <w:rPr>
+          <w:color w:val="074F6A" w:themeColor="accent4" w:themeShade="80"/>
+        </w:rPr>
+        <w:t>these rows</w:t>
+      </w:r>
+      <w:r>
+        <w:rPr>
+          <w:rFonts w:hint="eastAsia"/>
+          <w:color w:val="074F6A" w:themeColor="accent4" w:themeShade="80"/>
+        </w:rPr>
+        <w:t xml:space="preserve">  </w:t>
+      </w:r>
+    </w:p>
+    <w:p>
+      <w:pPr>
+        <w:spacing w:line="360" w:lineRule="auto"/>
+        <w:jc w:val="left"/>
+        <w:rPr>
+          <w:color w:val="074F6A" w:themeColor="accent4" w:themeShade="80"/>
+        </w:rPr>
+      </w:pPr>
+      <w:r>
+        <w:rPr>
+          <w:rFonts w:hint="eastAsia"/>
+          <w:color w:val="074F6A" w:themeColor="accent4" w:themeShade="80"/>
+        </w:rPr>
+        <w:t>我们可以通过写真值表来测试一个</w:t>
+      </w:r>
+      <w:r>
+        <w:rPr>
+          <w:rFonts w:hint="eastAsia"/>
+          <w:color w:val="074F6A" w:themeColor="accent4" w:themeShade="80"/>
+        </w:rPr>
+        <w:t>Argument is  valid(有效论证)</w:t>
+      </w:r>
+      <w:r>
+        <w:rPr>
+          <w:rFonts w:hint="eastAsia"/>
+          <w:color w:val="074F6A" w:themeColor="accent4" w:themeShade="80"/>
+        </w:rPr>
+        <w:t>。我们检查所有</w:t>
+      </w:r>
+      <w:r>
+        <w:rPr>
+          <w:rFonts w:hint="eastAsia"/>
+          <w:color w:val="074F6A" w:themeColor="accent4" w:themeShade="80"/>
+        </w:rPr>
+        <w:t>premise(前提)</w:t>
+      </w:r>
+      <w:r>
+        <w:rPr>
+          <w:rFonts w:hint="eastAsia"/>
+          <w:color w:val="074F6A" w:themeColor="accent4" w:themeShade="80"/>
+        </w:rPr>
+        <w:t>都为真的行。为了使</w:t>
+      </w:r>
+      <w:r>
+        <w:rPr>
+          <w:rFonts w:hint="eastAsia"/>
+          <w:color w:val="074F6A" w:themeColor="accent4" w:themeShade="80"/>
+        </w:rPr>
+        <w:t>argument is valid</w:t>
+      </w:r>
+      <w:r>
+        <w:rPr>
+          <w:rFonts w:hint="eastAsia"/>
+          <w:color w:val="074F6A" w:themeColor="accent4" w:themeShade="80"/>
+        </w:rPr>
+        <w:t>，</w:t>
+      </w:r>
+      <w:r>
+        <w:rPr>
+          <w:color w:val="074F6A" w:themeColor="accent4" w:themeShade="80"/>
+        </w:rPr>
+        <w:t>conclusion</w:t>
+      </w:r>
+      <w:r>
+        <w:rPr>
+          <w:rFonts w:hint="eastAsia"/>
+          <w:color w:val="074F6A" w:themeColor="accent4" w:themeShade="80"/>
+        </w:rPr>
+        <w:t>(</w:t>
+      </w:r>
+      <w:r>
+        <w:rPr>
+          <w:rFonts w:hint="eastAsia"/>
+          <w:color w:val="074F6A" w:themeColor="accent4" w:themeShade="80"/>
+        </w:rPr>
+        <w:t>结论</w:t>
+      </w:r>
+      <w:r>
+        <w:rPr>
+          <w:rFonts w:hint="eastAsia"/>
+          <w:color w:val="074F6A" w:themeColor="accent4" w:themeShade="80"/>
+        </w:rPr>
+        <w:t>)</w:t>
+      </w:r>
+      <w:r>
+        <w:rPr>
+          <w:rFonts w:hint="eastAsia"/>
+          <w:color w:val="074F6A" w:themeColor="accent4" w:themeShade="80"/>
+        </w:rPr>
+        <w:t>必须在所有这些行中都为真</w:t>
+      </w:r>
+      <w:r>
+        <w:rPr>
+          <w:rFonts w:hint="eastAsia"/>
+          <w:color w:val="074F6A" w:themeColor="accent4" w:themeShade="80"/>
+        </w:rPr>
+        <w:t>。</w:t>
+      </w:r>
+    </w:p>
+    <w:p>
+      <w:pPr>
+        <w:spacing w:line="360" w:lineRule="auto"/>
+        <w:jc w:val="left"/>
+        <w:rPr>
+          <w:color w:val="074F6A" w:themeColor="accent4" w:themeShade="80"/>
+        </w:rPr>
+      </w:pPr>
+    </w:p>
+    <w:p>
+      <w:pPr>
+        <w:spacing w:line="360" w:lineRule="auto"/>
+        <w:jc w:val="left"/>
+        <w:rPr>
+          <w:color w:val="074F6A" w:themeColor="accent4" w:themeShade="80"/>
+        </w:rPr>
+      </w:pPr>
+    </w:p>
+    <w:p>
+      <w:pPr>
+        <w:spacing w:line="360" w:lineRule="auto"/>
+        <w:jc w:val="left"/>
+        <w:rPr>
+          <w:color w:val="074F6A" w:themeColor="accent4" w:themeShade="80"/>
+        </w:rPr>
+      </w:pPr>
+      <w:r>
+        <w:rPr>
+          <w:rFonts w:hint="eastAsia"/>
+          <w:color w:val="074F6A" w:themeColor="accent4" w:themeShade="80"/>
+        </w:rPr>
+        <w:lastRenderedPageBreak/>
+        <w:t>例子1：</w:t>
+      </w:r>
+    </w:p>
+    <w:p>
+      <w:pPr>
+        <w:spacing w:line="360" w:lineRule="auto"/>
+        <w:jc w:val="left"/>
+        <w:rPr>
+          <w:color w:val="074F6A" w:themeColor="accent4" w:themeShade="80"/>
+        </w:rPr>
+      </w:pPr>
+      <w:r>
+        <w:rPr>
+          <w:noProof/>
+          <w:color w:val="074F6A" w:themeColor="accent4" w:themeShade="80"/>
+        </w:rPr>
+        <w:drawing>
+          <wp:inline distT="0" distB="0" distL="0" distR="0" wp14:anchorId="1A0D85D3" wp14:editId="690B0B52">
+            <wp:extent cx="5753100" cy="1372037"/>
+            <wp:effectExtent l="0" t="0" r="0" b="0"/>
+            <wp:docPr id="402542738" name="图片 1"/>
+            <wp:cNvGraphicFramePr>
+              <a:graphicFrameLocks xmlns:a="http://schemas.openxmlformats.org/drawingml/2006/main" noChangeAspect="1"/>
+            </wp:cNvGraphicFramePr>
+            <a:graphic xmlns:a="http://schemas.openxmlformats.org/drawingml/2006/main">
+              <a:graphicData uri="http://schemas.openxmlformats.org/drawingml/2006/picture">
+                <pic:pic xmlns:pic="http://schemas.openxmlformats.org/drawingml/2006/picture">
+                  <pic:nvPicPr>
+                    <pic:cNvPr id="0" name="Picture 1"/>
+                    <pic:cNvPicPr>
+                      <a:picLocks noChangeAspect="1" noChangeArrowheads="1"/>
+                    </pic:cNvPicPr>
+                  </pic:nvPicPr>
+                  <pic:blipFill>
+                    <a:blip r:embed="rId36">
+                      <a:extLst>
+                        <a:ext uri="{28A0092B-C50C-407E-A947-70E740481C1C}">
+                          <a14:useLocalDpi xmlns:a14="http://schemas.microsoft.com/office/drawing/2010/main" val="0"/>
+                        </a:ext>
+                      </a:extLst>
+                    </a:blip>
+                    <a:srcRect/>
+                    <a:stretch>
+                      <a:fillRect/>
+                    </a:stretch>
+                  </pic:blipFill>
+                  <pic:spPr bwMode="auto">
+                    <a:xfrm>
+                      <a:off x="0" y="0"/>
+                      <a:ext cx="5788795" cy="1380550"/>
+                    </a:xfrm>
+                    <a:prstGeom prst="rect">
+                      <a:avLst/>
+                    </a:prstGeom>
+                    <a:noFill/>
+                    <a:ln>
+                      <a:noFill/>
+                    </a:ln>
+                  </pic:spPr>
+                </pic:pic>
+              </a:graphicData>
+            </a:graphic>
+          </wp:inline>
+        </w:drawing>
+      </w:r>
+    </w:p>
+    <w:tbl>
+      <w:tblPr>
+        <w:tblStyle w:val="af1"/>
+        <w:tblW w:w="0" w:type="auto"/>
+        <w:tblLook w:val="04A0" w:firstRow="1" w:lastRow="0" w:firstColumn="1" w:lastColumn="0" w:noHBand="0" w:noVBand="1"/>
+      </w:tblPr>
+      <w:tblGrid>
+        <w:gridCol w:w="3539"/>
+        <w:gridCol w:w="5528"/>
+      </w:tblGrid>
+      <w:tr>
+        <w:trPr>
+          <w:trHeight w:val="201"/>
+        </w:trPr>
+        <w:tc>
+          <w:tcPr>
+            <w:tcW w:w="3539" w:type="dxa"/>
+          </w:tcPr>
+          <w:p>
+            <w:pPr>
+              <w:spacing w:line="360" w:lineRule="auto"/>
+              <w:jc w:val="left"/>
+              <w:rPr>
+                <w:rFonts w:hint="eastAsia"/>
+                <w:color w:val="074F6A" w:themeColor="accent4" w:themeShade="80"/>
+                <w:sz w:val="24"/>
+                <w:szCs w:val="24"/>
+              </w:rPr>
+            </w:pPr>
+            <w:r>
+              <w:rPr>
+                <w:rFonts w:hint="eastAsia"/>
+                <w:color w:val="074F6A" w:themeColor="accent4" w:themeShade="80"/>
+                <w:sz w:val="24"/>
+                <w:szCs w:val="24"/>
+              </w:rPr>
+              <w:t xml:space="preserve">Premise 1 </w:t>
+            </w:r>
+          </w:p>
+        </w:tc>
+        <w:tc>
+          <w:tcPr>
+            <w:tcW w:w="5528" w:type="dxa"/>
+          </w:tcPr>
+          <w:p>
+            <w:pPr>
+              <w:spacing w:line="360" w:lineRule="auto"/>
+              <w:jc w:val="left"/>
+              <w:rPr>
+                <w:rFonts w:hint="eastAsia"/>
+                <w:color w:val="074F6A" w:themeColor="accent4" w:themeShade="80"/>
+                <w:sz w:val="24"/>
+                <w:szCs w:val="24"/>
+              </w:rPr>
+            </w:pPr>
+            <w:r>
+              <w:rPr>
+                <w:rFonts w:hint="eastAsia"/>
+                <w:color w:val="074F6A" w:themeColor="accent4" w:themeShade="80"/>
+                <w:sz w:val="24"/>
+                <w:szCs w:val="24"/>
+              </w:rPr>
+              <w:t xml:space="preserve">P1 </w:t>
+            </w:r>
+            <w:r>
+              <w:rPr>
+                <w:rFonts w:cstheme="majorBidi"/>
+                <w:color w:val="0F4761" w:themeColor="accent1" w:themeShade="BF"/>
+                <w:sz w:val="24"/>
+                <w:szCs w:val="24"/>
+              </w:rPr>
+              <w:t>∨</w:t>
+            </w:r>
+            <w:r>
+              <w:rPr>
+                <w:rFonts w:hint="eastAsia"/>
+                <w:color w:val="074F6A" w:themeColor="accent4" w:themeShade="80"/>
+                <w:sz w:val="24"/>
+                <w:szCs w:val="24"/>
+              </w:rPr>
+              <w:t xml:space="preserve"> P2  </w:t>
+            </w:r>
+          </w:p>
+        </w:tc>
+      </w:tr>
+      <w:tr>
+        <w:trPr>
+          <w:trHeight w:val="264"/>
+        </w:trPr>
+        <w:tc>
+          <w:tcPr>
+            <w:tcW w:w="3539" w:type="dxa"/>
+          </w:tcPr>
+          <w:p>
+            <w:pPr>
+              <w:spacing w:line="360" w:lineRule="auto"/>
+              <w:jc w:val="left"/>
+              <w:rPr>
+                <w:rFonts w:hint="eastAsia"/>
+                <w:color w:val="074F6A" w:themeColor="accent4" w:themeShade="80"/>
+                <w:sz w:val="24"/>
+                <w:szCs w:val="24"/>
+              </w:rPr>
+            </w:pPr>
+            <w:r>
+              <w:rPr>
+                <w:rFonts w:hint="eastAsia"/>
+                <w:color w:val="074F6A" w:themeColor="accent4" w:themeShade="80"/>
+                <w:sz w:val="24"/>
+                <w:szCs w:val="24"/>
+              </w:rPr>
+              <w:t xml:space="preserve">Premise </w:t>
+            </w:r>
+            <w:r>
+              <w:rPr>
+                <w:rFonts w:hint="eastAsia"/>
+                <w:color w:val="074F6A" w:themeColor="accent4" w:themeShade="80"/>
+                <w:sz w:val="24"/>
+                <w:szCs w:val="24"/>
+              </w:rPr>
+              <w:t xml:space="preserve">2 </w:t>
+            </w:r>
+          </w:p>
+        </w:tc>
+        <w:tc>
+          <w:tcPr>
+            <w:tcW w:w="5528" w:type="dxa"/>
+          </w:tcPr>
+          <w:p>
+            <w:pPr>
+              <w:spacing w:line="360" w:lineRule="auto"/>
+              <w:jc w:val="left"/>
+              <w:rPr>
+                <w:rFonts w:hint="eastAsia"/>
+                <w:color w:val="074F6A" w:themeColor="accent4" w:themeShade="80"/>
+                <w:sz w:val="24"/>
+                <w:szCs w:val="24"/>
+              </w:rPr>
+            </w:pPr>
+            <w:r>
+              <w:rPr>
+                <w:rFonts w:cstheme="majorBidi"/>
+                <w:color w:val="0F4761" w:themeColor="accent1" w:themeShade="BF"/>
+                <w:sz w:val="24"/>
+                <w:szCs w:val="24"/>
+              </w:rPr>
+              <w:t>¬</w:t>
+            </w:r>
+            <w:r>
+              <w:rPr>
+                <w:rFonts w:cstheme="majorBidi" w:hint="eastAsia"/>
+                <w:color w:val="0F4761" w:themeColor="accent1" w:themeShade="BF"/>
+                <w:sz w:val="24"/>
+                <w:szCs w:val="24"/>
+              </w:rPr>
+              <w:t xml:space="preserve"> </w:t>
+            </w:r>
+            <w:r>
+              <w:rPr>
+                <w:rFonts w:cstheme="majorBidi" w:hint="eastAsia"/>
+                <w:color w:val="0F4761" w:themeColor="accent1" w:themeShade="BF"/>
+                <w:sz w:val="24"/>
+                <w:szCs w:val="24"/>
+              </w:rPr>
+              <w:t>P2</w:t>
+            </w:r>
+          </w:p>
+        </w:tc>
+      </w:tr>
+      <w:tr>
+        <w:tc>
+          <w:tcPr>
+            <w:tcW w:w="3539" w:type="dxa"/>
+          </w:tcPr>
+          <w:p>
+            <w:pPr>
+              <w:spacing w:line="360" w:lineRule="auto"/>
+              <w:jc w:val="left"/>
+              <w:rPr>
+                <w:rFonts w:hint="eastAsia"/>
+                <w:color w:val="074F6A" w:themeColor="accent4" w:themeShade="80"/>
+                <w:sz w:val="24"/>
+                <w:szCs w:val="24"/>
+              </w:rPr>
+            </w:pPr>
+            <w:r>
+              <w:rPr>
+                <w:rFonts w:hint="eastAsia"/>
+                <w:color w:val="074F6A" w:themeColor="accent4" w:themeShade="80"/>
+                <w:sz w:val="24"/>
+                <w:szCs w:val="24"/>
+              </w:rPr>
+              <w:t>检查</w:t>
+            </w:r>
+            <w:r>
+              <w:rPr>
+                <w:rFonts w:hint="eastAsia"/>
+                <w:color w:val="074F6A" w:themeColor="accent4" w:themeShade="80"/>
+                <w:sz w:val="24"/>
+                <w:szCs w:val="24"/>
+              </w:rPr>
+              <w:t>All the Premise为真</w:t>
+            </w:r>
+            <w:r>
+              <w:rPr>
+                <w:rFonts w:hint="eastAsia"/>
+                <w:color w:val="074F6A" w:themeColor="accent4" w:themeShade="80"/>
+                <w:sz w:val="24"/>
+                <w:szCs w:val="24"/>
+              </w:rPr>
+              <w:t>的</w:t>
+            </w:r>
+            <w:r>
+              <w:rPr>
+                <w:rFonts w:hint="eastAsia"/>
+                <w:color w:val="074F6A" w:themeColor="accent4" w:themeShade="80"/>
+                <w:sz w:val="24"/>
+                <w:szCs w:val="24"/>
+              </w:rPr>
+              <w:t>行</w:t>
+            </w:r>
+          </w:p>
+        </w:tc>
+        <w:tc>
+          <w:tcPr>
+            <w:tcW w:w="5528" w:type="dxa"/>
+          </w:tcPr>
+          <w:p>
+            <w:pPr>
+              <w:spacing w:line="360" w:lineRule="auto"/>
+              <w:jc w:val="left"/>
+              <w:rPr>
+                <w:rFonts w:cstheme="majorBidi"/>
+                <w:color w:val="0F4761" w:themeColor="accent1" w:themeShade="BF"/>
+                <w:sz w:val="24"/>
+                <w:szCs w:val="24"/>
+              </w:rPr>
+            </w:pPr>
+            <w:r>
+              <w:rPr>
+                <w:rFonts w:cstheme="majorBidi" w:hint="eastAsia"/>
+                <w:color w:val="0F4761" w:themeColor="accent1" w:themeShade="BF"/>
+                <w:sz w:val="24"/>
+                <w:szCs w:val="24"/>
+              </w:rPr>
+              <w:t>第</w:t>
+            </w:r>
+            <w:r>
+              <w:rPr>
+                <w:rFonts w:cstheme="majorBidi" w:hint="eastAsia"/>
+                <w:color w:val="0F4761" w:themeColor="accent1" w:themeShade="BF"/>
+                <w:sz w:val="24"/>
+                <w:szCs w:val="24"/>
+              </w:rPr>
+              <w:t>2</w:t>
+            </w:r>
+            <w:r>
+              <w:rPr>
+                <w:rFonts w:cstheme="majorBidi" w:hint="eastAsia"/>
+                <w:color w:val="0F4761" w:themeColor="accent1" w:themeShade="BF"/>
+                <w:sz w:val="24"/>
+                <w:szCs w:val="24"/>
+              </w:rPr>
+              <w:t>行</w:t>
+            </w:r>
+          </w:p>
+        </w:tc>
+      </w:tr>
+      <w:tr>
+        <w:tc>
+          <w:tcPr>
+            <w:tcW w:w="3539" w:type="dxa"/>
+          </w:tcPr>
+          <w:p>
+            <w:pPr>
+              <w:spacing w:line="360" w:lineRule="auto"/>
+              <w:jc w:val="left"/>
+              <w:rPr>
+                <w:rFonts w:hint="eastAsia"/>
+                <w:color w:val="074F6A" w:themeColor="accent4" w:themeShade="80"/>
+                <w:sz w:val="24"/>
+                <w:szCs w:val="24"/>
+              </w:rPr>
+            </w:pPr>
+            <w:r>
+              <w:rPr>
+                <w:rFonts w:hint="eastAsia"/>
+                <w:color w:val="074F6A" w:themeColor="accent4" w:themeShade="80"/>
+                <w:sz w:val="24"/>
+                <w:szCs w:val="24"/>
+              </w:rPr>
+              <w:t>该行的</w:t>
+            </w:r>
+            <w:r>
+              <w:rPr>
+                <w:rFonts w:hint="eastAsia"/>
+                <w:color w:val="074F6A" w:themeColor="accent4" w:themeShade="80"/>
+                <w:sz w:val="24"/>
+                <w:szCs w:val="24"/>
+              </w:rPr>
+              <w:t>conclusion</w:t>
+            </w:r>
+            <w:r>
+              <w:rPr>
+                <w:rFonts w:hint="eastAsia"/>
+                <w:color w:val="074F6A" w:themeColor="accent4" w:themeShade="80"/>
+                <w:sz w:val="24"/>
+                <w:szCs w:val="24"/>
+              </w:rPr>
+              <w:t>也为真</w:t>
+            </w:r>
+          </w:p>
+        </w:tc>
+        <w:tc>
+          <w:tcPr>
+            <w:tcW w:w="5528" w:type="dxa"/>
+          </w:tcPr>
+          <w:p>
+            <w:pPr>
+              <w:spacing w:line="360" w:lineRule="auto"/>
+              <w:jc w:val="left"/>
+              <w:rPr>
+                <w:rFonts w:cstheme="majorBidi" w:hint="eastAsia"/>
+                <w:color w:val="0F4761" w:themeColor="accent1" w:themeShade="BF"/>
+                <w:sz w:val="24"/>
+                <w:szCs w:val="24"/>
+              </w:rPr>
+            </w:pPr>
+            <w:r>
+              <w:rPr>
+                <w:rFonts w:cstheme="majorBidi" w:hint="eastAsia"/>
+                <w:color w:val="0F4761" w:themeColor="accent1" w:themeShade="BF"/>
+                <w:sz w:val="24"/>
+                <w:szCs w:val="24"/>
+              </w:rPr>
+              <w:t>Yes</w:t>
+            </w:r>
+          </w:p>
+        </w:tc>
+      </w:tr>
+      <w:tr>
+        <w:tc>
+          <w:tcPr>
+            <w:tcW w:w="3539" w:type="dxa"/>
+          </w:tcPr>
+          <w:p>
+            <w:pPr>
+              <w:spacing w:line="360" w:lineRule="auto"/>
+              <w:jc w:val="left"/>
+              <w:rPr>
+                <w:rFonts w:hint="eastAsia"/>
+                <w:color w:val="074F6A" w:themeColor="accent4" w:themeShade="80"/>
+                <w:sz w:val="24"/>
+                <w:szCs w:val="24"/>
+              </w:rPr>
+            </w:pPr>
+            <w:r>
+              <w:rPr>
+                <w:rFonts w:hint="eastAsia"/>
+                <w:color w:val="074F6A" w:themeColor="accent4" w:themeShade="80"/>
+                <w:sz w:val="24"/>
+                <w:szCs w:val="24"/>
+              </w:rPr>
+              <w:t>Arugment is</w:t>
+            </w:r>
+            <w:r>
+              <w:rPr>
+                <w:rFonts w:hint="eastAsia"/>
+                <w:color w:val="074F6A" w:themeColor="accent4" w:themeShade="80"/>
+                <w:sz w:val="24"/>
+                <w:szCs w:val="24"/>
+              </w:rPr>
+              <w:t xml:space="preserve"> </w:t>
+            </w:r>
+            <w:r>
+              <w:rPr>
+                <w:rFonts w:hint="eastAsia"/>
+                <w:color w:val="074F6A" w:themeColor="accent4" w:themeShade="80"/>
+                <w:sz w:val="24"/>
+                <w:szCs w:val="24"/>
+              </w:rPr>
+              <w:t xml:space="preserve">？ </w:t>
+            </w:r>
+          </w:p>
+        </w:tc>
+        <w:tc>
+          <w:tcPr>
+            <w:tcW w:w="5528" w:type="dxa"/>
+          </w:tcPr>
+          <w:p>
+            <w:pPr>
+              <w:spacing w:line="360" w:lineRule="auto"/>
+              <w:jc w:val="left"/>
+              <w:rPr>
+                <w:rFonts w:cstheme="majorBidi" w:hint="eastAsia"/>
+                <w:color w:val="0F4761" w:themeColor="accent1" w:themeShade="BF"/>
+                <w:sz w:val="24"/>
+                <w:szCs w:val="24"/>
+              </w:rPr>
+            </w:pPr>
+            <w:r>
+              <w:rPr>
+                <w:rFonts w:cstheme="majorBidi" w:hint="eastAsia"/>
+                <w:color w:val="0F4761" w:themeColor="accent1" w:themeShade="BF"/>
+                <w:sz w:val="24"/>
+                <w:szCs w:val="24"/>
+              </w:rPr>
+              <w:t>Valid</w:t>
+            </w:r>
+          </w:p>
+        </w:tc>
+      </w:tr>
+    </w:tbl>
+    <w:p>
+      <w:pPr>
+        <w:spacing w:line="360" w:lineRule="auto"/>
+        <w:jc w:val="left"/>
+        <w:rPr>
+          <w:color w:val="074F6A" w:themeColor="accent4" w:themeShade="80"/>
+        </w:rPr>
+      </w:pPr>
+    </w:p>
+    <w:p>
+      <w:pPr>
+        <w:spacing w:line="360" w:lineRule="auto"/>
+        <w:jc w:val="left"/>
+        <w:rPr>
+          <w:color w:val="074F6A" w:themeColor="accent4" w:themeShade="80"/>
+        </w:rPr>
+      </w:pPr>
+      <w:r>
+        <w:rPr>
+          <w:rFonts w:hint="eastAsia"/>
+          <w:color w:val="074F6A" w:themeColor="accent4" w:themeShade="80"/>
+        </w:rPr>
+        <w:t>例子2：</w:t>
+      </w:r>
+    </w:p>
+    <w:p>
+      <w:pPr>
+        <w:spacing w:line="360" w:lineRule="auto"/>
+        <w:jc w:val="left"/>
+        <w:rPr>
+          <w:rFonts w:hint="eastAsia"/>
+          <w:color w:val="074F6A" w:themeColor="accent4" w:themeShade="80"/>
+        </w:rPr>
+      </w:pPr>
+      <w:r>
+        <w:rPr>
+          <w:noProof/>
+          <w:color w:val="074F6A" w:themeColor="accent4" w:themeShade="80"/>
+        </w:rPr>
+        <w:drawing>
+          <wp:inline distT="0" distB="0" distL="0" distR="0" wp14:anchorId="62B8786F" wp14:editId="5CA6FBB1">
+            <wp:extent cx="3705225" cy="1573766"/>
+            <wp:effectExtent l="0" t="0" r="0" b="7620"/>
+            <wp:docPr id="269536415" name="图片 2"/>
+            <wp:cNvGraphicFramePr>
+              <a:graphicFrameLocks xmlns:a="http://schemas.openxmlformats.org/drawingml/2006/main" noChangeAspect="1"/>
+            </wp:cNvGraphicFramePr>
+            <a:graphic xmlns:a="http://schemas.openxmlformats.org/drawingml/2006/main">
+              <a:graphicData uri="http://schemas.openxmlformats.org/drawingml/2006/picture">
+                <pic:pic xmlns:pic="http://schemas.openxmlformats.org/drawingml/2006/picture">
+                  <pic:nvPicPr>
+                    <pic:cNvPr id="0" name="Picture 2"/>
+                    <pic:cNvPicPr>
+                      <a:picLocks noChangeAspect="1" noChangeArrowheads="1"/>
+                    </pic:cNvPicPr>
+                  </pic:nvPicPr>
+                  <pic:blipFill>
+                    <a:blip r:embed="rId37">
+                      <a:extLst>
+                        <a:ext uri="{28A0092B-C50C-407E-A947-70E740481C1C}">
+                          <a14:useLocalDpi xmlns:a14="http://schemas.microsoft.com/office/drawing/2010/main" val="0"/>
+                        </a:ext>
+                      </a:extLst>
+                    </a:blip>
+                    <a:srcRect/>
+                    <a:stretch>
+                      <a:fillRect/>
+                    </a:stretch>
+                  </pic:blipFill>
+                  <pic:spPr bwMode="auto">
+                    <a:xfrm>
+                      <a:off x="0" y="0"/>
+                      <a:ext cx="3719862" cy="1579983"/>
+                    </a:xfrm>
+                    <a:prstGeom prst="rect">
+                      <a:avLst/>
+                    </a:prstGeom>
+                    <a:noFill/>
+                    <a:ln>
+                      <a:noFill/>
+                    </a:ln>
+                  </pic:spPr>
+                </pic:pic>
+              </a:graphicData>
+            </a:graphic>
+          </wp:inline>
+        </w:drawing>
+      </w:r>
+    </w:p>
+    <w:tbl>
+      <w:tblPr>
+        <w:tblStyle w:val="af1"/>
+        <w:tblW w:w="0" w:type="auto"/>
+        <w:tblLook w:val="04A0" w:firstRow="1" w:lastRow="0" w:firstColumn="1" w:lastColumn="0" w:noHBand="0" w:noVBand="1"/>
+      </w:tblPr>
+      <w:tblGrid>
+        <w:gridCol w:w="3539"/>
+        <w:gridCol w:w="5528"/>
+      </w:tblGrid>
+      <w:tr>
+        <w:trPr>
+          <w:trHeight w:val="201"/>
+        </w:trPr>
+        <w:tc>
+          <w:tcPr>
+            <w:tcW w:w="3539" w:type="dxa"/>
+          </w:tcPr>
+          <w:p>
+            <w:pPr>
+              <w:spacing w:line="360" w:lineRule="auto"/>
+              <w:jc w:val="left"/>
+              <w:rPr>
+                <w:rFonts w:hint="eastAsia"/>
+                <w:color w:val="074F6A" w:themeColor="accent4" w:themeShade="80"/>
+                <w:sz w:val="24"/>
+                <w:szCs w:val="24"/>
+              </w:rPr>
+            </w:pPr>
+            <w:r>
+              <w:rPr>
+                <w:rFonts w:hint="eastAsia"/>
+                <w:color w:val="074F6A" w:themeColor="accent4" w:themeShade="80"/>
+                <w:sz w:val="24"/>
+                <w:szCs w:val="24"/>
+              </w:rPr>
+              <w:t xml:space="preserve">Premise 1 </w:t>
+            </w:r>
+          </w:p>
+        </w:tc>
+        <w:tc>
+          <w:tcPr>
+            <w:tcW w:w="5528" w:type="dxa"/>
+          </w:tcPr>
+          <w:p>
+            <w:pPr>
+              <w:spacing w:line="360" w:lineRule="auto"/>
+              <w:jc w:val="left"/>
+              <w:rPr>
+                <w:rFonts w:hint="eastAsia"/>
+                <w:color w:val="074F6A" w:themeColor="accent4" w:themeShade="80"/>
+                <w:sz w:val="24"/>
+                <w:szCs w:val="24"/>
+              </w:rPr>
+            </w:pPr>
+            <w:r>
+              <w:rPr>
+                <w:rFonts w:hint="eastAsia"/>
+                <w:color w:val="074F6A" w:themeColor="accent4" w:themeShade="80"/>
+                <w:sz w:val="24"/>
+                <w:szCs w:val="24"/>
+              </w:rPr>
+              <w:t xml:space="preserve">P1 </w:t>
+            </w:r>
+            <w:r>
+              <w:rPr>
+                <w:rFonts w:cstheme="majorBidi" w:hint="eastAsia"/>
+                <w:color w:val="0F4761" w:themeColor="accent1" w:themeShade="BF"/>
+                <w:sz w:val="24"/>
+                <w:szCs w:val="24"/>
+              </w:rPr>
+              <w:t>=&gt; (</w:t>
+            </w:r>
+            <w:r>
+              <w:rPr>
+                <w:rFonts w:cstheme="majorBidi"/>
+                <w:color w:val="0F4761" w:themeColor="accent1" w:themeShade="BF"/>
+                <w:sz w:val="24"/>
+                <w:szCs w:val="24"/>
+              </w:rPr>
+              <w:t>¬</w:t>
+            </w:r>
+            <w:r>
+              <w:rPr>
+                <w:rFonts w:cstheme="majorBidi" w:hint="eastAsia"/>
+                <w:color w:val="0F4761" w:themeColor="accent1" w:themeShade="BF"/>
+                <w:sz w:val="24"/>
+                <w:szCs w:val="24"/>
+              </w:rPr>
+              <w:t>P2)</w:t>
+            </w:r>
+          </w:p>
+        </w:tc>
+      </w:tr>
+      <w:tr>
+        <w:trPr>
+          <w:trHeight w:val="264"/>
+        </w:trPr>
+        <w:tc>
+          <w:tcPr>
+            <w:tcW w:w="3539" w:type="dxa"/>
+          </w:tcPr>
+          <w:p>
+            <w:pPr>
+              <w:spacing w:line="360" w:lineRule="auto"/>
+              <w:jc w:val="left"/>
+              <w:rPr>
+                <w:rFonts w:hint="eastAsia"/>
+                <w:color w:val="074F6A" w:themeColor="accent4" w:themeShade="80"/>
+                <w:sz w:val="24"/>
+                <w:szCs w:val="24"/>
+              </w:rPr>
+            </w:pPr>
+            <w:r>
+              <w:rPr>
+                <w:rFonts w:hint="eastAsia"/>
+                <w:color w:val="074F6A" w:themeColor="accent4" w:themeShade="80"/>
+                <w:sz w:val="24"/>
+                <w:szCs w:val="24"/>
+              </w:rPr>
+              <w:t xml:space="preserve">Premise 2 </w:t>
+            </w:r>
+          </w:p>
+        </w:tc>
+        <w:tc>
+          <w:tcPr>
+            <w:tcW w:w="5528" w:type="dxa"/>
+          </w:tcPr>
+          <w:p>
+            <w:pPr>
+              <w:spacing w:line="360" w:lineRule="auto"/>
+              <w:jc w:val="left"/>
+              <w:rPr>
+                <w:rFonts w:hint="eastAsia"/>
+                <w:color w:val="074F6A" w:themeColor="accent4" w:themeShade="80"/>
+                <w:sz w:val="24"/>
+                <w:szCs w:val="24"/>
+              </w:rPr>
+            </w:pPr>
+            <w:r>
+              <w:rPr>
+                <w:rFonts w:cstheme="majorBidi" w:hint="eastAsia"/>
+                <w:color w:val="0F4761" w:themeColor="accent1" w:themeShade="BF"/>
+                <w:sz w:val="24"/>
+                <w:szCs w:val="24"/>
+              </w:rPr>
+              <w:t>P2</w:t>
+            </w:r>
+          </w:p>
+        </w:tc>
+      </w:tr>
+      <w:tr>
+        <w:tc>
+          <w:tcPr>
+            <w:tcW w:w="3539" w:type="dxa"/>
+          </w:tcPr>
+          <w:p>
+            <w:pPr>
+              <w:spacing w:line="360" w:lineRule="auto"/>
+              <w:jc w:val="left"/>
+              <w:rPr>
+                <w:rFonts w:hint="eastAsia"/>
+                <w:color w:val="074F6A" w:themeColor="accent4" w:themeShade="80"/>
+                <w:sz w:val="24"/>
+                <w:szCs w:val="24"/>
+              </w:rPr>
+            </w:pPr>
+            <w:r>
+              <w:rPr>
+                <w:rFonts w:hint="eastAsia"/>
+                <w:color w:val="074F6A" w:themeColor="accent4" w:themeShade="80"/>
+                <w:sz w:val="24"/>
+                <w:szCs w:val="24"/>
+              </w:rPr>
+              <w:t>检查All the Premise为真的行</w:t>
+            </w:r>
+          </w:p>
+        </w:tc>
+        <w:tc>
+          <w:tcPr>
+            <w:tcW w:w="5528" w:type="dxa"/>
+          </w:tcPr>
+          <w:p>
+            <w:pPr>
+              <w:spacing w:line="360" w:lineRule="auto"/>
+              <w:jc w:val="left"/>
+              <w:rPr>
+                <w:rFonts w:cstheme="majorBidi"/>
+                <w:color w:val="0F4761" w:themeColor="accent1" w:themeShade="BF"/>
+                <w:sz w:val="24"/>
+                <w:szCs w:val="24"/>
+              </w:rPr>
+            </w:pPr>
+            <w:r>
+              <w:rPr>
+                <w:rFonts w:cstheme="majorBidi" w:hint="eastAsia"/>
+                <w:color w:val="0F4761" w:themeColor="accent1" w:themeShade="BF"/>
+                <w:sz w:val="24"/>
+                <w:szCs w:val="24"/>
+              </w:rPr>
+              <w:t>第</w:t>
+            </w:r>
+            <w:r>
+              <w:rPr>
+                <w:rFonts w:cstheme="majorBidi" w:hint="eastAsia"/>
+                <w:color w:val="0F4761" w:themeColor="accent1" w:themeShade="BF"/>
+                <w:sz w:val="24"/>
+                <w:szCs w:val="24"/>
+              </w:rPr>
+              <w:t>3</w:t>
+            </w:r>
+            <w:r>
+              <w:rPr>
+                <w:rFonts w:cstheme="majorBidi" w:hint="eastAsia"/>
+                <w:color w:val="0F4761" w:themeColor="accent1" w:themeShade="BF"/>
+                <w:sz w:val="24"/>
+                <w:szCs w:val="24"/>
+              </w:rPr>
+              <w:t>行</w:t>
+            </w:r>
+          </w:p>
+        </w:tc>
+      </w:tr>
+      <w:tr>
+        <w:tc>
+          <w:tcPr>
+            <w:tcW w:w="3539" w:type="dxa"/>
+          </w:tcPr>
+          <w:p>
+            <w:pPr>
+              <w:spacing w:line="360" w:lineRule="auto"/>
+              <w:jc w:val="left"/>
+              <w:rPr>
+                <w:rFonts w:hint="eastAsia"/>
+                <w:color w:val="074F6A" w:themeColor="accent4" w:themeShade="80"/>
+                <w:sz w:val="24"/>
+                <w:szCs w:val="24"/>
+              </w:rPr>
+            </w:pPr>
+            <w:r>
+              <w:rPr>
+                <w:rFonts w:hint="eastAsia"/>
+                <w:color w:val="074F6A" w:themeColor="accent4" w:themeShade="80"/>
+                <w:sz w:val="24"/>
+                <w:szCs w:val="24"/>
+              </w:rPr>
+              <w:t>该行的conclusion也为真</w:t>
+            </w:r>
+          </w:p>
+        </w:tc>
+        <w:tc>
+          <w:tcPr>
+            <w:tcW w:w="5528" w:type="dxa"/>
+          </w:tcPr>
+          <w:p>
+            <w:pPr>
+              <w:spacing w:line="360" w:lineRule="auto"/>
+              <w:jc w:val="left"/>
+              <w:rPr>
+                <w:rFonts w:cstheme="majorBidi" w:hint="eastAsia"/>
+                <w:color w:val="0F4761" w:themeColor="accent1" w:themeShade="BF"/>
+                <w:sz w:val="24"/>
+                <w:szCs w:val="24"/>
+              </w:rPr>
+            </w:pPr>
+            <w:r>
+              <w:rPr>
+                <w:rFonts w:cstheme="majorBidi" w:hint="eastAsia"/>
+                <w:color w:val="0F4761" w:themeColor="accent1" w:themeShade="BF"/>
+                <w:sz w:val="24"/>
+                <w:szCs w:val="24"/>
+              </w:rPr>
+              <w:t>Yes</w:t>
+            </w:r>
+          </w:p>
+        </w:tc>
+      </w:tr>
+      <w:tr>
+        <w:tc>
+          <w:tcPr>
+            <w:tcW w:w="3539" w:type="dxa"/>
+          </w:tcPr>
+          <w:p>
+            <w:pPr>
+              <w:spacing w:line="360" w:lineRule="auto"/>
+              <w:jc w:val="left"/>
+              <w:rPr>
+                <w:rFonts w:hint="eastAsia"/>
+                <w:color w:val="074F6A" w:themeColor="accent4" w:themeShade="80"/>
+                <w:sz w:val="24"/>
+                <w:szCs w:val="24"/>
+              </w:rPr>
+            </w:pPr>
+            <w:r>
+              <w:rPr>
+                <w:rFonts w:hint="eastAsia"/>
+                <w:color w:val="074F6A" w:themeColor="accent4" w:themeShade="80"/>
+                <w:sz w:val="24"/>
+                <w:szCs w:val="24"/>
+              </w:rPr>
+              <w:t xml:space="preserve">Arugment is？ </w:t>
+            </w:r>
+          </w:p>
+        </w:tc>
+        <w:tc>
+          <w:tcPr>
+            <w:tcW w:w="5528" w:type="dxa"/>
+          </w:tcPr>
+          <w:p>
+            <w:pPr>
+              <w:spacing w:line="360" w:lineRule="auto"/>
+              <w:jc w:val="left"/>
+              <w:rPr>
+                <w:rFonts w:cstheme="majorBidi" w:hint="eastAsia"/>
+                <w:color w:val="0F4761" w:themeColor="accent1" w:themeShade="BF"/>
+                <w:sz w:val="24"/>
+                <w:szCs w:val="24"/>
+              </w:rPr>
+            </w:pPr>
+            <w:r>
+              <w:rPr>
+                <w:rFonts w:cstheme="majorBidi" w:hint="eastAsia"/>
+                <w:color w:val="0F4761" w:themeColor="accent1" w:themeShade="BF"/>
+                <w:sz w:val="24"/>
+                <w:szCs w:val="24"/>
+              </w:rPr>
+              <w:t>Valid</w:t>
+            </w:r>
+          </w:p>
+        </w:tc>
+      </w:tr>
+    </w:tbl>
+    <w:p>
+      <w:pPr>
+        <w:spacing w:line="360" w:lineRule="auto"/>
+        <w:jc w:val="left"/>
+        <w:rPr>
+          <w:color w:val="074F6A" w:themeColor="accent4" w:themeShade="80"/>
+        </w:rPr>
+      </w:pPr>
+    </w:p>
+    <w:p>
+      <w:pPr>
+        <w:spacing w:line="360" w:lineRule="auto"/>
+        <w:jc w:val="left"/>
+        <w:rPr>
+          <w:color w:val="074F6A" w:themeColor="accent4" w:themeShade="80"/>
+        </w:rPr>
+      </w:pPr>
+      <w:r>
+        <w:rPr>
+          <w:rFonts w:hint="eastAsia"/>
+          <w:color w:val="074F6A" w:themeColor="accent4" w:themeShade="80"/>
+        </w:rPr>
+        <w:t>例子</w:t>
+      </w:r>
+      <w:r>
+        <w:rPr>
+          <w:rFonts w:hint="eastAsia"/>
+          <w:color w:val="074F6A" w:themeColor="accent4" w:themeShade="80"/>
+        </w:rPr>
+        <w:t>3</w:t>
+      </w:r>
+      <w:r>
+        <w:rPr>
+          <w:rFonts w:hint="eastAsia"/>
+          <w:color w:val="074F6A" w:themeColor="accent4" w:themeShade="80"/>
+        </w:rPr>
+        <w:t>：</w:t>
+      </w:r>
+    </w:p>
+    <w:p>
+      <w:pPr>
+        <w:spacing w:line="360" w:lineRule="auto"/>
+        <w:jc w:val="left"/>
+        <w:rPr>
+          <w:color w:val="074F6A" w:themeColor="accent4" w:themeShade="80"/>
+        </w:rPr>
+      </w:pPr>
+      <w:r>
+        <w:rPr>
+          <w:noProof/>
+          <w:color w:val="074F6A" w:themeColor="accent4" w:themeShade="80"/>
+        </w:rPr>
+        <w:drawing>
+          <wp:inline distT="0" distB="0" distL="0" distR="0" wp14:anchorId="671D6137" wp14:editId="52AD199D">
+            <wp:extent cx="5686425" cy="1167059"/>
+            <wp:effectExtent l="0" t="0" r="0" b="0"/>
+            <wp:docPr id="1305591059" name="图片 3"/>
+            <wp:cNvGraphicFramePr>
+              <a:graphicFrameLocks xmlns:a="http://schemas.openxmlformats.org/drawingml/2006/main" noChangeAspect="1"/>
+            </wp:cNvGraphicFramePr>
+            <a:graphic xmlns:a="http://schemas.openxmlformats.org/drawingml/2006/main">
+              <a:graphicData uri="http://schemas.openxmlformats.org/drawingml/2006/picture">
+                <pic:pic xmlns:pic="http://schemas.openxmlformats.org/drawingml/2006/picture">
+                  <pic:nvPicPr>
+                    <pic:cNvPr id="0" name="Picture 3"/>
+                    <pic:cNvPicPr>
+                      <a:picLocks noChangeAspect="1" noChangeArrowheads="1"/>
+                    </pic:cNvPicPr>
+                  </pic:nvPicPr>
+                  <pic:blipFill>
+                    <a:blip r:embed="rId38">
+                      <a:extLst>
+                        <a:ext uri="{28A0092B-C50C-407E-A947-70E740481C1C}">
+                          <a14:useLocalDpi xmlns:a14="http://schemas.microsoft.com/office/drawing/2010/main" val="0"/>
+                        </a:ext>
+                      </a:extLst>
+                    </a:blip>
+                    <a:srcRect/>
+                    <a:stretch>
+                      <a:fillRect/>
+                    </a:stretch>
+                  </pic:blipFill>
+                  <pic:spPr bwMode="auto">
+                    <a:xfrm>
+                      <a:off x="0" y="0"/>
+                      <a:ext cx="5705271" cy="1170927"/>
+                    </a:xfrm>
+                    <a:prstGeom prst="rect">
+                      <a:avLst/>
+                    </a:prstGeom>
+                    <a:noFill/>
+                    <a:ln>
+                      <a:noFill/>
+                    </a:ln>
+                  </pic:spPr>
+                </pic:pic>
+              </a:graphicData>
+            </a:graphic>
+          </wp:inline>
+        </w:drawing>
+      </w:r>
+    </w:p>
+    <w:tbl>
+      <w:tblPr>
+        <w:tblStyle w:val="af1"/>
+        <w:tblW w:w="0" w:type="auto"/>
+        <w:tblLook w:val="04A0" w:firstRow="1" w:lastRow="0" w:firstColumn="1" w:lastColumn="0" w:noHBand="0" w:noVBand="1"/>
+      </w:tblPr>
+      <w:tblGrid>
+        <w:gridCol w:w="3539"/>
+        <w:gridCol w:w="5528"/>
+      </w:tblGrid>
+      <w:tr>
+        <w:trPr>
+          <w:trHeight w:val="201"/>
+        </w:trPr>
+        <w:tc>
+          <w:tcPr>
+            <w:tcW w:w="3539" w:type="dxa"/>
+          </w:tcPr>
+          <w:p>
+            <w:pPr>
+              <w:spacing w:line="360" w:lineRule="auto"/>
+              <w:jc w:val="left"/>
+              <w:rPr>
+                <w:rFonts w:hint="eastAsia"/>
+                <w:color w:val="074F6A" w:themeColor="accent4" w:themeShade="80"/>
+                <w:sz w:val="24"/>
+                <w:szCs w:val="24"/>
+              </w:rPr>
+            </w:pPr>
+            <w:r>
+              <w:rPr>
+                <w:rFonts w:hint="eastAsia"/>
+                <w:color w:val="074F6A" w:themeColor="accent4" w:themeShade="80"/>
+                <w:sz w:val="24"/>
+                <w:szCs w:val="24"/>
+              </w:rPr>
+              <w:t xml:space="preserve">Premise 1 </w:t>
+            </w:r>
+          </w:p>
+        </w:tc>
+        <w:tc>
+          <w:tcPr>
+            <w:tcW w:w="5528" w:type="dxa"/>
+          </w:tcPr>
+          <w:p>
+            <w:pPr>
+              <w:spacing w:line="360" w:lineRule="auto"/>
+              <w:jc w:val="left"/>
+              <w:rPr>
+                <w:rFonts w:hint="eastAsia"/>
+                <w:color w:val="074F6A" w:themeColor="accent4" w:themeShade="80"/>
+                <w:sz w:val="24"/>
+                <w:szCs w:val="24"/>
+              </w:rPr>
+            </w:pPr>
+            <w:r>
+              <w:rPr>
+                <w:rFonts w:hint="eastAsia"/>
+                <w:color w:val="074F6A" w:themeColor="accent4" w:themeShade="80"/>
+                <w:sz w:val="24"/>
+                <w:szCs w:val="24"/>
+              </w:rPr>
+              <w:t xml:space="preserve">P1 </w:t>
+            </w:r>
+            <w:r>
+              <w:rPr>
+                <w:rFonts w:cstheme="majorBidi"/>
+                <w:color w:val="0F4761" w:themeColor="accent1" w:themeShade="BF"/>
+                <w:sz w:val="24"/>
+                <w:szCs w:val="24"/>
+              </w:rPr>
+              <w:t>∨</w:t>
+            </w:r>
+            <w:r>
+              <w:rPr>
+                <w:rFonts w:cstheme="majorBidi" w:hint="eastAsia"/>
+                <w:color w:val="0F4761" w:themeColor="accent1" w:themeShade="BF"/>
+                <w:sz w:val="24"/>
+                <w:szCs w:val="24"/>
+              </w:rPr>
+              <w:t xml:space="preserve"> </w:t>
+            </w:r>
+            <w:r>
+              <w:rPr>
+                <w:rFonts w:cstheme="majorBidi" w:hint="eastAsia"/>
+                <w:color w:val="0F4761" w:themeColor="accent1" w:themeShade="BF"/>
+                <w:sz w:val="24"/>
+                <w:szCs w:val="24"/>
+              </w:rPr>
+              <w:t>P2</w:t>
+            </w:r>
+          </w:p>
+        </w:tc>
+      </w:tr>
+      <w:tr>
+        <w:trPr>
+          <w:trHeight w:val="264"/>
+        </w:trPr>
+        <w:tc>
+          <w:tcPr>
+            <w:tcW w:w="3539" w:type="dxa"/>
+          </w:tcPr>
+          <w:p>
+            <w:pPr>
+              <w:spacing w:line="360" w:lineRule="auto"/>
+              <w:jc w:val="left"/>
+              <w:rPr>
+                <w:rFonts w:hint="eastAsia"/>
+                <w:color w:val="074F6A" w:themeColor="accent4" w:themeShade="80"/>
+                <w:sz w:val="24"/>
+                <w:szCs w:val="24"/>
+              </w:rPr>
+            </w:pPr>
+            <w:r>
+              <w:rPr>
+                <w:rFonts w:hint="eastAsia"/>
+                <w:color w:val="074F6A" w:themeColor="accent4" w:themeShade="80"/>
+                <w:sz w:val="24"/>
+                <w:szCs w:val="24"/>
+              </w:rPr>
+              <w:t xml:space="preserve">Premise 2 </w:t>
+            </w:r>
+          </w:p>
+        </w:tc>
+        <w:tc>
+          <w:tcPr>
+            <w:tcW w:w="5528" w:type="dxa"/>
+          </w:tcPr>
+          <w:p>
+            <w:pPr>
+              <w:spacing w:line="360" w:lineRule="auto"/>
+              <w:jc w:val="left"/>
+              <w:rPr>
+                <w:rFonts w:hint="eastAsia"/>
+                <w:color w:val="074F6A" w:themeColor="accent4" w:themeShade="80"/>
+                <w:sz w:val="24"/>
+                <w:szCs w:val="24"/>
+              </w:rPr>
+            </w:pPr>
+            <w:r>
+              <w:rPr>
+                <w:rFonts w:cstheme="majorBidi" w:hint="eastAsia"/>
+                <w:color w:val="0F4761" w:themeColor="accent1" w:themeShade="BF"/>
+                <w:sz w:val="24"/>
+                <w:szCs w:val="24"/>
+              </w:rPr>
+              <w:t>P2</w:t>
+            </w:r>
+          </w:p>
+        </w:tc>
+      </w:tr>
+      <w:tr>
+        <w:tc>
+          <w:tcPr>
+            <w:tcW w:w="3539" w:type="dxa"/>
+          </w:tcPr>
+          <w:p>
+            <w:pPr>
+              <w:spacing w:line="360" w:lineRule="auto"/>
+              <w:jc w:val="left"/>
+              <w:rPr>
+                <w:rFonts w:hint="eastAsia"/>
+                <w:color w:val="074F6A" w:themeColor="accent4" w:themeShade="80"/>
+                <w:sz w:val="24"/>
+                <w:szCs w:val="24"/>
+              </w:rPr>
+            </w:pPr>
+            <w:r>
+              <w:rPr>
+                <w:rFonts w:hint="eastAsia"/>
+                <w:color w:val="074F6A" w:themeColor="accent4" w:themeShade="80"/>
+                <w:sz w:val="24"/>
+                <w:szCs w:val="24"/>
+              </w:rPr>
+              <w:t>检查All the Premise为真的行</w:t>
+            </w:r>
+          </w:p>
+        </w:tc>
+        <w:tc>
+          <w:tcPr>
+            <w:tcW w:w="5528" w:type="dxa"/>
+          </w:tcPr>
+          <w:p>
+            <w:pPr>
+              <w:spacing w:line="360" w:lineRule="auto"/>
+              <w:jc w:val="left"/>
+              <w:rPr>
+                <w:rFonts w:cstheme="majorBidi" w:hint="eastAsia"/>
+                <w:color w:val="0F4761" w:themeColor="accent1" w:themeShade="BF"/>
+                <w:sz w:val="24"/>
+                <w:szCs w:val="24"/>
+              </w:rPr>
+            </w:pPr>
+            <w:r>
+              <w:rPr>
+                <w:rFonts w:cstheme="majorBidi" w:hint="eastAsia"/>
+                <w:color w:val="0F4761" w:themeColor="accent1" w:themeShade="BF"/>
+                <w:sz w:val="24"/>
+                <w:szCs w:val="24"/>
+              </w:rPr>
+              <w:t>第</w:t>
+            </w:r>
+            <w:r>
+              <w:rPr>
+                <w:rFonts w:cstheme="majorBidi" w:hint="eastAsia"/>
+                <w:color w:val="0F4761" w:themeColor="accent1" w:themeShade="BF"/>
+                <w:sz w:val="24"/>
+                <w:szCs w:val="24"/>
+              </w:rPr>
+              <w:t>1</w:t>
+            </w:r>
+            <w:r>
+              <w:rPr>
+                <w:rFonts w:cstheme="majorBidi" w:hint="eastAsia"/>
+                <w:color w:val="0F4761" w:themeColor="accent1" w:themeShade="BF"/>
+                <w:sz w:val="24"/>
+                <w:szCs w:val="24"/>
+              </w:rPr>
+              <w:t>行</w:t>
+            </w:r>
+            <w:r>
+              <w:rPr>
+                <w:rFonts w:cstheme="majorBidi" w:hint="eastAsia"/>
+                <w:color w:val="0F4761" w:themeColor="accent1" w:themeShade="BF"/>
+                <w:sz w:val="24"/>
+                <w:szCs w:val="24"/>
+              </w:rPr>
+              <w:t xml:space="preserve">   </w:t>
+            </w:r>
+            <w:r>
+              <w:rPr>
+                <w:rFonts w:cstheme="majorBidi" w:hint="eastAsia"/>
+                <w:color w:val="0F4761" w:themeColor="accent1" w:themeShade="BF"/>
+                <w:sz w:val="24"/>
+                <w:szCs w:val="24"/>
+              </w:rPr>
+              <w:t>第</w:t>
+            </w:r>
+            <w:r>
+              <w:rPr>
+                <w:rFonts w:cstheme="majorBidi" w:hint="eastAsia"/>
+                <w:color w:val="0F4761" w:themeColor="accent1" w:themeShade="BF"/>
+                <w:sz w:val="24"/>
+                <w:szCs w:val="24"/>
+              </w:rPr>
+              <w:t>3</w:t>
+            </w:r>
+            <w:r>
+              <w:rPr>
+                <w:rFonts w:cstheme="majorBidi" w:hint="eastAsia"/>
+                <w:color w:val="0F4761" w:themeColor="accent1" w:themeShade="BF"/>
+                <w:sz w:val="24"/>
+                <w:szCs w:val="24"/>
+              </w:rPr>
+              <w:t>行</w:t>
+            </w:r>
+          </w:p>
+        </w:tc>
+      </w:tr>
+      <w:tr>
+        <w:tc>
+          <w:tcPr>
+            <w:tcW w:w="3539" w:type="dxa"/>
+          </w:tcPr>
+          <w:p>
+            <w:pPr>
+              <w:spacing w:line="360" w:lineRule="auto"/>
+              <w:jc w:val="left"/>
+              <w:rPr>
+                <w:rFonts w:hint="eastAsia"/>
+                <w:color w:val="074F6A" w:themeColor="accent4" w:themeShade="80"/>
+                <w:sz w:val="24"/>
+                <w:szCs w:val="24"/>
+              </w:rPr>
+            </w:pPr>
+            <w:r>
+              <w:rPr>
+                <w:rFonts w:hint="eastAsia"/>
+                <w:color w:val="074F6A" w:themeColor="accent4" w:themeShade="80"/>
+                <w:sz w:val="24"/>
+                <w:szCs w:val="24"/>
+              </w:rPr>
+              <w:lastRenderedPageBreak/>
+              <w:t>该行的conclusion也为真</w:t>
+            </w:r>
+          </w:p>
+        </w:tc>
+        <w:tc>
+          <w:tcPr>
+            <w:tcW w:w="5528" w:type="dxa"/>
+          </w:tcPr>
+          <w:p>
+            <w:pPr>
+              <w:spacing w:line="360" w:lineRule="auto"/>
+              <w:jc w:val="left"/>
+              <w:rPr>
+                <w:rFonts w:cstheme="majorBidi" w:hint="eastAsia"/>
+                <w:color w:val="0F4761" w:themeColor="accent1" w:themeShade="BF"/>
+                <w:sz w:val="24"/>
+                <w:szCs w:val="24"/>
+              </w:rPr>
+            </w:pPr>
+            <w:r>
+              <w:rPr>
+                <w:rFonts w:cstheme="majorBidi" w:hint="eastAsia"/>
+                <w:color w:val="0F4761" w:themeColor="accent1" w:themeShade="BF"/>
+                <w:sz w:val="24"/>
+                <w:szCs w:val="24"/>
+              </w:rPr>
+              <w:t>Yes</w:t>
+            </w:r>
+            <w:r>
+              <w:rPr>
+                <w:rFonts w:cstheme="majorBidi" w:hint="eastAsia"/>
+                <w:color w:val="0F4761" w:themeColor="accent1" w:themeShade="BF"/>
+                <w:sz w:val="24"/>
+                <w:szCs w:val="24"/>
+              </w:rPr>
+              <w:t xml:space="preserve">           No</w:t>
+            </w:r>
+          </w:p>
+        </w:tc>
+      </w:tr>
+      <w:tr>
+        <w:tc>
+          <w:tcPr>
+            <w:tcW w:w="3539" w:type="dxa"/>
+          </w:tcPr>
+          <w:p>
+            <w:pPr>
+              <w:spacing w:line="360" w:lineRule="auto"/>
+              <w:jc w:val="left"/>
+              <w:rPr>
+                <w:rFonts w:hint="eastAsia"/>
+                <w:color w:val="074F6A" w:themeColor="accent4" w:themeShade="80"/>
+                <w:sz w:val="24"/>
+                <w:szCs w:val="24"/>
+              </w:rPr>
+            </w:pPr>
+            <w:r>
+              <w:rPr>
+                <w:rFonts w:hint="eastAsia"/>
+                <w:color w:val="074F6A" w:themeColor="accent4" w:themeShade="80"/>
+                <w:sz w:val="24"/>
+                <w:szCs w:val="24"/>
+              </w:rPr>
+              <w:t xml:space="preserve">Arugment is？ </w:t>
+            </w:r>
+          </w:p>
+        </w:tc>
+        <w:tc>
+          <w:tcPr>
+            <w:tcW w:w="5528" w:type="dxa"/>
+          </w:tcPr>
+          <w:p>
+            <w:pPr>
+              <w:spacing w:line="360" w:lineRule="auto"/>
+              <w:jc w:val="left"/>
+              <w:rPr>
+                <w:rFonts w:cstheme="majorBidi" w:hint="eastAsia"/>
+                <w:color w:val="0F4761" w:themeColor="accent1" w:themeShade="BF"/>
+                <w:sz w:val="24"/>
+                <w:szCs w:val="24"/>
+              </w:rPr>
+            </w:pPr>
+            <w:r>
+              <w:rPr>
+                <w:rFonts w:cstheme="majorBidi" w:hint="eastAsia"/>
+                <w:color w:val="0F4761" w:themeColor="accent1" w:themeShade="BF"/>
+                <w:sz w:val="24"/>
+                <w:szCs w:val="24"/>
+              </w:rPr>
+              <w:t>Inv</w:t>
+            </w:r>
+            <w:r>
+              <w:rPr>
+                <w:rFonts w:cstheme="majorBidi" w:hint="eastAsia"/>
+                <w:color w:val="0F4761" w:themeColor="accent1" w:themeShade="BF"/>
+                <w:sz w:val="24"/>
+                <w:szCs w:val="24"/>
+              </w:rPr>
+              <w:t>alid</w:t>
+            </w:r>
+          </w:p>
+        </w:tc>
+      </w:tr>
+    </w:tbl>
+    <w:p>
+      <w:pPr>
+        <w:spacing w:line="360" w:lineRule="auto"/>
+        <w:jc w:val="left"/>
+        <w:rPr>
+          <w:color w:val="074F6A" w:themeColor="accent4" w:themeShade="80"/>
+        </w:rPr>
+      </w:pPr>
+    </w:p>
+    <w:p>
+      <w:pPr>
+        <w:spacing w:line="360" w:lineRule="auto"/>
+        <w:jc w:val="left"/>
+        <w:rPr>
+          <w:color w:val="074F6A" w:themeColor="accent4" w:themeShade="80"/>
+        </w:rPr>
+      </w:pPr>
+      <w:r>
+        <w:rPr>
+          <w:rFonts w:hint="eastAsia"/>
+          <w:color w:val="074F6A" w:themeColor="accent4" w:themeShade="80"/>
+        </w:rPr>
+        <w:t>例子</w:t>
+      </w:r>
+      <w:r>
+        <w:rPr>
+          <w:rFonts w:hint="eastAsia"/>
+          <w:color w:val="074F6A" w:themeColor="accent4" w:themeShade="80"/>
+        </w:rPr>
+        <w:t>4</w:t>
+      </w:r>
+      <w:r>
+        <w:rPr>
+          <w:rFonts w:hint="eastAsia"/>
+          <w:color w:val="074F6A" w:themeColor="accent4" w:themeShade="80"/>
+        </w:rPr>
+        <w:t>：</w:t>
+      </w:r>
+      <w:r>
+        <w:rPr>
+          <w:rFonts w:hint="eastAsia"/>
+          <w:color w:val="074F6A" w:themeColor="accent4" w:themeShade="80"/>
+        </w:rPr>
+        <w:t>（注意： 如果All premise为真的行不存在， Argument is valid）</w:t>
+      </w:r>
+    </w:p>
+    <w:p>
+      <w:pPr>
+        <w:spacing w:line="360" w:lineRule="auto"/>
+        <w:jc w:val="left"/>
+        <w:rPr>
+          <w:color w:val="074F6A" w:themeColor="accent4" w:themeShade="80"/>
+        </w:rPr>
+      </w:pPr>
+      <w:r>
+        <w:rPr>
+          <w:noProof/>
+          <w:color w:val="074F6A" w:themeColor="accent4" w:themeShade="80"/>
+        </w:rPr>
+        <w:drawing>
+          <wp:inline distT="0" distB="0" distL="0" distR="0" wp14:anchorId="55C4DA3E" wp14:editId="6098F865">
+            <wp:extent cx="5886450" cy="1701930"/>
+            <wp:effectExtent l="0" t="0" r="0" b="0"/>
+            <wp:docPr id="1736292935" name="图片 4"/>
+            <wp:cNvGraphicFramePr>
+              <a:graphicFrameLocks xmlns:a="http://schemas.openxmlformats.org/drawingml/2006/main" noChangeAspect="1"/>
+            </wp:cNvGraphicFramePr>
+            <a:graphic xmlns:a="http://schemas.openxmlformats.org/drawingml/2006/main">
+              <a:graphicData uri="http://schemas.openxmlformats.org/drawingml/2006/picture">
+                <pic:pic xmlns:pic="http://schemas.openxmlformats.org/drawingml/2006/picture">
+                  <pic:nvPicPr>
+                    <pic:cNvPr id="0" name="Picture 4"/>
+                    <pic:cNvPicPr>
+                      <a:picLocks noChangeAspect="1" noChangeArrowheads="1"/>
+                    </pic:cNvPicPr>
+                  </pic:nvPicPr>
+                  <pic:blipFill>
+                    <a:blip r:embed="rId39">
+                      <a:extLst>
+                        <a:ext uri="{28A0092B-C50C-407E-A947-70E740481C1C}">
+                          <a14:useLocalDpi xmlns:a14="http://schemas.microsoft.com/office/drawing/2010/main" val="0"/>
+                        </a:ext>
+                      </a:extLst>
+                    </a:blip>
+                    <a:srcRect/>
+                    <a:stretch>
+                      <a:fillRect/>
+                    </a:stretch>
+                  </pic:blipFill>
+                  <pic:spPr bwMode="auto">
+                    <a:xfrm>
+                      <a:off x="0" y="0"/>
+                      <a:ext cx="5905208" cy="1707353"/>
+                    </a:xfrm>
+                    <a:prstGeom prst="rect">
+                      <a:avLst/>
+                    </a:prstGeom>
+                    <a:noFill/>
+                    <a:ln>
+                      <a:noFill/>
+                    </a:ln>
+                  </pic:spPr>
+                </pic:pic>
+              </a:graphicData>
+            </a:graphic>
+          </wp:inline>
+        </w:drawing>
+      </w:r>
+    </w:p>
+    <w:p>
+      <w:pPr>
+        <w:spacing w:line="360" w:lineRule="auto"/>
+        <w:jc w:val="left"/>
+        <w:rPr>
+          <w:rFonts w:hint="eastAsia"/>
+          <w:color w:val="074F6A" w:themeColor="accent4" w:themeShade="80"/>
+        </w:rPr>
+      </w:pPr>
+    </w:p>
+    <w:p>
+      <w:pPr>
+        <w:spacing w:line="360" w:lineRule="auto"/>
+        <w:jc w:val="left"/>
+        <w:rPr>
+          <w:color w:val="074F6A" w:themeColor="accent4" w:themeShade="80"/>
+        </w:rPr>
+      </w:pPr>
+      <w:r>
+        <w:rPr>
+          <w:rFonts w:hint="eastAsia"/>
+          <w:color w:val="074F6A" w:themeColor="accent4" w:themeShade="80"/>
+        </w:rPr>
+        <w:t>例子</w:t>
+      </w:r>
+      <w:r>
+        <w:rPr>
+          <w:rFonts w:hint="eastAsia"/>
+          <w:color w:val="074F6A" w:themeColor="accent4" w:themeShade="80"/>
+        </w:rPr>
+        <w:t>5</w:t>
+      </w:r>
+      <w:r>
+        <w:rPr>
+          <w:rFonts w:hint="eastAsia"/>
+          <w:color w:val="074F6A" w:themeColor="accent4" w:themeShade="80"/>
+        </w:rPr>
+        <w:t>：</w:t>
+      </w:r>
+    </w:p>
+    <w:p>
+      <w:pPr>
+        <w:spacing w:line="360" w:lineRule="auto"/>
+        <w:jc w:val="left"/>
+        <w:rPr>
+          <w:color w:val="074F6A" w:themeColor="accent4" w:themeShade="80"/>
+        </w:rPr>
+      </w:pPr>
+      <w:r>
+        <w:rPr>
+          <w:rFonts w:hint="eastAsia"/>
+          <w:noProof/>
+          <w:color w:val="074F6A" w:themeColor="accent4" w:themeShade="80"/>
+        </w:rPr>
+        <w:drawing>
+          <wp:inline distT="0" distB="0" distL="0" distR="0" wp14:anchorId="36753BD5" wp14:editId="39502AF8">
+            <wp:extent cx="5886450" cy="2542068"/>
+            <wp:effectExtent l="0" t="0" r="0" b="0"/>
+            <wp:docPr id="1023247430" name="图片 6"/>
+            <wp:cNvGraphicFramePr>
+              <a:graphicFrameLocks xmlns:a="http://schemas.openxmlformats.org/drawingml/2006/main" noChangeAspect="1"/>
+            </wp:cNvGraphicFramePr>
+            <a:graphic xmlns:a="http://schemas.openxmlformats.org/drawingml/2006/main">
+              <a:graphicData uri="http://schemas.openxmlformats.org/drawingml/2006/picture">
+                <pic:pic xmlns:pic="http://schemas.openxmlformats.org/drawingml/2006/picture">
+                  <pic:nvPicPr>
+                    <pic:cNvPr id="0" name="Picture 6"/>
+                    <pic:cNvPicPr>
+                      <a:picLocks noChangeAspect="1" noChangeArrowheads="1"/>
+                    </pic:cNvPicPr>
+                  </pic:nvPicPr>
+                  <pic:blipFill>
+                    <a:blip r:embed="rId40">
+                      <a:extLst>
+                        <a:ext uri="{28A0092B-C50C-407E-A947-70E740481C1C}">
+                          <a14:useLocalDpi xmlns:a14="http://schemas.microsoft.com/office/drawing/2010/main" val="0"/>
+                        </a:ext>
+                      </a:extLst>
+                    </a:blip>
+                    <a:srcRect/>
+                    <a:stretch>
+                      <a:fillRect/>
+                    </a:stretch>
+                  </pic:blipFill>
+                  <pic:spPr bwMode="auto">
+                    <a:xfrm>
+                      <a:off x="0" y="0"/>
+                      <a:ext cx="5887791" cy="2542647"/>
+                    </a:xfrm>
+                    <a:prstGeom prst="rect">
+                      <a:avLst/>
+                    </a:prstGeom>
+                    <a:noFill/>
+                    <a:ln>
+                      <a:noFill/>
+                    </a:ln>
+                  </pic:spPr>
+                </pic:pic>
+              </a:graphicData>
+            </a:graphic>
+          </wp:inline>
+        </w:drawing>
+      </w:r>
+    </w:p>
+    <w:p>
+      <w:pPr>
+        <w:spacing w:line="360" w:lineRule="auto"/>
+        <w:jc w:val="left"/>
+        <w:rPr>
+          <w:color w:val="074F6A" w:themeColor="accent4" w:themeShade="80"/>
+        </w:rPr>
+      </w:pPr>
+    </w:p>
+    <w:p>
+      <w:pPr>
+        <w:pStyle w:val="5"/>
+      </w:pPr>
+      <w:r>
+        <w:rPr>
+          <w:rFonts w:hint="eastAsia"/>
+        </w:rPr>
+        <w:t>2.3.</w:t>
+      </w:r>
+      <w:r>
+        <w:rPr>
+          <w:rFonts w:hint="eastAsia"/>
+        </w:rPr>
+        <w:t>3</w:t>
+      </w:r>
+      <w:r>
+        <w:rPr>
+          <w:rFonts w:hint="eastAsia"/>
+        </w:rPr>
+        <w:t xml:space="preserve"> </w:t>
+      </w:r>
+      <w:r>
+        <w:t>Rules of inference</w:t>
+      </w:r>
+      <w:r>
+        <w:rPr>
+          <w:rFonts w:hint="eastAsia"/>
+        </w:rPr>
+        <w:t>（</w:t>
+      </w:r>
+      <w:r>
+        <w:t>推理规则</w:t>
+      </w:r>
+      <w:r>
+        <w:rPr>
+          <w:rFonts w:hint="eastAsia"/>
+        </w:rPr>
+        <w:t>）</w:t>
+      </w:r>
+    </w:p>
+    <w:p>
+      <w:pPr>
+        <w:spacing w:line="360" w:lineRule="auto"/>
+        <w:ind w:firstLine="420"/>
+        <w:rPr>
+          <w:color w:val="074F6A" w:themeColor="accent4" w:themeShade="80"/>
+        </w:rPr>
+      </w:pPr>
+      <w:r>
+        <w:rPr>
+          <w:color w:val="074F6A" w:themeColor="accent4" w:themeShade="80"/>
+        </w:rPr>
+        <w:t>如果原子命题很多，或者使用的是谓词逻辑，那么用真值表来检验（论证）就是不可行的。</w:t>
+      </w:r>
+    </w:p>
+    <w:p>
+      <w:pPr>
+        <w:spacing w:line="360" w:lineRule="auto"/>
+        <w:ind w:firstLine="420"/>
+        <w:rPr>
+          <w:color w:val="074F6A" w:themeColor="accent4" w:themeShade="80"/>
+        </w:rPr>
+      </w:pPr>
+      <w:r>
+        <w:rPr>
+          <w:color w:val="074F6A" w:themeColor="accent4" w:themeShade="80"/>
+        </w:rPr>
+        <w:t>取而代之的是，我们使用</w:t>
+      </w:r>
+      <w:r>
+        <w:rPr>
+          <w:b/>
+          <w:bCs/>
+          <w:color w:val="074F6A" w:themeColor="accent4" w:themeShade="80"/>
+        </w:rPr>
+        <w:t>推理规则（rules of inference）</w:t>
+      </w:r>
+      <w:r>
+        <w:rPr>
+          <w:color w:val="074F6A" w:themeColor="accent4" w:themeShade="80"/>
+        </w:rPr>
+        <w:t>来验证一个论证是否有效。</w:t>
+      </w:r>
+    </w:p>
+    <w:p>
+      <w:pPr>
+        <w:numPr>
+          <w:ilvl w:val="0"/>
+          <w:numId w:val="15"/>
+        </w:numPr>
+        <w:spacing w:line="360" w:lineRule="auto"/>
+        <w:rPr>
+          <w:color w:val="074F6A" w:themeColor="accent4" w:themeShade="80"/>
+        </w:rPr>
+      </w:pPr>
+      <w:r>
+        <w:rPr>
+          <w:color w:val="074F6A" w:themeColor="accent4" w:themeShade="80"/>
+        </w:rPr>
+        <w:t>首先，列出该</w:t>
+      </w:r>
+      <w:r>
+        <w:rPr>
+          <w:rFonts w:hint="eastAsia"/>
+          <w:color w:val="074F6A" w:themeColor="accent4" w:themeShade="80"/>
+        </w:rPr>
+        <w:t>Argument（</w:t>
+      </w:r>
+      <w:r>
+        <w:rPr>
+          <w:color w:val="074F6A" w:themeColor="accent4" w:themeShade="80"/>
+        </w:rPr>
+        <w:t>论证</w:t>
+      </w:r>
+      <w:r>
+        <w:rPr>
+          <w:rFonts w:hint="eastAsia"/>
+          <w:color w:val="074F6A" w:themeColor="accent4" w:themeShade="80"/>
+        </w:rPr>
+        <w:t>）</w:t>
+      </w:r>
+      <w:r>
+        <w:rPr>
+          <w:color w:val="074F6A" w:themeColor="accent4" w:themeShade="80"/>
+        </w:rPr>
+        <w:t>的各个</w:t>
+      </w:r>
+      <w:r>
+        <w:rPr>
+          <w:rFonts w:hint="eastAsia"/>
+          <w:color w:val="074F6A" w:themeColor="accent4" w:themeShade="80"/>
+        </w:rPr>
+        <w:t>premise</w:t>
+      </w:r>
+      <w:r>
+        <w:rPr>
+          <w:rFonts w:hint="eastAsia"/>
+          <w:color w:val="074F6A" w:themeColor="accent4" w:themeShade="80"/>
+        </w:rPr>
+        <w:t>（</w:t>
+      </w:r>
+      <w:r>
+        <w:rPr>
+          <w:color w:val="074F6A" w:themeColor="accent4" w:themeShade="80"/>
+        </w:rPr>
+        <w:t>前提</w:t>
+      </w:r>
+      <w:r>
+        <w:rPr>
+          <w:rFonts w:hint="eastAsia"/>
+          <w:color w:val="074F6A" w:themeColor="accent4" w:themeShade="80"/>
+        </w:rPr>
+        <w:t>）</w:t>
+      </w:r>
+      <w:r>
+        <w:rPr>
+          <w:color w:val="074F6A" w:themeColor="accent4" w:themeShade="80"/>
+        </w:rPr>
+        <w:t>。</w:t>
+      </w:r>
+    </w:p>
+    <w:p>
+      <w:pPr>
+        <w:numPr>
+          <w:ilvl w:val="0"/>
+          <w:numId w:val="15"/>
+        </w:numPr>
+        <w:spacing w:line="360" w:lineRule="auto"/>
+        <w:rPr>
+          <w:color w:val="074F6A" w:themeColor="accent4" w:themeShade="80"/>
+        </w:rPr>
+      </w:pPr>
+      <w:r>
+        <w:rPr>
+          <w:color w:val="074F6A" w:themeColor="accent4" w:themeShade="80"/>
+        </w:rPr>
+        <w:t>然后，利用推理规则，从序列中已有的命题推出新的逻辑命题。</w:t>
+      </w:r>
+    </w:p>
+    <w:p>
+      <w:pPr>
+        <w:numPr>
+          <w:ilvl w:val="0"/>
+          <w:numId w:val="15"/>
+        </w:numPr>
+        <w:spacing w:line="360" w:lineRule="auto"/>
+        <w:rPr>
+          <w:color w:val="074F6A" w:themeColor="accent4" w:themeShade="80"/>
+        </w:rPr>
+      </w:pPr>
+      <w:r>
+        <w:rPr>
+          <w:color w:val="074F6A" w:themeColor="accent4" w:themeShade="80"/>
+        </w:rPr>
+        <w:t>这些推理规则的设计保证了：只要我们假定</w:t>
+      </w:r>
+      <w:r>
+        <w:rPr>
+          <w:rFonts w:hint="eastAsia"/>
+          <w:color w:val="074F6A" w:themeColor="accent4" w:themeShade="80"/>
+        </w:rPr>
+        <w:t>premise</w:t>
+      </w:r>
+      <w:r>
+        <w:rPr>
+          <w:color w:val="074F6A" w:themeColor="accent4" w:themeShade="80"/>
+        </w:rPr>
+        <w:t>为真，序列中推导出的每一个命题也都为真。</w:t>
+      </w:r>
+    </w:p>
+    <w:p>
+      <w:pPr>
+        <w:numPr>
+          <w:ilvl w:val="0"/>
+          <w:numId w:val="15"/>
+        </w:numPr>
+        <w:spacing w:line="360" w:lineRule="auto"/>
+        <w:rPr>
+          <w:color w:val="074F6A" w:themeColor="accent4" w:themeShade="80"/>
+        </w:rPr>
+      </w:pPr>
+      <w:r>
+        <w:rPr>
+          <w:color w:val="074F6A" w:themeColor="accent4" w:themeShade="80"/>
+        </w:rPr>
+        <w:t>如果我们最终推出了该论证的结论，那么就知道：前提的真实性必然导致结论的真实性，因此该论证是</w:t>
+      </w:r>
+      <w:r>
+        <w:rPr>
+          <w:b/>
+          <w:bCs/>
+          <w:color w:val="074F6A" w:themeColor="accent4" w:themeShade="80"/>
+        </w:rPr>
+        <w:t>有效的</w:t>
+      </w:r>
+      <w:r>
+        <w:rPr>
+          <w:color w:val="074F6A" w:themeColor="accent4" w:themeShade="80"/>
+        </w:rPr>
+        <w:t>。</w:t>
+      </w:r>
+    </w:p>
+    <w:p>
+      <w:pPr>
+        <w:spacing w:line="360" w:lineRule="auto"/>
+        <w:ind w:firstLine="420"/>
+        <w:rPr>
+          <w:rFonts w:hint="eastAsia"/>
+          <w:color w:val="074F6A" w:themeColor="accent4" w:themeShade="80"/>
+        </w:rPr>
+      </w:pPr>
+    </w:p>
+    <w:p>
+      <w:pPr>
+        <w:pStyle w:val="6"/>
+      </w:pPr>
+      <w:r>
+        <w:rPr>
+          <w:rFonts w:hint="eastAsia"/>
+        </w:rPr>
+        <w:lastRenderedPageBreak/>
+        <w:t>规则</w:t>
+      </w:r>
+      <w:r>
+        <w:rPr>
+          <w:rFonts w:hint="eastAsia"/>
+        </w:rPr>
+        <w:t xml:space="preserve">1  </w:t>
+      </w:r>
+      <w:r>
+        <w:t>Conjunction Elimination</w:t>
+      </w:r>
+      <w:r>
+        <w:rPr>
+          <w:rFonts w:hint="eastAsia"/>
+        </w:rPr>
+        <w:t xml:space="preserve"> 规则</w:t>
+      </w:r>
+      <w:r>
+        <w:t>（合取消去</w:t>
+      </w:r>
+      <w:r>
+        <w:rPr>
+          <w:rFonts w:hint="eastAsia"/>
+        </w:rPr>
+        <w:t>规则</w:t>
+      </w:r>
+      <w:r>
+        <w:t>，∧Elim）</w:t>
+      </w:r>
+    </w:p>
+    <w:p>
+      <w:pPr>
+        <w:pStyle w:val="6"/>
+      </w:pPr>
+      <w:r>
+        <w:rPr>
+          <w:noProof/>
+        </w:rPr>
+        <w:drawing>
+          <wp:inline distT="0" distB="0" distL="0" distR="0" wp14:anchorId="3EDEF568" wp14:editId="1186CEE5">
+            <wp:extent cx="4419600" cy="4354332"/>
+            <wp:effectExtent l="0" t="0" r="0" b="8255"/>
+            <wp:docPr id="189516789" name="图片 7"/>
+            <wp:cNvGraphicFramePr>
+              <a:graphicFrameLocks xmlns:a="http://schemas.openxmlformats.org/drawingml/2006/main" noChangeAspect="1"/>
+            </wp:cNvGraphicFramePr>
+            <a:graphic xmlns:a="http://schemas.openxmlformats.org/drawingml/2006/main">
+              <a:graphicData uri="http://schemas.openxmlformats.org/drawingml/2006/picture">
+                <pic:pic xmlns:pic="http://schemas.openxmlformats.org/drawingml/2006/picture">
+                  <pic:nvPicPr>
+                    <pic:cNvPr id="0" name="Picture 7"/>
+                    <pic:cNvPicPr>
+                      <a:picLocks noChangeAspect="1" noChangeArrowheads="1"/>
+                    </pic:cNvPicPr>
+                  </pic:nvPicPr>
+                  <pic:blipFill>
+                    <a:blip r:embed="rId41">
+                      <a:extLst>
+                        <a:ext uri="{28A0092B-C50C-407E-A947-70E740481C1C}">
+                          <a14:useLocalDpi xmlns:a14="http://schemas.microsoft.com/office/drawing/2010/main" val="0"/>
+                        </a:ext>
+                      </a:extLst>
+                    </a:blip>
+                    <a:srcRect/>
+                    <a:stretch>
+                      <a:fillRect/>
+                    </a:stretch>
+                  </pic:blipFill>
+                  <pic:spPr bwMode="auto">
+                    <a:xfrm>
+                      <a:off x="0" y="0"/>
+                      <a:ext cx="4424646" cy="4359303"/>
+                    </a:xfrm>
+                    <a:prstGeom prst="rect">
+                      <a:avLst/>
+                    </a:prstGeom>
+                    <a:noFill/>
+                    <a:ln>
+                      <a:noFill/>
+                    </a:ln>
+                  </pic:spPr>
+                </pic:pic>
+              </a:graphicData>
+            </a:graphic>
+          </wp:inline>
+        </w:drawing>
+      </w:r>
+    </w:p>
+    <w:p>
+      <w:pPr>
+        <w:rPr>
+          <w:rFonts w:hint="eastAsia"/>
+        </w:rPr>
+      </w:pPr>
+    </w:p>
+    <w:p>
+      <w:pPr>
+        <w:pStyle w:val="6"/>
+      </w:pPr>
+      <w:r>
+        <w:rPr>
+          <w:rFonts w:hint="eastAsia"/>
+        </w:rPr>
+        <w:t>规则2</w:t>
+      </w:r>
+      <w:r>
+        <w:rPr>
+          <w:rFonts w:hint="eastAsia"/>
+        </w:rPr>
+        <w:t xml:space="preserve">  </w:t>
+      </w:r>
+      <w:r>
+        <w:t>Conjunction Introduction</w:t>
+      </w:r>
+      <w:r>
+        <w:rPr>
+          <w:rFonts w:hint="eastAsia"/>
+        </w:rPr>
+        <w:t>规则</w:t>
+      </w:r>
+      <w:r>
+        <w:t>（合取引入</w:t>
+      </w:r>
+      <w:r>
+        <w:rPr>
+          <w:rFonts w:hint="eastAsia"/>
+        </w:rPr>
+        <w:t>规则</w:t>
+      </w:r>
+      <w:r>
+        <w:t>，∧Intro）</w:t>
+      </w:r>
+    </w:p>
+    <w:p>
+      <w:pPr>
+        <w:rPr>
+          <w:rFonts w:hint="eastAsia"/>
+        </w:rPr>
+      </w:pPr>
+      <w:r>
+        <w:rPr>
+          <w:rFonts w:hint="eastAsia"/>
+          <w:noProof/>
+        </w:rPr>
+        <w:drawing>
+          <wp:inline distT="0" distB="0" distL="0" distR="0" wp14:anchorId="09AC4447" wp14:editId="76678B0C">
+            <wp:extent cx="4791075" cy="4432433"/>
+            <wp:effectExtent l="0" t="0" r="0" b="6350"/>
+            <wp:docPr id="558577449" name="图片 8"/>
+            <wp:cNvGraphicFramePr>
+              <a:graphicFrameLocks xmlns:a="http://schemas.openxmlformats.org/drawingml/2006/main" noChangeAspect="1"/>
+            </wp:cNvGraphicFramePr>
+            <a:graphic xmlns:a="http://schemas.openxmlformats.org/drawingml/2006/main">
+              <a:graphicData uri="http://schemas.openxmlformats.org/drawingml/2006/picture">
+                <pic:pic xmlns:pic="http://schemas.openxmlformats.org/drawingml/2006/picture">
+                  <pic:nvPicPr>
+                    <pic:cNvPr id="0" name="Picture 8"/>
+                    <pic:cNvPicPr>
+                      <a:picLocks noChangeAspect="1" noChangeArrowheads="1"/>
+                    </pic:cNvPicPr>
+                  </pic:nvPicPr>
+                  <pic:blipFill>
+                    <a:blip r:embed="rId42">
+                      <a:extLst>
+                        <a:ext uri="{28A0092B-C50C-407E-A947-70E740481C1C}">
+                          <a14:useLocalDpi xmlns:a14="http://schemas.microsoft.com/office/drawing/2010/main" val="0"/>
+                        </a:ext>
+                      </a:extLst>
+                    </a:blip>
+                    <a:srcRect/>
+                    <a:stretch>
+                      <a:fillRect/>
+                    </a:stretch>
+                  </pic:blipFill>
+                  <pic:spPr bwMode="auto">
+                    <a:xfrm>
+                      <a:off x="0" y="0"/>
+                      <a:ext cx="4795163" cy="4436215"/>
+                    </a:xfrm>
+                    <a:prstGeom prst="rect">
+                      <a:avLst/>
+                    </a:prstGeom>
+                    <a:noFill/>
+                    <a:ln>
+                      <a:noFill/>
+                    </a:ln>
+                  </pic:spPr>
+                </pic:pic>
+              </a:graphicData>
+            </a:graphic>
+          </wp:inline>
+        </w:drawing>
+      </w:r>
+    </w:p>
+    <w:p>
+      <w:pPr>
+        <w:pStyle w:val="6"/>
+        <w:rPr>
+          <w:color w:val="074F6A" w:themeColor="accent4" w:themeShade="80"/>
+        </w:rPr>
+      </w:pPr>
+      <w:r>
+        <w:rPr>
+          <w:color w:val="074F6A" w:themeColor="accent4" w:themeShade="80"/>
+        </w:rPr>
+        <w:lastRenderedPageBreak/>
+        <w:t>两者关系</w:t>
+      </w:r>
+    </w:p>
+    <w:p>
+      <w:pPr>
+        <w:pStyle w:val="6"/>
+        <w:numPr>
+          <w:ilvl w:val="0"/>
+          <w:numId w:val="16"/>
+        </w:numPr>
+        <w:rPr>
+          <w:color w:val="074F6A" w:themeColor="accent4" w:themeShade="80"/>
+        </w:rPr>
+      </w:pPr>
+      <w:r>
+        <w:rPr>
+          <w:color w:val="074F6A" w:themeColor="accent4" w:themeShade="80"/>
+        </w:rPr>
+        <w:t>消去（Elim）：</w:t>
+      </w:r>
+      <w:r>
+        <w:rPr>
+          <w:i/>
+          <w:iCs/>
+          <w:color w:val="074F6A" w:themeColor="accent4" w:themeShade="80"/>
+        </w:rPr>
+        <w:t>A</w:t>
+      </w:r>
+      <w:r>
+        <w:rPr>
+          <w:color w:val="074F6A" w:themeColor="accent4" w:themeShade="80"/>
+        </w:rPr>
+        <w:t>∧</w:t>
+      </w:r>
+      <w:r>
+        <w:rPr>
+          <w:i/>
+          <w:iCs/>
+          <w:color w:val="074F6A" w:themeColor="accent4" w:themeShade="80"/>
+        </w:rPr>
+        <w:t>B</w:t>
+      </w:r>
+      <w:r>
+        <w:rPr>
+          <w:rFonts w:ascii="Cambria Math" w:hAnsi="Cambria Math" w:cs="Cambria Math"/>
+          <w:color w:val="074F6A" w:themeColor="accent4" w:themeShade="80"/>
+        </w:rPr>
+        <w:t>⇒</w:t>
+      </w:r>
+      <w:r>
+        <w:rPr>
+          <w:i/>
+          <w:iCs/>
+          <w:color w:val="074F6A" w:themeColor="accent4" w:themeShade="80"/>
+        </w:rPr>
+        <w:t>A</w:t>
+      </w:r>
+      <w:r>
+        <w:rPr>
+          <w:color w:val="074F6A" w:themeColor="accent4" w:themeShade="80"/>
+        </w:rPr>
+        <w:t xml:space="preserve"> （拆开用），口诀"有且有，可以取一个"。</w:t>
+      </w:r>
+    </w:p>
+    <w:p>
+      <w:pPr>
+        <w:pStyle w:val="6"/>
+        <w:numPr>
+          <w:ilvl w:val="0"/>
+          <w:numId w:val="16"/>
+        </w:numPr>
+        <w:rPr>
+          <w:color w:val="074F6A" w:themeColor="accent4" w:themeShade="80"/>
+        </w:rPr>
+      </w:pPr>
+      <w:r>
+        <w:rPr>
+          <w:color w:val="074F6A" w:themeColor="accent4" w:themeShade="80"/>
+        </w:rPr>
+        <w:t>引入（Intro）：</w:t>
+      </w:r>
+      <w:r>
+        <w:rPr>
+          <w:i/>
+          <w:iCs/>
+          <w:color w:val="074F6A" w:themeColor="accent4" w:themeShade="80"/>
+        </w:rPr>
+        <w:t>A</w:t>
+      </w:r>
+      <w:r>
+        <w:rPr>
+          <w:color w:val="074F6A" w:themeColor="accent4" w:themeShade="80"/>
+        </w:rPr>
+        <w:t>, </w:t>
+      </w:r>
+      <w:r>
+        <w:rPr>
+          <w:i/>
+          <w:iCs/>
+          <w:color w:val="074F6A" w:themeColor="accent4" w:themeShade="80"/>
+        </w:rPr>
+        <w:t>B</w:t>
+      </w:r>
+      <w:r>
+        <w:rPr>
+          <w:rFonts w:ascii="Cambria Math" w:hAnsi="Cambria Math" w:cs="Cambria Math"/>
+          <w:color w:val="074F6A" w:themeColor="accent4" w:themeShade="80"/>
+        </w:rPr>
+        <w:t>⇒</w:t>
+      </w:r>
+      <w:r>
+        <w:rPr>
+          <w:i/>
+          <w:iCs/>
+          <w:color w:val="074F6A" w:themeColor="accent4" w:themeShade="80"/>
+        </w:rPr>
+        <w:t>A</w:t>
+      </w:r>
+      <w:r>
+        <w:rPr>
+          <w:color w:val="074F6A" w:themeColor="accent4" w:themeShade="80"/>
+        </w:rPr>
+        <w:t>∧</w:t>
+      </w:r>
+      <w:r>
+        <w:rPr>
+          <w:i/>
+          <w:iCs/>
+          <w:color w:val="074F6A" w:themeColor="accent4" w:themeShade="80"/>
+        </w:rPr>
+        <w:t>B</w:t>
+      </w:r>
+      <w:r>
+        <w:rPr>
+          <w:color w:val="074F6A" w:themeColor="accent4" w:themeShade="80"/>
+        </w:rPr>
+        <w:t xml:space="preserve"> （合起来用），口诀"两个都有，可以合着说"。</w:t>
+      </w:r>
+    </w:p>
+    <w:p>
+      <w:pPr>
+        <w:pStyle w:val="6"/>
+        <w:rPr>
+          <w:color w:val="074F6A" w:themeColor="accent4" w:themeShade="80"/>
+        </w:rPr>
+      </w:pPr>
+    </w:p>
+    <w:p>
+      <w:pPr>
+        <w:pStyle w:val="6"/>
+        <w:rPr>
+          <w:rFonts w:hint="eastAsia"/>
+        </w:rPr>
+      </w:pPr>
+      <w:r>
+        <w:rPr>
+          <w:rFonts w:hint="eastAsia"/>
+        </w:rPr>
+        <w:t xml:space="preserve">规则3 </w:t>
+      </w:r>
+      <w:r>
+        <w:t>Implication Elimination</w:t>
+      </w:r>
+      <w:r>
+        <w:rPr>
+          <w:rFonts w:hint="eastAsia"/>
+        </w:rPr>
+        <w:t>规则</w:t>
+      </w:r>
+      <w:r>
+        <w:t>（蕴含消去，</w:t>
+      </w:r>
+      <w:r>
+        <w:rPr>
+          <w:rFonts w:ascii="Cambria Math" w:hAnsi="Cambria Math" w:cs="Cambria Math"/>
+        </w:rPr>
+        <w:t>⇒</w:t>
+      </w:r>
+      <w:r>
+        <w:t>Elim）</w:t>
+      </w:r>
+    </w:p>
+    <w:p>
+      <w:r>
+        <w:rPr>
+          <w:rFonts w:hint="eastAsia"/>
+          <w:noProof/>
+        </w:rPr>
+        <w:drawing>
+          <wp:inline distT="0" distB="0" distL="0" distR="0" wp14:anchorId="16CCBC30" wp14:editId="240BCE74">
+            <wp:extent cx="5219700" cy="5219700"/>
+            <wp:effectExtent l="0" t="0" r="0" b="0"/>
+            <wp:docPr id="642948128" name="图片 9"/>
+            <wp:cNvGraphicFramePr>
+              <a:graphicFrameLocks xmlns:a="http://schemas.openxmlformats.org/drawingml/2006/main" noChangeAspect="1"/>
+            </wp:cNvGraphicFramePr>
+            <a:graphic xmlns:a="http://schemas.openxmlformats.org/drawingml/2006/main">
+              <a:graphicData uri="http://schemas.openxmlformats.org/drawingml/2006/picture">
+                <pic:pic xmlns:pic="http://schemas.openxmlformats.org/drawingml/2006/picture">
+                  <pic:nvPicPr>
+                    <pic:cNvPr id="0" name="Picture 9"/>
+                    <pic:cNvPicPr>
+                      <a:picLocks noChangeAspect="1" noChangeArrowheads="1"/>
+                    </pic:cNvPicPr>
+                  </pic:nvPicPr>
+                  <pic:blipFill>
+                    <a:blip r:embed="rId43">
+                      <a:extLst>
+                        <a:ext uri="{28A0092B-C50C-407E-A947-70E740481C1C}">
+                          <a14:useLocalDpi xmlns:a14="http://schemas.microsoft.com/office/drawing/2010/main" val="0"/>
+                        </a:ext>
+                      </a:extLst>
+                    </a:blip>
+                    <a:srcRect/>
+                    <a:stretch>
+                      <a:fillRect/>
+                    </a:stretch>
+                  </pic:blipFill>
+                  <pic:spPr bwMode="auto">
+                    <a:xfrm>
+                      <a:off x="0" y="0"/>
+                      <a:ext cx="5219700" cy="5219700"/>
+                    </a:xfrm>
+                    <a:prstGeom prst="rect">
+                      <a:avLst/>
+                    </a:prstGeom>
+                    <a:noFill/>
+                    <a:ln>
+                      <a:noFill/>
+                    </a:ln>
+                  </pic:spPr>
+                </pic:pic>
+              </a:graphicData>
+            </a:graphic>
+          </wp:inline>
+        </w:drawing>
+      </w:r>
+    </w:p>
+    <w:p>
+      <w:pPr>
+        <w:pStyle w:val="5"/>
+      </w:pPr>
+      <w:r>
+        <w:rPr>
+          <w:rFonts w:hint="eastAsia"/>
+        </w:rPr>
+        <w:t xml:space="preserve">2.3.4 </w:t>
+      </w:r>
+      <w:r>
+        <w:t>Fitch diagrams</w:t>
+      </w:r>
+    </w:p>
+    <w:p>
+      <w:pPr>
+        <w:rPr>
+          <w:rFonts w:hint="eastAsia"/>
+        </w:rPr>
+      </w:pPr>
+      <w:r>
+        <w:rPr>
+          <w:rFonts w:hint="eastAsia"/>
+          <w:noProof/>
+        </w:rPr>
+        <w:drawing>
+          <wp:inline distT="0" distB="0" distL="0" distR="0" wp14:anchorId="41CD0227" wp14:editId="7757D8D6">
+            <wp:extent cx="3429000" cy="1971483"/>
+            <wp:effectExtent l="0" t="0" r="0" b="0"/>
+            <wp:docPr id="547203740" name="图片 11"/>
+            <wp:cNvGraphicFramePr>
+              <a:graphicFrameLocks xmlns:a="http://schemas.openxmlformats.org/drawingml/2006/main" noChangeAspect="1"/>
+            </wp:cNvGraphicFramePr>
+            <a:graphic xmlns:a="http://schemas.openxmlformats.org/drawingml/2006/main">
+              <a:graphicData uri="http://schemas.openxmlformats.org/drawingml/2006/picture">
+                <pic:pic xmlns:pic="http://schemas.openxmlformats.org/drawingml/2006/picture">
+                  <pic:nvPicPr>
+                    <pic:cNvPr id="0" name="Picture 11"/>
+                    <pic:cNvPicPr>
+                      <a:picLocks noChangeAspect="1" noChangeArrowheads="1"/>
+                    </pic:cNvPicPr>
+                  </pic:nvPicPr>
+                  <pic:blipFill>
+                    <a:blip r:embed="rId44">
+                      <a:extLst>
+                        <a:ext uri="{28A0092B-C50C-407E-A947-70E740481C1C}">
+                          <a14:useLocalDpi xmlns:a14="http://schemas.microsoft.com/office/drawing/2010/main" val="0"/>
+                        </a:ext>
+                      </a:extLst>
+                    </a:blip>
+                    <a:srcRect/>
+                    <a:stretch>
+                      <a:fillRect/>
+                    </a:stretch>
+                  </pic:blipFill>
+                  <pic:spPr bwMode="auto">
+                    <a:xfrm>
+                      <a:off x="0" y="0"/>
+                      <a:ext cx="3437966" cy="1976638"/>
+                    </a:xfrm>
+                    <a:prstGeom prst="rect">
+                      <a:avLst/>
+                    </a:prstGeom>
+                    <a:noFill/>
+                    <a:ln>
+                      <a:noFill/>
+                    </a:ln>
+                  </pic:spPr>
+                </pic:pic>
+              </a:graphicData>
+            </a:graphic>
+          </wp:inline>
+        </w:drawing>
+      </w:r>
+    </w:p>
+    <w:p>
+      <w:pPr>
+        <w:rPr>
+          <w:rFonts w:hint="eastAsia"/>
+        </w:rPr>
+      </w:pPr>
+      <w:r>
+        <w:rPr>
+          <w:rFonts w:hint="eastAsia"/>
+          <w:noProof/>
+        </w:rPr>
+        <w:lastRenderedPageBreak/>
+        <w:drawing>
+          <wp:inline distT="0" distB="0" distL="0" distR="0" wp14:anchorId="0B11BBE9" wp14:editId="371D531B">
+            <wp:extent cx="4791075" cy="3305414"/>
+            <wp:effectExtent l="0" t="0" r="0" b="9525"/>
+            <wp:docPr id="2137009659" name="图片 10"/>
+            <wp:cNvGraphicFramePr>
+              <a:graphicFrameLocks xmlns:a="http://schemas.openxmlformats.org/drawingml/2006/main" noChangeAspect="1"/>
+            </wp:cNvGraphicFramePr>
+            <a:graphic xmlns:a="http://schemas.openxmlformats.org/drawingml/2006/main">
+              <a:graphicData uri="http://schemas.openxmlformats.org/drawingml/2006/picture">
+                <pic:pic xmlns:pic="http://schemas.openxmlformats.org/drawingml/2006/picture">
+                  <pic:nvPicPr>
+                    <pic:cNvPr id="0" name="Picture 10"/>
+                    <pic:cNvPicPr>
+                      <a:picLocks noChangeAspect="1" noChangeArrowheads="1"/>
+                    </pic:cNvPicPr>
+                  </pic:nvPicPr>
+                  <pic:blipFill>
+                    <a:blip r:embed="rId45">
+                      <a:extLst>
+                        <a:ext uri="{28A0092B-C50C-407E-A947-70E740481C1C}">
+                          <a14:useLocalDpi xmlns:a14="http://schemas.microsoft.com/office/drawing/2010/main" val="0"/>
+                        </a:ext>
+                      </a:extLst>
+                    </a:blip>
+                    <a:srcRect/>
+                    <a:stretch>
+                      <a:fillRect/>
+                    </a:stretch>
+                  </pic:blipFill>
+                  <pic:spPr bwMode="auto">
+                    <a:xfrm>
+                      <a:off x="0" y="0"/>
+                      <a:ext cx="4832270" cy="3333835"/>
+                    </a:xfrm>
+                    <a:prstGeom prst="rect">
+                      <a:avLst/>
+                    </a:prstGeom>
+                    <a:noFill/>
+                    <a:ln>
+                      <a:noFill/>
+                    </a:ln>
+                  </pic:spPr>
+                </pic:pic>
+              </a:graphicData>
+            </a:graphic>
+          </wp:inline>
+        </w:drawing>
+      </w:r>
+    </w:p>
+    <w:p/>
+    <w:p>
+      <w:pPr>
+        <w:rPr>
+          <w:rFonts w:hint="eastAsia"/>
+        </w:rPr>
+      </w:pPr>
     </w:p>
     <w:sectPr>
       <w:pgSz w:w="11906" w:h="16838"/>
@@ -16766,6 +19515,155 @@
     </w:lvl>
   </w:abstractNum>
   <w:abstractNum w:abstractNumId="8" w15:restartNumberingAfterBreak="0">
+    <w:nsid w:val="59956185"/>
+    <w:multiLevelType w:val="multilevel"/>
+    <w:tmpl w:val="F744B2D4"/>
+    <w:lvl w:ilvl="0">
+      <w:start w:val="1"/>
+      <w:numFmt w:val="bullet"/>
+      <w:lvlText w:val=""/>
+      <w:lvlJc w:val="left"/>
+      <w:pPr>
+        <w:tabs>
+          <w:tab w:val="num" w:pos="720"/>
+        </w:tabs>
+        <w:ind w:left="720" w:hanging="360"/>
+      </w:pPr>
+      <w:rPr>
+        <w:rFonts w:ascii="Symbol" w:hAnsi="Symbol" w:hint="default"/>
+        <w:sz w:val="20"/>
+      </w:rPr>
+    </w:lvl>
+    <w:lvl w:ilvl="1" w:tentative="1">
+      <w:start w:val="1"/>
+      <w:numFmt w:val="bullet"/>
+      <w:lvlText w:val=""/>
+      <w:lvlJc w:val="left"/>
+      <w:pPr>
+        <w:tabs>
+          <w:tab w:val="num" w:pos="1440"/>
+        </w:tabs>
+        <w:ind w:left="1440" w:hanging="360"/>
+      </w:pPr>
+      <w:rPr>
+        <w:rFonts w:ascii="Symbol" w:hAnsi="Symbol" w:hint="default"/>
+        <w:sz w:val="20"/>
+      </w:rPr>
+    </w:lvl>
+    <w:lvl w:ilvl="2" w:tentative="1">
+      <w:start w:val="1"/>
+      <w:numFmt w:val="bullet"/>
+      <w:lvlText w:val=""/>
+      <w:lvlJc w:val="left"/>
+      <w:pPr>
+        <w:tabs>
+          <w:tab w:val="num" w:pos="2160"/>
+        </w:tabs>
+        <w:ind w:left="2160" w:hanging="360"/>
+      </w:pPr>
+      <w:rPr>
+        <w:rFonts w:ascii="Symbol" w:hAnsi="Symbol" w:hint="default"/>
+        <w:sz w:val="20"/>
+      </w:rPr>
+    </w:lvl>
+    <w:lvl w:ilvl="3" w:tentative="1">
+      <w:start w:val="1"/>
+      <w:numFmt w:val="bullet"/>
+      <w:lvlText w:val=""/>
+      <w:lvlJc w:val="left"/>
+      <w:pPr>
+        <w:tabs>
+          <w:tab w:val="num" w:pos="2880"/>
+        </w:tabs>
+        <w:ind w:left="2880" w:hanging="360"/>
+      </w:pPr>
+      <w:rPr>
+        <w:rFonts w:ascii="Symbol" w:hAnsi="Symbol" w:hint="default"/>
+        <w:sz w:val="20"/>
+      </w:rPr>
+    </w:lvl>
+    <w:lvl w:ilvl="4" w:tentative="1">
+      <w:start w:val="1"/>
+      <w:numFmt w:val="bullet"/>
+      <w:lvlText w:val=""/>
+      <w:lvlJc w:val="left"/>
+      <w:pPr>
+        <w:tabs>
+          <w:tab w:val="num" w:pos="3600"/>
+        </w:tabs>
+        <w:ind w:left="3600" w:hanging="360"/>
+      </w:pPr>
+      <w:rPr>
+        <w:rFonts w:ascii="Symbol" w:hAnsi="Symbol" w:hint="default"/>
+        <w:sz w:val="20"/>
+      </w:rPr>
+    </w:lvl>
+    <w:lvl w:ilvl="5" w:tentative="1">
+      <w:start w:val="1"/>
+      <w:numFmt w:val="bullet"/>
+      <w:lvlText w:val=""/>
+      <w:lvlJc w:val="left"/>
+      <w:pPr>
+        <w:tabs>
+          <w:tab w:val="num" w:pos="4320"/>
+        </w:tabs>
+        <w:ind w:left="4320" w:hanging="360"/>
+      </w:pPr>
+      <w:rPr>
+        <w:rFonts w:ascii="Symbol" w:hAnsi="Symbol" w:hint="default"/>
+        <w:sz w:val="20"/>
+      </w:rPr>
+    </w:lvl>
+    <w:lvl w:ilvl="6" w:tentative="1">
+      <w:start w:val="1"/>
+      <w:numFmt w:val="bullet"/>
+      <w:lvlText w:val=""/>
+      <w:lvlJc w:val="left"/>
+      <w:pPr>
+        <w:tabs>
+          <w:tab w:val="num" w:pos="5040"/>
+        </w:tabs>
+        <w:ind w:left="5040" w:hanging="360"/>
+      </w:pPr>
+      <w:rPr>
+        <w:rFonts w:ascii="Symbol" w:hAnsi="Symbol" w:hint="default"/>
+        <w:sz w:val="20"/>
+      </w:rPr>
+    </w:lvl>
+    <w:lvl w:ilvl="7" w:tentative="1">
+      <w:start w:val="1"/>
+      <w:numFmt w:val="bullet"/>
+      <w:lvlText w:val=""/>
+      <w:lvlJc w:val="left"/>
+      <w:pPr>
+        <w:tabs>
+          <w:tab w:val="num" w:pos="5760"/>
+        </w:tabs>
+        <w:ind w:left="5760" w:hanging="360"/>
+      </w:pPr>
+      <w:rPr>
+        <w:rFonts w:ascii="Symbol" w:hAnsi="Symbol" w:hint="default"/>
+        <w:sz w:val="20"/>
+      </w:rPr>
+    </w:lvl>
+    <w:lvl w:ilvl="8" w:tentative="1">
+      <w:start w:val="1"/>
+      <w:numFmt w:val="bullet"/>
+      <w:lvlText w:val=""/>
+      <w:lvlJc w:val="left"/>
+      <w:pPr>
+        <w:tabs>
+          <w:tab w:val="num" w:pos="6480"/>
+        </w:tabs>
+        <w:ind w:left="6480" w:hanging="360"/>
+      </w:pPr>
+      <w:rPr>
+        <w:rFonts w:ascii="Symbol" w:hAnsi="Symbol" w:hint="default"/>
+        <w:sz w:val="20"/>
+      </w:rPr>
+    </w:lvl>
+  </w:abstractNum>
+  <w:abstractNum w:abstractNumId="9" w15:restartNumberingAfterBreak="0">
     <w:nsid w:val="5D142187"/>
     <w:multiLevelType w:val="multilevel"/>
     <w:tmpl w:val="0409001F"/>
@@ -16878,7 +19776,7 @@
       </w:rPr>
     </w:lvl>
   </w:abstractNum>
-  <w:abstractNum w:abstractNumId="9" w15:restartNumberingAfterBreak="0">
+  <w:abstractNum w:abstractNumId="10" w15:restartNumberingAfterBreak="0">
     <w:nsid w:val="5FF16C55"/>
     <w:multiLevelType w:val="hybridMultilevel"/>
     <w:tmpl w:val="47DAF114"/>
@@ -16991,7 +19889,156 @@
       </w:rPr>
     </w:lvl>
   </w:abstractNum>
-  <w:abstractNum w:abstractNumId="10" w15:restartNumberingAfterBreak="0">
+  <w:abstractNum w:abstractNumId="11" w15:restartNumberingAfterBreak="0">
+    <w:nsid w:val="685B2CC5"/>
+    <w:multiLevelType w:val="multilevel"/>
+    <w:tmpl w:val="5F908CB2"/>
+    <w:lvl w:ilvl="0">
+      <w:start w:val="1"/>
+      <w:numFmt w:val="bullet"/>
+      <w:lvlText w:val=""/>
+      <w:lvlJc w:val="left"/>
+      <w:pPr>
+        <w:tabs>
+          <w:tab w:val="num" w:pos="720"/>
+        </w:tabs>
+        <w:ind w:left="720" w:hanging="360"/>
+      </w:pPr>
+      <w:rPr>
+        <w:rFonts w:ascii="Symbol" w:hAnsi="Symbol" w:hint="default"/>
+        <w:sz w:val="20"/>
+      </w:rPr>
+    </w:lvl>
+    <w:lvl w:ilvl="1" w:tentative="1">
+      <w:start w:val="1"/>
+      <w:numFmt w:val="bullet"/>
+      <w:lvlText w:val=""/>
+      <w:lvlJc w:val="left"/>
+      <w:pPr>
+        <w:tabs>
+          <w:tab w:val="num" w:pos="1440"/>
+        </w:tabs>
+        <w:ind w:left="1440" w:hanging="360"/>
+      </w:pPr>
+      <w:rPr>
+        <w:rFonts w:ascii="Symbol" w:hAnsi="Symbol" w:hint="default"/>
+        <w:sz w:val="20"/>
+      </w:rPr>
+    </w:lvl>
+    <w:lvl w:ilvl="2" w:tentative="1">
+      <w:start w:val="1"/>
+      <w:numFmt w:val="bullet"/>
+      <w:lvlText w:val=""/>
+      <w:lvlJc w:val="left"/>
+      <w:pPr>
+        <w:tabs>
+          <w:tab w:val="num" w:pos="2160"/>
+        </w:tabs>
+        <w:ind w:left="2160" w:hanging="360"/>
+      </w:pPr>
+      <w:rPr>
+        <w:rFonts w:ascii="Symbol" w:hAnsi="Symbol" w:hint="default"/>
+        <w:sz w:val="20"/>
+      </w:rPr>
+    </w:lvl>
+    <w:lvl w:ilvl="3" w:tentative="1">
+      <w:start w:val="1"/>
+      <w:numFmt w:val="bullet"/>
+      <w:lvlText w:val=""/>
+      <w:lvlJc w:val="left"/>
+      <w:pPr>
+        <w:tabs>
+          <w:tab w:val="num" w:pos="2880"/>
+        </w:tabs>
+        <w:ind w:left="2880" w:hanging="360"/>
+      </w:pPr>
+      <w:rPr>
+        <w:rFonts w:ascii="Symbol" w:hAnsi="Symbol" w:hint="default"/>
+        <w:sz w:val="20"/>
+      </w:rPr>
+    </w:lvl>
+    <w:lvl w:ilvl="4" w:tentative="1">
+      <w:start w:val="1"/>
+      <w:numFmt w:val="bullet"/>
+      <w:lvlText w:val=""/>
+      <w:lvlJc w:val="left"/>
+      <w:pPr>
+        <w:tabs>
+          <w:tab w:val="num" w:pos="3600"/>
+        </w:tabs>
+        <w:ind w:left="3600" w:hanging="360"/>
+      </w:pPr>
+      <w:rPr>
+        <w:rFonts w:ascii="Symbol" w:hAnsi="Symbol" w:hint="default"/>
+        <w:sz w:val="20"/>
+      </w:rPr>
+    </w:lvl>
+    <w:lvl w:ilvl="5" w:tentative="1">
+      <w:start w:val="1"/>
+      <w:numFmt w:val="bullet"/>
+      <w:lvlText w:val=""/>
+      <w:lvlJc w:val="left"/>
+      <w:pPr>
+        <w:tabs>
+          <w:tab w:val="num" w:pos="4320"/>
+        </w:tabs>
+        <w:ind w:left="4320" w:hanging="360"/>
+      </w:pPr>
+      <w:rPr>
+        <w:rFonts w:ascii="Symbol" w:hAnsi="Symbol" w:hint="default"/>
+        <w:sz w:val="20"/>
+      </w:rPr>
+    </w:lvl>
+    <w:lvl w:ilvl="6" w:tentative="1">
+      <w:start w:val="1"/>
+      <w:numFmt w:val="bullet"/>
+      <w:lvlText w:val=""/>
+      <w:lvlJc w:val="left"/>
+      <w:pPr>
+        <w:tabs>
+          <w:tab w:val="num" w:pos="5040"/>
+        </w:tabs>
+        <w:ind w:left="5040" w:hanging="360"/>
+      </w:pPr>
+      <w:rPr>
+        <w:rFonts w:ascii="Symbol" w:hAnsi="Symbol" w:hint="default"/>
+        <w:sz w:val="20"/>
+      </w:rPr>
+    </w:lvl>
+    <w:lvl w:ilvl="7" w:tentative="1">
+      <w:start w:val="1"/>
+      <w:numFmt w:val="bullet"/>
+      <w:lvlText w:val=""/>
+      <w:lvlJc w:val="left"/>
+      <w:pPr>
+        <w:tabs>
+          <w:tab w:val="num" w:pos="5760"/>
+        </w:tabs>
+        <w:ind w:left="5760" w:hanging="360"/>
+      </w:pPr>
+      <w:rPr>
+        <w:rFonts w:ascii="Symbol" w:hAnsi="Symbol" w:hint="default"/>
+        <w:sz w:val="20"/>
+      </w:rPr>
+    </w:lvl>
+    <w:lvl w:ilvl="8" w:tentative="1">
+      <w:start w:val="1"/>
+      <w:numFmt w:val="bullet"/>
+      <w:lvlText w:val=""/>
+      <w:lvlJc w:val="left"/>
+      <w:pPr>
+        <w:tabs>
+          <w:tab w:val="num" w:pos="6480"/>
+        </w:tabs>
+        <w:ind w:left="6480" w:hanging="360"/>
+      </w:pPr>
+      <w:rPr>
+        <w:rFonts w:ascii="Symbol" w:hAnsi="Symbol" w:hint="default"/>
+        <w:sz w:val="20"/>
+      </w:rPr>
+    </w:lvl>
+  </w:abstractNum>
+  <w:abstractNum w:abstractNumId="12" w15:restartNumberingAfterBreak="0">
     <w:nsid w:val="70E021A9"/>
     <w:multiLevelType w:val="hybridMultilevel"/>
     <w:tmpl w:val="F44EEFF2"/>
@@ -17081,7 +20128,7 @@
       </w:pPr>
     </w:lvl>
   </w:abstractNum>
-  <w:abstractNum w:abstractNumId="11" w15:restartNumberingAfterBreak="0">
+  <w:abstractNum w:abstractNumId="13" w15:restartNumberingAfterBreak="0">
     <w:nsid w:val="77084836"/>
     <w:multiLevelType w:val="multilevel"/>
     <w:tmpl w:val="EED29006"/>
@@ -17230,7 +20277,7 @@
       </w:rPr>
     </w:lvl>
   </w:abstractNum>
-  <w:abstractNum w:abstractNumId="12" w15:restartNumberingAfterBreak="0">
+  <w:abstractNum w:abstractNumId="14" w15:restartNumberingAfterBreak="0">
     <w:nsid w:val="7A5C712F"/>
     <w:multiLevelType w:val="multilevel"/>
     <w:tmpl w:val="619C202E"/>
@@ -17351,7 +20398,7 @@
       </w:rPr>
     </w:lvl>
   </w:abstractNum>
-  <w:abstractNum w:abstractNumId="13" w15:restartNumberingAfterBreak="0">
+  <w:abstractNum w:abstractNumId="15" w15:restartNumberingAfterBreak="0">
     <w:nsid w:val="7E991A8B"/>
     <w:multiLevelType w:val="hybridMultilevel"/>
     <w:tmpl w:val="C922B06A"/>
@@ -17464,23 +20511,172 @@
       </w:rPr>
     </w:lvl>
   </w:abstractNum>
+  <w:abstractNum w:abstractNumId="16" w15:restartNumberingAfterBreak="0">
+    <w:nsid w:val="7E9F712C"/>
+    <w:multiLevelType w:val="multilevel"/>
+    <w:tmpl w:val="C7744728"/>
+    <w:lvl w:ilvl="0">
+      <w:start w:val="1"/>
+      <w:numFmt w:val="bullet"/>
+      <w:lvlText w:val=""/>
+      <w:lvlJc w:val="left"/>
+      <w:pPr>
+        <w:tabs>
+          <w:tab w:val="num" w:pos="720"/>
+        </w:tabs>
+        <w:ind w:left="720" w:hanging="360"/>
+      </w:pPr>
+      <w:rPr>
+        <w:rFonts w:ascii="Symbol" w:hAnsi="Symbol" w:hint="default"/>
+        <w:sz w:val="20"/>
+      </w:rPr>
+    </w:lvl>
+    <w:lvl w:ilvl="1" w:tentative="1">
+      <w:start w:val="1"/>
+      <w:numFmt w:val="bullet"/>
+      <w:lvlText w:val=""/>
+      <w:lvlJc w:val="left"/>
+      <w:pPr>
+        <w:tabs>
+          <w:tab w:val="num" w:pos="1440"/>
+        </w:tabs>
+        <w:ind w:left="1440" w:hanging="360"/>
+      </w:pPr>
+      <w:rPr>
+        <w:rFonts w:ascii="Symbol" w:hAnsi="Symbol" w:hint="default"/>
+        <w:sz w:val="20"/>
+      </w:rPr>
+    </w:lvl>
+    <w:lvl w:ilvl="2" w:tentative="1">
+      <w:start w:val="1"/>
+      <w:numFmt w:val="bullet"/>
+      <w:lvlText w:val=""/>
+      <w:lvlJc w:val="left"/>
+      <w:pPr>
+        <w:tabs>
+          <w:tab w:val="num" w:pos="2160"/>
+        </w:tabs>
+        <w:ind w:left="2160" w:hanging="360"/>
+      </w:pPr>
+      <w:rPr>
+        <w:rFonts w:ascii="Symbol" w:hAnsi="Symbol" w:hint="default"/>
+        <w:sz w:val="20"/>
+      </w:rPr>
+    </w:lvl>
+    <w:lvl w:ilvl="3" w:tentative="1">
+      <w:start w:val="1"/>
+      <w:numFmt w:val="bullet"/>
+      <w:lvlText w:val=""/>
+      <w:lvlJc w:val="left"/>
+      <w:pPr>
+        <w:tabs>
+          <w:tab w:val="num" w:pos="2880"/>
+        </w:tabs>
+        <w:ind w:left="2880" w:hanging="360"/>
+      </w:pPr>
+      <w:rPr>
+        <w:rFonts w:ascii="Symbol" w:hAnsi="Symbol" w:hint="default"/>
+        <w:sz w:val="20"/>
+      </w:rPr>
+    </w:lvl>
+    <w:lvl w:ilvl="4" w:tentative="1">
+      <w:start w:val="1"/>
+      <w:numFmt w:val="bullet"/>
+      <w:lvlText w:val=""/>
+      <w:lvlJc w:val="left"/>
+      <w:pPr>
+        <w:tabs>
+          <w:tab w:val="num" w:pos="3600"/>
+        </w:tabs>
+        <w:ind w:left="3600" w:hanging="360"/>
+      </w:pPr>
+      <w:rPr>
+        <w:rFonts w:ascii="Symbol" w:hAnsi="Symbol" w:hint="default"/>
+        <w:sz w:val="20"/>
+      </w:rPr>
+    </w:lvl>
+    <w:lvl w:ilvl="5" w:tentative="1">
+      <w:start w:val="1"/>
+      <w:numFmt w:val="bullet"/>
+      <w:lvlText w:val=""/>
+      <w:lvlJc w:val="left"/>
+      <w:pPr>
+        <w:tabs>
+          <w:tab w:val="num" w:pos="4320"/>
+        </w:tabs>
+        <w:ind w:left="4320" w:hanging="360"/>
+      </w:pPr>
+      <w:rPr>
+        <w:rFonts w:ascii="Symbol" w:hAnsi="Symbol" w:hint="default"/>
+        <w:sz w:val="20"/>
+      </w:rPr>
+    </w:lvl>
+    <w:lvl w:ilvl="6" w:tentative="1">
+      <w:start w:val="1"/>
+      <w:numFmt w:val="bullet"/>
+      <w:lvlText w:val=""/>
+      <w:lvlJc w:val="left"/>
+      <w:pPr>
+        <w:tabs>
+          <w:tab w:val="num" w:pos="5040"/>
+        </w:tabs>
+        <w:ind w:left="5040" w:hanging="360"/>
+      </w:pPr>
+      <w:rPr>
+        <w:rFonts w:ascii="Symbol" w:hAnsi="Symbol" w:hint="default"/>
+        <w:sz w:val="20"/>
+      </w:rPr>
+    </w:lvl>
+    <w:lvl w:ilvl="7" w:tentative="1">
+      <w:start w:val="1"/>
+      <w:numFmt w:val="bullet"/>
+      <w:lvlText w:val=""/>
+      <w:lvlJc w:val="left"/>
+      <w:pPr>
+        <w:tabs>
+          <w:tab w:val="num" w:pos="5760"/>
+        </w:tabs>
+        <w:ind w:left="5760" w:hanging="360"/>
+      </w:pPr>
+      <w:rPr>
+        <w:rFonts w:ascii="Symbol" w:hAnsi="Symbol" w:hint="default"/>
+        <w:sz w:val="20"/>
+      </w:rPr>
+    </w:lvl>
+    <w:lvl w:ilvl="8" w:tentative="1">
+      <w:start w:val="1"/>
+      <w:numFmt w:val="bullet"/>
+      <w:lvlText w:val=""/>
+      <w:lvlJc w:val="left"/>
+      <w:pPr>
+        <w:tabs>
+          <w:tab w:val="num" w:pos="6480"/>
+        </w:tabs>
+        <w:ind w:left="6480" w:hanging="360"/>
+      </w:pPr>
+      <w:rPr>
+        <w:rFonts w:ascii="Symbol" w:hAnsi="Symbol" w:hint="default"/>
+        <w:sz w:val="20"/>
+      </w:rPr>
+    </w:lvl>
+  </w:abstractNum>
   <w:num w:numId="1" w16cid:durableId="607204533">
     <w:abstractNumId w:val="5"/>
   </w:num>
   <w:num w:numId="2" w16cid:durableId="1240867659">
-    <w:abstractNumId w:val="8"/>
+    <w:abstractNumId w:val="9"/>
   </w:num>
   <w:num w:numId="3" w16cid:durableId="518933528">
-    <w:abstractNumId w:val="13"/>
+    <w:abstractNumId w:val="15"/>
   </w:num>
   <w:num w:numId="4" w16cid:durableId="290597978">
     <w:abstractNumId w:val="6"/>
   </w:num>
   <w:num w:numId="5" w16cid:durableId="198785566">
-    <w:abstractNumId w:val="12"/>
+    <w:abstractNumId w:val="14"/>
   </w:num>
   <w:num w:numId="6" w16cid:durableId="213349035">
-    <w:abstractNumId w:val="10"/>
+    <w:abstractNumId w:val="12"/>
   </w:num>
   <w:num w:numId="7" w16cid:durableId="860822821">
     <w:abstractNumId w:val="4"/>
@@ -17495,7 +20691,7 @@
     <w:abstractNumId w:val="3"/>
   </w:num>
   <w:num w:numId="11" w16cid:durableId="1568107422">
-    <w:abstractNumId w:val="9"/>
+    <w:abstractNumId w:val="10"/>
   </w:num>
   <w:num w:numId="12" w16cid:durableId="1933976752">
     <w:abstractNumId w:val="1"/>
@@ -17504,6 +20700,15 @@
     <w:abstractNumId w:val="7"/>
   </w:num>
   <w:num w:numId="14" w16cid:durableId="1756508992">
+    <w:abstractNumId w:val="13"/>
+  </w:num>
+  <w:num w:numId="15" w16cid:durableId="156774775">
+    <w:abstractNumId w:val="8"/>
+  </w:num>
+  <w:num w:numId="16" w16cid:durableId="284124577">
+    <w:abstractNumId w:val="16"/>
+  </w:num>
+  <w:num w:numId="17" w16cid:durableId="309483357">
     <w:abstractNumId w:val="11"/>
   </w:num>
 </w:numbering>
@@ -17905,7 +21110,7 @@
   <w:style w:type="paragraph" w:default="1" w:styleId="a">
     <w:name w:val="Normal"/>
     <w:qFormat/>
-    <w:rsid w:val="00ED55B4"/>
+    <w:rsid w:val="007334B0"/>
     <w:pPr>
       <w:widowControl w:val="0"/>
       <w:jc w:val="both"/>
@@ -18026,7 +21231,6 @@
     <w:next w:val="a"/>
     <w:link w:val="60"/>
     <w:uiPriority w:val="9"/>
-    <w:semiHidden/>
     <w:unhideWhenUsed/>
     <w:qFormat/>
     <w:rsid w:val="006551B8"/>
@@ -18202,7 +21406,6 @@
     <w:basedOn w:val="a0"/>
     <w:link w:val="6"/>
     <w:uiPriority w:val="9"/>
-    <w:semiHidden/>
     <w:rsid w:val="006551B8"/>
     <w:rPr>
       <w:rFonts w:cstheme="majorBidi"/>

</xml_diff>

<commit_message>
add session 2 note in 1960
</commit_message>
<xml_diff>
--- a/26fall/1870/Note/w1s1.docx
+++ b/26fall/1870/Note/w1s1.docx
@@ -8954,6 +8954,9 @@
           <w:ilvl w:val="1"/>
           <w:numId w:val="2"/>
         </w:numPr>
+        <w:rPr>
+          <w:rFonts w:hint="eastAsia"/>
+        </w:rPr>
       </w:pPr>
       <w:r>
         <w:lastRenderedPageBreak/>
@@ -8969,6 +8972,9 @@
     <w:p>
       <w:pPr>
         <w:pStyle w:val="5"/>
+        <w:rPr>
+          <w:rFonts w:hint="eastAsia"/>
+        </w:rPr>
       </w:pPr>
       <w:r>
         <w:rPr>
@@ -8997,29 +9003,16 @@
       <w:pPr>
         <w:ind w:firstLine="420"/>
         <w:rPr>
-          <w:color w:val="074F6A" w:themeColor="accent4" w:themeShade="80"/>
-        </w:rPr>
-      </w:pPr>
-      <w:r>
-        <w:rPr>
-          <w:rFonts w:hint="eastAsia"/>
-          <w:color w:val="074F6A" w:themeColor="accent4" w:themeShade="80"/>
-        </w:rPr>
-        <w:t>Predicate</w:t>
-      </w:r>
-      <w:r>
-        <w:rPr>
-          <w:rFonts w:hint="eastAsia"/>
-          <w:color w:val="074F6A" w:themeColor="accent4" w:themeShade="80"/>
-        </w:rPr>
-        <w:t>（谓词）是包含</w:t>
-      </w:r>
-      <w:r>
-        <w:rPr>
-          <w:rFonts w:hint="eastAsia"/>
-          <w:color w:val="074F6A" w:themeColor="accent4" w:themeShade="80"/>
-        </w:rPr>
-        <w:t>一个或多个</w:t>
+          <w:rFonts w:hint="eastAsia"/>
+          <w:color w:val="074F6A" w:themeColor="accent4" w:themeShade="80"/>
+        </w:rPr>
+      </w:pPr>
+      <w:r>
+        <w:rPr>
+          <w:rFonts w:hint="eastAsia"/>
+          <w:color w:val="074F6A" w:themeColor="accent4" w:themeShade="80"/>
+        </w:rPr>
+        <w:t>Predicate（谓词）是包含一个或多个</w:t>
       </w:r>
       <w:r>
         <w:rPr>
@@ -9218,6 +9211,7 @@
       <w:pPr>
         <w:ind w:firstLine="420"/>
         <w:rPr>
+          <w:rFonts w:hint="eastAsia"/>
           <w:color w:val="074F6A" w:themeColor="accent4" w:themeShade="80"/>
         </w:rPr>
       </w:pPr>
@@ -9400,13 +9394,7 @@
               <w:rPr>
                 <w:rFonts w:ascii="宋体" w:eastAsia="宋体" w:hAnsi="宋体" w:hint="eastAsia"/>
               </w:rPr>
-              <w:t>n是2026年7月的一天，n是星期四</w:t>
-            </w:r>
-            <w:r>
-              <w:rPr>
-                <w:rFonts w:ascii="宋体" w:eastAsia="宋体" w:hAnsi="宋体" w:hint="eastAsia"/>
-              </w:rPr>
-              <w:t xml:space="preserve"> （n是</w:t>
+              <w:t>n是2026年7月的一天，n是星期四 （n是</w:t>
             </w:r>
             <w:r>
               <w:rPr>
@@ -9458,19 +9446,7 @@
               <w:rPr>
                 <w:rFonts w:ascii="宋体" w:eastAsia="宋体" w:hAnsi="宋体" w:hint="eastAsia"/>
               </w:rPr>
-              <w:t>n是正整数，2n 是一个偶数</w:t>
-            </w:r>
-            <w:r>
-              <w:rPr>
-                <w:rFonts w:ascii="宋体" w:eastAsia="宋体" w:hAnsi="宋体" w:hint="eastAsia"/>
-              </w:rPr>
-              <w:t xml:space="preserve">         </w:t>
-            </w:r>
-            <w:r>
-              <w:rPr>
-                <w:rFonts w:ascii="宋体" w:eastAsia="宋体" w:hAnsi="宋体" w:hint="eastAsia"/>
-              </w:rPr>
-              <w:t>（n是</w:t>
+              <w:t>n是正整数，2n 是一个偶数         （n是</w:t>
             </w:r>
             <w:r>
               <w:rPr>
@@ -9500,34 +9476,22 @@
     <w:p>
       <w:pPr>
         <w:rPr>
-          <w:color w:val="074F6A" w:themeColor="accent4" w:themeShade="80"/>
-        </w:rPr>
-      </w:pPr>
-      <w:r>
-        <w:rPr>
-          <w:rFonts w:hint="eastAsia"/>
-          <w:color w:val="074F6A" w:themeColor="accent4" w:themeShade="80"/>
-        </w:rPr>
-        <w:t>例子</w:t>
-      </w:r>
-      <w:r>
-        <w:rPr>
-          <w:rFonts w:hint="eastAsia"/>
-          <w:color w:val="074F6A" w:themeColor="accent4" w:themeShade="80"/>
-        </w:rPr>
-        <w:t>2</w:t>
-      </w:r>
-      <w:r>
-        <w:rPr>
-          <w:rFonts w:hint="eastAsia"/>
-          <w:color w:val="074F6A" w:themeColor="accent4" w:themeShade="80"/>
-        </w:rPr>
-        <w:t>：</w:t>
-      </w:r>
-    </w:p>
-    <w:p>
-      <w:pPr>
-        <w:rPr>
+          <w:rFonts w:hint="eastAsia"/>
+          <w:color w:val="074F6A" w:themeColor="accent4" w:themeShade="80"/>
+        </w:rPr>
+      </w:pPr>
+      <w:r>
+        <w:rPr>
+          <w:rFonts w:hint="eastAsia"/>
+          <w:color w:val="074F6A" w:themeColor="accent4" w:themeShade="80"/>
+        </w:rPr>
+        <w:t>例子2：</w:t>
+      </w:r>
+    </w:p>
+    <w:p>
+      <w:pPr>
+        <w:rPr>
+          <w:rFonts w:hint="eastAsia"/>
           <w:color w:val="074F6A" w:themeColor="accent4" w:themeShade="80"/>
         </w:rPr>
       </w:pPr>
@@ -9618,6 +9582,13 @@
           <w:rFonts w:hint="eastAsia"/>
           <w:color w:val="074F6A" w:themeColor="accent4" w:themeShade="80"/>
         </w:rPr>
+        <w:t xml:space="preserve">  x</w:t>
+      </w:r>
+      <w:r>
+        <w:rPr>
+          <w:rFonts w:hint="eastAsia"/>
+          <w:color w:val="074F6A" w:themeColor="accent4" w:themeShade="80"/>
+        </w:rPr>
         <w:t xml:space="preserve"> </w:t>
       </w:r>
       <w:r>
@@ -9625,26 +9596,13 @@
           <w:rFonts w:hint="eastAsia"/>
           <w:color w:val="074F6A" w:themeColor="accent4" w:themeShade="80"/>
         </w:rPr>
-        <w:t xml:space="preserve"> x</w:t>
-      </w:r>
-      <w:r>
-        <w:rPr>
-          <w:rFonts w:hint="eastAsia"/>
-          <w:color w:val="074F6A" w:themeColor="accent4" w:themeShade="80"/>
-        </w:rPr>
-        <w:t xml:space="preserve"> </w:t>
-      </w:r>
-      <w:r>
-        <w:rPr>
-          <w:rFonts w:hint="eastAsia"/>
-          <w:color w:val="074F6A" w:themeColor="accent4" w:themeShade="80"/>
-        </w:rPr>
         <w:t>∈ N+</w:t>
       </w:r>
     </w:p>
     <w:p>
       <w:pPr>
         <w:rPr>
+          <w:rFonts w:hint="eastAsia"/>
           <w:color w:val="074F6A" w:themeColor="accent4" w:themeShade="80"/>
         </w:rPr>
       </w:pPr>
@@ -9665,6 +9623,11 @@
       </w:r>
     </w:p>
     <w:p>
+      <w:pPr>
+        <w:rPr>
+          <w:rFonts w:hint="eastAsia"/>
+        </w:rPr>
+      </w:pPr>
       <w:r>
         <w:rPr>
           <w:rFonts w:hint="eastAsia"/>
@@ -9682,6 +9645,11 @@
       </w:r>
     </w:p>
     <w:p>
+      <w:pPr>
+        <w:rPr>
+          <w:rFonts w:hint="eastAsia"/>
+        </w:rPr>
+      </w:pPr>
       <w:r>
         <w:rPr>
           <w:rFonts w:hint="eastAsia"/>
@@ -9705,6 +9673,11 @@
       </w:r>
     </w:p>
     <w:p>
+      <w:pPr>
+        <w:rPr>
+          <w:rFonts w:hint="eastAsia"/>
+        </w:rPr>
+      </w:pPr>
       <w:r>
         <w:rPr>
           <w:rFonts w:hint="eastAsia"/>
@@ -9760,26 +9733,21 @@
     <w:p>
       <w:pPr>
         <w:jc w:val="left"/>
-      </w:pPr>
-      <w:r>
-        <w:rPr>
-          <w:rFonts w:hint="eastAsia"/>
-        </w:rPr>
-        <w:t>P(x)</w:t>
-      </w:r>
-      <w:r>
-        <w:rPr>
-          <w:rFonts w:hint="eastAsia"/>
-        </w:rPr>
-        <w:t xml:space="preserve"> Statement：</w:t>
+        <w:rPr>
+          <w:rFonts w:hint="eastAsia"/>
+        </w:rPr>
+      </w:pPr>
+      <w:r>
+        <w:rPr>
+          <w:rFonts w:hint="eastAsia"/>
+        </w:rPr>
+        <w:t>P(x) Statement：</w:t>
       </w:r>
       <w:r>
         <w:tab/>
       </w:r>
       <w:r>
         <w:tab/>
-      </w:r>
-      <w:r>
         <w:t xml:space="preserve">return the value </w:t>
       </w:r>
       <w:r>
@@ -9942,29 +9910,16 @@
     <w:p>
       <w:pPr>
         <w:rPr>
-          <w:color w:val="074F6A" w:themeColor="accent4" w:themeShade="80"/>
-        </w:rPr>
-      </w:pPr>
-      <w:r>
-        <w:rPr>
-          <w:rFonts w:hint="eastAsia"/>
-          <w:color w:val="074F6A" w:themeColor="accent4" w:themeShade="80"/>
-        </w:rPr>
-        <w:t>例子</w:t>
-      </w:r>
-      <w:r>
-        <w:rPr>
-          <w:rFonts w:hint="eastAsia"/>
-          <w:color w:val="074F6A" w:themeColor="accent4" w:themeShade="80"/>
-        </w:rPr>
-        <w:t>3</w:t>
-      </w:r>
-      <w:r>
-        <w:rPr>
-          <w:rFonts w:hint="eastAsia"/>
-          <w:color w:val="074F6A" w:themeColor="accent4" w:themeShade="80"/>
-        </w:rPr>
-        <w:t>：</w:t>
+          <w:rFonts w:hint="eastAsia"/>
+          <w:color w:val="074F6A" w:themeColor="accent4" w:themeShade="80"/>
+        </w:rPr>
+      </w:pPr>
+      <w:r>
+        <w:rPr>
+          <w:rFonts w:hint="eastAsia"/>
+          <w:color w:val="074F6A" w:themeColor="accent4" w:themeShade="80"/>
+        </w:rPr>
+        <w:t>例子3：</w:t>
       </w:r>
     </w:p>
     <w:p>
@@ -10085,21 +10040,7 @@
           <w:rFonts w:hint="eastAsia"/>
           <w:color w:val="074F6A" w:themeColor="accent4" w:themeShade="80"/>
         </w:rPr>
-        <w:t xml:space="preserve">  </w:t>
-      </w:r>
-      <w:r>
-        <w:rPr>
-          <w:rFonts w:hint="eastAsia"/>
-          <w:color w:val="074F6A" w:themeColor="accent4" w:themeShade="80"/>
-        </w:rPr>
-        <w:t>x</w:t>
-      </w:r>
-      <w:r>
-        <w:rPr>
-          <w:rFonts w:hint="eastAsia"/>
-          <w:color w:val="074F6A" w:themeColor="accent4" w:themeShade="80"/>
-        </w:rPr>
-        <w:t>，y</w:t>
+        <w:t xml:space="preserve">  x，y</w:t>
       </w:r>
       <w:r>
         <w:rPr>
@@ -10141,6 +10082,11 @@
       </w:r>
     </w:p>
     <w:p>
+      <w:pPr>
+        <w:rPr>
+          <w:rFonts w:hint="eastAsia"/>
+        </w:rPr>
+      </w:pPr>
       <w:r>
         <w:rPr>
           <w:rFonts w:hint="eastAsia"/>
@@ -10156,6 +10102,11 @@
       </w:r>
     </w:p>
     <w:p>
+      <w:pPr>
+        <w:rPr>
+          <w:rFonts w:hint="eastAsia"/>
+        </w:rPr>
+      </w:pPr>
       <w:r>
         <w:rPr>
           <w:rFonts w:hint="eastAsia"/>
@@ -10219,6 +10170,11 @@
       </w:r>
     </w:p>
     <w:p>
+      <w:pPr>
+        <w:rPr>
+          <w:rFonts w:hint="eastAsia"/>
+        </w:rPr>
+      </w:pPr>
       <w:r>
         <w:rPr>
           <w:rFonts w:hint="eastAsia"/>
@@ -10310,6 +10266,9 @@
     <w:p>
       <w:pPr>
         <w:jc w:val="left"/>
+        <w:rPr>
+          <w:rFonts w:hint="eastAsia"/>
+        </w:rPr>
       </w:pPr>
       <w:r>
         <w:rPr>
@@ -10420,6 +10379,9 @@
           <w:ilvl w:val="2"/>
           <w:numId w:val="5"/>
         </w:numPr>
+        <w:rPr>
+          <w:rFonts w:hint="eastAsia"/>
+        </w:rPr>
       </w:pPr>
       <w:r>
         <w:lastRenderedPageBreak/>
@@ -10448,6 +10410,7 @@
       <w:pPr>
         <w:ind w:firstLine="420"/>
         <w:rPr>
+          <w:rFonts w:hint="eastAsia"/>
           <w:color w:val="074F6A" w:themeColor="accent4" w:themeShade="80"/>
         </w:rPr>
       </w:pPr>
@@ -10462,14 +10425,7 @@
           <w:rFonts w:hint="eastAsia"/>
           <w:color w:val="074F6A" w:themeColor="accent4" w:themeShade="80"/>
         </w:rPr>
-        <w:t>(</w:t>
-      </w:r>
-      <w:r>
-        <w:rPr>
-          <w:rFonts w:hint="eastAsia"/>
-          <w:color w:val="074F6A" w:themeColor="accent4" w:themeShade="80"/>
-        </w:rPr>
-        <w:t>量词</w:t>
+        <w:t>(量词</w:t>
       </w:r>
       <w:r>
         <w:rPr>
@@ -10483,14 +10439,7 @@
           <w:rFonts w:ascii="Cambria Math" w:hAnsi="Cambria Math" w:cs="Cambria Math"/>
           <w:color w:val="074F6A" w:themeColor="accent4" w:themeShade="80"/>
         </w:rPr>
-        <w:t xml:space="preserve"> </w:t>
-      </w:r>
-      <w:r>
-        <w:rPr>
-          <w:rFonts w:ascii="Cambria Math" w:hAnsi="Cambria Math" w:cs="Cambria Math"/>
-          <w:color w:val="074F6A" w:themeColor="accent4" w:themeShade="80"/>
-        </w:rPr>
-        <w:t>∃</w:t>
+        <w:t xml:space="preserve"> ∃</w:t>
       </w:r>
       <w:r>
         <w:rPr>
@@ -10585,6 +10534,7 @@
           <w:numId w:val="11"/>
         </w:numPr>
         <w:rPr>
+          <w:rFonts w:hint="eastAsia"/>
           <w:color w:val="074F6A" w:themeColor="accent4" w:themeShade="80"/>
         </w:rPr>
       </w:pPr>
@@ -10744,21 +10694,7 @@
           <w:rFonts w:hint="eastAsia"/>
           <w:color w:val="074F6A" w:themeColor="accent4" w:themeShade="80"/>
         </w:rPr>
-        <w:t xml:space="preserve">可以记忆成 </w:t>
-      </w:r>
-      <w:r>
-        <w:rPr>
-          <w:rFonts w:hint="eastAsia"/>
-          <w:color w:val="074F6A" w:themeColor="accent4" w:themeShade="80"/>
-        </w:rPr>
-        <w:t>All</w:t>
-      </w:r>
-      <w:r>
-        <w:rPr>
-          <w:rFonts w:hint="eastAsia"/>
-          <w:color w:val="074F6A" w:themeColor="accent4" w:themeShade="80"/>
-        </w:rPr>
-        <w:t>倒过来)</w:t>
+        <w:t>可以记忆成 All倒过来)</w:t>
       </w:r>
     </w:p>
     <w:p>
@@ -10844,6 +10780,7 @@
           <w:p>
             <w:pPr>
               <w:rPr>
+                <w:rFonts w:hint="eastAsia"/>
                 <w:b/>
                 <w:bCs/>
               </w:rPr>
@@ -10994,6 +10931,7 @@
           <w:p>
             <w:pPr>
               <w:rPr>
+                <w:rFonts w:hint="eastAsia"/>
                 <w:b/>
                 <w:bCs/>
               </w:rPr>
@@ -11082,13 +11020,7 @@
               <w:rPr>
                 <w:rFonts w:hint="eastAsia"/>
               </w:rPr>
-              <w:t>，</w:t>
-            </w:r>
-            <w:r>
-              <w:rPr>
-                <w:rFonts w:hint="eastAsia"/>
-              </w:rPr>
-              <w:t>let  5x</w:t>
+              <w:t>，let  5x</w:t>
             </w:r>
             <w:r>
               <w:rPr>
@@ -11123,7 +11055,15 @@
       </w:r>
     </w:p>
     <w:p>
-      <w:r>
+      <w:pPr>
+        <w:rPr>
+          <w:rFonts w:hint="eastAsia"/>
+        </w:rPr>
+      </w:pPr>
+      <w:r>
+        <w:rPr>
+          <w:noProof/>
+        </w:rPr>
         <w:drawing>
           <wp:inline distT="0" distB="0" distL="0" distR="0" wp14:anchorId="174B3EE5" wp14:editId="18430EB7">
             <wp:extent cx="3822700" cy="1291887"/>
@@ -11164,6 +11104,7 @@
     <w:p>
       <w:pPr>
         <w:rPr>
+          <w:rFonts w:hint="eastAsia"/>
           <w:color w:val="074F6A" w:themeColor="accent4" w:themeShade="80"/>
         </w:rPr>
       </w:pPr>
@@ -11178,6 +11119,7 @@
     <w:p>
       <w:pPr>
         <w:rPr>
+          <w:rFonts w:hint="eastAsia"/>
           <w:color w:val="074F6A" w:themeColor="accent4" w:themeShade="80"/>
         </w:rPr>
       </w:pPr>
@@ -11192,48 +11134,22 @@
     <w:p>
       <w:pPr>
         <w:rPr>
-          <w:color w:val="074F6A" w:themeColor="accent4" w:themeShade="80"/>
-        </w:rPr>
-      </w:pPr>
-      <w:r>
-        <w:rPr>
-          <w:rFonts w:hint="eastAsia"/>
-          <w:color w:val="074F6A" w:themeColor="accent4" w:themeShade="80"/>
-        </w:rPr>
-        <w:t>D</w:t>
-      </w:r>
-      <w:r>
-        <w:rPr>
-          <w:rFonts w:hint="eastAsia"/>
-          <w:color w:val="074F6A" w:themeColor="accent4" w:themeShade="80"/>
-        </w:rPr>
-        <w:t>(x</w:t>
-      </w:r>
-      <w:r>
-        <w:rPr>
-          <w:rFonts w:hint="eastAsia"/>
-          <w:color w:val="074F6A" w:themeColor="accent4" w:themeShade="80"/>
-        </w:rPr>
-        <w:t>，y</w:t>
-      </w:r>
-      <w:r>
-        <w:rPr>
-          <w:rFonts w:hint="eastAsia"/>
-          <w:color w:val="074F6A" w:themeColor="accent4" w:themeShade="80"/>
-        </w:rPr>
-        <w:t xml:space="preserve">)     </w:t>
-      </w:r>
-      <w:r>
-        <w:rPr>
-          <w:rFonts w:hint="eastAsia"/>
-          <w:color w:val="074F6A" w:themeColor="accent4" w:themeShade="80"/>
-        </w:rPr>
-        <w:t>y可以整除x</w:t>
-      </w:r>
-    </w:p>
-    <w:p>
-      <w:pPr>
-        <w:rPr>
+          <w:rFonts w:hint="eastAsia"/>
+          <w:color w:val="074F6A" w:themeColor="accent4" w:themeShade="80"/>
+        </w:rPr>
+      </w:pPr>
+      <w:r>
+        <w:rPr>
+          <w:rFonts w:hint="eastAsia"/>
+          <w:color w:val="074F6A" w:themeColor="accent4" w:themeShade="80"/>
+        </w:rPr>
+        <w:t>D(x，y)     y可以整除x</w:t>
+      </w:r>
+    </w:p>
+    <w:p>
+      <w:pPr>
+        <w:rPr>
+          <w:rFonts w:hint="eastAsia"/>
           <w:color w:val="074F6A" w:themeColor="accent4" w:themeShade="80"/>
         </w:rPr>
       </w:pPr>
@@ -11248,6 +11164,7 @@
     <w:p>
       <w:pPr>
         <w:rPr>
+          <w:rFonts w:hint="eastAsia"/>
           <w:color w:val="074F6A" w:themeColor="accent4" w:themeShade="80"/>
         </w:rPr>
       </w:pPr>
@@ -11262,6 +11179,7 @@
     <w:p>
       <w:pPr>
         <w:rPr>
+          <w:rFonts w:hint="eastAsia"/>
           <w:color w:val="074F6A" w:themeColor="accent4" w:themeShade="80"/>
         </w:rPr>
       </w:pPr>
@@ -11361,6 +11279,7 @@
     <w:p>
       <w:pPr>
         <w:rPr>
+          <w:rFonts w:hint="eastAsia"/>
           <w:color w:val="074F6A" w:themeColor="accent4" w:themeShade="80"/>
         </w:rPr>
       </w:pPr>
@@ -11380,6 +11299,7 @@
           <w:numId w:val="12"/>
         </w:numPr>
         <w:rPr>
+          <w:rFonts w:hint="eastAsia"/>
           <w:color w:val="074F6A" w:themeColor="accent4" w:themeShade="80"/>
         </w:rPr>
       </w:pPr>
@@ -11406,6 +11326,7 @@
           <w:numId w:val="12"/>
         </w:numPr>
         <w:rPr>
+          <w:rFonts w:hint="eastAsia"/>
           <w:color w:val="074F6A" w:themeColor="accent4" w:themeShade="80"/>
         </w:rPr>
       </w:pPr>
@@ -11425,6 +11346,7 @@
           <w:numId w:val="12"/>
         </w:numPr>
         <w:rPr>
+          <w:rFonts w:hint="eastAsia"/>
           <w:color w:val="074F6A" w:themeColor="accent4" w:themeShade="80"/>
         </w:rPr>
       </w:pPr>
@@ -11446,6 +11368,7 @@
     <w:p>
       <w:pPr>
         <w:rPr>
+          <w:rFonts w:hint="eastAsia"/>
           <w:color w:val="074F6A" w:themeColor="accent4" w:themeShade="80"/>
         </w:rPr>
       </w:pPr>
@@ -11461,13 +11384,7 @@
         <w:rPr>
           <w:rFonts w:hint="eastAsia"/>
         </w:rPr>
-        <w:t>2.2.3</w:t>
-      </w:r>
-      <w:r>
-        <w:rPr>
-          <w:rFonts w:hint="eastAsia"/>
-        </w:rPr>
-        <w:t xml:space="preserve"> 否定量词</w:t>
+        <w:t>2.2.3 否定量词</w:t>
       </w:r>
     </w:p>
     <w:p>
@@ -12548,6 +12465,7 @@
     <w:p>
       <w:pPr>
         <w:rPr>
+          <w:rFonts w:hint="eastAsia"/>
           <w:color w:val="074F6A" w:themeColor="accent4" w:themeShade="80"/>
         </w:rPr>
       </w:pPr>
@@ -12563,40 +12481,34 @@
         <w:rPr>
           <w:rFonts w:hint="eastAsia"/>
         </w:rPr>
-        <w:t xml:space="preserve">2.2.3 </w:t>
-      </w:r>
-      <w:r>
-        <w:rPr>
-          <w:rFonts w:hint="eastAsia"/>
-        </w:rPr>
-        <w:t xml:space="preserve">带量词证明 </w:t>
-      </w:r>
-    </w:p>
-    <w:p>
-      <w:pPr>
+        <w:t xml:space="preserve">2.2.3 带量词证明 </w:t>
+      </w:r>
+    </w:p>
+    <w:p>
+      <w:pPr>
+        <w:rPr>
+          <w:rFonts w:cstheme="majorBidi" w:hint="eastAsia"/>
+          <w:color w:val="0F4761" w:themeColor="accent1" w:themeShade="BF"/>
+          <w:sz w:val="24"/>
+          <w:szCs w:val="24"/>
+        </w:rPr>
+      </w:pPr>
+      <w:r>
+        <w:rPr>
+          <w:rFonts w:cstheme="majorBidi" w:hint="eastAsia"/>
+          <w:color w:val="0F4761" w:themeColor="accent1" w:themeShade="BF"/>
+          <w:sz w:val="24"/>
+          <w:szCs w:val="24"/>
+        </w:rPr>
+        <w:t xml:space="preserve">Proof:    </w:t>
+      </w:r>
+      <w:r>
         <w:rPr>
           <w:rFonts w:cstheme="majorBidi"/>
           <w:color w:val="0F4761" w:themeColor="accent1" w:themeShade="BF"/>
           <w:sz w:val="24"/>
           <w:szCs w:val="24"/>
         </w:rPr>
-      </w:pPr>
-      <w:r>
-        <w:rPr>
-          <w:rFonts w:cstheme="majorBidi" w:hint="eastAsia"/>
-          <w:color w:val="0F4761" w:themeColor="accent1" w:themeShade="BF"/>
-          <w:sz w:val="24"/>
-          <w:szCs w:val="24"/>
-        </w:rPr>
-        <w:t xml:space="preserve">Proof:    </w:t>
-      </w:r>
-      <w:r>
-        <w:rPr>
-          <w:rFonts w:cstheme="majorBidi"/>
-          <w:color w:val="0F4761" w:themeColor="accent1" w:themeShade="BF"/>
-          <w:sz w:val="24"/>
-          <w:szCs w:val="24"/>
-        </w:rPr>
         <w:t>¬</w:t>
       </w:r>
       <w:r>
@@ -12615,25 +12527,7 @@
           <w:sz w:val="24"/>
           <w:szCs w:val="24"/>
         </w:rPr>
-        <w:t xml:space="preserve">x (P(x) </w:t>
-      </w:r>
-      <w:r>
-        <w:rPr>
-          <w:rFonts w:ascii="Cambria Math" w:hAnsi="Cambria Math" w:cs="Cambria Math" w:hint="eastAsia"/>
-          <w:color w:val="0F4761" w:themeColor="accent1" w:themeShade="BF"/>
-          <w:sz w:val="24"/>
-          <w:szCs w:val="24"/>
-        </w:rPr>
-        <w:t>=&gt;</w:t>
-      </w:r>
-      <w:r>
-        <w:rPr>
-          <w:rFonts w:ascii="Cambria Math" w:hAnsi="Cambria Math" w:cs="Cambria Math" w:hint="eastAsia"/>
-          <w:color w:val="0F4761" w:themeColor="accent1" w:themeShade="BF"/>
-          <w:sz w:val="24"/>
-          <w:szCs w:val="24"/>
-        </w:rPr>
-        <w:t xml:space="preserve"> </w:t>
+        <w:t xml:space="preserve">x (P(x) =&gt; </w:t>
       </w:r>
       <w:r>
         <w:rPr>
@@ -12803,7 +12697,7 @@
           <w:p>
             <w:pPr>
               <w:rPr>
-                <w:rFonts w:cstheme="majorBidi"/>
+                <w:rFonts w:cstheme="majorBidi" w:hint="eastAsia"/>
                 <w:color w:val="0F4761" w:themeColor="accent1" w:themeShade="BF"/>
                 <w:sz w:val="24"/>
                 <w:szCs w:val="24"/>
@@ -12976,74 +12870,137 @@
           <w:p>
             <w:pPr>
               <w:rPr>
+                <w:rFonts w:cstheme="majorBidi" w:hint="eastAsia"/>
+                <w:color w:val="0F4761" w:themeColor="accent1" w:themeShade="BF"/>
+                <w:sz w:val="24"/>
+                <w:szCs w:val="24"/>
+              </w:rPr>
+            </w:pPr>
+            <w:r>
+              <w:rPr>
+                <w:rFonts w:ascii="Cambria Math" w:hAnsi="Cambria Math" w:cs="Cambria Math"/>
+                <w:color w:val="0F4761" w:themeColor="accent1" w:themeShade="BF"/>
+                <w:sz w:val="24"/>
+                <w:szCs w:val="24"/>
+              </w:rPr>
+              <w:t>¬</w:t>
+            </w:r>
+            <w:r>
+              <w:rPr>
+                <w:rFonts w:ascii="Cambria Math" w:hAnsi="Cambria Math" w:cs="Cambria Math"/>
+                <w:color w:val="0F4761" w:themeColor="accent1" w:themeShade="BF"/>
+                <w:sz w:val="24"/>
+                <w:szCs w:val="24"/>
+              </w:rPr>
+              <w:t>∃</w:t>
+            </w:r>
+            <w:r>
+              <w:rPr>
+                <w:rFonts w:ascii="Cambria Math" w:hAnsi="Cambria Math" w:cs="Cambria Math" w:hint="eastAsia"/>
+                <w:color w:val="0F4761" w:themeColor="accent1" w:themeShade="BF"/>
+                <w:sz w:val="24"/>
+                <w:szCs w:val="24"/>
+              </w:rPr>
+              <w:t>x P(x)</w:t>
+            </w:r>
+            <w:r>
+              <w:rPr>
+                <w:rFonts w:ascii="Cambria Math" w:hAnsi="Cambria Math" w:cs="Cambria Math" w:hint="eastAsia"/>
+                <w:color w:val="0F4761" w:themeColor="accent1" w:themeShade="BF"/>
+                <w:sz w:val="24"/>
+                <w:szCs w:val="24"/>
+              </w:rPr>
+              <w:t>为</w:t>
+            </w:r>
+            <w:r>
+              <w:rPr>
+                <w:rFonts w:ascii="Cambria Math" w:hAnsi="Cambria Math" w:cs="Cambria Math" w:hint="eastAsia"/>
+                <w:color w:val="0F4761" w:themeColor="accent1" w:themeShade="BF"/>
+                <w:sz w:val="24"/>
+                <w:szCs w:val="24"/>
+              </w:rPr>
+              <w:t>真</w:t>
+            </w:r>
+            <w:r>
+              <w:rPr>
+                <w:rFonts w:ascii="Cambria Math" w:hAnsi="Cambria Math" w:cs="Cambria Math" w:hint="eastAsia"/>
+                <w:color w:val="0F4761" w:themeColor="accent1" w:themeShade="BF"/>
+                <w:sz w:val="24"/>
+                <w:szCs w:val="24"/>
+              </w:rPr>
+              <w:t xml:space="preserve">   </w:t>
+            </w:r>
+            <w:r>
+              <w:rPr>
+                <w:rFonts w:cstheme="majorBidi" w:hint="eastAsia"/>
+                <w:color w:val="0F4761" w:themeColor="accent1" w:themeShade="BF"/>
+                <w:sz w:val="24"/>
+                <w:szCs w:val="24"/>
+              </w:rPr>
+              <w:t>=</w:t>
+            </w:r>
+            <w:r>
+              <w:rPr>
+                <w:rFonts w:cstheme="majorBidi" w:hint="eastAsia"/>
+                <w:color w:val="0F4761" w:themeColor="accent1" w:themeShade="BF"/>
+                <w:sz w:val="24"/>
+                <w:szCs w:val="24"/>
+              </w:rPr>
+              <w:t xml:space="preserve">    </w:t>
+            </w:r>
+            <w:r>
+              <w:rPr>
+                <w:rFonts w:ascii="Cambria Math" w:hAnsi="Cambria Math" w:cs="Cambria Math"/>
+                <w:color w:val="0F4761" w:themeColor="accent1" w:themeShade="BF"/>
+                <w:sz w:val="24"/>
+                <w:szCs w:val="24"/>
+              </w:rPr>
+              <w:t>∀</w:t>
+            </w:r>
+            <w:r>
+              <w:rPr>
+                <w:rFonts w:cstheme="majorBidi" w:hint="eastAsia"/>
+                <w:color w:val="0F4761" w:themeColor="accent1" w:themeShade="BF"/>
+                <w:sz w:val="24"/>
+                <w:szCs w:val="24"/>
+              </w:rPr>
+              <w:t xml:space="preserve"> x</w:t>
+            </w:r>
+            <w:r>
+              <w:rPr>
+                <w:rFonts w:cstheme="majorBidi" w:hint="eastAsia"/>
+                <w:color w:val="0F4761" w:themeColor="accent1" w:themeShade="BF"/>
+                <w:sz w:val="24"/>
+                <w:szCs w:val="24"/>
+              </w:rPr>
+              <w:t xml:space="preserve"> </w:t>
+            </w:r>
+            <w:r>
+              <w:rPr>
+                <w:rFonts w:cstheme="majorBidi" w:hint="eastAsia"/>
+                <w:color w:val="0F4761" w:themeColor="accent1" w:themeShade="BF"/>
+                <w:sz w:val="24"/>
+                <w:szCs w:val="24"/>
+              </w:rPr>
+              <w:t xml:space="preserve"> </w:t>
+            </w:r>
+            <w:r>
+              <w:rPr>
+                <w:rFonts w:cstheme="majorBidi" w:hint="eastAsia"/>
+                <w:color w:val="0F4761" w:themeColor="accent1" w:themeShade="BF"/>
+                <w:sz w:val="24"/>
+                <w:szCs w:val="24"/>
+              </w:rPr>
+              <w:t xml:space="preserve"> </w:t>
+            </w:r>
+            <w:r>
+              <w:rPr>
                 <w:rFonts w:cstheme="majorBidi"/>
                 <w:color w:val="0F4761" w:themeColor="accent1" w:themeShade="BF"/>
                 <w:sz w:val="24"/>
                 <w:szCs w:val="24"/>
               </w:rPr>
-            </w:pPr>
-            <w:r>
-              <w:rPr>
-                <w:rFonts w:ascii="Cambria Math" w:hAnsi="Cambria Math" w:cs="Cambria Math"/>
-                <w:color w:val="0F4761" w:themeColor="accent1" w:themeShade="BF"/>
-                <w:sz w:val="24"/>
-                <w:szCs w:val="24"/>
-              </w:rPr>
               <w:t>¬</w:t>
-            </w:r>
-            <w:r>
-              <w:rPr>
-                <w:rFonts w:ascii="Cambria Math" w:hAnsi="Cambria Math" w:cs="Cambria Math"/>
-                <w:color w:val="0F4761" w:themeColor="accent1" w:themeShade="BF"/>
-                <w:sz w:val="24"/>
-                <w:szCs w:val="24"/>
-              </w:rPr>
-              <w:t>∃</w:t>
-            </w:r>
-            <w:r>
-              <w:rPr>
-                <w:rFonts w:ascii="Cambria Math" w:hAnsi="Cambria Math" w:cs="Cambria Math" w:hint="eastAsia"/>
-                <w:color w:val="0F4761" w:themeColor="accent1" w:themeShade="BF"/>
-                <w:sz w:val="24"/>
-                <w:szCs w:val="24"/>
-              </w:rPr>
-              <w:t>x</w:t>
-            </w:r>
-            <w:r>
-              <w:rPr>
-                <w:rFonts w:ascii="Cambria Math" w:hAnsi="Cambria Math" w:cs="Cambria Math" w:hint="eastAsia"/>
-                <w:color w:val="0F4761" w:themeColor="accent1" w:themeShade="BF"/>
-                <w:sz w:val="24"/>
-                <w:szCs w:val="24"/>
-              </w:rPr>
-              <w:t xml:space="preserve"> P(x)</w:t>
-            </w:r>
-            <w:r>
-              <w:rPr>
-                <w:rFonts w:ascii="Cambria Math" w:hAnsi="Cambria Math" w:cs="Cambria Math" w:hint="eastAsia"/>
-                <w:color w:val="0F4761" w:themeColor="accent1" w:themeShade="BF"/>
-                <w:sz w:val="24"/>
-                <w:szCs w:val="24"/>
-              </w:rPr>
-              <w:t>为</w:t>
-            </w:r>
-            <w:r>
-              <w:rPr>
-                <w:rFonts w:ascii="Cambria Math" w:hAnsi="Cambria Math" w:cs="Cambria Math" w:hint="eastAsia"/>
-                <w:color w:val="0F4761" w:themeColor="accent1" w:themeShade="BF"/>
-                <w:sz w:val="24"/>
-                <w:szCs w:val="24"/>
-              </w:rPr>
-              <w:t>真</w:t>
-            </w:r>
-            <w:r>
-              <w:rPr>
-                <w:rFonts w:ascii="Cambria Math" w:hAnsi="Cambria Math" w:cs="Cambria Math" w:hint="eastAsia"/>
-                <w:color w:val="0F4761" w:themeColor="accent1" w:themeShade="BF"/>
-                <w:sz w:val="24"/>
-                <w:szCs w:val="24"/>
-              </w:rPr>
-              <w:t xml:space="preserve">   </w:t>
             </w:r>
             <w:r>
               <w:rPr>
@@ -13052,88 +13009,7 @@
                 <w:sz w:val="24"/>
                 <w:szCs w:val="24"/>
               </w:rPr>
-              <w:t>=</w:t>
-            </w:r>
-            <w:r>
-              <w:rPr>
-                <w:rFonts w:cstheme="majorBidi" w:hint="eastAsia"/>
-                <w:color w:val="0F4761" w:themeColor="accent1" w:themeShade="BF"/>
-                <w:sz w:val="24"/>
-                <w:szCs w:val="24"/>
-              </w:rPr>
-              <w:t xml:space="preserve">    </w:t>
-            </w:r>
-            <w:r>
-              <w:rPr>
-                <w:rFonts w:ascii="Cambria Math" w:hAnsi="Cambria Math" w:cs="Cambria Math"/>
-                <w:color w:val="0F4761" w:themeColor="accent1" w:themeShade="BF"/>
-                <w:sz w:val="24"/>
-                <w:szCs w:val="24"/>
-              </w:rPr>
-              <w:t>∀</w:t>
-            </w:r>
-            <w:r>
-              <w:rPr>
-                <w:rFonts w:cstheme="majorBidi" w:hint="eastAsia"/>
-                <w:color w:val="0F4761" w:themeColor="accent1" w:themeShade="BF"/>
-                <w:sz w:val="24"/>
-                <w:szCs w:val="24"/>
-              </w:rPr>
-              <w:t xml:space="preserve"> x</w:t>
-            </w:r>
-            <w:r>
-              <w:rPr>
-                <w:rFonts w:cstheme="majorBidi" w:hint="eastAsia"/>
-                <w:color w:val="0F4761" w:themeColor="accent1" w:themeShade="BF"/>
-                <w:sz w:val="24"/>
-                <w:szCs w:val="24"/>
-              </w:rPr>
-              <w:t xml:space="preserve"> </w:t>
-            </w:r>
-            <w:r>
-              <w:rPr>
-                <w:rFonts w:cstheme="majorBidi" w:hint="eastAsia"/>
-                <w:color w:val="0F4761" w:themeColor="accent1" w:themeShade="BF"/>
-                <w:sz w:val="24"/>
-                <w:szCs w:val="24"/>
-              </w:rPr>
-              <w:t xml:space="preserve"> </w:t>
-            </w:r>
-            <w:r>
-              <w:rPr>
-                <w:rFonts w:cstheme="majorBidi" w:hint="eastAsia"/>
-                <w:color w:val="0F4761" w:themeColor="accent1" w:themeShade="BF"/>
-                <w:sz w:val="24"/>
-                <w:szCs w:val="24"/>
-              </w:rPr>
-              <w:t xml:space="preserve"> </w:t>
-            </w:r>
-            <w:r>
-              <w:rPr>
-                <w:rFonts w:cstheme="majorBidi"/>
-                <w:color w:val="0F4761" w:themeColor="accent1" w:themeShade="BF"/>
-                <w:sz w:val="24"/>
-                <w:szCs w:val="24"/>
-              </w:rPr>
-              <w:t>¬</w:t>
-            </w:r>
-            <w:r>
-              <w:rPr>
-                <w:rFonts w:cstheme="majorBidi" w:hint="eastAsia"/>
-                <w:color w:val="0F4761" w:themeColor="accent1" w:themeShade="BF"/>
-                <w:sz w:val="24"/>
-                <w:szCs w:val="24"/>
-              </w:rPr>
-              <w:t xml:space="preserve">  P(x)</w:t>
-            </w:r>
-            <w:r>
-              <w:rPr>
-                <w:rFonts w:cstheme="majorBidi" w:hint="eastAsia"/>
-                <w:color w:val="0F4761" w:themeColor="accent1" w:themeShade="BF"/>
-                <w:sz w:val="24"/>
-                <w:szCs w:val="24"/>
-              </w:rPr>
-              <w:t>为真</w:t>
+              <w:t xml:space="preserve">  P(x)为真</w:t>
             </w:r>
           </w:p>
           <w:p>
@@ -13275,23 +13151,7 @@
                 <w:sz w:val="24"/>
                 <w:szCs w:val="24"/>
               </w:rPr>
-              <w:t xml:space="preserve"> </w:t>
-            </w:r>
-            <w:r>
-              <w:rPr>
-                <w:rFonts w:ascii="Cambria Math" w:hAnsi="Cambria Math" w:cs="Cambria Math" w:hint="eastAsia"/>
-                <w:sz w:val="24"/>
-                <w:szCs w:val="24"/>
-              </w:rPr>
-              <w:t>x</w:t>
-            </w:r>
-            <w:r>
-              <w:rPr>
-                <w:rFonts w:ascii="Cambria Math" w:hAnsi="Cambria Math" w:cs="Cambria Math" w:hint="eastAsia"/>
-                <w:sz w:val="24"/>
-                <w:szCs w:val="24"/>
-              </w:rPr>
-              <w:t xml:space="preserve">  </w:t>
+              <w:t xml:space="preserve"> x  </w:t>
             </w:r>
             <w:r>
               <w:rPr>
@@ -13552,16 +13412,7 @@
                 <w:sz w:val="24"/>
                 <w:szCs w:val="24"/>
               </w:rPr>
-              <w:t xml:space="preserve"> </w:t>
-            </w:r>
-            <w:r>
-              <w:rPr>
-                <w:rFonts w:cstheme="majorBidi"/>
-                <w:color w:val="EE0000"/>
-                <w:sz w:val="24"/>
-                <w:szCs w:val="24"/>
-              </w:rPr>
-              <w:t>∨</w:t>
+              <w:t xml:space="preserve"> ∨</w:t>
             </w:r>
             <w:r>
               <w:rPr>
@@ -13629,25 +13480,7 @@
                 <w:sz w:val="24"/>
                 <w:szCs w:val="24"/>
               </w:rPr>
-              <w:t xml:space="preserve">A </w:t>
-            </w:r>
-            <w:r>
-              <w:rPr>
-                <w:rFonts w:cstheme="majorBidi" w:hint="eastAsia"/>
-                <w:color w:val="0F4761" w:themeColor="accent1" w:themeShade="BF"/>
-                <w:sz w:val="24"/>
-                <w:szCs w:val="24"/>
-              </w:rPr>
-              <w:t>=&gt;</w:t>
-            </w:r>
-            <w:r>
-              <w:rPr>
-                <w:rFonts w:cstheme="majorBidi" w:hint="eastAsia"/>
-                <w:color w:val="0F4761" w:themeColor="accent1" w:themeShade="BF"/>
-                <w:sz w:val="24"/>
-                <w:szCs w:val="24"/>
-              </w:rPr>
-              <w:t xml:space="preserve"> B       </w:t>
+              <w:t xml:space="preserve">A =&gt; B       </w:t>
             </w:r>
             <w:r>
               <w:rPr>
@@ -13768,15 +13601,7 @@
                 <w:sz w:val="24"/>
                 <w:szCs w:val="24"/>
               </w:rPr>
-              <w:t>P(x)</w:t>
-            </w:r>
-            <w:r>
-              <w:rPr>
-                <w:rFonts w:cstheme="majorBidi" w:hint="eastAsia"/>
-                <w:sz w:val="24"/>
-                <w:szCs w:val="24"/>
-              </w:rPr>
-              <w:t xml:space="preserve"> </w:t>
+              <w:t xml:space="preserve">P(x) </w:t>
             </w:r>
             <w:r>
               <w:rPr>
@@ -14309,19 +14134,7 @@
         <w:rPr>
           <w:rFonts w:hint="eastAsia"/>
         </w:rPr>
-        <w:t xml:space="preserve"> </w:t>
-      </w:r>
-      <w:r>
-        <w:rPr>
-          <w:rFonts w:hint="eastAsia"/>
-        </w:rPr>
-        <w:t>常用数学符号</w:t>
-      </w:r>
-      <w:r>
-        <w:rPr>
-          <w:rFonts w:hint="eastAsia"/>
-        </w:rPr>
-        <w:t xml:space="preserve"> </w:t>
+        <w:t xml:space="preserve"> 常用数学符号 </w:t>
       </w:r>
     </w:p>
     <w:p>
@@ -14435,13 +14248,45 @@
           <w:ilvl w:val="1"/>
           <w:numId w:val="2"/>
         </w:numPr>
+        <w:rPr>
+          <w:rFonts w:hint="eastAsia"/>
+        </w:rPr>
       </w:pPr>
       <w:r>
         <w:rPr>
           <w:rFonts w:hint="eastAsia"/>
         </w:rPr>
         <w:lastRenderedPageBreak/>
-        <w:t>Proof（证明</w:t>
+        <w:t>Proof（证明）</w:t>
+      </w:r>
+    </w:p>
+    <w:p>
+      <w:pPr>
+        <w:pStyle w:val="5"/>
+        <w:rPr>
+          <w:rFonts w:hint="eastAsia"/>
+        </w:rPr>
+      </w:pPr>
+      <w:r>
+        <w:rPr>
+          <w:rFonts w:hint="eastAsia"/>
+        </w:rPr>
+        <w:t xml:space="preserve">2.3.1 </w:t>
+      </w:r>
+      <w:r>
+        <w:t>Logical arguments</w:t>
+      </w:r>
+      <w:r>
+        <w:rPr>
+          <w:rFonts w:hint="eastAsia"/>
+        </w:rPr>
+        <w:t>（逻辑</w:t>
+      </w:r>
+      <w:r>
+        <w:rPr>
+          <w:rFonts w:hint="eastAsia"/>
+        </w:rPr>
+        <w:t>论证</w:t>
       </w:r>
       <w:r>
         <w:rPr>
@@ -14452,39 +14297,10 @@
     </w:p>
     <w:p>
       <w:pPr>
-        <w:pStyle w:val="5"/>
-      </w:pPr>
-      <w:r>
-        <w:rPr>
-          <w:rFonts w:hint="eastAsia"/>
-        </w:rPr>
-        <w:t xml:space="preserve">2.3.1 </w:t>
-      </w:r>
-      <w:r>
-        <w:t>Logical arguments</w:t>
-      </w:r>
-      <w:r>
-        <w:rPr>
-          <w:rFonts w:hint="eastAsia"/>
-        </w:rPr>
-        <w:t>（逻辑</w:t>
-      </w:r>
-      <w:r>
-        <w:rPr>
-          <w:rFonts w:hint="eastAsia"/>
-        </w:rPr>
-        <w:t>论证</w:t>
-      </w:r>
-      <w:r>
-        <w:rPr>
-          <w:rFonts w:hint="eastAsia"/>
-        </w:rPr>
-        <w:t>）</w:t>
-      </w:r>
-    </w:p>
-    <w:p>
-      <w:pPr>
         <w:jc w:val="left"/>
+        <w:rPr>
+          <w:rFonts w:hint="eastAsia"/>
+        </w:rPr>
       </w:pPr>
       <w:r>
         <w:rPr>
@@ -14706,8 +14522,14 @@
     <w:p>
       <w:pPr>
         <w:jc w:val="left"/>
-      </w:pPr>
-      <w:r>
+        <w:rPr>
+          <w:rFonts w:hint="eastAsia"/>
+        </w:rPr>
+      </w:pPr>
+      <w:r>
+        <w:rPr>
+          <w:noProof/>
+        </w:rPr>
         <w:drawing>
           <wp:inline distT="0" distB="0" distL="0" distR="0" wp14:anchorId="3D4FB376" wp14:editId="35CBD8D6">
             <wp:extent cx="5524500" cy="749022"/>
@@ -14745,10 +14567,19 @@
         </w:drawing>
       </w:r>
     </w:p>
-    <w:p/>
+    <w:p>
+      <w:pPr>
+        <w:rPr>
+          <w:rFonts w:hint="eastAsia"/>
+        </w:rPr>
+      </w:pPr>
+    </w:p>
     <w:p>
       <w:pPr>
         <w:pStyle w:val="5"/>
+        <w:rPr>
+          <w:rFonts w:hint="eastAsia"/>
+        </w:rPr>
       </w:pPr>
       <w:r>
         <w:rPr>
@@ -14794,6 +14625,7 @@
       <w:pPr>
         <w:jc w:val="left"/>
         <w:rPr>
+          <w:rFonts w:hint="eastAsia"/>
           <w:b/>
           <w:bCs/>
         </w:rPr>
@@ -14956,6 +14788,7 @@
         <w:ind w:firstLineChars="150" w:firstLine="315"/>
         <w:jc w:val="left"/>
         <w:rPr>
+          <w:rFonts w:hint="eastAsia"/>
           <w:color w:val="074F6A" w:themeColor="accent4" w:themeShade="80"/>
         </w:rPr>
       </w:pPr>
@@ -15002,6 +14835,7 @@
         <w:spacing w:line="360" w:lineRule="auto"/>
         <w:jc w:val="left"/>
         <w:rPr>
+          <w:rFonts w:hint="eastAsia"/>
           <w:b/>
           <w:bCs/>
           <w:color w:val="074F6A" w:themeColor="accent4" w:themeShade="80"/>
@@ -15030,16 +14864,7 @@
           <w:bCs/>
           <w:color w:val="074F6A" w:themeColor="accent4" w:themeShade="80"/>
         </w:rPr>
-        <w:t>(前提)</w:t>
-      </w:r>
-      <w:r>
-        <w:rPr>
-          <w:rFonts w:hint="eastAsia"/>
-          <w:b/>
-          <w:bCs/>
-          <w:color w:val="074F6A" w:themeColor="accent4" w:themeShade="80"/>
-        </w:rPr>
-        <w:t xml:space="preserve"> </w:t>
+        <w:t xml:space="preserve">(前提) </w:t>
       </w:r>
       <w:r>
         <w:rPr>
@@ -15166,6 +14991,7 @@
         <w:ind w:left="720"/>
         <w:jc w:val="left"/>
         <w:rPr>
+          <w:rFonts w:hint="eastAsia"/>
           <w:b/>
           <w:bCs/>
           <w:color w:val="074F6A" w:themeColor="accent4" w:themeShade="80"/>
@@ -15239,6 +15065,7 @@
         <w:spacing w:line="360" w:lineRule="auto"/>
         <w:jc w:val="left"/>
         <w:rPr>
+          <w:rFonts w:hint="eastAsia"/>
           <w:color w:val="074F6A" w:themeColor="accent4" w:themeShade="80"/>
         </w:rPr>
       </w:pPr>
@@ -15760,6 +15587,7 @@
         <w:spacing w:line="360" w:lineRule="auto"/>
         <w:jc w:val="left"/>
         <w:rPr>
+          <w:rFonts w:hint="eastAsia"/>
           <w:b/>
           <w:bCs/>
           <w:color w:val="074F6A" w:themeColor="accent4" w:themeShade="80"/>
@@ -15931,6 +15759,7 @@
         <w:ind w:left="720"/>
         <w:jc w:val="left"/>
         <w:rPr>
+          <w:rFonts w:hint="eastAsia"/>
           <w:color w:val="074F6A" w:themeColor="accent4" w:themeShade="80"/>
         </w:rPr>
       </w:pPr>
@@ -15994,6 +15823,7 @@
         <w:ind w:left="720"/>
         <w:jc w:val="left"/>
         <w:rPr>
+          <w:rFonts w:hint="eastAsia"/>
           <w:color w:val="074F6A" w:themeColor="accent4" w:themeShade="80"/>
         </w:rPr>
       </w:pPr>
@@ -16160,6 +15990,7 @@
         <w:spacing w:line="360" w:lineRule="auto"/>
         <w:jc w:val="left"/>
         <w:rPr>
+          <w:rFonts w:hint="eastAsia"/>
           <w:color w:val="074F6A" w:themeColor="accent4" w:themeShade="80"/>
         </w:rPr>
       </w:pPr>
@@ -16259,6 +16090,7 @@
         <w:spacing w:line="360" w:lineRule="auto"/>
         <w:jc w:val="left"/>
         <w:rPr>
+          <w:rFonts w:hint="eastAsia"/>
           <w:color w:val="074F6A" w:themeColor="accent4" w:themeShade="80"/>
         </w:rPr>
       </w:pPr>
@@ -16268,6 +16100,7 @@
         <w:spacing w:line="360" w:lineRule="auto"/>
         <w:jc w:val="left"/>
         <w:rPr>
+          <w:rFonts w:hint="eastAsia"/>
           <w:color w:val="074F6A" w:themeColor="accent4" w:themeShade="80"/>
         </w:rPr>
       </w:pPr>
@@ -16277,6 +16110,7 @@
         <w:spacing w:line="360" w:lineRule="auto"/>
         <w:jc w:val="left"/>
         <w:rPr>
+          <w:rFonts w:hint="eastAsia"/>
           <w:color w:val="074F6A" w:themeColor="accent4" w:themeShade="80"/>
         </w:rPr>
       </w:pPr>
@@ -16294,6 +16128,7 @@
         <w:spacing w:line="360" w:lineRule="auto"/>
         <w:jc w:val="left"/>
         <w:rPr>
+          <w:rFonts w:hint="eastAsia"/>
           <w:color w:val="074F6A" w:themeColor="accent4" w:themeShade="80"/>
         </w:rPr>
       </w:pPr>
@@ -16463,16 +16298,7 @@
                 <w:sz w:val="24"/>
                 <w:szCs w:val="24"/>
               </w:rPr>
-              <w:t xml:space="preserve">Premise </w:t>
-            </w:r>
-            <w:r>
-              <w:rPr>
-                <w:rFonts w:hint="eastAsia"/>
-                <w:color w:val="074F6A" w:themeColor="accent4" w:themeShade="80"/>
-                <w:sz w:val="24"/>
-                <w:szCs w:val="24"/>
-              </w:rPr>
-              <w:t xml:space="preserve">2 </w:t>
+              <w:t xml:space="preserve">Premise 2 </w:t>
             </w:r>
           </w:p>
         </w:tc>
@@ -16507,16 +16333,7 @@
                 <w:sz w:val="24"/>
                 <w:szCs w:val="24"/>
               </w:rPr>
-              <w:t xml:space="preserve"> </w:t>
-            </w:r>
-            <w:r>
-              <w:rPr>
-                <w:rFonts w:cstheme="majorBidi" w:hint="eastAsia"/>
-                <w:color w:val="0F4761" w:themeColor="accent1" w:themeShade="BF"/>
-                <w:sz w:val="24"/>
-                <w:szCs w:val="24"/>
-              </w:rPr>
-              <w:t>P2</w:t>
+              <w:t xml:space="preserve"> P2</w:t>
             </w:r>
           </w:p>
         </w:tc>
@@ -16584,7 +16401,7 @@
               <w:spacing w:line="360" w:lineRule="auto"/>
               <w:jc w:val="left"/>
               <w:rPr>
-                <w:rFonts w:cstheme="majorBidi"/>
+                <w:rFonts w:cstheme="majorBidi" w:hint="eastAsia"/>
                 <w:color w:val="0F4761" w:themeColor="accent1" w:themeShade="BF"/>
                 <w:sz w:val="24"/>
                 <w:szCs w:val="24"/>
@@ -16770,6 +16587,7 @@
         <w:spacing w:line="360" w:lineRule="auto"/>
         <w:jc w:val="left"/>
         <w:rPr>
+          <w:rFonts w:hint="eastAsia"/>
           <w:color w:val="074F6A" w:themeColor="accent4" w:themeShade="80"/>
         </w:rPr>
       </w:pPr>
@@ -16779,6 +16597,7 @@
         <w:spacing w:line="360" w:lineRule="auto"/>
         <w:jc w:val="left"/>
         <w:rPr>
+          <w:rFonts w:hint="eastAsia"/>
           <w:color w:val="074F6A" w:themeColor="accent4" w:themeShade="80"/>
         </w:rPr>
       </w:pPr>
@@ -17041,7 +16860,7 @@
               <w:spacing w:line="360" w:lineRule="auto"/>
               <w:jc w:val="left"/>
               <w:rPr>
-                <w:rFonts w:cstheme="majorBidi"/>
+                <w:rFonts w:cstheme="majorBidi" w:hint="eastAsia"/>
                 <w:color w:val="0F4761" w:themeColor="accent1" w:themeShade="BF"/>
                 <w:sz w:val="24"/>
                 <w:szCs w:val="24"/>
@@ -17191,6 +17010,7 @@
         <w:spacing w:line="360" w:lineRule="auto"/>
         <w:jc w:val="left"/>
         <w:rPr>
+          <w:rFonts w:hint="eastAsia"/>
           <w:color w:val="074F6A" w:themeColor="accent4" w:themeShade="80"/>
         </w:rPr>
       </w:pPr>
@@ -17200,29 +17020,16 @@
         <w:spacing w:line="360" w:lineRule="auto"/>
         <w:jc w:val="left"/>
         <w:rPr>
-          <w:color w:val="074F6A" w:themeColor="accent4" w:themeShade="80"/>
-        </w:rPr>
-      </w:pPr>
-      <w:r>
-        <w:rPr>
-          <w:rFonts w:hint="eastAsia"/>
-          <w:color w:val="074F6A" w:themeColor="accent4" w:themeShade="80"/>
-        </w:rPr>
-        <w:t>例子</w:t>
-      </w:r>
-      <w:r>
-        <w:rPr>
-          <w:rFonts w:hint="eastAsia"/>
-          <w:color w:val="074F6A" w:themeColor="accent4" w:themeShade="80"/>
-        </w:rPr>
-        <w:t>3</w:t>
-      </w:r>
-      <w:r>
-        <w:rPr>
-          <w:rFonts w:hint="eastAsia"/>
-          <w:color w:val="074F6A" w:themeColor="accent4" w:themeShade="80"/>
-        </w:rPr>
-        <w:t>：</w:t>
+          <w:rFonts w:hint="eastAsia"/>
+          <w:color w:val="074F6A" w:themeColor="accent4" w:themeShade="80"/>
+        </w:rPr>
+      </w:pPr>
+      <w:r>
+        <w:rPr>
+          <w:rFonts w:hint="eastAsia"/>
+          <w:color w:val="074F6A" w:themeColor="accent4" w:themeShade="80"/>
+        </w:rPr>
+        <w:t>例子3：</w:t>
       </w:r>
     </w:p>
     <w:p>
@@ -17230,6 +17037,7 @@
         <w:spacing w:line="360" w:lineRule="auto"/>
         <w:jc w:val="left"/>
         <w:rPr>
+          <w:rFonts w:hint="eastAsia"/>
           <w:color w:val="074F6A" w:themeColor="accent4" w:themeShade="80"/>
         </w:rPr>
       </w:pPr>
@@ -17368,16 +17176,7 @@
                 <w:sz w:val="24"/>
                 <w:szCs w:val="24"/>
               </w:rPr>
-              <w:t xml:space="preserve"> </w:t>
-            </w:r>
-            <w:r>
-              <w:rPr>
-                <w:rFonts w:cstheme="majorBidi" w:hint="eastAsia"/>
-                <w:color w:val="0F4761" w:themeColor="accent1" w:themeShade="BF"/>
-                <w:sz w:val="24"/>
-                <w:szCs w:val="24"/>
-              </w:rPr>
-              <w:t>P2</w:t>
+              <w:t xml:space="preserve"> P2</w:t>
             </w:r>
           </w:p>
         </w:tc>
@@ -17660,16 +17459,7 @@
                 <w:sz w:val="24"/>
                 <w:szCs w:val="24"/>
               </w:rPr>
-              <w:t>Inv</w:t>
-            </w:r>
-            <w:r>
-              <w:rPr>
-                <w:rFonts w:cstheme="majorBidi" w:hint="eastAsia"/>
-                <w:color w:val="0F4761" w:themeColor="accent1" w:themeShade="BF"/>
-                <w:sz w:val="24"/>
-                <w:szCs w:val="24"/>
-              </w:rPr>
-              <w:t>alid</w:t>
+              <w:t>Invalid</w:t>
             </w:r>
           </w:p>
         </w:tc>
@@ -17680,6 +17470,7 @@
         <w:spacing w:line="360" w:lineRule="auto"/>
         <w:jc w:val="left"/>
         <w:rPr>
+          <w:rFonts w:hint="eastAsia"/>
           <w:color w:val="074F6A" w:themeColor="accent4" w:themeShade="80"/>
         </w:rPr>
       </w:pPr>
@@ -17689,29 +17480,16 @@
         <w:spacing w:line="360" w:lineRule="auto"/>
         <w:jc w:val="left"/>
         <w:rPr>
-          <w:color w:val="074F6A" w:themeColor="accent4" w:themeShade="80"/>
-        </w:rPr>
-      </w:pPr>
-      <w:r>
-        <w:rPr>
-          <w:rFonts w:hint="eastAsia"/>
-          <w:color w:val="074F6A" w:themeColor="accent4" w:themeShade="80"/>
-        </w:rPr>
-        <w:t>例子</w:t>
-      </w:r>
-      <w:r>
-        <w:rPr>
-          <w:rFonts w:hint="eastAsia"/>
-          <w:color w:val="074F6A" w:themeColor="accent4" w:themeShade="80"/>
-        </w:rPr>
-        <w:t>4</w:t>
-      </w:r>
-      <w:r>
-        <w:rPr>
-          <w:rFonts w:hint="eastAsia"/>
-          <w:color w:val="074F6A" w:themeColor="accent4" w:themeShade="80"/>
-        </w:rPr>
-        <w:t>：</w:t>
+          <w:rFonts w:hint="eastAsia"/>
+          <w:color w:val="074F6A" w:themeColor="accent4" w:themeShade="80"/>
+        </w:rPr>
+      </w:pPr>
+      <w:r>
+        <w:rPr>
+          <w:rFonts w:hint="eastAsia"/>
+          <w:color w:val="074F6A" w:themeColor="accent4" w:themeShade="80"/>
+        </w:rPr>
+        <w:t>例子4：</w:t>
       </w:r>
       <w:r>
         <w:rPr>
@@ -17726,6 +17504,7 @@
         <w:spacing w:line="360" w:lineRule="auto"/>
         <w:jc w:val="left"/>
         <w:rPr>
+          <w:rFonts w:hint="eastAsia"/>
           <w:color w:val="074F6A" w:themeColor="accent4" w:themeShade="80"/>
         </w:rPr>
       </w:pPr>
@@ -17799,6 +17578,7 @@
         <w:spacing w:line="360" w:lineRule="auto"/>
         <w:jc w:val="left"/>
         <w:rPr>
+          <w:rFonts w:hint="eastAsia"/>
           <w:color w:val="074F6A" w:themeColor="accent4" w:themeShade="80"/>
         </w:rPr>
       </w:pPr>
@@ -17829,6 +17609,7 @@
         <w:spacing w:line="360" w:lineRule="auto"/>
         <w:jc w:val="left"/>
         <w:rPr>
+          <w:rFonts w:hint="eastAsia"/>
           <w:color w:val="074F6A" w:themeColor="accent4" w:themeShade="80"/>
         </w:rPr>
       </w:pPr>
@@ -17893,6 +17674,7 @@
         <w:spacing w:line="360" w:lineRule="auto"/>
         <w:jc w:val="left"/>
         <w:rPr>
+          <w:rFonts w:hint="eastAsia"/>
           <w:color w:val="074F6A" w:themeColor="accent4" w:themeShade="80"/>
         </w:rPr>
       </w:pPr>
@@ -17900,6 +17682,9 @@
     <w:p>
       <w:pPr>
         <w:pStyle w:val="5"/>
+        <w:rPr>
+          <w:rFonts w:hint="eastAsia"/>
+        </w:rPr>
       </w:pPr>
       <w:r>
         <w:rPr>
@@ -17943,6 +17728,7 @@
         <w:spacing w:line="360" w:lineRule="auto"/>
         <w:ind w:firstLine="420"/>
         <w:rPr>
+          <w:rFonts w:hint="eastAsia"/>
           <w:color w:val="074F6A" w:themeColor="accent4" w:themeShade="80"/>
         </w:rPr>
       </w:pPr>
@@ -17958,6 +17744,7 @@
         <w:spacing w:line="360" w:lineRule="auto"/>
         <w:ind w:firstLine="420"/>
         <w:rPr>
+          <w:rFonts w:hint="eastAsia"/>
           <w:color w:val="074F6A" w:themeColor="accent4" w:themeShade="80"/>
         </w:rPr>
       </w:pPr>
@@ -17990,6 +17777,7 @@
         </w:numPr>
         <w:spacing w:line="360" w:lineRule="auto"/>
         <w:rPr>
+          <w:rFonts w:hint="eastAsia"/>
           <w:color w:val="074F6A" w:themeColor="accent4" w:themeShade="80"/>
         </w:rPr>
       </w:pPr>
@@ -18067,6 +17855,7 @@
         </w:numPr>
         <w:spacing w:line="360" w:lineRule="auto"/>
         <w:rPr>
+          <w:rFonts w:hint="eastAsia"/>
           <w:color w:val="074F6A" w:themeColor="accent4" w:themeShade="80"/>
         </w:rPr>
       </w:pPr>
@@ -18085,6 +17874,7 @@
         </w:numPr>
         <w:spacing w:line="360" w:lineRule="auto"/>
         <w:rPr>
+          <w:rFonts w:hint="eastAsia"/>
           <w:color w:val="074F6A" w:themeColor="accent4" w:themeShade="80"/>
         </w:rPr>
       </w:pPr>
@@ -18116,6 +17906,7 @@
         </w:numPr>
         <w:spacing w:line="360" w:lineRule="auto"/>
         <w:rPr>
+          <w:rFonts w:hint="eastAsia"/>
           <w:color w:val="074F6A" w:themeColor="accent4" w:themeShade="80"/>
         </w:rPr>
       </w:pPr>
@@ -18153,6 +17944,9 @@
     <w:p>
       <w:pPr>
         <w:pStyle w:val="6"/>
+        <w:rPr>
+          <w:rFonts w:hint="eastAsia"/>
+        </w:rPr>
       </w:pPr>
       <w:r>
         <w:rPr>
@@ -18191,7 +17985,9 @@
     </w:p>
     <w:p>
       <w:pPr>
-        <w:pStyle w:val="6"/>
+        <w:rPr>
+          <w:rFonts w:hint="eastAsia"/>
+        </w:rPr>
       </w:pPr>
       <w:r>
         <w:rPr>
@@ -18257,6 +18053,9 @@
     <w:p>
       <w:pPr>
         <w:pStyle w:val="6"/>
+        <w:rPr>
+          <w:rFonts w:hint="eastAsia"/>
+        </w:rPr>
       </w:pPr>
       <w:r>
         <w:rPr>
@@ -18357,6 +18156,7 @@
       <w:pPr>
         <w:pStyle w:val="6"/>
         <w:rPr>
+          <w:rFonts w:hint="eastAsia"/>
           <w:color w:val="074F6A" w:themeColor="accent4" w:themeShade="80"/>
         </w:rPr>
       </w:pPr>
@@ -18376,6 +18176,7 @@
           <w:numId w:val="16"/>
         </w:numPr>
         <w:rPr>
+          <w:rFonts w:hint="eastAsia"/>
           <w:color w:val="074F6A" w:themeColor="accent4" w:themeShade="80"/>
         </w:rPr>
       </w:pPr>
@@ -18437,6 +18238,7 @@
           <w:numId w:val="16"/>
         </w:numPr>
         <w:rPr>
+          <w:rFonts w:hint="eastAsia"/>
           <w:color w:val="074F6A" w:themeColor="accent4" w:themeShade="80"/>
         </w:rPr>
       </w:pPr>
@@ -18506,16 +18308,15 @@
     </w:p>
     <w:p>
       <w:pPr>
+        <w:rPr>
+          <w:rFonts w:hint="eastAsia"/>
+        </w:rPr>
+      </w:pPr>
+    </w:p>
+    <w:p>
+      <w:pPr>
         <w:pStyle w:val="6"/>
         <w:rPr>
-          <w:color w:val="074F6A" w:themeColor="accent4" w:themeShade="80"/>
-        </w:rPr>
-      </w:pPr>
-    </w:p>
-    <w:p>
-      <w:pPr>
-        <w:pStyle w:val="6"/>
-        <w:rPr>
           <w:rFonts w:hint="eastAsia"/>
         </w:rPr>
       </w:pPr>
@@ -18548,6 +18349,11 @@
       </w:r>
     </w:p>
     <w:p>
+      <w:pPr>
+        <w:rPr>
+          <w:rFonts w:hint="eastAsia"/>
+        </w:rPr>
+      </w:pPr>
       <w:r>
         <w:rPr>
           <w:rFonts w:hint="eastAsia"/>
@@ -18606,6 +18412,9 @@
     <w:p>
       <w:pPr>
         <w:pStyle w:val="5"/>
+        <w:rPr>
+          <w:rFonts w:hint="eastAsia"/>
+        </w:rPr>
       </w:pPr>
       <w:r>
         <w:rPr>
@@ -18740,7 +18549,13 @@
         </w:drawing>
       </w:r>
     </w:p>
-    <w:p/>
+    <w:p>
+      <w:pPr>
+        <w:rPr>
+          <w:rFonts w:hint="eastAsia"/>
+        </w:rPr>
+      </w:pPr>
+    </w:p>
     <w:p>
       <w:pPr>
         <w:rPr>
@@ -21313,6 +21128,7 @@
   <w:style w:type="character" w:default="1" w:styleId="a0">
     <w:name w:val="Default Paragraph Font"/>
     <w:uiPriority w:val="1"/>
+    <w:semiHidden/>
     <w:unhideWhenUsed/>
   </w:style>
   <w:style w:type="table" w:default="1" w:styleId="a1">

</xml_diff>

<commit_message>
add 50 week1.4 note
</commit_message>
<xml_diff>
--- a/26fall/1870/Note/w1s1.docx
+++ b/26fall/1870/Note/w1s1.docx
@@ -384,7 +384,7 @@
                     </pic:cNvPicPr>
                   </pic:nvPicPr>
                   <pic:blipFill>
-                    <a:blip r:embed="rId6">
+                    <a:blip r:embed="rId8">
                       <a:extLst>
                         <a:ext uri="{28A0092B-C50C-407E-A947-70E740481C1C}">
                           <a14:useLocalDpi xmlns:a14="http://schemas.microsoft.com/office/drawing/2010/main" val="0"/>
@@ -1571,7 +1571,7 @@
                     <pic:cNvPicPr/>
                   </pic:nvPicPr>
                   <pic:blipFill>
-                    <a:blip r:embed="rId7"/>
+                    <a:blip r:embed="rId9"/>
                     <a:stretch>
                       <a:fillRect/>
                     </a:stretch>
@@ -1836,7 +1836,7 @@
                     </pic:cNvPicPr>
                   </pic:nvPicPr>
                   <pic:blipFill>
-                    <a:blip r:embed="rId8">
+                    <a:blip r:embed="rId10">
                       <a:extLst>
                         <a:ext uri="{28A0092B-C50C-407E-A947-70E740481C1C}">
                           <a14:useLocalDpi xmlns:a14="http://schemas.microsoft.com/office/drawing/2010/main" val="0"/>
@@ -2063,7 +2063,7 @@
                     </pic:cNvPicPr>
                   </pic:nvPicPr>
                   <pic:blipFill>
-                    <a:blip r:embed="rId9">
+                    <a:blip r:embed="rId11">
                       <a:extLst>
                         <a:ext uri="{28A0092B-C50C-407E-A947-70E740481C1C}">
                           <a14:useLocalDpi xmlns:a14="http://schemas.microsoft.com/office/drawing/2010/main" val="0"/>
@@ -2126,7 +2126,7 @@
           <w:color w:val="074F6A" w:themeColor="accent4" w:themeShade="80"/>
         </w:rPr>
       </w:pPr>
-      <w:hyperlink r:id="rId10" w:history="1">
+      <w:hyperlink r:id="rId12" w:history="1">
         <w:r>
           <w:rPr>
             <w:rStyle w:val="ae"/>
@@ -2283,7 +2283,7 @@
                     <pic:cNvPicPr/>
                   </pic:nvPicPr>
                   <pic:blipFill>
-                    <a:blip r:embed="rId11"/>
+                    <a:blip r:embed="rId13"/>
                     <a:stretch>
                       <a:fillRect/>
                     </a:stretch>
@@ -2500,7 +2500,7 @@
                     </pic:cNvPicPr>
                   </pic:nvPicPr>
                   <pic:blipFill>
-                    <a:blip r:embed="rId9">
+                    <a:blip r:embed="rId11">
                       <a:extLst>
                         <a:ext uri="{28A0092B-C50C-407E-A947-70E740481C1C}">
                           <a14:useLocalDpi xmlns:a14="http://schemas.microsoft.com/office/drawing/2010/main" val="0"/>
@@ -4042,7 +4042,7 @@
                     </pic:cNvPicPr>
                   </pic:nvPicPr>
                   <pic:blipFill>
-                    <a:blip r:embed="rId12">
+                    <a:blip r:embed="rId14">
                       <a:extLst>
                         <a:ext uri="{28A0092B-C50C-407E-A947-70E740481C1C}">
                           <a14:useLocalDpi xmlns:a14="http://schemas.microsoft.com/office/drawing/2010/main" val="0"/>
@@ -4688,7 +4688,7 @@
                     </pic:cNvPicPr>
                   </pic:nvPicPr>
                   <pic:blipFill>
-                    <a:blip r:embed="rId13">
+                    <a:blip r:embed="rId15">
                       <a:extLst>
                         <a:ext uri="{28A0092B-C50C-407E-A947-70E740481C1C}">
                           <a14:useLocalDpi xmlns:a14="http://schemas.microsoft.com/office/drawing/2010/main" val="0"/>
@@ -4882,7 +4882,7 @@
                     <pic:cNvPicPr/>
                   </pic:nvPicPr>
                   <pic:blipFill>
-                    <a:blip r:embed="rId14"/>
+                    <a:blip r:embed="rId16"/>
                     <a:stretch>
                       <a:fillRect/>
                     </a:stretch>
@@ -4935,7 +4935,7 @@
                     </pic:cNvPicPr>
                   </pic:nvPicPr>
                   <pic:blipFill>
-                    <a:blip r:embed="rId15">
+                    <a:blip r:embed="rId17">
                       <a:extLst>
                         <a:ext uri="{28A0092B-C50C-407E-A947-70E740481C1C}">
                           <a14:useLocalDpi xmlns:a14="http://schemas.microsoft.com/office/drawing/2010/main" val="0"/>
@@ -5150,7 +5150,7 @@
                           <pic:cNvPicPr/>
                         </pic:nvPicPr>
                         <pic:blipFill>
-                          <a:blip r:embed="rId16"/>
+                          <a:blip r:embed="rId18"/>
                           <a:stretch>
                             <a:fillRect/>
                           </a:stretch>
@@ -5368,7 +5368,7 @@
                           <pic:cNvPicPr/>
                         </pic:nvPicPr>
                         <pic:blipFill>
-                          <a:blip r:embed="rId17"/>
+                          <a:blip r:embed="rId19"/>
                           <a:stretch>
                             <a:fillRect/>
                           </a:stretch>
@@ -5574,7 +5574,7 @@
                           <pic:cNvPicPr/>
                         </pic:nvPicPr>
                         <pic:blipFill>
-                          <a:blip r:embed="rId18"/>
+                          <a:blip r:embed="rId20"/>
                           <a:stretch>
                             <a:fillRect/>
                           </a:stretch>
@@ -5820,7 +5820,7 @@
                           <pic:cNvPicPr/>
                         </pic:nvPicPr>
                         <pic:blipFill>
-                          <a:blip r:embed="rId19"/>
+                          <a:blip r:embed="rId21"/>
                           <a:stretch>
                             <a:fillRect/>
                           </a:stretch>
@@ -6049,7 +6049,7 @@
                           <pic:cNvPicPr/>
                         </pic:nvPicPr>
                         <pic:blipFill>
-                          <a:blip r:embed="rId20"/>
+                          <a:blip r:embed="rId22"/>
                           <a:stretch>
                             <a:fillRect/>
                           </a:stretch>
@@ -6538,7 +6538,7 @@
                           <pic:cNvPicPr/>
                         </pic:nvPicPr>
                         <pic:blipFill>
-                          <a:blip r:embed="rId21"/>
+                          <a:blip r:embed="rId23"/>
                           <a:stretch>
                             <a:fillRect/>
                           </a:stretch>
@@ -6730,7 +6730,7 @@
           <w:color w:val="074F6A" w:themeColor="accent4" w:themeShade="80"/>
         </w:rPr>
       </w:pPr>
-      <w:hyperlink r:id="rId22" w:history="1">
+      <w:hyperlink r:id="rId24" w:history="1">
         <w:r>
           <w:rPr>
             <w:rStyle w:val="ae"/>
@@ -6747,7 +6747,7 @@
           <w:color w:val="074F6A" w:themeColor="accent4" w:themeShade="80"/>
         </w:rPr>
       </w:pPr>
-      <w:hyperlink r:id="rId23" w:history="1">
+      <w:hyperlink r:id="rId25" w:history="1">
         <w:r>
           <w:rPr>
             <w:rStyle w:val="ae"/>
@@ -7663,7 +7663,7 @@
                     <pic:cNvPicPr/>
                   </pic:nvPicPr>
                   <pic:blipFill>
-                    <a:blip r:embed="rId24"/>
+                    <a:blip r:embed="rId26"/>
                     <a:stretch>
                       <a:fillRect/>
                     </a:stretch>
@@ -7724,7 +7724,7 @@
                     </pic:cNvPicPr>
                   </pic:nvPicPr>
                   <pic:blipFill>
-                    <a:blip r:embed="rId25">
+                    <a:blip r:embed="rId27">
                       <a:extLst>
                         <a:ext uri="{28A0092B-C50C-407E-A947-70E740481C1C}">
                           <a14:useLocalDpi xmlns:a14="http://schemas.microsoft.com/office/drawing/2010/main" val="0"/>
@@ -7806,7 +7806,7 @@
                     <pic:cNvPicPr/>
                   </pic:nvPicPr>
                   <pic:blipFill>
-                    <a:blip r:embed="rId26"/>
+                    <a:blip r:embed="rId28"/>
                     <a:stretch>
                       <a:fillRect/>
                     </a:stretch>
@@ -7893,7 +7893,7 @@
                     <pic:cNvPicPr/>
                   </pic:nvPicPr>
                   <pic:blipFill>
-                    <a:blip r:embed="rId27"/>
+                    <a:blip r:embed="rId29"/>
                     <a:stretch>
                       <a:fillRect/>
                     </a:stretch>
@@ -8217,7 +8217,7 @@
                     <pic:cNvPicPr/>
                   </pic:nvPicPr>
                   <pic:blipFill>
-                    <a:blip r:embed="rId28"/>
+                    <a:blip r:embed="rId30"/>
                     <a:stretch>
                       <a:fillRect/>
                     </a:stretch>
@@ -8687,7 +8687,7 @@
                     </pic:cNvPicPr>
                   </pic:nvPicPr>
                   <pic:blipFill>
-                    <a:blip r:embed="rId29">
+                    <a:blip r:embed="rId31">
                       <a:extLst>
                         <a:ext uri="{28A0092B-C50C-407E-A947-70E740481C1C}">
                           <a14:useLocalDpi xmlns:a14="http://schemas.microsoft.com/office/drawing/2010/main" val="0"/>
@@ -8749,7 +8749,7 @@
                     </pic:cNvPicPr>
                   </pic:nvPicPr>
                   <pic:blipFill>
-                    <a:blip r:embed="rId30">
+                    <a:blip r:embed="rId32">
                       <a:extLst>
                         <a:ext uri="{28A0092B-C50C-407E-A947-70E740481C1C}">
                           <a14:useLocalDpi xmlns:a14="http://schemas.microsoft.com/office/drawing/2010/main" val="0"/>
@@ -8814,7 +8814,7 @@
                     <pic:cNvPicPr/>
                   </pic:nvPicPr>
                   <pic:blipFill>
-                    <a:blip r:embed="rId31"/>
+                    <a:blip r:embed="rId33"/>
                     <a:stretch>
                       <a:fillRect/>
                     </a:stretch>
@@ -8871,7 +8871,7 @@
                     </pic:cNvPicPr>
                   </pic:nvPicPr>
                   <pic:blipFill>
-                    <a:blip r:embed="rId32">
+                    <a:blip r:embed="rId34">
                       <a:extLst>
                         <a:ext uri="{28A0092B-C50C-407E-A947-70E740481C1C}">
                           <a14:useLocalDpi xmlns:a14="http://schemas.microsoft.com/office/drawing/2010/main" val="0"/>
@@ -8936,7 +8936,7 @@
                     <pic:cNvPicPr/>
                   </pic:nvPicPr>
                   <pic:blipFill>
-                    <a:blip r:embed="rId33"/>
+                    <a:blip r:embed="rId35"/>
                     <a:stretch>
                       <a:fillRect/>
                     </a:stretch>
@@ -11119,7 +11119,7 @@
                     <pic:cNvPicPr/>
                   </pic:nvPicPr>
                   <pic:blipFill>
-                    <a:blip r:embed="rId34"/>
+                    <a:blip r:embed="rId36"/>
                     <a:stretch>
                       <a:fillRect/>
                     </a:stretch>
@@ -18202,7 +18202,7 @@
                     </pic:cNvPicPr>
                   </pic:nvPicPr>
                   <pic:blipFill>
-                    <a:blip r:embed="rId35">
+                    <a:blip r:embed="rId37">
                       <a:extLst>
                         <a:ext uri="{28A0092B-C50C-407E-A947-70E740481C1C}">
                           <a14:useLocalDpi xmlns:a14="http://schemas.microsoft.com/office/drawing/2010/main" val="0"/>
@@ -18270,7 +18270,7 @@
                     </pic:cNvPicPr>
                   </pic:nvPicPr>
                   <pic:blipFill>
-                    <a:blip r:embed="rId36">
+                    <a:blip r:embed="rId38">
                       <a:extLst>
                         <a:ext uri="{28A0092B-C50C-407E-A947-70E740481C1C}">
                           <a14:useLocalDpi xmlns:a14="http://schemas.microsoft.com/office/drawing/2010/main" val="0"/>
@@ -18348,7 +18348,7 @@
                     </pic:cNvPicPr>
                   </pic:nvPicPr>
                   <pic:blipFill>
-                    <a:blip r:embed="rId37">
+                    <a:blip r:embed="rId39">
                       <a:extLst>
                         <a:ext uri="{28A0092B-C50C-407E-A947-70E740481C1C}">
                           <a14:useLocalDpi xmlns:a14="http://schemas.microsoft.com/office/drawing/2010/main" val="0"/>
@@ -18443,7 +18443,7 @@
                     </pic:cNvPicPr>
                   </pic:nvPicPr>
                   <pic:blipFill>
-                    <a:blip r:embed="rId38">
+                    <a:blip r:embed="rId40">
                       <a:extLst>
                         <a:ext uri="{28A0092B-C50C-407E-A947-70E740481C1C}">
                           <a14:useLocalDpi xmlns:a14="http://schemas.microsoft.com/office/drawing/2010/main" val="0"/>
@@ -18639,10 +18639,10 @@
         <w:tblLook w:val="04A0" w:firstRow="1" w:lastRow="0" w:firstColumn="1" w:lastColumn="0" w:noHBand="0" w:noVBand="1"/>
       </w:tblPr>
       <w:tblGrid>
-        <w:gridCol w:w="2118"/>
-        <w:gridCol w:w="2646"/>
-        <w:gridCol w:w="2198"/>
-        <w:gridCol w:w="3504"/>
+        <w:gridCol w:w="2119"/>
+        <w:gridCol w:w="2648"/>
+        <w:gridCol w:w="2199"/>
+        <w:gridCol w:w="3500"/>
       </w:tblGrid>
       <w:tr>
         <w:tc>
@@ -18911,9 +18911,9 @@
                   <o:lock v:ext="edit" aspectratio="t"/>
                 </v:shapetype>
                 <v:shape id="_x0000_i1025" type="#_x0000_t75" style="width:58.5pt;height:33pt" o:ole="">
-                  <v:imagedata r:id="rId39" o:title=""/>
+                  <v:imagedata r:id="rId41" o:title=""/>
                 </v:shape>
-                <o:OLEObject Type="Embed" ProgID="PBrush" ShapeID="_x0000_i1025" DrawAspect="Content" ObjectID="_1853571011" r:id="rId40"/>
+                <o:OLEObject Type="Embed" ProgID="PBrush" ShapeID="_x0000_i1025" DrawAspect="Content" ObjectID="_1853742671" r:id="rId42"/>
               </w:object>
             </w:r>
           </w:p>
@@ -18940,9 +18940,9 @@
               </w:rPr>
               <w:object w:dxaOrig="4215" w:dyaOrig="1395" w14:anchorId="2CAF7B2E">
                 <v:shape id="_x0000_i1026" type="#_x0000_t75" style="width:164.25pt;height:54pt" o:ole="">
-                  <v:imagedata r:id="rId41" o:title=""/>
+                  <v:imagedata r:id="rId43" o:title=""/>
                 </v:shape>
-                <o:OLEObject Type="Embed" ProgID="PBrush" ShapeID="_x0000_i1026" DrawAspect="Content" ObjectID="_1853571012" r:id="rId42"/>
+                <o:OLEObject Type="Embed" ProgID="PBrush" ShapeID="_x0000_i1026" DrawAspect="Content" ObjectID="_1853742672" r:id="rId44"/>
               </w:object>
             </w:r>
           </w:p>
@@ -18997,7 +18997,7 @@
                     </pic:cNvPicPr>
                   </pic:nvPicPr>
                   <pic:blipFill>
-                    <a:blip r:embed="rId43">
+                    <a:blip r:embed="rId45">
                       <a:extLst>
                         <a:ext uri="{28A0092B-C50C-407E-A947-70E740481C1C}">
                           <a14:useLocalDpi xmlns:a14="http://schemas.microsoft.com/office/drawing/2010/main" val="0"/>
@@ -20185,7 +20185,7 @@
                     </pic:cNvPicPr>
                   </pic:nvPicPr>
                   <pic:blipFill>
-                    <a:blip r:embed="rId44">
+                    <a:blip r:embed="rId46">
                       <a:extLst>
                         <a:ext uri="{28A0092B-C50C-407E-A947-70E740481C1C}">
                           <a14:useLocalDpi xmlns:a14="http://schemas.microsoft.com/office/drawing/2010/main" val="0"/>
@@ -20671,7 +20671,7 @@
                     </pic:cNvPicPr>
                   </pic:nvPicPr>
                   <pic:blipFill>
-                    <a:blip r:embed="rId45">
+                    <a:blip r:embed="rId47">
                       <a:extLst>
                         <a:ext uri="{28A0092B-C50C-407E-A947-70E740481C1C}">
                           <a14:useLocalDpi xmlns:a14="http://schemas.microsoft.com/office/drawing/2010/main" val="0"/>
@@ -21094,7 +21094,7 @@
                     </pic:cNvPicPr>
                   </pic:nvPicPr>
                   <pic:blipFill>
-                    <a:blip r:embed="rId46">
+                    <a:blip r:embed="rId48">
                       <a:extLst>
                         <a:ext uri="{28A0092B-C50C-407E-A947-70E740481C1C}">
                           <a14:useLocalDpi xmlns:a14="http://schemas.microsoft.com/office/drawing/2010/main" val="0"/>
@@ -21561,7 +21561,7 @@
                     </pic:cNvPicPr>
                   </pic:nvPicPr>
                   <pic:blipFill>
-                    <a:blip r:embed="rId47">
+                    <a:blip r:embed="rId49">
                       <a:extLst>
                         <a:ext uri="{28A0092B-C50C-407E-A947-70E740481C1C}">
                           <a14:useLocalDpi xmlns:a14="http://schemas.microsoft.com/office/drawing/2010/main" val="0"/>
@@ -21667,7 +21667,7 @@
                     </pic:cNvPicPr>
                   </pic:nvPicPr>
                   <pic:blipFill>
-                    <a:blip r:embed="rId48">
+                    <a:blip r:embed="rId50">
                       <a:extLst>
                         <a:ext uri="{28A0092B-C50C-407E-A947-70E740481C1C}">
                           <a14:useLocalDpi xmlns:a14="http://schemas.microsoft.com/office/drawing/2010/main" val="0"/>
@@ -22048,7 +22048,7 @@
                     </pic:cNvPicPr>
                   </pic:nvPicPr>
                   <pic:blipFill>
-                    <a:blip r:embed="rId49">
+                    <a:blip r:embed="rId51">
                       <a:extLst>
                         <a:ext uri="{28A0092B-C50C-407E-A947-70E740481C1C}">
                           <a14:useLocalDpi xmlns:a14="http://schemas.microsoft.com/office/drawing/2010/main" val="0"/>
@@ -22163,7 +22163,7 @@
                     </pic:cNvPicPr>
                   </pic:nvPicPr>
                   <pic:blipFill>
-                    <a:blip r:embed="rId50">
+                    <a:blip r:embed="rId52">
                       <a:extLst>
                         <a:ext uri="{28A0092B-C50C-407E-A947-70E740481C1C}">
                           <a14:useLocalDpi xmlns:a14="http://schemas.microsoft.com/office/drawing/2010/main" val="0"/>
@@ -22388,7 +22388,7 @@
                     </pic:cNvPicPr>
                   </pic:nvPicPr>
                   <pic:blipFill>
-                    <a:blip r:embed="rId51">
+                    <a:blip r:embed="rId53">
                       <a:extLst>
                         <a:ext uri="{28A0092B-C50C-407E-A947-70E740481C1C}">
                           <a14:useLocalDpi xmlns:a14="http://schemas.microsoft.com/office/drawing/2010/main" val="0"/>
@@ -22490,7 +22490,7 @@
                     </pic:cNvPicPr>
                   </pic:nvPicPr>
                   <pic:blipFill>
-                    <a:blip r:embed="rId52">
+                    <a:blip r:embed="rId54">
                       <a:extLst>
                         <a:ext uri="{28A0092B-C50C-407E-A947-70E740481C1C}">
                           <a14:useLocalDpi xmlns:a14="http://schemas.microsoft.com/office/drawing/2010/main" val="0"/>
@@ -22605,7 +22605,7 @@
                     </pic:cNvPicPr>
                   </pic:nvPicPr>
                   <pic:blipFill>
-                    <a:blip r:embed="rId53">
+                    <a:blip r:embed="rId55">
                       <a:extLst>
                         <a:ext uri="{28A0092B-C50C-407E-A947-70E740481C1C}">
                           <a14:useLocalDpi xmlns:a14="http://schemas.microsoft.com/office/drawing/2010/main" val="0"/>
@@ -22748,7 +22748,7 @@
                     <pic:cNvPicPr/>
                   </pic:nvPicPr>
                   <pic:blipFill>
-                    <a:blip r:embed="rId54"/>
+                    <a:blip r:embed="rId56"/>
                     <a:stretch>
                       <a:fillRect/>
                     </a:stretch>
@@ -22799,7 +22799,7 @@
                     </pic:cNvPicPr>
                   </pic:nvPicPr>
                   <pic:blipFill>
-                    <a:blip r:embed="rId55">
+                    <a:blip r:embed="rId57">
                       <a:extLst>
                         <a:ext uri="{28A0092B-C50C-407E-A947-70E740481C1C}">
                           <a14:useLocalDpi xmlns:a14="http://schemas.microsoft.com/office/drawing/2010/main" val="0"/>
@@ -22867,7 +22867,7 @@
                     </pic:cNvPicPr>
                   </pic:nvPicPr>
                   <pic:blipFill>
-                    <a:blip r:embed="rId56">
+                    <a:blip r:embed="rId58">
                       <a:extLst>
                         <a:ext uri="{28A0092B-C50C-407E-A947-70E740481C1C}">
                           <a14:useLocalDpi xmlns:a14="http://schemas.microsoft.com/office/drawing/2010/main" val="0"/>
@@ -23700,7 +23700,7 @@
                     </pic:cNvPicPr>
                   </pic:nvPicPr>
                   <pic:blipFill>
-                    <a:blip r:embed="rId57">
+                    <a:blip r:embed="rId59">
                       <a:extLst>
                         <a:ext uri="{28A0092B-C50C-407E-A947-70E740481C1C}">
                           <a14:useLocalDpi xmlns:a14="http://schemas.microsoft.com/office/drawing/2010/main" val="0"/>
@@ -23761,7 +23761,7 @@
                     <pic:cNvPicPr/>
                   </pic:nvPicPr>
                   <pic:blipFill>
-                    <a:blip r:embed="rId58"/>
+                    <a:blip r:embed="rId60"/>
                     <a:stretch>
                       <a:fillRect/>
                     </a:stretch>
@@ -23905,7 +23905,7 @@
                     </pic:cNvPicPr>
                   </pic:nvPicPr>
                   <pic:blipFill>
-                    <a:blip r:embed="rId59">
+                    <a:blip r:embed="rId61">
                       <a:extLst>
                         <a:ext uri="{28A0092B-C50C-407E-A947-70E740481C1C}">
                           <a14:useLocalDpi xmlns:a14="http://schemas.microsoft.com/office/drawing/2010/main" val="0"/>
@@ -24353,7 +24353,7 @@
                           <pic:cNvPicPr/>
                         </pic:nvPicPr>
                         <pic:blipFill>
-                          <a:blip r:embed="rId60"/>
+                          <a:blip r:embed="rId62"/>
                           <a:stretch>
                             <a:fillRect/>
                           </a:stretch>
@@ -24532,7 +24532,7 @@
                           <pic:cNvPicPr/>
                         </pic:nvPicPr>
                         <pic:blipFill>
-                          <a:blip r:embed="rId61"/>
+                          <a:blip r:embed="rId63"/>
                           <a:stretch>
                             <a:fillRect/>
                           </a:stretch>
@@ -24718,9 +24718,9 @@
               </w:rPr>
               <w:object w:dxaOrig="4695" w:dyaOrig="585" w14:anchorId="1B24F6BB">
                 <v:shape id="_x0000_i1027" type="#_x0000_t75" style="width:234.75pt;height:29.25pt" o:ole="">
-                  <v:imagedata r:id="rId62" o:title=""/>
+                  <v:imagedata r:id="rId64" o:title=""/>
                 </v:shape>
-                <o:OLEObject Type="Embed" ProgID="PBrush" ShapeID="_x0000_i1027" DrawAspect="Content" ObjectID="_1853571013" r:id="rId63"/>
+                <o:OLEObject Type="Embed" ProgID="PBrush" ShapeID="_x0000_i1027" DrawAspect="Content" ObjectID="_1853742673" r:id="rId65"/>
               </w:object>
             </w:r>
             <w:r>
@@ -24879,7 +24879,7 @@
                           <pic:cNvPicPr/>
                         </pic:nvPicPr>
                         <pic:blipFill>
-                          <a:blip r:embed="rId64"/>
+                          <a:blip r:embed="rId66"/>
                           <a:stretch>
                             <a:fillRect/>
                           </a:stretch>
@@ -25010,7 +25010,7 @@
                           <pic:cNvPicPr/>
                         </pic:nvPicPr>
                         <pic:blipFill>
-                          <a:blip r:embed="rId65"/>
+                          <a:blip r:embed="rId67"/>
                           <a:stretch>
                             <a:fillRect/>
                           </a:stretch>
@@ -25160,9 +25160,9 @@
               </w:rPr>
               <w:object w:dxaOrig="5910" w:dyaOrig="615" w14:anchorId="741A2A97">
                 <v:shape id="_x0000_i1028" type="#_x0000_t75" style="width:295.5pt;height:30.75pt" o:ole="">
-                  <v:imagedata r:id="rId66" o:title=""/>
+                  <v:imagedata r:id="rId68" o:title=""/>
                 </v:shape>
-                <o:OLEObject Type="Embed" ProgID="PBrush" ShapeID="_x0000_i1028" DrawAspect="Content" ObjectID="_1853571014" r:id="rId67"/>
+                <o:OLEObject Type="Embed" ProgID="PBrush" ShapeID="_x0000_i1028" DrawAspect="Content" ObjectID="_1853742674" r:id="rId69"/>
               </w:object>
             </w:r>
           </w:p>
@@ -25264,9 +25264,9 @@
               </w:rPr>
               <w:object w:dxaOrig="2565" w:dyaOrig="750" w14:anchorId="2AE0C7B6">
                 <v:shape id="_x0000_i1029" type="#_x0000_t75" style="width:105pt;height:30.75pt" o:ole="">
-                  <v:imagedata r:id="rId68" o:title=""/>
+                  <v:imagedata r:id="rId70" o:title=""/>
                 </v:shape>
-                <o:OLEObject Type="Embed" ProgID="PBrush" ShapeID="_x0000_i1029" DrawAspect="Content" ObjectID="_1853571015" r:id="rId69"/>
+                <o:OLEObject Type="Embed" ProgID="PBrush" ShapeID="_x0000_i1029" DrawAspect="Content" ObjectID="_1853742675" r:id="rId71"/>
               </w:object>
             </w:r>
           </w:p>
@@ -25371,9 +25371,9 @@
               </w:rPr>
               <w:object w:dxaOrig="1950" w:dyaOrig="720" w14:anchorId="0C5A577A">
                 <v:shape id="_x0000_i1030" type="#_x0000_t75" style="width:86.25pt;height:32.25pt" o:ole="">
-                  <v:imagedata r:id="rId70" o:title=""/>
+                  <v:imagedata r:id="rId72" o:title=""/>
                 </v:shape>
-                <o:OLEObject Type="Embed" ProgID="PBrush" ShapeID="_x0000_i1030" DrawAspect="Content" ObjectID="_1853571016" r:id="rId71"/>
+                <o:OLEObject Type="Embed" ProgID="PBrush" ShapeID="_x0000_i1030" DrawAspect="Content" ObjectID="_1853742676" r:id="rId73"/>
               </w:object>
             </w:r>
             <w:r>
@@ -25473,7 +25473,7 @@
                     </pic:cNvPicPr>
                   </pic:nvPicPr>
                   <pic:blipFill>
-                    <a:blip r:embed="rId72">
+                    <a:blip r:embed="rId74">
                       <a:extLst>
                         <a:ext uri="{28A0092B-C50C-407E-A947-70E740481C1C}">
                           <a14:useLocalDpi xmlns:a14="http://schemas.microsoft.com/office/drawing/2010/main" val="0"/>
@@ -25627,7 +25627,7 @@
                           <pic:cNvPicPr/>
                         </pic:nvPicPr>
                         <pic:blipFill>
-                          <a:blip r:embed="rId60"/>
+                          <a:blip r:embed="rId62"/>
                           <a:stretch>
                             <a:fillRect/>
                           </a:stretch>
@@ -25793,7 +25793,7 @@
                           <pic:cNvPicPr/>
                         </pic:nvPicPr>
                         <pic:blipFill>
-                          <a:blip r:embed="rId61"/>
+                          <a:blip r:embed="rId63"/>
                           <a:stretch>
                             <a:fillRect/>
                           </a:stretch>
@@ -25867,7 +25867,7 @@
                     </pic:cNvPicPr>
                   </pic:nvPicPr>
                   <pic:blipFill>
-                    <a:blip r:embed="rId73">
+                    <a:blip r:embed="rId75">
                       <a:extLst>
                         <a:ext uri="{28A0092B-C50C-407E-A947-70E740481C1C}">
                           <a14:useLocalDpi xmlns:a14="http://schemas.microsoft.com/office/drawing/2010/main" val="0"/>
@@ -25996,7 +25996,7 @@
                           <pic:cNvPicPr/>
                         </pic:nvPicPr>
                         <pic:blipFill>
-                          <a:blip r:embed="rId65"/>
+                          <a:blip r:embed="rId67"/>
                           <a:stretch>
                             <a:fillRect/>
                           </a:stretch>
@@ -26068,7 +26068,7 @@
                     <pic:cNvPicPr/>
                   </pic:nvPicPr>
                   <pic:blipFill>
-                    <a:blip r:embed="rId74"/>
+                    <a:blip r:embed="rId76"/>
                     <a:stretch>
                       <a:fillRect/>
                     </a:stretch>
@@ -26115,7 +26115,7 @@
                     <pic:cNvPicPr/>
                   </pic:nvPicPr>
                   <pic:blipFill>
-                    <a:blip r:embed="rId75"/>
+                    <a:blip r:embed="rId77"/>
                     <a:stretch>
                       <a:fillRect/>
                     </a:stretch>
@@ -26240,7 +26240,7 @@
                           <pic:cNvPicPr/>
                         </pic:nvPicPr>
                         <pic:blipFill>
-                          <a:blip r:embed="rId65"/>
+                          <a:blip r:embed="rId67"/>
                           <a:stretch>
                             <a:fillRect/>
                           </a:stretch>
@@ -26358,9 +26358,9 @@
               </w:rPr>
               <w:object w:dxaOrig="5910" w:dyaOrig="615" w14:anchorId="33777D35">
                 <v:shape id="_x0000_i1031" type="#_x0000_t75" style="width:295.5pt;height:30.75pt" o:ole="">
-                  <v:imagedata r:id="rId66" o:title=""/>
+                  <v:imagedata r:id="rId68" o:title=""/>
                 </v:shape>
-                <o:OLEObject Type="Embed" ProgID="PBrush" ShapeID="_x0000_i1031" DrawAspect="Content" ObjectID="_1853571017" r:id="rId76"/>
+                <o:OLEObject Type="Embed" ProgID="PBrush" ShapeID="_x0000_i1031" DrawAspect="Content" ObjectID="_1853742677" r:id="rId78"/>
               </w:object>
             </w:r>
           </w:p>
@@ -26417,7 +26417,7 @@
                     <pic:cNvPicPr/>
                   </pic:nvPicPr>
                   <pic:blipFill>
-                    <a:blip r:embed="rId77"/>
+                    <a:blip r:embed="rId79"/>
                     <a:stretch>
                       <a:fillRect/>
                     </a:stretch>
@@ -26553,7 +26553,7 @@
                           <pic:cNvPicPr/>
                         </pic:nvPicPr>
                         <pic:blipFill>
-                          <a:blip r:embed="rId60"/>
+                          <a:blip r:embed="rId62"/>
                           <a:stretch>
                             <a:fillRect/>
                           </a:stretch>
@@ -26719,7 +26719,7 @@
                           <pic:cNvPicPr/>
                         </pic:nvPicPr>
                         <pic:blipFill>
-                          <a:blip r:embed="rId61"/>
+                          <a:blip r:embed="rId63"/>
                           <a:stretch>
                             <a:fillRect/>
                           </a:stretch>
@@ -26873,7 +26873,7 @@
                           <pic:cNvPicPr/>
                         </pic:nvPicPr>
                         <pic:blipFill>
-                          <a:blip r:embed="rId64"/>
+                          <a:blip r:embed="rId66"/>
                           <a:stretch>
                             <a:fillRect/>
                           </a:stretch>
@@ -26983,7 +26983,7 @@
                           <pic:cNvPicPr/>
                         </pic:nvPicPr>
                         <pic:blipFill>
-                          <a:blip r:embed="rId65"/>
+                          <a:blip r:embed="rId67"/>
                           <a:stretch>
                             <a:fillRect/>
                           </a:stretch>
@@ -27101,9 +27101,9 @@
               </w:rPr>
               <w:object w:dxaOrig="5910" w:dyaOrig="615" w14:anchorId="50F06EE8">
                 <v:shape id="_x0000_i1032" type="#_x0000_t75" style="width:295.5pt;height:30.75pt" o:ole="">
-                  <v:imagedata r:id="rId66" o:title=""/>
+                  <v:imagedata r:id="rId68" o:title=""/>
                 </v:shape>
-                <o:OLEObject Type="Embed" ProgID="PBrush" ShapeID="_x0000_i1032" DrawAspect="Content" ObjectID="_1853571018" r:id="rId78"/>
+                <o:OLEObject Type="Embed" ProgID="PBrush" ShapeID="_x0000_i1032" DrawAspect="Content" ObjectID="_1853742678" r:id="rId80"/>
               </w:object>
             </w:r>
           </w:p>
@@ -27160,7 +27160,7 @@
                     <pic:cNvPicPr/>
                   </pic:nvPicPr>
                   <pic:blipFill>
-                    <a:blip r:embed="rId79"/>
+                    <a:blip r:embed="rId81"/>
                     <a:stretch>
                       <a:fillRect/>
                     </a:stretch>
@@ -27335,7 +27335,7 @@
                           <pic:cNvPicPr/>
                         </pic:nvPicPr>
                         <pic:blipFill>
-                          <a:blip r:embed="rId80"/>
+                          <a:blip r:embed="rId82"/>
                           <a:stretch>
                             <a:fillRect/>
                           </a:stretch>
@@ -27421,7 +27421,7 @@
                     <pic:cNvPicPr/>
                   </pic:nvPicPr>
                   <pic:blipFill>
-                    <a:blip r:embed="rId81"/>
+                    <a:blip r:embed="rId83"/>
                     <a:stretch>
                       <a:fillRect/>
                     </a:stretch>
@@ -27527,9 +27527,9 @@
               </w:rPr>
               <w:object w:dxaOrig="1950" w:dyaOrig="720" w14:anchorId="3590B1B8">
                 <v:shape id="_x0000_i1033" type="#_x0000_t75" style="width:86.25pt;height:32.25pt" o:ole="">
-                  <v:imagedata r:id="rId70" o:title=""/>
+                  <v:imagedata r:id="rId72" o:title=""/>
                 </v:shape>
-                <o:OLEObject Type="Embed" ProgID="PBrush" ShapeID="_x0000_i1033" DrawAspect="Content" ObjectID="_1853571019" r:id="rId82"/>
+                <o:OLEObject Type="Embed" ProgID="PBrush" ShapeID="_x0000_i1033" DrawAspect="Content" ObjectID="_1853742679" r:id="rId84"/>
               </w:object>
             </w:r>
           </w:p>
@@ -27584,7 +27584,7 @@
                     <pic:cNvPicPr/>
                   </pic:nvPicPr>
                   <pic:blipFill>
-                    <a:blip r:embed="rId83"/>
+                    <a:blip r:embed="rId85"/>
                     <a:stretch>
                       <a:fillRect/>
                     </a:stretch>
@@ -27690,9 +27690,9 @@
               </w:rPr>
               <w:object w:dxaOrig="2565" w:dyaOrig="750" w14:anchorId="52B0882F">
                 <v:shape id="_x0000_i1034" type="#_x0000_t75" style="width:105pt;height:30.75pt" o:ole="">
-                  <v:imagedata r:id="rId68" o:title=""/>
+                  <v:imagedata r:id="rId70" o:title=""/>
                 </v:shape>
-                <o:OLEObject Type="Embed" ProgID="PBrush" ShapeID="_x0000_i1034" DrawAspect="Content" ObjectID="_1853571020" r:id="rId84"/>
+                <o:OLEObject Type="Embed" ProgID="PBrush" ShapeID="_x0000_i1034" DrawAspect="Content" ObjectID="_1853742680" r:id="rId86"/>
               </w:object>
             </w:r>
           </w:p>
@@ -28861,7 +28861,7 @@
                     <pic:cNvPicPr/>
                   </pic:nvPicPr>
                   <pic:blipFill>
-                    <a:blip r:embed="rId85"/>
+                    <a:blip r:embed="rId87"/>
                     <a:stretch>
                       <a:fillRect/>
                     </a:stretch>
@@ -29539,9 +29539,9 @@
               </w:rPr>
               <w:object w:dxaOrig="4095" w:dyaOrig="750" w14:anchorId="1C44A0ED">
                 <v:shape id="_x0000_i1035" type="#_x0000_t75" style="width:204.75pt;height:37.5pt" o:ole="">
-                  <v:imagedata r:id="rId86" o:title=""/>
+                  <v:imagedata r:id="rId88" o:title=""/>
                 </v:shape>
-                <o:OLEObject Type="Embed" ProgID="PBrush" ShapeID="_x0000_i1035" DrawAspect="Content" ObjectID="_1853571021" r:id="rId87"/>
+                <o:OLEObject Type="Embed" ProgID="PBrush" ShapeID="_x0000_i1035" DrawAspect="Content" ObjectID="_1853742681" r:id="rId89"/>
               </w:object>
             </w:r>
           </w:p>
@@ -29658,7 +29658,7 @@
                           <pic:cNvPicPr/>
                         </pic:nvPicPr>
                         <pic:blipFill>
-                          <a:blip r:embed="rId88"/>
+                          <a:blip r:embed="rId90"/>
                           <a:stretch>
                             <a:fillRect/>
                           </a:stretch>
@@ -29712,7 +29712,7 @@
                           <pic:cNvPicPr/>
                         </pic:nvPicPr>
                         <pic:blipFill>
-                          <a:blip r:embed="rId89"/>
+                          <a:blip r:embed="rId91"/>
                           <a:stretch>
                             <a:fillRect/>
                           </a:stretch>
@@ -29807,7 +29807,7 @@
                     </pic:cNvPicPr>
                   </pic:nvPicPr>
                   <pic:blipFill>
-                    <a:blip r:embed="rId90">
+                    <a:blip r:embed="rId92">
                       <a:extLst>
                         <a:ext uri="{28A0092B-C50C-407E-A947-70E740481C1C}">
                           <a14:useLocalDpi xmlns:a14="http://schemas.microsoft.com/office/drawing/2010/main" val="0"/>
@@ -30067,7 +30067,7 @@
                     </pic:cNvPicPr>
                   </pic:nvPicPr>
                   <pic:blipFill>
-                    <a:blip r:embed="rId91">
+                    <a:blip r:embed="rId93">
                       <a:extLst>
                         <a:ext uri="{28A0092B-C50C-407E-A947-70E740481C1C}">
                           <a14:useLocalDpi xmlns:a14="http://schemas.microsoft.com/office/drawing/2010/main" val="0"/>
@@ -30347,9 +30347,9 @@
               </w:rPr>
               <w:object w:dxaOrig="1950" w:dyaOrig="720" w14:anchorId="0A392061">
                 <v:shape id="_x0000_i1036" type="#_x0000_t75" style="width:86.25pt;height:32.25pt" o:ole="">
-                  <v:imagedata r:id="rId70" o:title=""/>
+                  <v:imagedata r:id="rId72" o:title=""/>
                 </v:shape>
-                <o:OLEObject Type="Embed" ProgID="PBrush" ShapeID="_x0000_i1036" DrawAspect="Content" ObjectID="_1853571022" r:id="rId92"/>
+                <o:OLEObject Type="Embed" ProgID="PBrush" ShapeID="_x0000_i1036" DrawAspect="Content" ObjectID="_1853742682" r:id="rId94"/>
               </w:object>
             </w:r>
           </w:p>
@@ -30392,7 +30392,7 @@
                     </pic:cNvPicPr>
                   </pic:nvPicPr>
                   <pic:blipFill>
-                    <a:blip r:embed="rId93">
+                    <a:blip r:embed="rId95">
                       <a:extLst>
                         <a:ext uri="{28A0092B-C50C-407E-A947-70E740481C1C}">
                           <a14:useLocalDpi xmlns:a14="http://schemas.microsoft.com/office/drawing/2010/main" val="0"/>
@@ -30660,7 +30660,7 @@
           <w:numId w:val="23"/>
         </w:numPr>
         <w:rPr>
-          <w:rFonts w:asciiTheme="minorEastAsia" w:hAnsiTheme="minorEastAsia"/>
+          <w:rFonts w:asciiTheme="minorEastAsia" w:hAnsiTheme="minorEastAsia" w:hint="eastAsia"/>
         </w:rPr>
       </w:pPr>
       <w:r>
@@ -30709,146 +30709,196 @@
           <w:rFonts w:hint="eastAsia"/>
         </w:rPr>
         <w:lastRenderedPageBreak/>
+        <w:t>1.</w:t>
+      </w:r>
+      <w:r>
+        <w:rPr>
+          <w:rFonts w:hint="eastAsia"/>
+        </w:rPr>
+        <w:t xml:space="preserve"> </w:t>
+      </w:r>
+      <w:r>
+        <w:rPr>
+          <w:rFonts w:hint="eastAsia"/>
+        </w:rPr>
+        <w:t>强</w:t>
+      </w:r>
+      <w:r>
+        <w:rPr>
+          <w:rFonts w:hint="eastAsia"/>
+        </w:rPr>
+        <w:t>归纳法证明的模板</w:t>
+      </w:r>
+    </w:p>
+    <w:p>
+      <w:pPr>
+        <w:rPr>
+          <w:rFonts w:hint="eastAsia"/>
+          <w:color w:val="E97132" w:themeColor="accent2"/>
+        </w:rPr>
+      </w:pPr>
+      <w:r>
+        <w:rPr>
+          <w:color w:val="E97132" w:themeColor="accent2"/>
+        </w:rPr>
+        <w:t>1.</w:t>
+      </w:r>
+      <w:r>
+        <w:rPr>
+          <w:rFonts w:hint="eastAsia"/>
+          <w:color w:val="E97132" w:themeColor="accent2"/>
+        </w:rPr>
+        <w:t>定义P(n)</w:t>
+      </w:r>
+      <w:r>
+        <w:rPr>
+          <w:color w:val="E97132" w:themeColor="accent2"/>
+        </w:rPr>
+        <w:t>。</w:t>
+      </w:r>
+    </w:p>
+    <w:p>
+      <w:pPr>
+        <w:rPr>
+          <w:rFonts w:hint="eastAsia"/>
+          <w:color w:val="E97132" w:themeColor="accent2"/>
+        </w:rPr>
+      </w:pPr>
+      <w:r>
+        <w:rPr>
+          <w:rFonts w:hint="eastAsia"/>
+          <w:color w:val="E97132" w:themeColor="accent2"/>
+        </w:rPr>
+        <w:t>2</w:t>
+      </w:r>
+      <w:r>
+        <w:rPr>
+          <w:color w:val="E97132" w:themeColor="accent2"/>
+        </w:rPr>
+        <w:t>.证明P（</w:t>
+      </w:r>
+      <w:r>
+        <w:rPr>
+          <w:rFonts w:hint="eastAsia"/>
+          <w:color w:val="E97132" w:themeColor="accent2"/>
+        </w:rPr>
         <w:t>1</w:t>
       </w:r>
       <w:r>
         <w:rPr>
-          <w:rFonts w:hint="eastAsia"/>
+          <w:color w:val="E97132" w:themeColor="accent2"/>
+        </w:rPr>
+        <w:t>）为真。</w:t>
+      </w:r>
+    </w:p>
+    <w:p>
+      <w:pPr>
+        <w:rPr>
+          <w:color w:val="E97132" w:themeColor="accent2"/>
+        </w:rPr>
+      </w:pPr>
+      <w:r>
+        <w:rPr>
+          <w:rFonts w:hint="eastAsia"/>
+          <w:color w:val="E97132" w:themeColor="accent2"/>
+        </w:rPr>
+        <w:t>3</w:t>
+      </w:r>
+      <w:r>
+        <w:rPr>
+          <w:color w:val="E97132" w:themeColor="accent2"/>
         </w:rPr>
         <w:t>.</w:t>
       </w:r>
       <w:r>
         <w:rPr>
           <w:rFonts w:hint="eastAsia"/>
-        </w:rPr>
-        <w:t xml:space="preserve"> </w:t>
-      </w:r>
-      <w:r>
-        <w:rPr>
-          <w:rFonts w:hint="eastAsia"/>
-        </w:rPr>
-        <w:t>弱</w:t>
-      </w:r>
-      <w:r>
-        <w:rPr>
-          <w:rFonts w:hint="eastAsia"/>
-        </w:rPr>
-        <w:t>归纳法证明的模板</w:t>
-      </w:r>
-    </w:p>
-    <w:p>
-      <w:pPr>
-        <w:rPr>
-          <w:rFonts w:hint="eastAsia"/>
           <w:color w:val="E97132" w:themeColor="accent2"/>
         </w:rPr>
-      </w:pPr>
+        <w:t>假设n=1,2,3</w:t>
+      </w:r>
       <w:r>
         <w:rPr>
           <w:color w:val="E97132" w:themeColor="accent2"/>
         </w:rPr>
-        <w:t>1.陈述使用归纳法进行证明。</w:t>
-      </w:r>
-    </w:p>
-    <w:p>
-      <w:pPr>
+        <w:t>…</w:t>
+      </w:r>
+      <w:r>
         <w:rPr>
           <w:rFonts w:hint="eastAsia"/>
           <w:color w:val="E97132" w:themeColor="accent2"/>
         </w:rPr>
-      </w:pPr>
+        <w:t>.k时，</w:t>
+      </w:r>
       <w:r>
         <w:rPr>
           <w:color w:val="E97132" w:themeColor="accent2"/>
         </w:rPr>
-        <w:t>2.定义适当的谓词P（n）。</w:t>
-      </w:r>
-    </w:p>
-    <w:p>
-      <w:pPr>
+        <w:t>P（</w:t>
+      </w:r>
+      <w:r>
         <w:rPr>
           <w:rFonts w:hint="eastAsia"/>
           <w:color w:val="E97132" w:themeColor="accent2"/>
         </w:rPr>
-      </w:pPr>
+        <w:t>n</w:t>
+      </w:r>
       <w:r>
         <w:rPr>
           <w:color w:val="E97132" w:themeColor="accent2"/>
         </w:rPr>
-        <w:t>3.证明P（0）为真。</w:t>
-      </w:r>
-    </w:p>
-    <w:p>
-      <w:pPr>
+        <w:t>）</w:t>
+      </w:r>
+      <w:r>
         <w:rPr>
           <w:rFonts w:hint="eastAsia"/>
           <w:color w:val="E97132" w:themeColor="accent2"/>
         </w:rPr>
-      </w:pPr>
+        <w:t>都为真</w:t>
+      </w:r>
       <w:r>
         <w:rPr>
           <w:color w:val="E97132" w:themeColor="accent2"/>
         </w:rPr>
-        <w:t>4.证明P（n）蕴涵P（n+1）对任意非负整数成立。</w:t>
-      </w:r>
-    </w:p>
-    <w:p>
-      <w:pPr>
-        <w:rPr>
+        <w:t>。</w:t>
+      </w:r>
+    </w:p>
+    <w:p>
+      <w:pPr>
+        <w:rPr>
+          <w:rFonts w:hint="eastAsia"/>
           <w:color w:val="E97132" w:themeColor="accent2"/>
         </w:rPr>
       </w:pPr>
       <w:r>
         <w:rPr>
+          <w:rFonts w:hint="eastAsia"/>
           <w:color w:val="E97132" w:themeColor="accent2"/>
         </w:rPr>
+        <w:t>4. 证明P(k+1)为真</w:t>
+      </w:r>
+    </w:p>
+    <w:p>
+      <w:pPr>
+        <w:rPr>
+          <w:rFonts w:hint="eastAsia"/>
+          <w:color w:val="E97132" w:themeColor="accent2"/>
+        </w:rPr>
+      </w:pPr>
+      <w:r>
+        <w:rPr>
+          <w:color w:val="E97132" w:themeColor="accent2"/>
+        </w:rPr>
         <w:t>5.得出结论。</w:t>
       </w:r>
     </w:p>
     <w:p>
       <w:pPr>
         <w:rPr>
+          <w:rFonts w:hint="eastAsia"/>
           <w:color w:val="E97132" w:themeColor="accent2"/>
         </w:rPr>
       </w:pPr>
-    </w:p>
-    <w:p>
-      <w:pPr>
-        <w:rPr>
-          <w:b/>
-          <w:bCs/>
-        </w:rPr>
-      </w:pPr>
-      <w:r>
-        <w:rPr>
-          <w:b/>
-          <w:bCs/>
-        </w:rPr>
-        <w:t>To prove</w:t>
-      </w:r>
-      <w:r>
-        <w:rPr>
-          <w:rFonts w:hint="eastAsia"/>
-          <w:b/>
-          <w:bCs/>
-        </w:rPr>
-        <w:t xml:space="preserve">:  P(n) = </w:t>
-      </w:r>
-      <w:r>
-        <w:rPr>
-          <w:b/>
-          <w:bCs/>
-        </w:rPr>
-        <w:t>…</w:t>
-      </w:r>
-      <w:r>
-        <w:rPr>
-          <w:rFonts w:hint="eastAsia"/>
-          <w:b/>
-          <w:bCs/>
-        </w:rPr>
-        <w:t>.</w:t>
-      </w:r>
     </w:p>
     <w:p>
       <w:pPr>
@@ -30858,46 +30908,57 @@
           <w:numId w:val="24"/>
         </w:numPr>
         <w:rPr>
-          <w:b/>
-          <w:bCs/>
-        </w:rPr>
-      </w:pPr>
-      <w:r>
-        <w:rPr>
-          <w:b/>
-          <w:bCs/>
-        </w:rPr>
-        <w:t>Base Case Check</w:t>
-      </w:r>
-    </w:p>
-    <w:p>
-      <w:pPr>
-        <w:pStyle w:val="a9"/>
-        <w:ind w:left="420"/>
-        <w:rPr>
-          <w:b/>
-          <w:bCs/>
-        </w:rPr>
-      </w:pPr>
-      <w:r>
-        <w:rPr>
-          <w:rFonts w:hint="eastAsia"/>
-          <w:b/>
-          <w:bCs/>
-        </w:rPr>
-        <w:t>When n = 1/0,   LHS = ..   RHS = ...,  the base case is true</w:t>
-      </w:r>
-    </w:p>
-    <w:p>
-      <w:pPr>
-        <w:pStyle w:val="a9"/>
-        <w:ind w:left="420"/>
-        <w:rPr>
-          <w:rFonts w:hint="eastAsia"/>
-          <w:b/>
-          <w:bCs/>
-        </w:rPr>
-      </w:pPr>
+          <w:rFonts w:hint="eastAsia"/>
+          <w:b/>
+          <w:bCs/>
+        </w:rPr>
+      </w:pPr>
+      <w:r>
+        <w:rPr>
+          <w:b/>
+          <w:bCs/>
+        </w:rPr>
+        <w:t>To prove</w:t>
+      </w:r>
+      <w:r>
+        <w:rPr>
+          <w:rFonts w:hint="eastAsia"/>
+          <w:b/>
+          <w:bCs/>
+        </w:rPr>
+        <w:t xml:space="preserve">:  P(n) </w:t>
+      </w:r>
+      <w:r>
+        <w:rPr>
+          <w:rFonts w:hint="eastAsia"/>
+          <w:b/>
+          <w:bCs/>
+        </w:rPr>
+        <w:t xml:space="preserve">:  </w:t>
+      </w:r>
+      <w:r>
+        <w:rPr>
+          <w:rFonts w:hint="eastAsia"/>
+          <w:b/>
+          <w:bCs/>
+        </w:rPr>
+        <w:t xml:space="preserve"> </w:t>
+      </w:r>
+      <w:r>
+        <w:rPr>
+          <w:b/>
+          <w:bCs/>
+        </w:rPr>
+        <w:t>…</w:t>
+      </w:r>
+      <w:r>
+        <w:rPr>
+          <w:rFonts w:hint="eastAsia"/>
+          <w:b/>
+          <w:bCs/>
+        </w:rPr>
+        <w:t>.</w:t>
+      </w:r>
     </w:p>
     <w:p>
       <w:pPr>
@@ -30907,111 +30968,42 @@
           <w:numId w:val="24"/>
         </w:numPr>
         <w:rPr>
-          <w:b/>
-          <w:bCs/>
-        </w:rPr>
-      </w:pPr>
-      <w:r>
-        <w:rPr>
-          <w:rFonts w:hint="eastAsia"/>
-          <w:b/>
-          <w:bCs/>
-        </w:rPr>
-        <w:t>Inductive</w:t>
-      </w:r>
-      <w:r>
-        <w:rPr>
-          <w:rFonts w:hint="eastAsia"/>
-          <w:b/>
-          <w:bCs/>
-        </w:rPr>
-        <w:t xml:space="preserve"> assumption</w:t>
-      </w:r>
-      <w:r>
-        <w:rPr>
-          <w:rFonts w:hint="eastAsia"/>
-        </w:rPr>
-        <w:t xml:space="preserve"> </w:t>
-      </w:r>
-      <w:r>
-        <w:rPr>
-          <w:rFonts w:hint="eastAsia"/>
-          <w:b/>
-          <w:bCs/>
-        </w:rPr>
-        <w:t>Statement</w:t>
+          <w:rFonts w:hint="eastAsia"/>
+          <w:b/>
+          <w:bCs/>
+        </w:rPr>
+      </w:pPr>
+      <w:r>
+        <w:rPr>
+          <w:b/>
+          <w:bCs/>
+        </w:rPr>
+        <w:t>Base Case Check</w:t>
       </w:r>
     </w:p>
     <w:p>
       <w:pPr>
         <w:pStyle w:val="a9"/>
-        <w:ind w:left="360"/>
-        <w:rPr>
-          <w:rFonts w:hint="eastAsia"/>
-          <w:b/>
-          <w:bCs/>
-        </w:rPr>
-      </w:pPr>
-      <w:r>
-        <w:rPr>
-          <w:b/>
-          <w:bCs/>
-        </w:rPr>
-        <w:t>Assume that the statement is true</w:t>
-      </w:r>
-      <w:r>
-        <w:rPr>
-          <w:rFonts w:hint="eastAsia"/>
-          <w:b/>
-          <w:bCs/>
-        </w:rPr>
-        <w:t xml:space="preserve"> when n is in the range 1,2,</w:t>
-      </w:r>
-      <w:r>
-        <w:rPr>
-          <w:b/>
-          <w:bCs/>
-        </w:rPr>
-        <w:t>…</w:t>
-      </w:r>
-      <w:r>
-        <w:rPr>
-          <w:rFonts w:hint="eastAsia"/>
-          <w:b/>
-          <w:bCs/>
-        </w:rPr>
-        <w:t>k, k is a positive integer</w:t>
+        <w:ind w:left="420"/>
+        <w:rPr>
+          <w:rFonts w:hint="eastAsia"/>
+          <w:b/>
+          <w:bCs/>
+        </w:rPr>
+      </w:pPr>
+      <w:r>
+        <w:rPr>
+          <w:rFonts w:hint="eastAsia"/>
+          <w:b/>
+          <w:bCs/>
+        </w:rPr>
+        <w:t>When n = 1/0,   LHS = ..   RHS = ...,  the base case is true</w:t>
       </w:r>
     </w:p>
     <w:p>
       <w:pPr>
         <w:pStyle w:val="a9"/>
-        <w:ind w:left="360"/>
-        <w:rPr>
-          <w:b/>
-          <w:bCs/>
-        </w:rPr>
-      </w:pPr>
-      <w:r>
-        <w:rPr>
-          <w:b/>
-          <w:bCs/>
-        </w:rPr>
-        <w:tab/>
-      </w:r>
-      <w:r>
-        <w:rPr>
-          <w:rFonts w:hint="eastAsia"/>
-          <w:b/>
-          <w:bCs/>
-        </w:rPr>
-        <w:t xml:space="preserve">                         P(k):  ...</w:t>
-      </w:r>
-    </w:p>
-    <w:p>
-      <w:pPr>
-        <w:pStyle w:val="a9"/>
-        <w:ind w:left="360"/>
+        <w:ind w:left="420"/>
         <w:rPr>
           <w:rFonts w:hint="eastAsia"/>
           <w:b/>
@@ -31027,17 +31019,40 @@
           <w:numId w:val="24"/>
         </w:numPr>
         <w:rPr>
-          <w:b/>
-          <w:bCs/>
-        </w:rPr>
-      </w:pPr>
-      <w:r>
-        <w:rPr>
-          <w:rFonts w:hint="eastAsia"/>
-          <w:b/>
-          <w:bCs/>
-        </w:rPr>
-        <w:t>Inductive Step</w:t>
+          <w:rFonts w:hint="eastAsia"/>
+          <w:b/>
+          <w:bCs/>
+        </w:rPr>
+      </w:pPr>
+      <w:r>
+        <w:rPr>
+          <w:rFonts w:hint="eastAsia"/>
+          <w:b/>
+          <w:bCs/>
+        </w:rPr>
+        <w:t>Inductive</w:t>
+      </w:r>
+      <w:r>
+        <w:rPr>
+          <w:rFonts w:hint="eastAsia"/>
+          <w:b/>
+          <w:bCs/>
+        </w:rPr>
+        <w:t xml:space="preserve"> assumption</w:t>
+      </w:r>
+      <w:r>
+        <w:rPr>
+          <w:rFonts w:hint="eastAsia"/>
+        </w:rPr>
+        <w:t xml:space="preserve"> </w:t>
+      </w:r>
+      <w:r>
+        <w:rPr>
+          <w:rFonts w:hint="eastAsia"/>
+          <w:b/>
+          <w:bCs/>
+        </w:rPr>
+        <w:t>Statement</w:t>
       </w:r>
     </w:p>
     <w:p>
@@ -31045,71 +31060,40 @@
         <w:pStyle w:val="a9"/>
         <w:ind w:left="360"/>
         <w:rPr>
-          <w:b/>
-          <w:bCs/>
-        </w:rPr>
-      </w:pPr>
-      <w:r>
-        <w:rPr>
-          <w:b/>
-          <w:bCs/>
-        </w:rPr>
-        <w:t>We now prove</w:t>
-      </w:r>
-      <w:r>
-        <w:rPr>
-          <w:rFonts w:hint="eastAsia"/>
-          <w:b/>
-          <w:bCs/>
-        </w:rPr>
-        <w:t xml:space="preserve"> that </w:t>
-      </w:r>
-      <w:r>
-        <w:rPr>
-          <w:rFonts w:hint="eastAsia"/>
-          <w:b/>
-          <w:bCs/>
-        </w:rPr>
-        <w:t xml:space="preserve"> </w:t>
-      </w:r>
-      <w:r>
-        <w:rPr>
-          <w:b/>
-          <w:bCs/>
-        </w:rPr>
-        <w:t>the statement is true</w:t>
-      </w:r>
-      <w:r>
-        <w:rPr>
-          <w:rFonts w:hint="eastAsia"/>
-          <w:b/>
-          <w:bCs/>
-        </w:rPr>
-        <w:t xml:space="preserve"> w</w:t>
-      </w:r>
-      <w:r>
-        <w:rPr>
-          <w:rFonts w:hint="eastAsia"/>
-          <w:b/>
-          <w:bCs/>
-        </w:rPr>
-        <w:t xml:space="preserve">hen </w:t>
-      </w:r>
-      <w:r>
-        <w:rPr>
-          <w:rFonts w:hint="eastAsia"/>
-          <w:b/>
-          <w:bCs/>
-        </w:rPr>
-        <w:t>n</w:t>
-      </w:r>
-      <w:r>
-        <w:rPr>
-          <w:rFonts w:hint="eastAsia"/>
-          <w:b/>
-          <w:bCs/>
-        </w:rPr>
-        <w:t xml:space="preserve"> = k+1</w:t>
+          <w:rFonts w:hint="eastAsia"/>
+          <w:b/>
+          <w:bCs/>
+        </w:rPr>
+      </w:pPr>
+      <w:r>
+        <w:rPr>
+          <w:b/>
+          <w:bCs/>
+        </w:rPr>
+        <w:t>Assume that the statement is true</w:t>
+      </w:r>
+      <w:r>
+        <w:rPr>
+          <w:rFonts w:hint="eastAsia"/>
+          <w:b/>
+          <w:bCs/>
+        </w:rPr>
+        <w:t xml:space="preserve"> when n is in the range 1,2,</w:t>
+      </w:r>
+      <w:r>
+        <w:rPr>
+          <w:b/>
+          <w:bCs/>
+        </w:rPr>
+        <w:t>…</w:t>
+      </w:r>
+      <w:r>
+        <w:rPr>
+          <w:rFonts w:hint="eastAsia"/>
+          <w:b/>
+          <w:bCs/>
+        </w:rPr>
+        <w:t>k, k is a positive integer</w:t>
       </w:r>
     </w:p>
     <w:p>
@@ -31117,6 +31101,7 @@
         <w:pStyle w:val="a9"/>
         <w:ind w:left="360"/>
         <w:rPr>
+          <w:rFonts w:hint="eastAsia"/>
           <w:b/>
           <w:bCs/>
         </w:rPr>
@@ -31134,26 +31119,7 @@
           <w:b/>
           <w:bCs/>
         </w:rPr>
-        <w:t xml:space="preserve">                         P(k+1):  ...</w:t>
-      </w:r>
-    </w:p>
-    <w:p>
-      <w:pPr>
-        <w:pStyle w:val="a9"/>
-        <w:ind w:left="360"/>
-        <w:rPr>
-          <w:rFonts w:hint="eastAsia"/>
-          <w:b/>
-          <w:bCs/>
-        </w:rPr>
-      </w:pPr>
-      <w:r>
-        <w:rPr>
-          <w:rFonts w:hint="eastAsia"/>
-          <w:b/>
-          <w:bCs/>
-        </w:rPr>
-        <w:t xml:space="preserve">                      推导P(k+1)成立的过程</w:t>
+        <w:t xml:space="preserve">                         P(k):  ...</w:t>
       </w:r>
     </w:p>
     <w:p>
@@ -31175,17 +31141,18 @@
           <w:numId w:val="24"/>
         </w:numPr>
         <w:rPr>
-          <w:b/>
-          <w:bCs/>
-        </w:rPr>
-      </w:pPr>
-      <w:r>
-        <w:rPr>
-          <w:rFonts w:hint="eastAsia"/>
-          <w:b/>
-          <w:bCs/>
-        </w:rPr>
-        <w:t>Conclusion</w:t>
+          <w:rFonts w:hint="eastAsia"/>
+          <w:b/>
+          <w:bCs/>
+        </w:rPr>
+      </w:pPr>
+      <w:r>
+        <w:rPr>
+          <w:rFonts w:hint="eastAsia"/>
+          <w:b/>
+          <w:bCs/>
+        </w:rPr>
+        <w:t>Inductive Step</w:t>
       </w:r>
     </w:p>
     <w:p>
@@ -31193,6 +31160,158 @@
         <w:pStyle w:val="a9"/>
         <w:ind w:left="360"/>
         <w:rPr>
+          <w:rFonts w:hint="eastAsia"/>
+          <w:b/>
+          <w:bCs/>
+        </w:rPr>
+      </w:pPr>
+      <w:r>
+        <w:rPr>
+          <w:b/>
+          <w:bCs/>
+        </w:rPr>
+        <w:t>We now prove</w:t>
+      </w:r>
+      <w:r>
+        <w:rPr>
+          <w:rFonts w:hint="eastAsia"/>
+          <w:b/>
+          <w:bCs/>
+        </w:rPr>
+        <w:t xml:space="preserve"> that </w:t>
+      </w:r>
+      <w:r>
+        <w:rPr>
+          <w:rFonts w:hint="eastAsia"/>
+          <w:b/>
+          <w:bCs/>
+        </w:rPr>
+        <w:t xml:space="preserve"> </w:t>
+      </w:r>
+      <w:r>
+        <w:rPr>
+          <w:b/>
+          <w:bCs/>
+        </w:rPr>
+        <w:t>the statement is true</w:t>
+      </w:r>
+      <w:r>
+        <w:rPr>
+          <w:rFonts w:hint="eastAsia"/>
+          <w:b/>
+          <w:bCs/>
+        </w:rPr>
+        <w:t xml:space="preserve"> w</w:t>
+      </w:r>
+      <w:r>
+        <w:rPr>
+          <w:rFonts w:hint="eastAsia"/>
+          <w:b/>
+          <w:bCs/>
+        </w:rPr>
+        <w:t xml:space="preserve">hen </w:t>
+      </w:r>
+      <w:r>
+        <w:rPr>
+          <w:rFonts w:hint="eastAsia"/>
+          <w:b/>
+          <w:bCs/>
+        </w:rPr>
+        <w:t>n</w:t>
+      </w:r>
+      <w:r>
+        <w:rPr>
+          <w:rFonts w:hint="eastAsia"/>
+          <w:b/>
+          <w:bCs/>
+        </w:rPr>
+        <w:t xml:space="preserve"> = k+1</w:t>
+      </w:r>
+    </w:p>
+    <w:p>
+      <w:pPr>
+        <w:pStyle w:val="a9"/>
+        <w:ind w:left="360"/>
+        <w:rPr>
+          <w:rFonts w:hint="eastAsia"/>
+          <w:b/>
+          <w:bCs/>
+        </w:rPr>
+      </w:pPr>
+      <w:r>
+        <w:rPr>
+          <w:b/>
+          <w:bCs/>
+        </w:rPr>
+        <w:tab/>
+      </w:r>
+      <w:r>
+        <w:rPr>
+          <w:rFonts w:hint="eastAsia"/>
+          <w:b/>
+          <w:bCs/>
+        </w:rPr>
+        <w:t xml:space="preserve">                         P(k+1):  ...</w:t>
+      </w:r>
+    </w:p>
+    <w:p>
+      <w:pPr>
+        <w:pStyle w:val="a9"/>
+        <w:ind w:left="360"/>
+        <w:rPr>
+          <w:rFonts w:hint="eastAsia"/>
+          <w:b/>
+          <w:bCs/>
+        </w:rPr>
+      </w:pPr>
+      <w:r>
+        <w:rPr>
+          <w:rFonts w:hint="eastAsia"/>
+          <w:b/>
+          <w:bCs/>
+        </w:rPr>
+        <w:t xml:space="preserve">                      推导P(k+1)成立的过程</w:t>
+      </w:r>
+    </w:p>
+    <w:p>
+      <w:pPr>
+        <w:pStyle w:val="a9"/>
+        <w:ind w:left="360"/>
+        <w:rPr>
+          <w:rFonts w:hint="eastAsia"/>
+          <w:b/>
+          <w:bCs/>
+        </w:rPr>
+      </w:pPr>
+    </w:p>
+    <w:p>
+      <w:pPr>
+        <w:pStyle w:val="a9"/>
+        <w:numPr>
+          <w:ilvl w:val="0"/>
+          <w:numId w:val="24"/>
+        </w:numPr>
+        <w:rPr>
+          <w:rFonts w:hint="eastAsia"/>
+          <w:b/>
+          <w:bCs/>
+        </w:rPr>
+      </w:pPr>
+      <w:r>
+        <w:rPr>
+          <w:rFonts w:hint="eastAsia"/>
+          <w:b/>
+          <w:bCs/>
+        </w:rPr>
+        <w:t>Conclusion</w:t>
+      </w:r>
+    </w:p>
+    <w:p>
+      <w:pPr>
+        <w:pStyle w:val="a9"/>
+        <w:ind w:left="360"/>
+        <w:rPr>
+          <w:rFonts w:hint="eastAsia"/>
           <w:b/>
           <w:bCs/>
         </w:rPr>
@@ -31298,7 +31417,7 @@
                     </pic:cNvPicPr>
                   </pic:nvPicPr>
                   <pic:blipFill>
-                    <a:blip r:embed="rId94">
+                    <a:blip r:embed="rId96">
                       <a:extLst>
                         <a:ext uri="{28A0092B-C50C-407E-A947-70E740481C1C}">
                           <a14:useLocalDpi xmlns:a14="http://schemas.microsoft.com/office/drawing/2010/main" val="0"/>
@@ -31367,7 +31486,7 @@
                     <pic:cNvPicPr/>
                   </pic:nvPicPr>
                   <pic:blipFill>
-                    <a:blip r:embed="rId95"/>
+                    <a:blip r:embed="rId97"/>
                     <a:stretch>
                       <a:fillRect/>
                     </a:stretch>
@@ -31436,7 +31555,7 @@
                     <pic:cNvPicPr/>
                   </pic:nvPicPr>
                   <pic:blipFill>
-                    <a:blip r:embed="rId96"/>
+                    <a:blip r:embed="rId98"/>
                     <a:stretch>
                       <a:fillRect/>
                     </a:stretch>
@@ -31476,7 +31595,7 @@
                     <pic:cNvPicPr/>
                   </pic:nvPicPr>
                   <pic:blipFill>
-                    <a:blip r:embed="rId97"/>
+                    <a:blip r:embed="rId99"/>
                     <a:stretch>
                       <a:fillRect/>
                     </a:stretch>
@@ -31523,7 +31642,7 @@
                     <pic:cNvPicPr/>
                   </pic:nvPicPr>
                   <pic:blipFill>
-                    <a:blip r:embed="rId98"/>
+                    <a:blip r:embed="rId100"/>
                     <a:stretch>
                       <a:fillRect/>
                     </a:stretch>
@@ -31577,7 +31696,7 @@
                     <pic:cNvPicPr/>
                   </pic:nvPicPr>
                   <pic:blipFill>
-                    <a:blip r:embed="rId99"/>
+                    <a:blip r:embed="rId101"/>
                     <a:stretch>
                       <a:fillRect/>
                     </a:stretch>
@@ -31647,7 +31766,7 @@
                     </pic:cNvPicPr>
                   </pic:nvPicPr>
                   <pic:blipFill>
-                    <a:blip r:embed="rId100">
+                    <a:blip r:embed="rId102">
                       <a:extLst>
                         <a:ext uri="{28A0092B-C50C-407E-A947-70E740481C1C}">
                           <a14:useLocalDpi xmlns:a14="http://schemas.microsoft.com/office/drawing/2010/main" val="0"/>
@@ -31722,7 +31841,7 @@
                     </pic:cNvPicPr>
                   </pic:nvPicPr>
                   <pic:blipFill>
-                    <a:blip r:embed="rId101">
+                    <a:blip r:embed="rId103">
                       <a:extLst>
                         <a:ext uri="{28A0092B-C50C-407E-A947-70E740481C1C}">
                           <a14:useLocalDpi xmlns:a14="http://schemas.microsoft.com/office/drawing/2010/main" val="0"/>
@@ -31793,7 +31912,7 @@
                     </pic:cNvPicPr>
                   </pic:nvPicPr>
                   <pic:blipFill>
-                    <a:blip r:embed="rId102">
+                    <a:blip r:embed="rId104">
                       <a:extLst>
                         <a:ext uri="{28A0092B-C50C-407E-A947-70E740481C1C}">
                           <a14:useLocalDpi xmlns:a14="http://schemas.microsoft.com/office/drawing/2010/main" val="0"/>
@@ -31861,7 +31980,7 @@
                     <pic:cNvPicPr/>
                   </pic:nvPicPr>
                   <pic:blipFill>
-                    <a:blip r:embed="rId103"/>
+                    <a:blip r:embed="rId105"/>
                     <a:stretch>
                       <a:fillRect/>
                     </a:stretch>
@@ -31921,7 +32040,7 @@
                     </pic:cNvPicPr>
                   </pic:nvPicPr>
                   <pic:blipFill>
-                    <a:blip r:embed="rId104">
+                    <a:blip r:embed="rId106">
                       <a:extLst>
                         <a:ext uri="{28A0092B-C50C-407E-A947-70E740481C1C}">
                           <a14:useLocalDpi xmlns:a14="http://schemas.microsoft.com/office/drawing/2010/main" val="0"/>
@@ -31957,7 +32076,7 @@
       <w:pPr>
         <w:jc w:val="left"/>
         <w:rPr>
-          <w:rFonts w:eastAsiaTheme="minorHAnsi"/>
+          <w:rFonts w:eastAsiaTheme="minorHAnsi" w:hint="eastAsia"/>
           <w:b/>
           <w:bCs/>
           <w:sz w:val="24"/>
@@ -31991,7 +32110,7 @@
                     </pic:cNvPicPr>
                   </pic:nvPicPr>
                   <pic:blipFill>
-                    <a:blip r:embed="rId105">
+                    <a:blip r:embed="rId107">
                       <a:extLst>
                         <a:ext uri="{28A0092B-C50C-407E-A947-70E740481C1C}">
                           <a14:useLocalDpi xmlns:a14="http://schemas.microsoft.com/office/drawing/2010/main" val="0"/>
@@ -32054,36 +32173,24 @@
           <w:numId w:val="2"/>
         </w:numPr>
         <w:ind w:left="440" w:hanging="440"/>
+        <w:rPr>
+          <w:rFonts w:hint="eastAsia"/>
+        </w:rPr>
       </w:pPr>
       <w:r>
         <w:rPr>
           <w:rFonts w:hint="eastAsia"/>
         </w:rPr>
         <w:lastRenderedPageBreak/>
-        <w:t>Set</w:t>
-      </w:r>
-      <w:r>
-        <w:rPr>
-          <w:rFonts w:hint="eastAsia"/>
-        </w:rPr>
-        <w:t>（</w:t>
-      </w:r>
-      <w:r>
-        <w:rPr>
-          <w:rFonts w:hint="eastAsia"/>
-        </w:rPr>
-        <w:t>集合</w:t>
-      </w:r>
-      <w:r>
-        <w:rPr>
-          <w:rFonts w:hint="eastAsia"/>
-        </w:rPr>
-        <w:t>）</w:t>
+        <w:t>Set（集合）</w:t>
       </w:r>
     </w:p>
     <w:p>
       <w:pPr>
         <w:pStyle w:val="4"/>
+        <w:rPr>
+          <w:rFonts w:hint="eastAsia"/>
+        </w:rPr>
       </w:pPr>
       <w:r>
         <w:rPr>
@@ -32099,6 +32206,9 @@
         </w:rPr>
       </w:pPr>
       <w:r>
+        <w:rPr>
+          <w:noProof/>
+        </w:rPr>
         <w:drawing>
           <wp:inline distT="0" distB="0" distL="0" distR="0" wp14:anchorId="714518BF" wp14:editId="5ABEC4E9">
             <wp:extent cx="6645910" cy="320040"/>
@@ -32115,7 +32225,7 @@
                     <pic:cNvPicPr/>
                   </pic:nvPicPr>
                   <pic:blipFill>
-                    <a:blip r:embed="rId106"/>
+                    <a:blip r:embed="rId108"/>
                     <a:stretch>
                       <a:fillRect/>
                     </a:stretch>
@@ -32136,6 +32246,9 @@
         </w:drawing>
       </w:r>
       <w:r>
+        <w:rPr>
+          <w:noProof/>
+        </w:rPr>
         <w:drawing>
           <wp:inline distT="0" distB="0" distL="0" distR="0" wp14:anchorId="3EEED58D" wp14:editId="79C06D20">
             <wp:extent cx="6645910" cy="1802130"/>
@@ -32152,7 +32265,7 @@
                     <pic:cNvPicPr/>
                   </pic:nvPicPr>
                   <pic:blipFill>
-                    <a:blip r:embed="rId107"/>
+                    <a:blip r:embed="rId109"/>
                     <a:stretch>
                       <a:fillRect/>
                     </a:stretch>
@@ -32177,7 +32290,7 @@
       <w:pPr>
         <w:jc w:val="left"/>
         <w:rPr>
-          <w:rFonts w:eastAsiaTheme="minorHAnsi"/>
+          <w:rFonts w:eastAsiaTheme="minorHAnsi" w:hint="eastAsia"/>
           <w:b/>
           <w:bCs/>
           <w:sz w:val="24"/>
@@ -32189,7 +32302,7 @@
       <w:pPr>
         <w:jc w:val="left"/>
         <w:rPr>
-          <w:rFonts w:eastAsiaTheme="minorHAnsi"/>
+          <w:rFonts w:eastAsiaTheme="minorHAnsi" w:hint="eastAsia"/>
           <w:b/>
           <w:bCs/>
           <w:sz w:val="24"/>
@@ -32201,6 +32314,7 @@
           <w:rFonts w:eastAsiaTheme="minorHAnsi"/>
           <w:b/>
           <w:bCs/>
+          <w:noProof/>
           <w:sz w:val="24"/>
           <w:szCs w:val="24"/>
         </w:rPr>
@@ -32220,7 +32334,7 @@
                     <pic:cNvPicPr/>
                   </pic:nvPicPr>
                   <pic:blipFill>
-                    <a:blip r:embed="rId108"/>
+                    <a:blip r:embed="rId110"/>
                     <a:stretch>
                       <a:fillRect/>
                     </a:stretch>
@@ -32245,7 +32359,7 @@
       <w:pPr>
         <w:jc w:val="left"/>
         <w:rPr>
-          <w:rFonts w:eastAsiaTheme="minorHAnsi"/>
+          <w:rFonts w:eastAsiaTheme="minorHAnsi" w:hint="eastAsia"/>
           <w:b/>
           <w:bCs/>
           <w:sz w:val="24"/>
@@ -32257,6 +32371,7 @@
           <w:rFonts w:eastAsiaTheme="minorHAnsi"/>
           <w:b/>
           <w:bCs/>
+          <w:noProof/>
           <w:sz w:val="24"/>
           <w:szCs w:val="24"/>
         </w:rPr>
@@ -32276,7 +32391,7 @@
                     <pic:cNvPicPr/>
                   </pic:nvPicPr>
                   <pic:blipFill>
-                    <a:blip r:embed="rId109"/>
+                    <a:blip r:embed="rId111"/>
                     <a:stretch>
                       <a:fillRect/>
                     </a:stretch>
@@ -32301,7 +32416,7 @@
       <w:pPr>
         <w:jc w:val="left"/>
         <w:rPr>
-          <w:rFonts w:eastAsiaTheme="minorHAnsi"/>
+          <w:rFonts w:eastAsiaTheme="minorHAnsi" w:hint="eastAsia"/>
           <w:b/>
           <w:bCs/>
           <w:sz w:val="24"/>
@@ -32325,6 +32440,7 @@
           <w:rFonts w:eastAsiaTheme="minorHAnsi"/>
           <w:b/>
           <w:bCs/>
+          <w:noProof/>
           <w:sz w:val="24"/>
           <w:szCs w:val="24"/>
         </w:rPr>
@@ -32344,7 +32460,7 @@
                     <pic:cNvPicPr/>
                   </pic:nvPicPr>
                   <pic:blipFill>
-                    <a:blip r:embed="rId110"/>
+                    <a:blip r:embed="rId112"/>
                     <a:stretch>
                       <a:fillRect/>
                     </a:stretch>
@@ -32369,7 +32485,7 @@
       <w:pPr>
         <w:jc w:val="left"/>
         <w:rPr>
-          <w:rFonts w:eastAsiaTheme="minorHAnsi"/>
+          <w:rFonts w:eastAsiaTheme="minorHAnsi" w:hint="eastAsia"/>
           <w:b/>
           <w:bCs/>
           <w:sz w:val="24"/>
@@ -32381,6 +32497,7 @@
           <w:rFonts w:eastAsiaTheme="minorHAnsi"/>
           <w:b/>
           <w:bCs/>
+          <w:noProof/>
           <w:sz w:val="24"/>
           <w:szCs w:val="24"/>
         </w:rPr>
@@ -32400,7 +32517,7 @@
                     <pic:cNvPicPr/>
                   </pic:nvPicPr>
                   <pic:blipFill>
-                    <a:blip r:embed="rId111"/>
+                    <a:blip r:embed="rId113"/>
                     <a:stretch>
                       <a:fillRect/>
                     </a:stretch>
@@ -32425,7 +32542,7 @@
       <w:pPr>
         <w:jc w:val="left"/>
         <w:rPr>
-          <w:rFonts w:eastAsiaTheme="minorHAnsi"/>
+          <w:rFonts w:eastAsiaTheme="minorHAnsi" w:hint="eastAsia"/>
           <w:b/>
           <w:bCs/>
           <w:sz w:val="24"/>
@@ -32437,6 +32554,7 @@
           <w:rFonts w:eastAsiaTheme="minorHAnsi"/>
           <w:b/>
           <w:bCs/>
+          <w:noProof/>
           <w:sz w:val="24"/>
           <w:szCs w:val="24"/>
         </w:rPr>
@@ -32457,7 +32575,7 @@
                     <pic:cNvPicPr/>
                   </pic:nvPicPr>
                   <pic:blipFill>
-                    <a:blip r:embed="rId112"/>
+                    <a:blip r:embed="rId114"/>
                     <a:stretch>
                       <a:fillRect/>
                     </a:stretch>
@@ -32482,7 +32600,7 @@
       <w:pPr>
         <w:jc w:val="left"/>
         <w:rPr>
-          <w:rFonts w:eastAsiaTheme="minorHAnsi"/>
+          <w:rFonts w:eastAsiaTheme="minorHAnsi" w:hint="eastAsia"/>
           <w:b/>
           <w:bCs/>
           <w:sz w:val="24"/>
@@ -32526,8 +32644,8 @@
       </w:tblPr>
       <w:tblGrid>
         <w:gridCol w:w="2122"/>
-        <w:gridCol w:w="4394"/>
-        <w:gridCol w:w="3940"/>
+        <w:gridCol w:w="4115"/>
+        <w:gridCol w:w="4219"/>
       </w:tblGrid>
       <w:tr>
         <w:tc>
@@ -32559,7 +32677,7 @@
         </w:tc>
         <w:tc>
           <w:tcPr>
-            <w:tcW w:w="4394" w:type="dxa"/>
+            <w:tcW w:w="4115" w:type="dxa"/>
           </w:tcPr>
           <w:p>
             <w:pPr>
@@ -32586,7 +32704,7 @@
         </w:tc>
         <w:tc>
           <w:tcPr>
-            <w:tcW w:w="3940" w:type="dxa"/>
+            <w:tcW w:w="4219" w:type="dxa"/>
           </w:tcPr>
           <w:p>
             <w:pPr>
@@ -32636,17 +32754,7 @@
                 <w:sz w:val="24"/>
                 <w:szCs w:val="24"/>
               </w:rPr>
-              <w:t>Z</w:t>
-            </w:r>
-            <w:r>
-              <w:rPr>
-                <w:rFonts w:eastAsiaTheme="minorHAnsi" w:hint="eastAsia"/>
-                <w:b/>
-                <w:bCs/>
-                <w:sz w:val="24"/>
-                <w:szCs w:val="24"/>
-              </w:rPr>
-              <w:t>+</w:t>
+              <w:t>Z+</w:t>
             </w:r>
             <w:r>
               <w:rPr>
@@ -32662,13 +32770,13 @@
         </w:tc>
         <w:tc>
           <w:tcPr>
-            <w:tcW w:w="4394" w:type="dxa"/>
+            <w:tcW w:w="4115" w:type="dxa"/>
           </w:tcPr>
           <w:p>
             <w:pPr>
               <w:jc w:val="left"/>
               <w:rPr>
-                <w:rFonts w:eastAsiaTheme="minorHAnsi"/>
+                <w:rFonts w:eastAsiaTheme="minorHAnsi" w:hint="eastAsia"/>
                 <w:b/>
                 <w:bCs/>
                 <w:sz w:val="24"/>
@@ -32689,7 +32797,7 @@
         </w:tc>
         <w:tc>
           <w:tcPr>
-            <w:tcW w:w="3940" w:type="dxa"/>
+            <w:tcW w:w="4219" w:type="dxa"/>
           </w:tcPr>
           <w:p>
             <w:pPr>
@@ -32745,13 +32853,13 @@
         </w:tc>
         <w:tc>
           <w:tcPr>
-            <w:tcW w:w="4394" w:type="dxa"/>
+            <w:tcW w:w="4115" w:type="dxa"/>
           </w:tcPr>
           <w:p>
             <w:pPr>
               <w:jc w:val="left"/>
               <w:rPr>
-                <w:rFonts w:eastAsiaTheme="minorHAnsi"/>
+                <w:rFonts w:eastAsiaTheme="minorHAnsi" w:hint="eastAsia"/>
                 <w:b/>
                 <w:bCs/>
                 <w:sz w:val="24"/>
@@ -32772,7 +32880,7 @@
         </w:tc>
         <w:tc>
           <w:tcPr>
-            <w:tcW w:w="3940" w:type="dxa"/>
+            <w:tcW w:w="4219" w:type="dxa"/>
           </w:tcPr>
           <w:p>
             <w:pPr>
@@ -32793,17 +32901,7 @@
                 <w:sz w:val="24"/>
                 <w:szCs w:val="24"/>
               </w:rPr>
-              <w:t>负整数</w:t>
-            </w:r>
-            <w:r>
-              <w:rPr>
-                <w:rFonts w:eastAsiaTheme="minorHAnsi" w:hint="eastAsia"/>
-                <w:b/>
-                <w:bCs/>
-                <w:sz w:val="24"/>
-                <w:szCs w:val="24"/>
-              </w:rPr>
-              <w:t>（不包含0）</w:t>
+              <w:t>负整数（不包含0）</w:t>
             </w:r>
           </w:p>
         </w:tc>
@@ -32838,7 +32936,7 @@
         </w:tc>
         <w:tc>
           <w:tcPr>
-            <w:tcW w:w="4394" w:type="dxa"/>
+            <w:tcW w:w="4115" w:type="dxa"/>
           </w:tcPr>
           <w:p>
             <w:pPr>
@@ -32885,7 +32983,7 @@
         </w:tc>
         <w:tc>
           <w:tcPr>
-            <w:tcW w:w="3940" w:type="dxa"/>
+            <w:tcW w:w="4219" w:type="dxa"/>
           </w:tcPr>
           <w:p>
             <w:pPr>
@@ -32906,7 +33004,7 @@
                 <w:sz w:val="24"/>
                 <w:szCs w:val="24"/>
               </w:rPr>
-              <w:t>有理数: 整数+分数+无限不循环小数</w:t>
+              <w:t>有理数: 整数+分数+无限循环小数</w:t>
             </w:r>
           </w:p>
         </w:tc>
@@ -32920,7 +33018,7 @@
             <w:pPr>
               <w:jc w:val="left"/>
               <w:rPr>
-                <w:rFonts w:eastAsiaTheme="minorHAnsi"/>
+                <w:rFonts w:eastAsiaTheme="minorHAnsi" w:hint="eastAsia"/>
                 <w:b/>
                 <w:bCs/>
                 <w:sz w:val="24"/>
@@ -32941,13 +33039,13 @@
         </w:tc>
         <w:tc>
           <w:tcPr>
-            <w:tcW w:w="4394" w:type="dxa"/>
+            <w:tcW w:w="4115" w:type="dxa"/>
           </w:tcPr>
           <w:p>
             <w:pPr>
               <w:jc w:val="left"/>
               <w:rPr>
-                <w:rFonts w:eastAsiaTheme="minorHAnsi"/>
+                <w:rFonts w:eastAsiaTheme="minorHAnsi" w:hint="eastAsia"/>
                 <w:b/>
                 <w:bCs/>
                 <w:sz w:val="24"/>
@@ -32958,7 +33056,7 @@
         </w:tc>
         <w:tc>
           <w:tcPr>
-            <w:tcW w:w="3940" w:type="dxa"/>
+            <w:tcW w:w="4219" w:type="dxa"/>
           </w:tcPr>
           <w:p>
             <w:pPr>
@@ -33024,7 +33122,7 @@
         </w:tc>
         <w:tc>
           <w:tcPr>
-            <w:tcW w:w="4394" w:type="dxa"/>
+            <w:tcW w:w="4115" w:type="dxa"/>
           </w:tcPr>
           <w:p>
             <w:pPr>
@@ -33071,7 +33169,7 @@
         </w:tc>
         <w:tc>
           <w:tcPr>
-            <w:tcW w:w="3940" w:type="dxa"/>
+            <w:tcW w:w="4219" w:type="dxa"/>
           </w:tcPr>
           <w:p>
             <w:pPr>
@@ -33102,7 +33200,7 @@
       <w:pPr>
         <w:jc w:val="left"/>
         <w:rPr>
-          <w:rFonts w:eastAsiaTheme="minorHAnsi"/>
+          <w:rFonts w:eastAsiaTheme="minorHAnsi" w:hint="eastAsia"/>
           <w:b/>
           <w:bCs/>
           <w:sz w:val="24"/>
@@ -33117,6 +33215,9 @@
           <w:ilvl w:val="1"/>
           <w:numId w:val="19"/>
         </w:numPr>
+        <w:rPr>
+          <w:rFonts w:hint="eastAsia"/>
+        </w:rPr>
       </w:pPr>
       <w:r>
         <w:rPr>
@@ -33177,6 +33278,11 @@
       </w:r>
     </w:p>
     <w:p>
+      <w:pPr>
+        <w:rPr>
+          <w:rFonts w:hint="eastAsia"/>
+        </w:rPr>
+      </w:pPr>
       <w:r>
         <w:rPr>
           <w:rFonts w:hint="eastAsia"/>
@@ -33200,7 +33306,7 @@
                     </pic:cNvPicPr>
                   </pic:nvPicPr>
                   <pic:blipFill>
-                    <a:blip r:embed="rId113">
+                    <a:blip r:embed="rId115">
                       <a:extLst>
                         <a:ext uri="{28A0092B-C50C-407E-A947-70E740481C1C}">
                           <a14:useLocalDpi xmlns:a14="http://schemas.microsoft.com/office/drawing/2010/main" val="0"/>
@@ -33233,7 +33339,15 @@
       </w:r>
     </w:p>
     <w:p>
-      <w:r>
+      <w:pPr>
+        <w:rPr>
+          <w:rFonts w:hint="eastAsia"/>
+        </w:rPr>
+      </w:pPr>
+      <w:r>
+        <w:rPr>
+          <w:noProof/>
+        </w:rPr>
         <w:drawing>
           <wp:inline distT="0" distB="0" distL="0" distR="0" wp14:anchorId="0B84D4A2" wp14:editId="201EEFC9">
             <wp:extent cx="6645910" cy="1771650"/>
@@ -33250,7 +33364,7 @@
                     <pic:cNvPicPr/>
                   </pic:nvPicPr>
                   <pic:blipFill>
-                    <a:blip r:embed="rId114"/>
+                    <a:blip r:embed="rId116"/>
                     <a:stretch>
                       <a:fillRect/>
                     </a:stretch>
@@ -33271,8 +33385,19 @@
         </w:drawing>
       </w:r>
     </w:p>
-    <w:p/>
-    <w:p>
+    <w:p>
+      <w:pPr>
+        <w:rPr>
+          <w:rFonts w:hint="eastAsia"/>
+        </w:rPr>
+      </w:pPr>
+    </w:p>
+    <w:p>
+      <w:pPr>
+        <w:rPr>
+          <w:rFonts w:hint="eastAsia"/>
+        </w:rPr>
+      </w:pPr>
       <w:r>
         <w:rPr>
           <w:rFonts w:hint="eastAsia"/>
@@ -33296,7 +33421,7 @@
                     </pic:cNvPicPr>
                   </pic:nvPicPr>
                   <pic:blipFill>
-                    <a:blip r:embed="rId115">
+                    <a:blip r:embed="rId117">
                       <a:extLst>
                         <a:ext uri="{28A0092B-C50C-407E-A947-70E740481C1C}">
                           <a14:useLocalDpi xmlns:a14="http://schemas.microsoft.com/office/drawing/2010/main" val="0"/>
@@ -33329,7 +33454,15 @@
       </w:r>
     </w:p>
     <w:p>
-      <w:r>
+      <w:pPr>
+        <w:rPr>
+          <w:rFonts w:hint="eastAsia"/>
+        </w:rPr>
+      </w:pPr>
+      <w:r>
+        <w:rPr>
+          <w:noProof/>
+        </w:rPr>
         <w:drawing>
           <wp:inline distT="0" distB="0" distL="0" distR="0" wp14:anchorId="21BEBD6A" wp14:editId="0FFB8CDB">
             <wp:extent cx="6645910" cy="1649730"/>
@@ -33346,7 +33479,7 @@
                     <pic:cNvPicPr/>
                   </pic:nvPicPr>
                   <pic:blipFill>
-                    <a:blip r:embed="rId116"/>
+                    <a:blip r:embed="rId118"/>
                     <a:stretch>
                       <a:fillRect/>
                     </a:stretch>
@@ -33367,7 +33500,13 @@
         </w:drawing>
       </w:r>
     </w:p>
-    <w:p/>
+    <w:p>
+      <w:pPr>
+        <w:rPr>
+          <w:rFonts w:hint="eastAsia"/>
+        </w:rPr>
+      </w:pPr>
+    </w:p>
     <w:p>
       <w:pPr>
         <w:pStyle w:val="4"/>
@@ -33375,6 +33514,9 @@
           <w:ilvl w:val="1"/>
           <w:numId w:val="19"/>
         </w:numPr>
+        <w:rPr>
+          <w:rFonts w:hint="eastAsia"/>
+        </w:rPr>
       </w:pPr>
       <w:r>
         <w:rPr>
@@ -33794,13 +33936,53 @@
             <w:pPr>
               <w:jc w:val="left"/>
               <w:rPr>
+                <w:rFonts w:eastAsiaTheme="minorHAnsi" w:hint="eastAsia"/>
+                <w:b/>
+                <w:bCs/>
+                <w:sz w:val="24"/>
+                <w:szCs w:val="24"/>
+              </w:rPr>
+            </w:pPr>
+            <w:r>
+              <w:rPr>
                 <w:rFonts w:eastAsiaTheme="minorHAnsi"/>
                 <w:b/>
                 <w:bCs/>
                 <w:sz w:val="24"/>
                 <w:szCs w:val="24"/>
               </w:rPr>
-            </w:pPr>
+              <w:t xml:space="preserve">{x ∈ U | x </w:t>
+            </w:r>
+            <w:r>
+              <w:rPr>
+                <w:rFonts w:eastAsiaTheme="minorHAnsi" w:hint="eastAsia"/>
+                <w:b/>
+                <w:bCs/>
+                <w:sz w:val="24"/>
+                <w:szCs w:val="24"/>
+              </w:rPr>
+              <w:t xml:space="preserve"> </w:t>
+            </w:r>
+            <w:r>
+              <w:rPr>
+                <w:rFonts w:ascii="Cambria Math" w:eastAsiaTheme="minorHAnsi" w:hAnsi="Cambria Math" w:cs="Cambria Math" w:hint="eastAsia"/>
+                <w:b/>
+                <w:bCs/>
+                <w:sz w:val="24"/>
+                <w:szCs w:val="24"/>
+              </w:rPr>
+              <w:t>∉</w:t>
+            </w:r>
+            <w:r>
+              <w:rPr>
+                <w:rFonts w:ascii="Cambria Math" w:eastAsiaTheme="minorHAnsi" w:hAnsi="Cambria Math" w:cs="Cambria Math" w:hint="eastAsia"/>
+                <w:b/>
+                <w:bCs/>
+                <w:sz w:val="24"/>
+                <w:szCs w:val="24"/>
+              </w:rPr>
+              <w:t xml:space="preserve"> </w:t>
+            </w:r>
             <w:r>
               <w:rPr>
                 <w:rFonts w:eastAsiaTheme="minorHAnsi"/>
@@ -33809,47 +33991,7 @@
                 <w:sz w:val="24"/>
                 <w:szCs w:val="24"/>
               </w:rPr>
-              <w:t xml:space="preserve">{x | x </w:t>
-            </w:r>
-            <w:r>
-              <w:rPr>
-                <w:rFonts w:ascii="Cambria Math" w:eastAsiaTheme="minorHAnsi" w:hAnsi="Cambria Math" w:cs="Cambria Math"/>
-                <w:b/>
-                <w:bCs/>
-                <w:sz w:val="24"/>
-                <w:szCs w:val="24"/>
-              </w:rPr>
-              <w:t>∉</w:t>
-            </w:r>
-            <w:r>
-              <w:rPr>
-                <w:rFonts w:eastAsiaTheme="minorHAnsi"/>
-                <w:b/>
-                <w:bCs/>
-                <w:sz w:val="24"/>
-                <w:szCs w:val="24"/>
-              </w:rPr>
-              <w:t xml:space="preserve"> </w:t>
-            </w:r>
-            <w:r>
-              <w:rPr>
-                <w:rFonts w:eastAsiaTheme="minorHAnsi" w:hint="eastAsia"/>
-                <w:b/>
-                <w:bCs/>
-                <w:sz w:val="24"/>
-                <w:szCs w:val="24"/>
-              </w:rPr>
-              <w:t xml:space="preserve"> A                  </w:t>
-            </w:r>
-            <w:r>
-              <w:rPr>
-                <w:rFonts w:eastAsiaTheme="minorHAnsi"/>
-                <w:b/>
-                <w:bCs/>
-                <w:sz w:val="24"/>
-                <w:szCs w:val="24"/>
-              </w:rPr>
-              <w:t>}</w:t>
+              <w:t xml:space="preserve"> A}</w:t>
             </w:r>
           </w:p>
         </w:tc>
@@ -33876,17 +34018,7 @@
                 <w:sz w:val="24"/>
                 <w:szCs w:val="24"/>
               </w:rPr>
-              <w:t>补集</w:t>
-            </w:r>
-            <w:r>
-              <w:rPr>
-                <w:rFonts w:eastAsiaTheme="minorHAnsi" w:hint="eastAsia"/>
-                <w:b/>
-                <w:bCs/>
-                <w:sz w:val="24"/>
-                <w:szCs w:val="24"/>
-              </w:rPr>
-              <w:t xml:space="preserve">         </w:t>
+              <w:t xml:space="preserve">补集         </w:t>
             </w:r>
             <w:r>
               <w:rPr>
@@ -33910,7 +34042,7 @@
             <w:pPr>
               <w:jc w:val="left"/>
               <w:rPr>
-                <w:rFonts w:eastAsiaTheme="minorHAnsi"/>
+                <w:rFonts w:eastAsiaTheme="minorHAnsi" w:hint="eastAsia"/>
                 <w:b/>
                 <w:bCs/>
                 <w:sz w:val="24"/>
@@ -34126,7 +34258,7 @@
             <w:pPr>
               <w:jc w:val="left"/>
               <w:rPr>
-                <w:rFonts w:eastAsiaTheme="minorHAnsi"/>
+                <w:rFonts w:eastAsiaTheme="minorHAnsi" w:hint="eastAsia"/>
                 <w:b/>
                 <w:bCs/>
                 <w:sz w:val="24"/>
@@ -34194,17 +34326,7 @@
                 <w:sz w:val="24"/>
                 <w:szCs w:val="24"/>
               </w:rPr>
-              <w:t xml:space="preserve">A </w:t>
-            </w:r>
-            <w:r>
-              <w:rPr>
-                <w:rFonts w:eastAsiaTheme="minorHAnsi"/>
-                <w:b/>
-                <w:bCs/>
-                <w:sz w:val="24"/>
-                <w:szCs w:val="24"/>
-              </w:rPr>
-              <w:t>–</w:t>
+              <w:t>A \ B</w:t>
             </w:r>
             <w:r>
               <w:rPr>
@@ -34214,17 +34336,7 @@
                 <w:sz w:val="24"/>
                 <w:szCs w:val="24"/>
               </w:rPr>
-              <w:t xml:space="preserve"> B</w:t>
-            </w:r>
-            <w:r>
-              <w:rPr>
-                <w:rFonts w:eastAsiaTheme="minorHAnsi" w:hint="eastAsia"/>
-                <w:b/>
-                <w:bCs/>
-                <w:sz w:val="24"/>
-                <w:szCs w:val="24"/>
-              </w:rPr>
-              <w:t xml:space="preserve">  或      A \ B</w:t>
+              <w:t xml:space="preserve"> </w:t>
             </w:r>
           </w:p>
         </w:tc>
@@ -34295,13 +34407,33 @@
             <w:pPr>
               <w:jc w:val="left"/>
               <w:rPr>
+                <w:rFonts w:eastAsiaTheme="minorHAnsi" w:hint="eastAsia"/>
+                <w:b/>
+                <w:bCs/>
+                <w:sz w:val="24"/>
+                <w:szCs w:val="24"/>
+              </w:rPr>
+            </w:pPr>
+            <w:r>
+              <w:rPr>
                 <w:rFonts w:eastAsiaTheme="minorHAnsi"/>
                 <w:b/>
                 <w:bCs/>
                 <w:sz w:val="24"/>
                 <w:szCs w:val="24"/>
               </w:rPr>
-            </w:pPr>
+              <w:t>{x | x ∈ A</w:t>
+            </w:r>
+            <w:r>
+              <w:rPr>
+                <w:rFonts w:eastAsiaTheme="minorHAnsi" w:hint="eastAsia"/>
+                <w:b/>
+                <w:bCs/>
+                <w:sz w:val="24"/>
+                <w:szCs w:val="24"/>
+              </w:rPr>
+              <w:t>\</w:t>
+            </w:r>
             <w:r>
               <w:rPr>
                 <w:rFonts w:eastAsiaTheme="minorHAnsi"/>
@@ -34310,7 +34442,7 @@
                 <w:sz w:val="24"/>
                 <w:szCs w:val="24"/>
               </w:rPr>
-              <w:t>{x | x ∈ A</w:t>
+              <w:t>B or x ∈ B</w:t>
             </w:r>
             <w:r>
               <w:rPr>
@@ -34320,27 +34452,7 @@
                 <w:sz w:val="24"/>
                 <w:szCs w:val="24"/>
               </w:rPr>
-              <w:t>-</w:t>
-            </w:r>
-            <w:r>
-              <w:rPr>
-                <w:rFonts w:eastAsiaTheme="minorHAnsi"/>
-                <w:b/>
-                <w:bCs/>
-                <w:sz w:val="24"/>
-                <w:szCs w:val="24"/>
-              </w:rPr>
-              <w:t>B or x ∈ B</w:t>
-            </w:r>
-            <w:r>
-              <w:rPr>
-                <w:rFonts w:eastAsiaTheme="minorHAnsi" w:hint="eastAsia"/>
-                <w:b/>
-                <w:bCs/>
-                <w:sz w:val="24"/>
-                <w:szCs w:val="24"/>
-              </w:rPr>
-              <w:t>-</w:t>
+              <w:t>\</w:t>
             </w:r>
             <w:r>
               <w:rPr>
@@ -34357,23 +34469,13 @@
             <w:pPr>
               <w:jc w:val="left"/>
               <w:rPr>
-                <w:rFonts w:eastAsiaTheme="minorHAnsi"/>
-                <w:b/>
-                <w:bCs/>
-                <w:sz w:val="24"/>
-                <w:szCs w:val="24"/>
-              </w:rPr>
-            </w:pPr>
-            <w:r>
-              <w:rPr>
                 <w:rFonts w:eastAsiaTheme="minorHAnsi" w:hint="eastAsia"/>
                 <w:b/>
                 <w:bCs/>
                 <w:sz w:val="24"/>
                 <w:szCs w:val="24"/>
               </w:rPr>
-              <w:t xml:space="preserve">只属于A部分 </w:t>
-            </w:r>
+            </w:pPr>
             <w:r>
               <w:rPr>
                 <w:rFonts w:eastAsiaTheme="minorHAnsi" w:hint="eastAsia"/>
@@ -34382,7 +34484,7 @@
                 <w:sz w:val="24"/>
                 <w:szCs w:val="24"/>
               </w:rPr>
-              <w:t>+</w:t>
+              <w:t xml:space="preserve">只属于A部分 </w:t>
             </w:r>
             <w:r>
               <w:rPr>
@@ -34392,7 +34494,7 @@
                 <w:sz w:val="24"/>
                 <w:szCs w:val="24"/>
               </w:rPr>
-              <w:t xml:space="preserve"> </w:t>
+              <w:t>+</w:t>
             </w:r>
             <w:r>
               <w:rPr>
@@ -34402,27 +34504,7 @@
                 <w:sz w:val="24"/>
                 <w:szCs w:val="24"/>
               </w:rPr>
-              <w:t>只属于</w:t>
-            </w:r>
-            <w:r>
-              <w:rPr>
-                <w:rFonts w:eastAsiaTheme="minorHAnsi" w:hint="eastAsia"/>
-                <w:b/>
-                <w:bCs/>
-                <w:sz w:val="24"/>
-                <w:szCs w:val="24"/>
-              </w:rPr>
-              <w:t>B</w:t>
-            </w:r>
-            <w:r>
-              <w:rPr>
-                <w:rFonts w:eastAsiaTheme="minorHAnsi" w:hint="eastAsia"/>
-                <w:b/>
-                <w:bCs/>
-                <w:sz w:val="24"/>
-                <w:szCs w:val="24"/>
-              </w:rPr>
-              <w:t>部分</w:t>
+              <w:t xml:space="preserve"> 只属于B部分</w:t>
             </w:r>
           </w:p>
           <w:p>
@@ -34446,23 +34528,13 @@
             <w:pPr>
               <w:jc w:val="left"/>
               <w:rPr>
-                <w:rFonts w:eastAsiaTheme="minorHAnsi"/>
-                <w:b/>
-                <w:bCs/>
-                <w:sz w:val="24"/>
-                <w:szCs w:val="24"/>
-              </w:rPr>
-            </w:pPr>
-            <w:r>
-              <w:rPr>
                 <w:rFonts w:eastAsiaTheme="minorHAnsi" w:hint="eastAsia"/>
                 <w:b/>
                 <w:bCs/>
                 <w:sz w:val="24"/>
                 <w:szCs w:val="24"/>
               </w:rPr>
-              <w:t>对称</w:t>
-            </w:r>
+            </w:pPr>
             <w:r>
               <w:rPr>
                 <w:rFonts w:eastAsiaTheme="minorHAnsi" w:hint="eastAsia"/>
@@ -34471,7 +34543,7 @@
                 <w:sz w:val="24"/>
                 <w:szCs w:val="24"/>
               </w:rPr>
-              <w:t>差</w:t>
+              <w:t>对称差</w:t>
             </w:r>
             <w:r>
               <w:rPr>
@@ -34518,7 +34590,7 @@
             <w:pPr>
               <w:jc w:val="left"/>
               <w:rPr>
-                <w:rFonts w:eastAsiaTheme="minorHAnsi"/>
+                <w:rFonts w:eastAsiaTheme="minorHAnsi" w:hint="eastAsia"/>
                 <w:b/>
                 <w:bCs/>
                 <w:sz w:val="24"/>
@@ -34710,6 +34782,9 @@
     </w:p>
     <w:p>
       <w:r>
+        <w:rPr>
+          <w:noProof/>
+        </w:rPr>
         <w:drawing>
           <wp:inline distT="0" distB="0" distL="0" distR="0" wp14:anchorId="39DA4D7A" wp14:editId="43670F1A">
             <wp:extent cx="6645910" cy="696595"/>
@@ -34726,7 +34801,7 @@
                     <pic:cNvPicPr/>
                   </pic:nvPicPr>
                   <pic:blipFill>
-                    <a:blip r:embed="rId117"/>
+                    <a:blip r:embed="rId119"/>
                     <a:stretch>
                       <a:fillRect/>
                     </a:stretch>
@@ -34747,7 +34822,128 @@
         </w:drawing>
       </w:r>
     </w:p>
-    <w:p/>
+    <w:p>
+      <w:pPr>
+        <w:rPr>
+          <w:rFonts w:hint="eastAsia"/>
+        </w:rPr>
+      </w:pPr>
+      <w:r>
+        <w:rPr>
+          <w:noProof/>
+        </w:rPr>
+        <w:drawing>
+          <wp:inline distT="0" distB="0" distL="0" distR="0" wp14:anchorId="1A920EBA" wp14:editId="04330092">
+            <wp:extent cx="6645910" cy="5221605"/>
+            <wp:effectExtent l="0" t="0" r="2540" b="0"/>
+            <wp:docPr id="436153280" name="图片 4"/>
+            <wp:cNvGraphicFramePr>
+              <a:graphicFrameLocks xmlns:a="http://schemas.openxmlformats.org/drawingml/2006/main" noChangeAspect="1"/>
+            </wp:cNvGraphicFramePr>
+            <a:graphic xmlns:a="http://schemas.openxmlformats.org/drawingml/2006/main">
+              <a:graphicData uri="http://schemas.openxmlformats.org/drawingml/2006/picture">
+                <pic:pic xmlns:pic="http://schemas.openxmlformats.org/drawingml/2006/picture">
+                  <pic:nvPicPr>
+                    <pic:cNvPr id="0" name="Picture 16"/>
+                    <pic:cNvPicPr>
+                      <a:picLocks noChangeAspect="1" noChangeArrowheads="1"/>
+                    </pic:cNvPicPr>
+                  </pic:nvPicPr>
+                  <pic:blipFill>
+                    <a:blip r:embed="rId120">
+                      <a:extLst>
+                        <a:ext uri="{28A0092B-C50C-407E-A947-70E740481C1C}">
+                          <a14:useLocalDpi xmlns:a14="http://schemas.microsoft.com/office/drawing/2010/main" val="0"/>
+                        </a:ext>
+                      </a:extLst>
+                    </a:blip>
+                    <a:srcRect/>
+                    <a:stretch>
+                      <a:fillRect/>
+                    </a:stretch>
+                  </pic:blipFill>
+                  <pic:spPr bwMode="auto">
+                    <a:xfrm>
+                      <a:off x="0" y="0"/>
+                      <a:ext cx="6645910" cy="5221605"/>
+                    </a:xfrm>
+                    <a:prstGeom prst="rect">
+                      <a:avLst/>
+                    </a:prstGeom>
+                    <a:noFill/>
+                    <a:ln>
+                      <a:noFill/>
+                    </a:ln>
+                  </pic:spPr>
+                </pic:pic>
+              </a:graphicData>
+            </a:graphic>
+          </wp:inline>
+        </w:drawing>
+      </w:r>
+    </w:p>
+    <w:p>
+      <w:pPr>
+        <w:rPr>
+          <w:rFonts w:hint="eastAsia"/>
+        </w:rPr>
+      </w:pPr>
+      <w:r>
+        <w:rPr>
+          <w:rFonts w:hint="eastAsia"/>
+          <w:noProof/>
+        </w:rPr>
+        <w:lastRenderedPageBreak/>
+        <w:drawing>
+          <wp:inline distT="0" distB="0" distL="0" distR="0" wp14:anchorId="52923AAA" wp14:editId="3EFBD37B">
+            <wp:extent cx="6210300" cy="4455022"/>
+            <wp:effectExtent l="0" t="0" r="0" b="3175"/>
+            <wp:docPr id="2142206439" name="图片 1"/>
+            <wp:cNvGraphicFramePr>
+              <a:graphicFrameLocks xmlns:a="http://schemas.openxmlformats.org/drawingml/2006/main" noChangeAspect="1"/>
+            </wp:cNvGraphicFramePr>
+            <a:graphic xmlns:a="http://schemas.openxmlformats.org/drawingml/2006/main">
+              <a:graphicData uri="http://schemas.openxmlformats.org/drawingml/2006/picture">
+                <pic:pic xmlns:pic="http://schemas.openxmlformats.org/drawingml/2006/picture">
+                  <pic:nvPicPr>
+                    <pic:cNvPr id="0" name="Picture 13"/>
+                    <pic:cNvPicPr>
+                      <a:picLocks noChangeAspect="1" noChangeArrowheads="1"/>
+                    </pic:cNvPicPr>
+                  </pic:nvPicPr>
+                  <pic:blipFill>
+                    <a:blip r:embed="rId121">
+                      <a:extLst>
+                        <a:ext uri="{28A0092B-C50C-407E-A947-70E740481C1C}">
+                          <a14:useLocalDpi xmlns:a14="http://schemas.microsoft.com/office/drawing/2010/main" val="0"/>
+                        </a:ext>
+                      </a:extLst>
+                    </a:blip>
+                    <a:srcRect/>
+                    <a:stretch>
+                      <a:fillRect/>
+                    </a:stretch>
+                  </pic:blipFill>
+                  <pic:spPr bwMode="auto">
+                    <a:xfrm>
+                      <a:off x="0" y="0"/>
+                      <a:ext cx="6218203" cy="4460692"/>
+                    </a:xfrm>
+                    <a:prstGeom prst="rect">
+                      <a:avLst/>
+                    </a:prstGeom>
+                    <a:noFill/>
+                    <a:ln>
+                      <a:noFill/>
+                    </a:ln>
+                  </pic:spPr>
+                </pic:pic>
+              </a:graphicData>
+            </a:graphic>
+          </wp:inline>
+        </w:drawing>
+      </w:r>
+    </w:p>
     <w:p>
       <w:pPr>
         <w:pStyle w:val="4"/>
@@ -34755,6 +34951,9 @@
           <w:ilvl w:val="1"/>
           <w:numId w:val="19"/>
         </w:numPr>
+        <w:rPr>
+          <w:rFonts w:hint="eastAsia"/>
+        </w:rPr>
       </w:pPr>
       <w:r>
         <w:t>Venn diagrams</w:t>
@@ -34784,7 +34983,7 @@
                     </pic:cNvPicPr>
                   </pic:nvPicPr>
                   <pic:blipFill>
-                    <a:blip r:embed="rId118">
+                    <a:blip r:embed="rId122">
                       <a:extLst>
                         <a:ext uri="{28A0092B-C50C-407E-A947-70E740481C1C}">
                           <a14:useLocalDpi xmlns:a14="http://schemas.microsoft.com/office/drawing/2010/main" val="0"/>
@@ -34816,22 +35015,45 @@
         </w:drawing>
       </w:r>
     </w:p>
-    <w:p>
-      <w:pPr>
-        <w:rPr>
-          <w:rFonts w:hint="eastAsia"/>
-        </w:rPr>
-      </w:pPr>
-      <w:r>
-        <w:rPr>
+    <w:p/>
+    <w:p>
+      <w:pPr>
+        <w:pStyle w:val="4"/>
+        <w:numPr>
+          <w:ilvl w:val="1"/>
+          <w:numId w:val="19"/>
+        </w:numPr>
+        <w:rPr>
+          <w:rFonts w:hint="eastAsia"/>
+        </w:rPr>
+      </w:pPr>
+      <w:r>
+        <w:lastRenderedPageBreak/>
+        <w:t>Venn diagrams</w:t>
+      </w:r>
+      <w:r>
+        <w:rPr>
+          <w:rFonts w:hint="eastAsia"/>
+        </w:rPr>
+        <w:t>求解工具</w:t>
+      </w:r>
+    </w:p>
+    <w:p>
+      <w:pPr>
+        <w:rPr>
+          <w:rFonts w:hint="eastAsia"/>
+        </w:rPr>
+      </w:pPr>
+      <w:r>
+        <w:rPr>
+          <w:rFonts w:hint="eastAsia"/>
           <w:noProof/>
         </w:rPr>
-        <w:lastRenderedPageBreak/>
         <w:drawing>
-          <wp:inline distT="0" distB="0" distL="0" distR="0" wp14:anchorId="5AC43AAB" wp14:editId="2FCE1EA9">
-            <wp:extent cx="6645910" cy="5221605"/>
-            <wp:effectExtent l="0" t="0" r="2540" b="0"/>
-            <wp:docPr id="436153280" name="图片 4"/>
+          <wp:inline distT="0" distB="0" distL="0" distR="0" wp14:anchorId="09653EB9" wp14:editId="13FB541C">
+            <wp:extent cx="6896066" cy="2809875"/>
+            <wp:effectExtent l="0" t="0" r="635" b="0"/>
+            <wp:docPr id="328794758" name="图片 5"/>
             <wp:cNvGraphicFramePr>
               <a:graphicFrameLocks xmlns:a="http://schemas.openxmlformats.org/drawingml/2006/main" noChangeAspect="1"/>
             </wp:cNvGraphicFramePr>
@@ -34839,13 +35061,13 @@
               <a:graphicData uri="http://schemas.openxmlformats.org/drawingml/2006/picture">
                 <pic:pic xmlns:pic="http://schemas.openxmlformats.org/drawingml/2006/picture">
                   <pic:nvPicPr>
-                    <pic:cNvPr id="0" name="Picture 16"/>
+                    <pic:cNvPr id="0" name="Picture 17"/>
                     <pic:cNvPicPr>
                       <a:picLocks noChangeAspect="1" noChangeArrowheads="1"/>
                     </pic:cNvPicPr>
                   </pic:nvPicPr>
                   <pic:blipFill>
-                    <a:blip r:embed="rId119">
+                    <a:blip r:embed="rId123">
                       <a:extLst>
                         <a:ext uri="{28A0092B-C50C-407E-A947-70E740481C1C}">
                           <a14:useLocalDpi xmlns:a14="http://schemas.microsoft.com/office/drawing/2010/main" val="0"/>
@@ -34860,7 +35082,7 @@
                   <pic:spPr bwMode="auto">
                     <a:xfrm>
                       <a:off x="0" y="0"/>
-                      <a:ext cx="6645910" cy="5221605"/>
+                      <a:ext cx="6899319" cy="2811201"/>
                     </a:xfrm>
                     <a:prstGeom prst="rect">
                       <a:avLst/>
@@ -34877,6 +35099,13 @@
         </w:drawing>
       </w:r>
     </w:p>
+    <w:p>
+      <w:pPr>
+        <w:rPr>
+          <w:rFonts w:hint="eastAsia"/>
+        </w:rPr>
+      </w:pPr>
+    </w:p>
     <w:sectPr>
       <w:pgSz w:w="11906" w:h="16838"/>
       <w:pgMar w:top="720" w:right="720" w:bottom="720" w:left="720" w:header="851" w:footer="992" w:gutter="0"/>
@@ -34885,6 +35114,64 @@
     </w:sectPr>
   </w:body>
 </w:document>
+</file>
+
+<file path=word/endnotes.xml><?xml version="1.0" encoding="utf-8"?>
+<w:endnotes xmlns:wpc="http://schemas.microsoft.com/office/word/2010/wordprocessingCanvas" xmlns:cx="http://schemas.microsoft.com/office/drawing/2014/chartex" xmlns:cx1="http://schemas.microsoft.com/office/drawing/2015/9/8/chartex" xmlns:cx2="http://schemas.microsoft.com/office/drawing/2015/10/21/chartex" xmlns:cx3="http://schemas.microsoft.com/office/drawing/2016/5/9/chartex" xmlns:cx4="http://schemas.microsoft.com/office/drawing/2016/5/10/chartex" xmlns:cx5="http://schemas.microsoft.com/office/drawing/2016/5/11/chartex" xmlns:cx6="http://schemas.microsoft.com/office/drawing/2016/5/12/chartex" xmlns:cx7="http://schemas.microsoft.com/office/drawing/2016/5/13/chartex" xmlns:cx8="http://schemas.microsoft.com/office/drawing/2016/5/14/chartex" xmlns:mc="http://schemas.openxmlformats.org/markup-compatibility/2006" xmlns:aink="http://schemas.microsoft.com/office/drawing/2016/ink" xmlns:am3d="http://schemas.microsoft.com/office/drawing/2017/model3d" xmlns:o="urn:schemas-microsoft-com:office:office" xmlns:oel="http://schemas.microsoft.com/office/2019/extlst" xmlns:r="http://schemas.openxmlformats.org/officeDocument/2006/relationships" xmlns:m="http://schemas.openxmlformats.org/officeDocument/2006/math" xmlns:v="urn:schemas-microsoft-com:vml" xmlns:wp14="http://schemas.microsoft.com/office/word/2010/wordprocessingDrawing" xmlns:wp="http://schemas.openxmlformats.org/drawingml/2006/wordprocessingDrawing" xmlns:w10="urn:schemas-microsoft-com:office:word" xmlns:w="http://schemas.openxmlformats.org/wordprocessingml/2006/main" xmlns:w14="http://schemas.microsoft.com/office/word/2010/wordml" xmlns:w15="http://schemas.microsoft.com/office/word/2012/wordml" xmlns:w16cex="http://schemas.microsoft.com/office/word/2018/wordml/cex" xmlns:w16cid="http://schemas.microsoft.com/office/word/2016/wordml/cid" xmlns:w16="http://schemas.microsoft.com/office/word/2018/wordml" xmlns:w16du="http://schemas.microsoft.com/office/word/2023/wordml/word16du" xmlns:w16sdtdh="http://schemas.microsoft.com/office/word/2020/wordml/sdtdatahash" xmlns:w16sdtfl="http://schemas.microsoft.com/office/word/2024/wordml/sdtformatlock" xmlns:w16se="http://schemas.microsoft.com/office/word/2015/wordml/symex" xmlns:wpg="http://schemas.microsoft.com/office/word/2010/wordprocessingGroup" xmlns:wpi="http://schemas.microsoft.com/office/word/2010/wordprocessingInk" xmlns:wne="http://schemas.microsoft.com/office/word/2006/wordml" xmlns:wps="http://schemas.microsoft.com/office/word/2010/wordprocessingShape" mc:Ignorable="w14 w15 w16se w16cid w16 w16cex w16sdtdh w16sdtfl w16du wp14">
+  <w:endnote w:type="separator" w:id="-1">
+    <w:p>
+      <w:pPr>
+        <w:rPr>
+          <w:rFonts w:hint="eastAsia"/>
+        </w:rPr>
+      </w:pPr>
+      <w:r>
+        <w:separator/>
+      </w:r>
+    </w:p>
+  </w:endnote>
+  <w:endnote w:type="continuationSeparator" w:id="0">
+    <w:p>
+      <w:pPr>
+        <w:rPr>
+          <w:rFonts w:hint="eastAsia"/>
+        </w:rPr>
+      </w:pPr>
+      <w:r>
+        <w:continuationSeparator/>
+      </w:r>
+    </w:p>
+  </w:endnote>
+</w:endnotes>
+</file>
+
+<file path=word/footnotes.xml><?xml version="1.0" encoding="utf-8"?>
+<w:footnotes xmlns:wpc="http://schemas.microsoft.com/office/word/2010/wordprocessingCanvas" xmlns:cx="http://schemas.microsoft.com/office/drawing/2014/chartex" xmlns:cx1="http://schemas.microsoft.com/office/drawing/2015/9/8/chartex" xmlns:cx2="http://schemas.microsoft.com/office/drawing/2015/10/21/chartex" xmlns:cx3="http://schemas.microsoft.com/office/drawing/2016/5/9/chartex" xmlns:cx4="http://schemas.microsoft.com/office/drawing/2016/5/10/chartex" xmlns:cx5="http://schemas.microsoft.com/office/drawing/2016/5/11/chartex" xmlns:cx6="http://schemas.microsoft.com/office/drawing/2016/5/12/chartex" xmlns:cx7="http://schemas.microsoft.com/office/drawing/2016/5/13/chartex" xmlns:cx8="http://schemas.microsoft.com/office/drawing/2016/5/14/chartex" xmlns:mc="http://schemas.openxmlformats.org/markup-compatibility/2006" xmlns:aink="http://schemas.microsoft.com/office/drawing/2016/ink" xmlns:am3d="http://schemas.microsoft.com/office/drawing/2017/model3d" xmlns:o="urn:schemas-microsoft-com:office:office" xmlns:oel="http://schemas.microsoft.com/office/2019/extlst" xmlns:r="http://schemas.openxmlformats.org/officeDocument/2006/relationships" xmlns:m="http://schemas.openxmlformats.org/officeDocument/2006/math" xmlns:v="urn:schemas-microsoft-com:vml" xmlns:wp14="http://schemas.microsoft.com/office/word/2010/wordprocessingDrawing" xmlns:wp="http://schemas.openxmlformats.org/drawingml/2006/wordprocessingDrawing" xmlns:w10="urn:schemas-microsoft-com:office:word" xmlns:w="http://schemas.openxmlformats.org/wordprocessingml/2006/main" xmlns:w14="http://schemas.microsoft.com/office/word/2010/wordml" xmlns:w15="http://schemas.microsoft.com/office/word/2012/wordml" xmlns:w16cex="http://schemas.microsoft.com/office/word/2018/wordml/cex" xmlns:w16cid="http://schemas.microsoft.com/office/word/2016/wordml/cid" xmlns:w16="http://schemas.microsoft.com/office/word/2018/wordml" xmlns:w16du="http://schemas.microsoft.com/office/word/2023/wordml/word16du" xmlns:w16sdtdh="http://schemas.microsoft.com/office/word/2020/wordml/sdtdatahash" xmlns:w16sdtfl="http://schemas.microsoft.com/office/word/2024/wordml/sdtformatlock" xmlns:w16se="http://schemas.microsoft.com/office/word/2015/wordml/symex" xmlns:wpg="http://schemas.microsoft.com/office/word/2010/wordprocessingGroup" xmlns:wpi="http://schemas.microsoft.com/office/word/2010/wordprocessingInk" xmlns:wne="http://schemas.microsoft.com/office/word/2006/wordml" xmlns:wps="http://schemas.microsoft.com/office/word/2010/wordprocessingShape" mc:Ignorable="w14 w15 w16se w16cid w16 w16cex w16sdtdh w16sdtfl w16du wp14">
+  <w:footnote w:type="separator" w:id="-1">
+    <w:p>
+      <w:pPr>
+        <w:rPr>
+          <w:rFonts w:hint="eastAsia"/>
+        </w:rPr>
+      </w:pPr>
+      <w:r>
+        <w:separator/>
+      </w:r>
+    </w:p>
+  </w:footnote>
+  <w:footnote w:type="continuationSeparator" w:id="0">
+    <w:p>
+      <w:pPr>
+        <w:rPr>
+          <w:rFonts w:hint="eastAsia"/>
+        </w:rPr>
+      </w:pPr>
+      <w:r>
+        <w:continuationSeparator/>
+      </w:r>
+    </w:p>
+  </w:footnote>
+</w:footnotes>
 </file>
 
 <file path=word/numbering.xml><?xml version="1.0" encoding="utf-8"?>
@@ -35210,6 +35497,127 @@
     </w:lvl>
   </w:abstractNum>
   <w:abstractNum w:abstractNumId="3" w15:restartNumberingAfterBreak="0">
+    <w:nsid w:val="0DA823B8"/>
+    <w:multiLevelType w:val="multilevel"/>
+    <w:tmpl w:val="FA926726"/>
+    <w:lvl w:ilvl="0">
+      <w:start w:val="1"/>
+      <w:numFmt w:val="decimal"/>
+      <w:lvlText w:val="%1."/>
+      <w:lvlJc w:val="left"/>
+      <w:pPr>
+        <w:ind w:left="780" w:hanging="360"/>
+      </w:pPr>
+      <w:rPr>
+        <w:rFonts w:hint="default"/>
+      </w:rPr>
+    </w:lvl>
+    <w:lvl w:ilvl="1">
+      <w:start w:val="2"/>
+      <w:numFmt w:val="decimal"/>
+      <w:isLgl/>
+      <w:lvlText w:val="%1.%2"/>
+      <w:lvlJc w:val="left"/>
+      <w:pPr>
+        <w:ind w:left="860" w:hanging="435"/>
+      </w:pPr>
+      <w:rPr>
+        <w:rFonts w:hint="default"/>
+      </w:rPr>
+    </w:lvl>
+    <w:lvl w:ilvl="2">
+      <w:start w:val="1"/>
+      <w:numFmt w:val="decimal"/>
+      <w:isLgl/>
+      <w:lvlText w:val="%1.%2.%3"/>
+      <w:lvlJc w:val="left"/>
+      <w:pPr>
+        <w:ind w:left="1140" w:hanging="720"/>
+      </w:pPr>
+      <w:rPr>
+        <w:rFonts w:hint="default"/>
+      </w:rPr>
+    </w:lvl>
+    <w:lvl w:ilvl="3">
+      <w:start w:val="1"/>
+      <w:numFmt w:val="decimal"/>
+      <w:isLgl/>
+      <w:lvlText w:val="%1.%2.%3.%4"/>
+      <w:lvlJc w:val="left"/>
+      <w:pPr>
+        <w:ind w:left="1140" w:hanging="720"/>
+      </w:pPr>
+      <w:rPr>
+        <w:rFonts w:hint="default"/>
+      </w:rPr>
+    </w:lvl>
+    <w:lvl w:ilvl="4">
+      <w:start w:val="1"/>
+      <w:numFmt w:val="decimal"/>
+      <w:isLgl/>
+      <w:lvlText w:val="%1.%2.%3.%4.%5"/>
+      <w:lvlJc w:val="left"/>
+      <w:pPr>
+        <w:ind w:left="1500" w:hanging="1080"/>
+      </w:pPr>
+      <w:rPr>
+        <w:rFonts w:hint="default"/>
+      </w:rPr>
+    </w:lvl>
+    <w:lvl w:ilvl="5">
+      <w:start w:val="1"/>
+      <w:numFmt w:val="decimal"/>
+      <w:isLgl/>
+      <w:lvlText w:val="%1.%2.%3.%4.%5.%6"/>
+      <w:lvlJc w:val="left"/>
+      <w:pPr>
+        <w:ind w:left="1500" w:hanging="1080"/>
+      </w:pPr>
+      <w:rPr>
+        <w:rFonts w:hint="default"/>
+      </w:rPr>
+    </w:lvl>
+    <w:lvl w:ilvl="6">
+      <w:start w:val="1"/>
+      <w:numFmt w:val="decimal"/>
+      <w:isLgl/>
+      <w:lvlText w:val="%1.%2.%3.%4.%5.%6.%7"/>
+      <w:lvlJc w:val="left"/>
+      <w:pPr>
+        <w:ind w:left="1860" w:hanging="1440"/>
+      </w:pPr>
+      <w:rPr>
+        <w:rFonts w:hint="default"/>
+      </w:rPr>
+    </w:lvl>
+    <w:lvl w:ilvl="7">
+      <w:start w:val="1"/>
+      <w:numFmt w:val="decimal"/>
+      <w:isLgl/>
+      <w:lvlText w:val="%1.%2.%3.%4.%5.%6.%7.%8"/>
+      <w:lvlJc w:val="left"/>
+      <w:pPr>
+        <w:ind w:left="1860" w:hanging="1440"/>
+      </w:pPr>
+      <w:rPr>
+        <w:rFonts w:hint="default"/>
+      </w:rPr>
+    </w:lvl>
+    <w:lvl w:ilvl="8">
+      <w:start w:val="1"/>
+      <w:numFmt w:val="decimal"/>
+      <w:isLgl/>
+      <w:lvlText w:val="%1.%2.%3.%4.%5.%6.%7.%8.%9"/>
+      <w:lvlJc w:val="left"/>
+      <w:pPr>
+        <w:ind w:left="2220" w:hanging="1800"/>
+      </w:pPr>
+      <w:rPr>
+        <w:rFonts w:hint="default"/>
+      </w:rPr>
+    </w:lvl>
+  </w:abstractNum>
+  <w:abstractNum w:abstractNumId="4" w15:restartNumberingAfterBreak="0">
     <w:nsid w:val="12D065D4"/>
     <w:multiLevelType w:val="hybridMultilevel"/>
     <w:tmpl w:val="2F1A4D1C"/>
@@ -35298,7 +35706,7 @@
       </w:pPr>
     </w:lvl>
   </w:abstractNum>
-  <w:abstractNum w:abstractNumId="4" w15:restartNumberingAfterBreak="0">
+  <w:abstractNum w:abstractNumId="5" w15:restartNumberingAfterBreak="0">
     <w:nsid w:val="15E23631"/>
     <w:multiLevelType w:val="hybridMultilevel"/>
     <w:tmpl w:val="5AEECDA4"/>
@@ -35387,7 +35795,7 @@
       </w:pPr>
     </w:lvl>
   </w:abstractNum>
-  <w:abstractNum w:abstractNumId="5" w15:restartNumberingAfterBreak="0">
+  <w:abstractNum w:abstractNumId="6" w15:restartNumberingAfterBreak="0">
     <w:nsid w:val="1D806357"/>
     <w:multiLevelType w:val="multilevel"/>
     <w:tmpl w:val="0409001F"/>
@@ -35500,7 +35908,7 @@
       </w:rPr>
     </w:lvl>
   </w:abstractNum>
-  <w:abstractNum w:abstractNumId="6" w15:restartNumberingAfterBreak="0">
+  <w:abstractNum w:abstractNumId="7" w15:restartNumberingAfterBreak="0">
     <w:nsid w:val="1DD52405"/>
     <w:multiLevelType w:val="multilevel"/>
     <w:tmpl w:val="7CBA5486"/>
@@ -35621,7 +36029,7 @@
       </w:rPr>
     </w:lvl>
   </w:abstractNum>
-  <w:abstractNum w:abstractNumId="7" w15:restartNumberingAfterBreak="0">
+  <w:abstractNum w:abstractNumId="8" w15:restartNumberingAfterBreak="0">
     <w:nsid w:val="31972A51"/>
     <w:multiLevelType w:val="hybridMultilevel"/>
     <w:tmpl w:val="C1962BEC"/>
@@ -35710,7 +36118,7 @@
       </w:pPr>
     </w:lvl>
   </w:abstractNum>
-  <w:abstractNum w:abstractNumId="8" w15:restartNumberingAfterBreak="0">
+  <w:abstractNum w:abstractNumId="9" w15:restartNumberingAfterBreak="0">
     <w:nsid w:val="32552850"/>
     <w:multiLevelType w:val="hybridMultilevel"/>
     <w:tmpl w:val="5D8AFF94"/>
@@ -35823,7 +36231,7 @@
       </w:rPr>
     </w:lvl>
   </w:abstractNum>
-  <w:abstractNum w:abstractNumId="9" w15:restartNumberingAfterBreak="0">
+  <w:abstractNum w:abstractNumId="10" w15:restartNumberingAfterBreak="0">
     <w:nsid w:val="36837818"/>
     <w:multiLevelType w:val="hybridMultilevel"/>
     <w:tmpl w:val="FB14EA26"/>
@@ -35936,7 +36344,7 @@
       </w:rPr>
     </w:lvl>
   </w:abstractNum>
-  <w:abstractNum w:abstractNumId="10" w15:restartNumberingAfterBreak="0">
+  <w:abstractNum w:abstractNumId="11" w15:restartNumberingAfterBreak="0">
     <w:nsid w:val="3B475DB4"/>
     <w:multiLevelType w:val="hybridMultilevel"/>
     <w:tmpl w:val="1562C4A2"/>
@@ -36022,7 +36430,7 @@
       </w:pPr>
     </w:lvl>
   </w:abstractNum>
-  <w:abstractNum w:abstractNumId="11" w15:restartNumberingAfterBreak="0">
+  <w:abstractNum w:abstractNumId="12" w15:restartNumberingAfterBreak="0">
     <w:nsid w:val="3EB55B4C"/>
     <w:multiLevelType w:val="hybridMultilevel"/>
     <w:tmpl w:val="A8AC6B46"/>
@@ -36111,7 +36519,7 @@
       </w:pPr>
     </w:lvl>
   </w:abstractNum>
-  <w:abstractNum w:abstractNumId="12" w15:restartNumberingAfterBreak="0">
+  <w:abstractNum w:abstractNumId="13" w15:restartNumberingAfterBreak="0">
     <w:nsid w:val="479550A5"/>
     <w:multiLevelType w:val="multilevel"/>
     <w:tmpl w:val="0409001F"/>
@@ -36224,7 +36632,7 @@
       </w:rPr>
     </w:lvl>
   </w:abstractNum>
-  <w:abstractNum w:abstractNumId="13" w15:restartNumberingAfterBreak="0">
+  <w:abstractNum w:abstractNumId="14" w15:restartNumberingAfterBreak="0">
     <w:nsid w:val="49E10AEC"/>
     <w:multiLevelType w:val="hybridMultilevel"/>
     <w:tmpl w:val="6A90A774"/>
@@ -36337,7 +36745,7 @@
       </w:rPr>
     </w:lvl>
   </w:abstractNum>
-  <w:abstractNum w:abstractNumId="14" w15:restartNumberingAfterBreak="0">
+  <w:abstractNum w:abstractNumId="15" w15:restartNumberingAfterBreak="0">
     <w:nsid w:val="59956185"/>
     <w:multiLevelType w:val="multilevel"/>
     <w:tmpl w:val="F744B2D4"/>
@@ -36486,7 +36894,7 @@
       </w:rPr>
     </w:lvl>
   </w:abstractNum>
-  <w:abstractNum w:abstractNumId="15" w15:restartNumberingAfterBreak="0">
+  <w:abstractNum w:abstractNumId="16" w15:restartNumberingAfterBreak="0">
     <w:nsid w:val="5D142187"/>
     <w:multiLevelType w:val="multilevel"/>
     <w:tmpl w:val="0409001F"/>
@@ -36599,7 +37007,7 @@
       </w:rPr>
     </w:lvl>
   </w:abstractNum>
-  <w:abstractNum w:abstractNumId="16" w15:restartNumberingAfterBreak="0">
+  <w:abstractNum w:abstractNumId="17" w15:restartNumberingAfterBreak="0">
     <w:nsid w:val="5EFB1C64"/>
     <w:multiLevelType w:val="multilevel"/>
     <w:tmpl w:val="FA926726"/>
@@ -36720,7 +37128,7 @@
       </w:rPr>
     </w:lvl>
   </w:abstractNum>
-  <w:abstractNum w:abstractNumId="17" w15:restartNumberingAfterBreak="0">
+  <w:abstractNum w:abstractNumId="18" w15:restartNumberingAfterBreak="0">
     <w:nsid w:val="5FF16C55"/>
     <w:multiLevelType w:val="hybridMultilevel"/>
     <w:tmpl w:val="47DAF114"/>
@@ -36833,7 +37241,7 @@
       </w:rPr>
     </w:lvl>
   </w:abstractNum>
-  <w:abstractNum w:abstractNumId="18" w15:restartNumberingAfterBreak="0">
+  <w:abstractNum w:abstractNumId="19" w15:restartNumberingAfterBreak="0">
     <w:nsid w:val="65106790"/>
     <w:multiLevelType w:val="multilevel"/>
     <w:tmpl w:val="FA926726"/>
@@ -36954,7 +37362,7 @@
       </w:rPr>
     </w:lvl>
   </w:abstractNum>
-  <w:abstractNum w:abstractNumId="19" w15:restartNumberingAfterBreak="0">
+  <w:abstractNum w:abstractNumId="20" w15:restartNumberingAfterBreak="0">
     <w:nsid w:val="65605925"/>
     <w:multiLevelType w:val="multilevel"/>
     <w:tmpl w:val="6414B77E"/>
@@ -37103,7 +37511,7 @@
       </w:rPr>
     </w:lvl>
   </w:abstractNum>
-  <w:abstractNum w:abstractNumId="20" w15:restartNumberingAfterBreak="0">
+  <w:abstractNum w:abstractNumId="21" w15:restartNumberingAfterBreak="0">
     <w:nsid w:val="685B2CC5"/>
     <w:multiLevelType w:val="multilevel"/>
     <w:tmpl w:val="5F908CB2"/>
@@ -37252,7 +37660,7 @@
       </w:rPr>
     </w:lvl>
   </w:abstractNum>
-  <w:abstractNum w:abstractNumId="21" w15:restartNumberingAfterBreak="0">
+  <w:abstractNum w:abstractNumId="22" w15:restartNumberingAfterBreak="0">
     <w:nsid w:val="70E021A9"/>
     <w:multiLevelType w:val="hybridMultilevel"/>
     <w:tmpl w:val="F44EEFF2"/>
@@ -37342,7 +37750,7 @@
       </w:pPr>
     </w:lvl>
   </w:abstractNum>
-  <w:abstractNum w:abstractNumId="22" w15:restartNumberingAfterBreak="0">
+  <w:abstractNum w:abstractNumId="23" w15:restartNumberingAfterBreak="0">
     <w:nsid w:val="77084836"/>
     <w:multiLevelType w:val="multilevel"/>
     <w:tmpl w:val="EED29006"/>
@@ -37491,7 +37899,7 @@
       </w:rPr>
     </w:lvl>
   </w:abstractNum>
-  <w:abstractNum w:abstractNumId="23" w15:restartNumberingAfterBreak="0">
+  <w:abstractNum w:abstractNumId="24" w15:restartNumberingAfterBreak="0">
     <w:nsid w:val="7A5C712F"/>
     <w:multiLevelType w:val="multilevel"/>
     <w:tmpl w:val="619C202E"/>
@@ -37612,7 +38020,7 @@
       </w:rPr>
     </w:lvl>
   </w:abstractNum>
-  <w:abstractNum w:abstractNumId="24" w15:restartNumberingAfterBreak="0">
+  <w:abstractNum w:abstractNumId="25" w15:restartNumberingAfterBreak="0">
     <w:nsid w:val="7E991A8B"/>
     <w:multiLevelType w:val="hybridMultilevel"/>
     <w:tmpl w:val="C922B06A"/>
@@ -37725,7 +38133,7 @@
       </w:rPr>
     </w:lvl>
   </w:abstractNum>
-  <w:abstractNum w:abstractNumId="25" w15:restartNumberingAfterBreak="0">
+  <w:abstractNum w:abstractNumId="26" w15:restartNumberingAfterBreak="0">
     <w:nsid w:val="7E9F712C"/>
     <w:multiLevelType w:val="multilevel"/>
     <w:tmpl w:val="C7744728"/>
@@ -37875,82 +38283,85 @@
     </w:lvl>
   </w:abstractNum>
   <w:num w:numId="1" w16cid:durableId="607204533">
-    <w:abstractNumId w:val="10"/>
+    <w:abstractNumId w:val="11"/>
   </w:num>
   <w:num w:numId="2" w16cid:durableId="1240867659">
-    <w:abstractNumId w:val="15"/>
+    <w:abstractNumId w:val="16"/>
   </w:num>
   <w:num w:numId="3" w16cid:durableId="518933528">
+    <w:abstractNumId w:val="25"/>
+  </w:num>
+  <w:num w:numId="4" w16cid:durableId="290597978">
+    <w:abstractNumId w:val="12"/>
+  </w:num>
+  <w:num w:numId="5" w16cid:durableId="198785566">
     <w:abstractNumId w:val="24"/>
   </w:num>
-  <w:num w:numId="4" w16cid:durableId="290597978">
-    <w:abstractNumId w:val="11"/>
-  </w:num>
-  <w:num w:numId="5" w16cid:durableId="198785566">
-    <w:abstractNumId w:val="23"/>
-  </w:num>
   <w:num w:numId="6" w16cid:durableId="213349035">
-    <w:abstractNumId w:val="21"/>
+    <w:abstractNumId w:val="22"/>
   </w:num>
   <w:num w:numId="7" w16cid:durableId="860822821">
-    <w:abstractNumId w:val="6"/>
+    <w:abstractNumId w:val="7"/>
   </w:num>
   <w:num w:numId="8" w16cid:durableId="1668509154">
-    <w:abstractNumId w:val="4"/>
+    <w:abstractNumId w:val="5"/>
   </w:num>
   <w:num w:numId="9" w16cid:durableId="1908109799">
     <w:abstractNumId w:val="1"/>
   </w:num>
   <w:num w:numId="10" w16cid:durableId="1409882578">
-    <w:abstractNumId w:val="5"/>
+    <w:abstractNumId w:val="6"/>
   </w:num>
   <w:num w:numId="11" w16cid:durableId="1568107422">
+    <w:abstractNumId w:val="18"/>
+  </w:num>
+  <w:num w:numId="12" w16cid:durableId="1933976752">
+    <w:abstractNumId w:val="4"/>
+  </w:num>
+  <w:num w:numId="13" w16cid:durableId="68889914">
+    <w:abstractNumId w:val="13"/>
+  </w:num>
+  <w:num w:numId="14" w16cid:durableId="1756508992">
+    <w:abstractNumId w:val="23"/>
+  </w:num>
+  <w:num w:numId="15" w16cid:durableId="156774775">
+    <w:abstractNumId w:val="15"/>
+  </w:num>
+  <w:num w:numId="16" w16cid:durableId="284124577">
+    <w:abstractNumId w:val="26"/>
+  </w:num>
+  <w:num w:numId="17" w16cid:durableId="309483357">
+    <w:abstractNumId w:val="21"/>
+  </w:num>
+  <w:num w:numId="18" w16cid:durableId="1214578795">
+    <w:abstractNumId w:val="14"/>
+  </w:num>
+  <w:num w:numId="19" w16cid:durableId="1494445906">
     <w:abstractNumId w:val="17"/>
   </w:num>
-  <w:num w:numId="12" w16cid:durableId="1933976752">
-    <w:abstractNumId w:val="3"/>
-  </w:num>
-  <w:num w:numId="13" w16cid:durableId="68889914">
-    <w:abstractNumId w:val="12"/>
-  </w:num>
-  <w:num w:numId="14" w16cid:durableId="1756508992">
-    <w:abstractNumId w:val="22"/>
-  </w:num>
-  <w:num w:numId="15" w16cid:durableId="156774775">
-    <w:abstractNumId w:val="14"/>
-  </w:num>
-  <w:num w:numId="16" w16cid:durableId="284124577">
-    <w:abstractNumId w:val="25"/>
-  </w:num>
-  <w:num w:numId="17" w16cid:durableId="309483357">
-    <w:abstractNumId w:val="20"/>
-  </w:num>
-  <w:num w:numId="18" w16cid:durableId="1214578795">
-    <w:abstractNumId w:val="13"/>
-  </w:num>
-  <w:num w:numId="19" w16cid:durableId="1494445906">
-    <w:abstractNumId w:val="16"/>
-  </w:num>
   <w:num w:numId="20" w16cid:durableId="1238829811">
-    <w:abstractNumId w:val="8"/>
+    <w:abstractNumId w:val="9"/>
   </w:num>
   <w:num w:numId="21" w16cid:durableId="2105564320">
-    <w:abstractNumId w:val="9"/>
+    <w:abstractNumId w:val="10"/>
   </w:num>
   <w:num w:numId="22" w16cid:durableId="1890611329">
     <w:abstractNumId w:val="0"/>
   </w:num>
   <w:num w:numId="23" w16cid:durableId="2134015023">
-    <w:abstractNumId w:val="19"/>
+    <w:abstractNumId w:val="20"/>
   </w:num>
   <w:num w:numId="24" w16cid:durableId="320936087">
-    <w:abstractNumId w:val="7"/>
+    <w:abstractNumId w:val="8"/>
   </w:num>
   <w:num w:numId="25" w16cid:durableId="899560176">
     <w:abstractNumId w:val="2"/>
   </w:num>
   <w:num w:numId="26" w16cid:durableId="1061054480">
-    <w:abstractNumId w:val="18"/>
+    <w:abstractNumId w:val="19"/>
+  </w:num>
+  <w:num w:numId="27" w16cid:durableId="1960989088">
+    <w:abstractNumId w:val="3"/>
   </w:num>
 </w:numbering>
 </file>
@@ -38959,6 +39370,68 @@
       <w14:ligatures w14:val="none"/>
     </w:rPr>
   </w:style>
+  <w:style w:type="paragraph" w:styleId="af5">
+    <w:name w:val="header"/>
+    <w:basedOn w:val="a"/>
+    <w:link w:val="af6"/>
+    <w:uiPriority w:val="99"/>
+    <w:unhideWhenUsed/>
+    <w:rsid w:val="00B62E98"/>
+    <w:pPr>
+      <w:tabs>
+        <w:tab w:val="center" w:pos="4153"/>
+        <w:tab w:val="right" w:pos="8306"/>
+      </w:tabs>
+      <w:snapToGrid w:val="0"/>
+      <w:jc w:val="center"/>
+    </w:pPr>
+    <w:rPr>
+      <w:sz w:val="18"/>
+      <w:szCs w:val="18"/>
+    </w:rPr>
+  </w:style>
+  <w:style w:type="character" w:customStyle="1" w:styleId="af6">
+    <w:name w:val="页眉 字符"/>
+    <w:basedOn w:val="a0"/>
+    <w:link w:val="af5"/>
+    <w:uiPriority w:val="99"/>
+    <w:rsid w:val="00B62E98"/>
+    <w:rPr>
+      <w:sz w:val="18"/>
+      <w:szCs w:val="18"/>
+    </w:rPr>
+  </w:style>
+  <w:style w:type="paragraph" w:styleId="af7">
+    <w:name w:val="footer"/>
+    <w:basedOn w:val="a"/>
+    <w:link w:val="af8"/>
+    <w:uiPriority w:val="99"/>
+    <w:unhideWhenUsed/>
+    <w:rsid w:val="00B62E98"/>
+    <w:pPr>
+      <w:tabs>
+        <w:tab w:val="center" w:pos="4153"/>
+        <w:tab w:val="right" w:pos="8306"/>
+      </w:tabs>
+      <w:snapToGrid w:val="0"/>
+      <w:jc w:val="left"/>
+    </w:pPr>
+    <w:rPr>
+      <w:sz w:val="18"/>
+      <w:szCs w:val="18"/>
+    </w:rPr>
+  </w:style>
+  <w:style w:type="character" w:customStyle="1" w:styleId="af8">
+    <w:name w:val="页脚 字符"/>
+    <w:basedOn w:val="a0"/>
+    <w:link w:val="af7"/>
+    <w:uiPriority w:val="99"/>
+    <w:rsid w:val="00B62E98"/>
+    <w:rPr>
+      <w:sz w:val="18"/>
+      <w:szCs w:val="18"/>
+    </w:rPr>
+  </w:style>
 </w:styles>
 </file>
 

</xml_diff>